<commit_message>
Zev-7 Operator Manual V4: dark rule keyword (light-sensor-gated rules) — new Dark rules paragraph in §8, keyword-table row, whenever-dark example, Light Sensor cross-ref; revision/firmware markers V3→V4 (Zev-7S 2.4)
</commit_message>
<xml_diff>
--- a/Zev-7 Operator Manual.docx
+++ b/Zev-7 Operator Manual.docx
@@ -107,7 +107,7 @@
           <w:color w:val="000000"/>
           <w:sz w:val="24"/>
         </w:rPr>
-        <w:t>June 2026</w:t>
+        <w:t>July 2026</w:t>
       </w:r>
     </w:p>
     <w:p>
@@ -179,7 +179,7 @@
           </w:tcPr>
           <w:p>
             <w:r>
-              <w:t>V2 — Rules system replaces Period Overrides; adds Zev-7N numitron variants</w:t>
+              <w:t>V4 — adds the dark rule keyword (rules that apply only while the room is dark). V3 — adds Tube Healing (cathode recovery), day-of-week rule filters, and off accepted as a value. (V2 replaced Period Overrides with the Rules system and added Zev-7N numitron variants.)</w:t>
             </w:r>
           </w:p>
         </w:tc>
@@ -216,18 +216,8 @@
             <w:tcBorders/>
           </w:tcPr>
           <w:p>
-            <w:pPr>
-              <w:pStyle w:val="Normal"/>
-              <w:widowControl/>
-              <w:suppressAutoHyphens w:val="true"/>
-              <w:bidi w:val="0"/>
-              <w:spacing w:lineRule="auto" w:line="276" w:before="0" w:after="80"/>
-              <w:jc w:val="start"/>
-              <w:rPr/>
-            </w:pPr>
-            <w:r>
-              <w:rPr/>
-              <w:t>V2</w:t>
+            <w:r>
+              <w:t>V4</w:t>
             </w:r>
           </w:p>
         </w:tc>
@@ -863,14 +853,15 @@
           <w:color w:val="000000"/>
           <w:sz w:val="22"/>
         </w:rPr>
-        <w:t>15. OTA Firmware Update</w:t>
+        <w:t>15. Tube Healing</w:t>
+        <w:tab/>
+        <w:t>15-1</w:t>
       </w:r>
       <w:r>
         <w:rPr>
           <w:rFonts w:ascii="Arial" w:hAnsi="Arial"/>
           <w:sz w:val="22"/>
         </w:rPr>
-        <w:tab/>
       </w:r>
       <w:r>
         <w:rPr>
@@ -878,7 +869,6 @@
           <w:color w:val="000000"/>
           <w:sz w:val="22"/>
         </w:rPr>
-        <w:t>15-1</w:t>
       </w:r>
     </w:p>
     <w:p>
@@ -897,14 +887,15 @@
           <w:color w:val="000000"/>
           <w:sz w:val="22"/>
         </w:rPr>
-        <w:t>16. Factory Reset</w:t>
+        <w:t>16. OTA Firmware Update</w:t>
+        <w:tab/>
+        <w:t>16-1</w:t>
       </w:r>
       <w:r>
         <w:rPr>
           <w:rFonts w:ascii="Arial" w:hAnsi="Arial"/>
           <w:sz w:val="22"/>
         </w:rPr>
-        <w:tab/>
       </w:r>
       <w:r>
         <w:rPr>
@@ -912,7 +903,40 @@
           <w:color w:val="000000"/>
           <w:sz w:val="22"/>
         </w:rPr>
-        <w:t>16-1</w:t>
+      </w:r>
+    </w:p>
+    <w:p>
+      <w:pPr>
+        <w:pStyle w:val="Normal"/>
+        <w:tabs>
+          <w:tab w:val="clear" w:pos="720"/>
+          <w:tab w:val="right" w:pos="9072" w:leader="dot"/>
+        </w:tabs>
+        <w:spacing w:before="40" w:after="80"/>
+        <w:rPr/>
+      </w:pPr>
+      <w:r>
+        <w:rPr>
+          <w:rFonts w:ascii="Arial" w:hAnsi="Arial"/>
+          <w:color w:val="000000"/>
+          <w:sz w:val="22"/>
+        </w:rPr>
+        <w:t>17. Factory Reset</w:t>
+        <w:tab/>
+        <w:t>17-1</w:t>
+      </w:r>
+      <w:r>
+        <w:rPr>
+          <w:rFonts w:ascii="Arial" w:hAnsi="Arial"/>
+          <w:sz w:val="22"/>
+        </w:rPr>
+      </w:r>
+      <w:r>
+        <w:rPr>
+          <w:rFonts w:ascii="Arial" w:hAnsi="Arial"/>
+          <w:color w:val="000000"/>
+          <w:sz w:val="22"/>
+        </w:rPr>
       </w:r>
     </w:p>
     <w:p>
@@ -946,14 +970,15 @@
           <w:color w:val="000000"/>
           <w:sz w:val="22"/>
         </w:rPr>
-        <w:t>17. Troubleshooting</w:t>
+        <w:t>18. Troubleshooting</w:t>
+        <w:tab/>
+        <w:t>18-1</w:t>
       </w:r>
       <w:r>
         <w:rPr>
           <w:rFonts w:ascii="Arial" w:hAnsi="Arial"/>
           <w:sz w:val="22"/>
         </w:rPr>
-        <w:tab/>
       </w:r>
       <w:r>
         <w:rPr>
@@ -961,7 +986,6 @@
           <w:color w:val="000000"/>
           <w:sz w:val="22"/>
         </w:rPr>
-        <w:t>17-1</w:t>
       </w:r>
     </w:p>
     <w:p>
@@ -12254,6 +12278,32 @@
     <w:p>
       <w:pPr>
         <w:pStyle w:val="Heading2"/>
+      </w:pPr>
+      <w:r>
+        <w:t>Install as a Home-Screen App (Add to Home Screen)</w:t>
+      </w:r>
+    </w:p>
+    <w:p>
+      <w:pPr/>
+      <w:r>
+        <w:t>The live web interface can be added to a phone or tablet home screen so it launches full-screen like an app, showing the clock’s own nixie-tube icon and name. From the live home page, open the System page and tap Add to Home Screen. On Android this offers to install the page directly; on iPhone and iPad it reminds you to use Safari’s Share button and choose “Add to Home Screen” (Apple requires that step to be done from the browser’s Share menu). Either way, an icon appears on the home screen that opens straight to the clock’s settings.</w:t>
+      </w:r>
+    </w:p>
+    <w:p>
+      <w:pPr/>
+      <w:r>
+        <w:t>The icon is labeled with the clock’s Access Point Name, so in a multi-clock home each unit gets its own recognizable icon — for example “Kitchen Clock.”</w:t>
+      </w:r>
+    </w:p>
+    <w:p>
+      <w:pPr/>
+      <w:r>
+        <w:t>A home-screen icon remembers whichever address was open when it was created. For an icon that keeps working, add it from the clock’s name address (http://&lt;name&gt;.local/, see above) or give the clock a fixed IP address, so a changing DHCP lease cannot leave the icon pointing at the wrong place. If an icon ever stops opening, delete it and add it again from a working address.</w:t>
+      </w:r>
+    </w:p>
+    <w:p>
+      <w:pPr>
+        <w:pStyle w:val="Heading2"/>
         <w:keepNext w:val="true"/>
         <w:pBdr>
           <w:top w:val="single" w:sz="8" w:space="4" w:color="000000"/>
@@ -12713,6 +12763,18 @@
           <w:sz w:val="22"/>
         </w:rPr>
         <w:t>Field keys. Each override uses a 2-letter short key (or its full descriptive name) followed by "=" and a value. The supported keys are: nb / nixiebrightness (Nixie brightness 0-9), cd / colondisplay (colon neon pattern 0-8, see Section 11), lb / ledbrightness (LED brightness 0-9), le / ledeffect (LED effect 0-12, see Section 9), lc / ledcolor (LED color, hex #RRGGBB or color name), ub / underbrightness (under-light brightness 0-9, Zev-7 full only), uc / undercolor (under-light color, Zev-7 full only), and pir / passiveinfrared (motion-sensor timeout 0-9 - same scale as the Motion Sensor Timeout dropdown: 0=Off, 1=10s, 2=20s, 3=30s, 4=1m, 5=5m, 6=10m, 7=15m, 8=30m, 9=1hr). Add the bare keyword "wd" / "weekday" to restrict the rule to weekdays (Mon-Fri) or "we" / "weekend" to restrict it to weekends (Sat-Sun). Fields may appear in any order - the time range does not need to be first.</w:t>
+      </w:r>
+    </w:p>
+    <w:p>
+      <w:pPr/>
+      <w:r>
+        <w:t>Days of the week. Beyond the wd (weekday) and we (weekend) shortcuts, a rule can target specific days by name — sun, mon, tue, wed, thu, fri, sat, or the full names such as tuesday. A day range like tue-thu covers a span and may wrap the week (sat-mon covers Saturday, Sunday, Monday); a single day name limits the rule to that day. Day terms are combined as a union and may be mixed with wd/we. Separately, the value off may be used in place of 0 on any numeric field — nb=off, lb=off, and so on.</w:t>
+      </w:r>
+    </w:p>
+    <w:p>
+      <w:pPr/>
+      <w:r>
+        <w:t>Dark rules. The bare dark keyword makes a rule apply only while the room is dark. It requires the Light Sensor (Section 13) to be enabled. The clock waits for about a minute of continuous darkness before dark rules engage — brief shadows, headlights, or a passing cloud will not trigger them — and releases them within a few seconds once the room is lit again. dark combines with time ranges and day filters; use t=all with dark for a rule that follows the room rather than the clock. A dark rule on a clock whose Light Sensor is disabled stays dormant — it is accepted but never fires.</w:t>
       </w:r>
     </w:p>
     <w:p>
@@ -13612,6 +13674,31 @@
             <w:tcBorders/>
           </w:tcPr>
           <w:p>
+            <w:r>
+              <w:t>dark</w:t>
+            </w:r>
+          </w:p>
+        </w:tc>
+        <w:tc>
+          <w:tcPr>
+            <w:tcW w:w="7006" w:type="dxa"/>
+            <w:tcBorders/>
+          </w:tcPr>
+          <w:p>
+            <w:r>
+              <w:t>Bare keyword (no = value). The rule applies only while the room is dark, as measured by the light sensor. Engages after about a minute of continuous darkness; releases within a few seconds when the room lights up. Requires the Light Sensor to be enabled.</w:t>
+            </w:r>
+          </w:p>
+        </w:tc>
+      </w:tr>
+      <w:tr>
+        <w:trPr/>
+        <w:tc>
+          <w:tcPr>
+            <w:tcW w:w="2400" w:type="dxa"/>
+            <w:tcBorders/>
+          </w:tcPr>
+          <w:p>
             <w:pPr>
               <w:pStyle w:val="Normal"/>
               <w:widowControl/>
@@ -13665,6 +13752,72 @@
                 <w:lang w:val="en-US" w:eastAsia="en-US" w:bidi="ar-SA"/>
               </w:rPr>
               <w:t xml:space="preserve">Bare keyword (no = value). Shortcut that expands to nb=0, lb=0, ub=0 (everything off: Nixie tubes, digit LEDs, and under-light). On Zev-7 Mini the ub field isn't registered, so off only expands to nb=0, lb=0.</w:t>
+            </w:r>
+          </w:p>
+        </w:tc>
+      </w:tr>
+      <w:tr>
+        <w:tc>
+          <w:tcPr>
+            <w:tcW w:type="dxa" w:w="2400"/>
+          </w:tcPr>
+          <w:p>
+            <w:r>
+              <w:t>Day names / ranges</w:t>
+            </w:r>
+          </w:p>
+        </w:tc>
+        <w:tc>
+          <w:tcPr>
+            <w:tcW w:type="dxa" w:w="7006"/>
+          </w:tcPr>
+          <w:p>
+            <w:r>
+              <w:t>Bare day tokens restrict a rule to specific days of the week: sun, mon, tue, wed, thu, fri, sat (full names such as tuesday also work). A range spans consecutive days and may wrap the week — tue-thu means Tuesday through Thursday; sat-mon means Saturday, Sunday, Monday. A single token means that one day only. Day terms combine as a union and may be mixed with wd/we — for example wd, sat covers Monday through Saturday.</w:t>
+            </w:r>
+          </w:p>
+        </w:tc>
+      </w:tr>
+      <w:tr>
+        <w:tc>
+          <w:tcPr>
+            <w:tcW w:type="dxa" w:w="2400"/>
+          </w:tcPr>
+          <w:p>
+            <w:r>
+              <w:t>he / heal</w:t>
+            </w:r>
+          </w:p>
+        </w:tc>
+        <w:tc>
+          <w:tcPr>
+            <w:tcW w:type="dxa" w:w="7006"/>
+          </w:tcPr>
+          <w:p>
+            <w:r>
+              <w:t>Marks the time range as a Tube Healing window and sets the session length in days (1–99; a bare heal means 30 days; heal=0 cancels healing inside a higher-priority window). During a healing window the cathodes selected on the Tube Healing page glow to recover from poisoning while every other tube stays dark, and the motion sensor is held off for the window. See Section 15. Nixie models only.</w:t>
+            </w:r>
+          </w:p>
+        </w:tc>
+      </w:tr>
+      <w:tr>
+        <w:tc>
+          <w:tcPr>
+            <w:tcW w:type="dxa" w:w="2400"/>
+          </w:tcPr>
+          <w:p>
+            <w:r>
+              <w:t>off (as a value)</w:t>
+            </w:r>
+          </w:p>
+        </w:tc>
+        <w:tc>
+          <w:tcPr>
+            <w:tcW w:type="dxa" w:w="7006"/>
+          </w:tcPr>
+          <w:p>
+            <w:r>
+              <w:t>On any numeric field, off may be typed in place of 0 — for example nb=off, lb=off, ub=off, or heal=off. This is separate from the bare off shortcut above, which sets nb, lb, and ub together.</w:t>
             </w:r>
           </w:p>
         </w:tc>
@@ -15160,6 +15313,102 @@
           </w:p>
         </w:tc>
       </w:tr>
+      <w:tr>
+        <w:tc>
+          <w:tcPr>
+            <w:tcW w:type="dxa" w:w="4703"/>
+          </w:tcPr>
+          <w:p>
+            <w:r>
+              <w:t>t=7-9, tue-thu, nb=9</w:t>
+            </w:r>
+          </w:p>
+        </w:tc>
+        <w:tc>
+          <w:tcPr>
+            <w:tcW w:type="dxa" w:w="1567"/>
+          </w:tcPr>
+          <w:p>
+            <w:r>
+              <w:t>Day range</w:t>
+            </w:r>
+          </w:p>
+        </w:tc>
+        <w:tc>
+          <w:tcPr>
+            <w:tcW w:type="dxa" w:w="3136"/>
+          </w:tcPr>
+          <w:p>
+            <w:r>
+              <w:t>Full Nixie brightness from 7:00 through 8:59 AM, but only on Tuesday, Wednesday, and Thursday. Day names and ranges may be combined and mixed with wd/we.</w:t>
+            </w:r>
+          </w:p>
+        </w:tc>
+      </w:tr>
+      <w:tr>
+        <w:tc>
+          <w:tcPr>
+            <w:tcW w:type="dxa" w:w="4703"/>
+          </w:tcPr>
+          <w:p>
+            <w:r>
+              <w:t>t=0:00-6:30, heal=30</w:t>
+            </w:r>
+          </w:p>
+        </w:tc>
+        <w:tc>
+          <w:tcPr>
+            <w:tcW w:type="dxa" w:w="1567"/>
+          </w:tcPr>
+          <w:p>
+            <w:r>
+              <w:t>Healing window</w:t>
+            </w:r>
+          </w:p>
+        </w:tc>
+        <w:tc>
+          <w:tcPr>
+            <w:tcW w:type="dxa" w:w="3136"/>
+          </w:tcPr>
+          <w:p>
+            <w:r>
+              <w:t>Runs a 30-day Tube Healing session every night from midnight through 6:29 AM: the digits selected on the Tube Healing page glow to recover poisoned cathodes while the rest of the display is dark. See Section 15.</w:t>
+            </w:r>
+          </w:p>
+        </w:tc>
+      </w:tr>
+      <w:tr>
+        <w:tc>
+          <w:tcPr>
+            <w:tcW w:type="dxa" w:w="4703"/>
+          </w:tcPr>
+          <w:p>
+            <w:r>
+              <w:t>t=all, dark, nb=1, lb=0</w:t>
+            </w:r>
+          </w:p>
+        </w:tc>
+        <w:tc>
+          <w:tcPr>
+            <w:tcW w:type="dxa" w:w="1567"/>
+          </w:tcPr>
+          <w:p>
+            <w:r>
+              <w:t>Whenever dark</w:t>
+            </w:r>
+          </w:p>
+        </w:tc>
+        <w:tc>
+          <w:tcPr>
+            <w:tcW w:type="dxa" w:w="3136"/>
+          </w:tcPr>
+          <w:p>
+            <w:r>
+              <w:t>Follows the room instead of the clock: whenever the room is dark, tube brightness drops to 1 and the digit LEDs turn off. Everything returns a few seconds after the lights come on.</w:t>
+            </w:r>
+          </w:p>
+        </w:tc>
+      </w:tr>
     </w:tbl>
     <w:p>
       <w:pPr>
@@ -18462,20 +18711,10 @@
           <w:rFonts w:ascii="Arial" w:hAnsi="Arial"/>
           <w:sz w:val="22"/>
         </w:rPr>
-        <w:t>Calibration: Triple-click SW2 to enter calibration mode. The raw sensor reading (0–99) is displayed on the leftmost two tubes for ~30 seconds.</w:t>
+        <w:t>Calibration: The clock automatically dims its display to match the ambient light in the room, and you can teach it the brightness range of your location. Triple-click SW2 to enter calibration mode. The clock runs a 30-second calibration during which the four left-hand tubes show a live sensor reading (0–4095; note that brighter light produces a lower number). While calibration is running, expose the sensor to the brightest light at which you want the display at full brightness — for example, turn on the room lights or open the blinds — then cover or shade the sensor to register the darkest condition at which you want it dimmed to minimum. The clock tracks the brightest and darkest readings it sees during the 30 seconds; there is no button to press to finish. When the timer expires, calibration ends automatically, the new range is saved to memory, and the clock returns to showing the time. If too small a light range is captured, the clock keeps its previous calibration unchanged. The calibration is stored permanently and survives power loss, so it only needs to be repeated if the clock is moved to a location with noticeably different lighting.</w:t>
       </w:r>
-    </w:p>
-    <w:p>
-      <w:pPr>
-        <w:pStyle w:val="Normal"/>
-        <w:rPr/>
-      </w:pPr>
       <w:r>
-        <w:rPr>
-          <w:rFonts w:ascii="Arial" w:hAnsi="Arial"/>
-          <w:sz w:val="22"/>
-        </w:rPr>
-        <w:t>Calibration: Triple-click SW2 to enter calibration mode. The raw sensor reading (0–99) is displayed on the leftmost two tubes for ~30 seconds.</w:t>
+        <w:t xml:space="preserve"> The light sensor also drives dark rules — rules that apply only while the room is dark (see Section 8).</w:t>
       </w:r>
     </w:p>
     <w:p>
@@ -18853,6 +19092,56 @@
     <w:p>
       <w:pPr>
         <w:pStyle w:val="Heading1"/>
+      </w:pPr>
+      <w:r>
+        <w:t>15. Tube Healing</w:t>
+      </w:r>
+    </w:p>
+    <w:p>
+      <w:pPr/>
+      <w:r>
+        <w:t>Anti-poisoning (Section 14) prevents cathode poisoning; Tube Healing recovers a cathode that is already poisoned. If a particular digit on a particular tube looks faded or ghosted even after the regular anti-poison schedule has been running, Tube Healing lets you glow just that cathode for an extended period to burn the deposit off. Like anti-poisoning, this is a Nixie-only feature: the Zev-7N numitron models use filament tubes that do not poison, and have no Tube Healing page.</w:t>
+      </w:r>
+    </w:p>
+    <w:p>
+      <w:pPr/>
+      <w:r>
+        <w:t>Where it is. Tube Healing lives on the live web interface, not the AP setup form. From the live home page, open the System page and tap Tube Healing. The page has three parts: a Healing on/off switch, a row of digit-test buttons (0–9), and a grid of checkboxes with one column per tube and one row per digit.</w:t>
+      </w:r>
+    </w:p>
+    <w:p>
+      <w:pPr/>
+      <w:r>
+        <w:t>1. Find the weak cathodes. Tap a digit-test button and that digit is shown on every tube for a few seconds while the button turns blue. Step through the digits and note which tube-and-digit combinations look dim or patchy compared with the rest.</w:t>
+      </w:r>
+    </w:p>
+    <w:p>
+      <w:pPr/>
+      <w:r>
+        <w:t>2. Select and arm. In the grid, tick each weak digit under its tube (tube 1 is the leftmost). Turn the Healing switch on. Selections are saved immediately and survive a reboot.</w:t>
+      </w:r>
+    </w:p>
+    <w:p>
+      <w:pPr/>
+      <w:r>
+        <w:t>3. Schedule when it runs. Healing only treats during a rule window that carries the heal keyword (see Section 8). Add a rule such as t=0:00-6:30, heal=30 to heal every night from midnight to 6:30 AM for a 30-day session. A bare heal means 30 days; heal=N sets any length from 1 to 99 days. An overnight window keeps the clock readable during the day.</w:t>
+      </w:r>
+    </w:p>
+    <w:p>
+      <w:pPr/>
+      <w:r>
+        <w:t>What you see during a window. The clock stops showing the time entirely: only the selected cathodes glow, on their own tubes, and every other tube is dark. This is deliberate — a healing digit held in place of a time digit would be unreadable and would dilute the treatment. If more than one digit is selected on the same tube, that tube rotates through them, five minutes each. The motion sensor, the scheduled anti-poison cycles, and the date and weather info displays are all suspended for the duration of the window so the treatment runs uninterrupted. Outside the window the clock behaves normally.</w:t>
+      </w:r>
+    </w:p>
+    <w:p>
+      <w:pPr/>
+      <w:r>
+        <w:t>When it ends. The session ends automatically after the number of days set by heal=N (30 by default); the Healing switch then turns itself off, while the digit selections stay ticked so a follow-up session only needs the switch turned back on again. Turning the switch off at any time ends the session immediately. Light poisoning typically clears in about 30 days; heavy poisoning may need a second session. Note: a faded glow only along the bottom of a digit usually indicates a tube air leak rather than poisoning, and cannot be healed.</w:t>
+      </w:r>
+    </w:p>
+    <w:p>
+      <w:pPr>
+        <w:pStyle w:val="Heading1"/>
         <w:keepNext w:val="true"/>
         <w:spacing w:before="160" w:after="160"/>
         <w:rPr/>
@@ -18864,7 +19153,7 @@
           <w:color w:val="C25600"/>
           <w:sz w:val="40"/>
         </w:rPr>
-        <w:t>15. OTA Firmware Update</w:t>
+        <w:t>16. OTA Firmware Update</w:t>
       </w:r>
     </w:p>
     <w:p>
@@ -19791,7 +20080,7 @@
           <w:color w:val="C25600"/>
           <w:sz w:val="40"/>
         </w:rPr>
-        <w:t>16. Factory Reset</w:t>
+        <w:t>17. Factory Reset</w:t>
       </w:r>
     </w:p>
     <w:p>
@@ -19951,7 +20240,7 @@
           <w:color w:val="C25600"/>
           <w:sz w:val="40"/>
         </w:rPr>
-        <w:t>17. Troubleshooting</w:t>
+        <w:t>18. Troubleshooting</w:t>
       </w:r>
     </w:p>
     <w:p>

</xml_diff>

<commit_message>
Zev-7 Operator Manual: availability note in §2 Models — no Pico-version clocks available; existing Pico units were privately made and never sold
</commit_message>
<xml_diff>
--- a/Zev-7 Operator Manual.docx
+++ b/Zev-7 Operator Manual.docx
@@ -2680,6 +2680,35 @@
           <w:sz w:val="26"/>
         </w:rPr>
         <w:t xml:space="preserve"> display shows 00, the processor must be returned to the manufacturer for reprogramming.</w:t>
+      </w:r>
+    </w:p>
+    <w:p>
+      <w:pPr>
+        <w:pStyle w:val="Normal"/>
+        <w:pBdr>
+          <w:left w:val="single" w:sz="24" w:space="8" w:color="C25600"/>
+        </w:pBdr>
+        <w:spacing w:before="120" w:after="120"/>
+        <w:ind w:start="216"/>
+        <w:rPr/>
+        <w:sectPr>
+          <w:headerReference w:type="even" r:id="rId26"/>
+          <w:headerReference w:type="default" r:id="rId27"/>
+          <w:headerReference w:type="first" r:id="rId28"/>
+          <w:footerReference w:type="even" r:id="rId29"/>
+          <w:footerReference w:type="default" r:id="rId30"/>
+          <w:footerReference w:type="first" r:id="rId31"/>
+          <w:type w:val="nextPage"/>
+          <w:pgSz w:w="12240" w:h="15840"/>
+          <w:pgMar w:left="1417" w:right="1417" w:gutter="0" w:header="720" w:top="1134" w:footer="720" w:bottom="1134"/>
+          <w:pgNumType w:start="1" w:fmt="decimal"/>
+          <w:formProt w:val="false"/>
+          <w:textDirection w:val="lrTb"/>
+          <w:docGrid w:type="default" w:linePitch="360" w:charSpace="0"/>
+        </w:sectPr>
+      </w:pPr>
+      <w:r>
+        <w:t>Availability: No Pico-version clocks (the original clocks built on the ESP32-Pico processor) are available. The Pico units in existence were privately made and were never sold.</w:t>
       </w:r>
     </w:p>
     <w:p>

</xml_diff>

<commit_message>
Zev-7 Operator Manual: remove the Pico availability note
</commit_message>
<xml_diff>
--- a/Zev-7 Operator Manual.docx
+++ b/Zev-7 Operator Manual.docx
@@ -2680,35 +2680,6 @@
           <w:sz w:val="26"/>
         </w:rPr>
         <w:t xml:space="preserve"> display shows 00, the processor must be returned to the manufacturer for reprogramming.</w:t>
-      </w:r>
-    </w:p>
-    <w:p>
-      <w:pPr>
-        <w:pStyle w:val="Normal"/>
-        <w:pBdr>
-          <w:left w:val="single" w:sz="24" w:space="8" w:color="C25600"/>
-        </w:pBdr>
-        <w:spacing w:before="120" w:after="120"/>
-        <w:ind w:start="216"/>
-        <w:rPr/>
-        <w:sectPr>
-          <w:headerReference w:type="even" r:id="rId26"/>
-          <w:headerReference w:type="default" r:id="rId27"/>
-          <w:headerReference w:type="first" r:id="rId28"/>
-          <w:footerReference w:type="even" r:id="rId29"/>
-          <w:footerReference w:type="default" r:id="rId30"/>
-          <w:footerReference w:type="first" r:id="rId31"/>
-          <w:type w:val="nextPage"/>
-          <w:pgSz w:w="12240" w:h="15840"/>
-          <w:pgMar w:left="1417" w:right="1417" w:gutter="0" w:header="720" w:top="1134" w:footer="720" w:bottom="1134"/>
-          <w:pgNumType w:start="1" w:fmt="decimal"/>
-          <w:formProt w:val="false"/>
-          <w:textDirection w:val="lrTb"/>
-          <w:docGrid w:type="default" w:linePitch="360" w:charSpace="0"/>
-        </w:sectPr>
-      </w:pPr>
-      <w:r>
-        <w:t>Availability: No Pico-version clocks (the original clocks built on the ESP32-Pico processor) are available. The Pico units in existence were privately made and were never sold.</w:t>
       </w:r>
     </w:p>
     <w:p>

</xml_diff>

<commit_message>
Zev-7 operator manual: Weather Display Frequency + firmware-update status
- Weather Display Frequency: Every Minute (default), 2/3/5/10/15/20/30 minutes,
  or Hourly. Documented in the Date & Weather section and the settings reference,
  noting every interval divides evenly into an hour so the cycle lands on
  predictable minutes (Hourly at :00, Every 30 Minutes at :00 and :30).
- Firmware update status: the web page now distinguishes "already current" from
  "updating to v<new version>", stays on screen through download/install/reboot,
  and returns home on its own; the tubes show each update stage.
- Revision blurb updated to list both alongside the existing dark-rule note.
</commit_message>
<xml_diff>
--- a/Zev-7 Operator Manual.docx
+++ b/Zev-7 Operator Manual.docx
@@ -179,7 +179,7 @@
           </w:tcPr>
           <w:p>
             <w:r>
-              <w:t>V4 — adds the dark rule keyword (rules that apply only while the room is dark). V3 — adds Tube Healing (cathode recovery), day-of-week rule filters, and off accepted as a value. (V2 replaced Period Overrides with the Rules system and added Zev-7N numitron variants.)</w:t>
+              <w:t>V4 — adds the dark rule keyword (rules that apply only while the room is dark), the Weather Display Frequency setting, and improved firmware-update status (the web page shows the update result, and the tubes show each update stage). V3 — adds Tube Healing (cathode recovery), day-of-week rule filters, and off accepted as a value. (V2 replaced Period Overrides with the Rules system and added Zev-7N numitron variants.)</w:t>
             </w:r>
           </w:p>
         </w:tc>
@@ -12121,7 +12121,7 @@
           <w:rFonts w:ascii="Arial" w:hAnsi="Arial"/>
           <w:sz w:val="22"/>
         </w:rPr>
-        <w:t>The Date and Weather start seconds run independently. Keep them at several seconds apart so a long info cycle on one doesn't collide with the other.</w:t>
+        <w:t>The Date Display and Weather Display sections each have a Start Second setting, and the two run independently. Keep them several seconds apart so a long info cycle on one doesn't collide with the other. The Weather Display Frequency setting controls how often the weather cycle runs — from Every Minute (the default) down to Hourly. Every choice divides evenly into an hour, so the spacing stays even across the top of the hour.</w:t>
       </w:r>
     </w:p>
     <w:p>
@@ -12566,7 +12566,7 @@
           <w:rFonts w:ascii="Arial" w:hAnsi="Arial"/>
           <w:sz w:val="22"/>
         </w:rPr>
-        <w:t>Date Display Start Second, Weather Display Start Second</w:t>
+        <w:t>Date Display Start Second; Weather Display Frequency and Start Second</w:t>
       </w:r>
     </w:p>
     <w:p>
@@ -18478,7 +18478,7 @@
           <w:rFonts w:ascii="Arial" w:hAnsi="Arial"/>
           <w:sz w:val="22"/>
         </w:rPr>
-        <w:t>The clock periodically interrupts the time display to show additional information. Date and weather information run on independent schedules controlled by the Date Display Start Second and Weather Display Start Second settings (each fires once per minute at the configured second).</w:t>
+        <w:t>The clock periodically interrupts the time display to show additional information. Date and weather information run on independent schedules, each firing at its configured Start Second. The date cycle runs once per minute. The weather cycle runs at the configured Weather Display Frequency: Every Minute (the default), every 2, 3, 5, 10, 15, 20, or 30 minutes, or Hourly. Every interval divides evenly into an hour, so the cycle lands on predictable minutes — Hourly fires at minute :00, Every 30 Minutes at :00 and :30, and so on.</w:t>
       </w:r>
     </w:p>
     <w:p>
@@ -19202,7 +19202,7 @@
           <w:rFonts w:ascii="Arial" w:hAnsi="Arial"/>
           <w:sz w:val="22"/>
         </w:rPr>
-        <w:t>The firmware can also be updated from the web settings page, without using the button. On the System page, press Update Firmware. The settings form is replaced by a status message while the clock checks the firmware server. When the check completes, the result is shown — either confirmation that the firmware is already current (with its version number) or a brief error — and the page then returns to the home screen automatically. If a newer version is available, it is downloaded and installed and the clock reboots into it. The tubes show the same update status described below regardless of whether the update is started from the button or the web page.</w:t>
+        <w:t>The firmware can also be updated from the web settings page, without using the button. On the System page, press Update Firmware. The settings form is replaced by a status message while the clock checks the firmware server. If the firmware is already current, the message says so (with the version number) and the page returns to the home screen automatically. If a newer version is available, the message changes to “updating to v&lt;new version&gt;” and stays on screen while the clock downloads, installs, and reboots; once the clock is back up, the page returns to the home screen on its own. If the update fails, the clock reboots unchanged and the page also returns home — check the tubes for the error code below. The tubes show the same update status described below regardless of whether the update is started from the button or the web page.</w:t>
       </w:r>
     </w:p>
     <w:p>
@@ -19235,7 +19235,7 @@
           <w:rFonts w:ascii="Arial" w:hAnsi="Arial"/>
           <w:sz w:val="22"/>
         </w:rPr>
-        <w:t>All OTA status appears on the leftmost two tubes (NX1-NX2). All other tubes are blank during the update.</w:t>
+        <w:t>All OTA status appears on the leftmost tubes: download progress uses NX1–NX3, error codes use NX1–NX2. All other tubes are blank during the update.</w:t>
       </w:r>
     </w:p>
     <w:tbl>
@@ -19357,7 +19357,7 @@
                 <w:szCs w:val="22"/>
                 <w:lang w:val="en-US" w:eastAsia="en-US" w:bidi="ar-SA"/>
               </w:rPr>
-              <w:t>88</w:t>
+              <w:t>All tubes blank</w:t>
             </w:r>
           </w:p>
         </w:tc>
@@ -19388,7 +19388,7 @@
                 <w:szCs w:val="22"/>
                 <w:lang w:val="en-US" w:eastAsia="en-US" w:bidi="ar-SA"/>
               </w:rPr>
-              <w:t>Connecting to WiFi and the firmware server</w:t>
+              <w:t>Checking the firmware server for a new version</w:t>
             </w:r>
           </w:p>
         </w:tc>
@@ -19422,7 +19422,7 @@
                 <w:szCs w:val="22"/>
                 <w:lang w:val="en-US" w:eastAsia="en-US" w:bidi="ar-SA"/>
               </w:rPr>
-              <w:t>Version number (e.g., 1 0 7)</w:t>
+              <w:t>Version number (e.g., 2 4 3)</w:t>
             </w:r>
           </w:p>
         </w:tc>
@@ -19453,7 +19453,7 @@
                 <w:szCs w:val="22"/>
                 <w:lang w:val="en-US" w:eastAsia="en-US" w:bidi="ar-SA"/>
               </w:rPr>
-              <w:t>Firmware is already current. Displayed for 3 seconds, then returns to normal.</w:t>
+              <w:t>Firmware is already current. Displayed for 5 seconds, then the clock returns to normal.</w:t>
             </w:r>
           </w:p>
         </w:tc>
@@ -19487,7 +19487,7 @@
                 <w:szCs w:val="22"/>
                 <w:lang w:val="en-US" w:eastAsia="en-US" w:bidi="ar-SA"/>
               </w:rPr>
-              <w:t>NX1 counts 0–9</w:t>
+              <w:t>0</w:t>
             </w:r>
           </w:p>
         </w:tc>
@@ -19518,7 +19518,7 @@
                 <w:szCs w:val="22"/>
                 <w:lang w:val="en-US" w:eastAsia="en-US" w:bidi="ar-SA"/>
               </w:rPr>
-              <w:t>Downloading and flashing new firmware (cycling counter)</w:t>
+              <w:t>New version found — the download is about to begin</w:t>
             </w:r>
           </w:p>
         </w:tc>
@@ -19552,7 +19552,7 @@
                 <w:szCs w:val="22"/>
                 <w:lang w:val="en-US" w:eastAsia="en-US" w:bidi="ar-SA"/>
               </w:rPr>
-              <w:t>10</w:t>
+              <w:t>0–100</w:t>
             </w:r>
           </w:p>
         </w:tc>
@@ -19583,7 +19583,7 @@
                 <w:szCs w:val="22"/>
                 <w:lang w:val="en-US" w:eastAsia="en-US" w:bidi="ar-SA"/>
               </w:rPr>
-              <w:t>Update successful. Reboots automatically after 3 seconds.</w:t>
+              <w:t>Downloading and installing (percent complete). 100 holds for 5 seconds, then the clock reboots into the new firmware.</w:t>
             </w:r>
           </w:p>
         </w:tc>
@@ -19628,7 +19628,7 @@
           <w:rFonts w:ascii="Arial" w:hAnsi="Arial"/>
           <w:sz w:val="22"/>
         </w:rPr>
-        <w:t>If the update fails, NX1-NX2 display a two-digit error code, then the clock reboots after 3 seconds:</w:t>
+        <w:t>If the update fails, NX1-NX2 display a two-digit error code, then the clock reboots after a few seconds:</w:t>
       </w:r>
     </w:p>
     <w:tbl>

</xml_diff>

<commit_message>
Zev-7 operator manual: document Colon LED Brightness (numitron models)
Section 2 (Numitron Variants): the colon-indicators bullet now explains the
Colon LED Brightness control -- that it exists because LEDs read much brighter
than the filament tubes, that it is a relative trim (the colons still follow
Nixie Brightness and the light sensor), and that the default is 3.

Section 7 (Available Controls): new bullet for Colon LED Brightness (0-10,
numitron models only), alongside the existing RGB LED Brightness entry.
</commit_message>
<xml_diff>
--- a/Zev-7 Operator Manual.docx
+++ b/Zev-7 Operator Manual.docx
@@ -2738,7 +2738,7 @@
         <w:pStyle w:val="ListBullet"/>
       </w:pPr>
       <w:r>
-        <w:t>Colon indicators: the colon separators are LEDs rather than neon lamps, but every colon (neon) display pattern in Section 11 works identically.</w:t>
+        <w:t>Colon indicators: the colon separators are LEDs rather than neon lamps, but every colon (neon) display pattern in Section 11 works identically. Because LEDs read much brighter than the filament tubes, a Colon LED Brightness control (0–10) is provided on both the AP Settings form and the live form. It is a trim, not an absolute level: the colons still follow the Nixie Brightness setting and the light sensor, and this control only sets how bright they sit against the tubes. The default is 3. Raise it if the colons look too dim at low display brightness, lower it if they overpower the tubes.</w:t>
       </w:r>
     </w:p>
     <w:p>
@@ -12366,6 +12366,23 @@
           <w:sz w:val="22"/>
         </w:rPr>
         <w:t>RGB LED Brightness (0–9)</w:t>
+      </w:r>
+    </w:p>
+    <w:p>
+      <w:pPr>
+        <w:pStyle w:val="ListBullet"/>
+        <w:numPr>
+          <w:ilvl w:val="0"/>
+          <w:numId w:val="1"/>
+        </w:numPr>
+        <w:rPr/>
+      </w:pPr>
+      <w:r>
+        <w:rPr>
+          <w:rFonts w:ascii="Arial" w:hAnsi="Arial"/>
+          <w:sz w:val="22"/>
+        </w:rPr>
+        <w:t>Colon LED Brightness (0–10, numitron models only)</w:t>
       </w:r>
     </w:p>
     <w:p>

</xml_diff>

<commit_message>
Zev-7 Operator Manual: sunrise/sunset, automatic updates, rollback; fix factory-reset and Custom-effect errors
</commit_message>
<xml_diff>
--- a/Zev-7 Operator Manual.docx
+++ b/Zev-7 Operator Manual.docx
@@ -107,7 +107,7 @@
           <w:color w:val="000000"/>
           <w:sz w:val="24"/>
         </w:rPr>
-        <w:t>July 2026</w:t>
+        <w:t>August 2026</w:t>
       </w:r>
     </w:p>
     <w:p>
@@ -12795,6 +12795,30 @@
       </w:r>
     </w:p>
     <w:p>
+      <w:pPr/>
+      <w:r>
+        <w:t>Sunrise and sunset. Instead of a clock time, either end of a rule's time range can be anchored to today's sunrise or sunset, so a seasonal rule keeps following the sky instead of needing an edit twice a year. t=18:00-7:00 is right in December and two hours wrong in June; t=sunset-sunrise is right all year. Both ends may be anchors, and anchors mix freely with clock times: t=sunset-sunrise, t=sunrise-sunset, t=sunset-23:00, t=23:00-sunrise. Everything else about the rule is unchanged - day filters, dark, noap and the full field list all work the same way.</w:t>
+      </w:r>
+    </w:p>
+    <w:p>
+      <w:pPr/>
+      <w:r>
+        <w:t>Offsets. An anchor can be shifted by writing + or - followed by a number and a unit: m for minutes, h for hours, up to 12 hours either way. For example t=sunset-30m-23:00 starts 30 minutes before sunset and runs to 23:00, and t=sunrise+1h-sunset-1h covers only the solidly-daylight hours. The unit is required. A bare number after the keyword is read as a time, not an offset - t=sunset-0700 means "sunset until 07:00" - so an offset without its unit is rejected, with a message showing the corrected text.</w:t>
+      </w:r>
+    </w:p>
+    <w:p>
+      <w:pPr/>
+      <w:r>
+        <w:t>Location. Sunrise and sunset depend on where the clock is, so set Latitude and Longitude on the System page of the live settings form before using these rules. A map above the two fields lets you tap your location rather than typing it; it starts locked, so uncheck Lock Map first. The map needs an internet connection and is only available on the live form, not the initial AP setup form - the two text fields work either way. A sunrise or sunset rule entered with no location set is refused rather than silently ignored, and clearing the location warns that any such rules are paused.</w:t>
+      </w:r>
+    </w:p>
+    <w:p>
+      <w:pPr/>
+      <w:r>
+        <w:t>How the times are found. The clock calculates sunrise and sunset itself, from your latitude, longitude and the date - there is no internet lookup and nothing to subscribe to. It uses the standard NOAA sunrise equation: from the number of days since the year 2000 it finds where the Earth is in its orbit, corrects for the orbit being an ellipse rather than a circle, and from that gets the sun's position for the day - the moment of local solar noon and how far north or south of the equator the sun stands. Combining that with your latitude gives how long the sun takes to travel from overhead to the horizon, which is subtracted from solar noon for sunrise and added for sunset. The horizon is taken as 0.833 degrees below level, which allows for the width of the sun's disc and the way the atmosphere bends its light - the sun has really already set when you watch it touch the horizon. The result is accurate to well under a minute. Times are recalculated each day at midnight, and immediately whenever you change a rule or the location. At extreme latitudes, on days when the sun never rises or never sets, sunrise and sunset rules simply do not fire.</w:t>
+      </w:r>
+    </w:p>
+    <w:p>
       <w:pPr>
         <w:spacing w:before="0" w:after="80"/>
         <w:rPr/>
@@ -12804,7 +12828,7 @@
           <w:rFonts w:ascii="Arial" w:hAnsi="Arial"/>
           <w:sz w:val="22"/>
         </w:rPr>
-        <w:t>Note: lc is honored only when le=12 (Custom). Using lc by itself auto-promotes the rule to effect 12. Pairing lc with any other le value is rejected by the rule editor.</w:t>
+        <w:t>Note: lc is honored only when le=13 (Custom). Using lc by itself auto-promotes the rule to effect 13. Pairing lc with any other le value is rejected by the rule editor. (Effect numbering shifted when Chroma Digit was added: Cycle is 12 and Custom is 13.)</w:t>
       </w:r>
     </w:p>
     <w:p>
@@ -20038,7 +20062,7 @@
           <w:rFonts w:ascii="Arial" w:hAnsi="Arial"/>
           <w:sz w:val="22"/>
         </w:rPr>
-        <w:t>Major version change (e.g., 1.x.x to 2.x.x): All settings are reset to factory defaults after the update.</w:t>
+        <w:t>Firmware updates never reset your settings. Every update - patch, minor or major - preserves your configuration and WiFi credentials. (Earlier firmware wiped settings on a major version change; that behavior was removed.)</w:t>
       </w:r>
     </w:p>
     <w:p>
@@ -20067,7 +20091,233 @@
           <w:rFonts w:ascii="Arial" w:hAnsi="Arial"/>
           <w:sz w:val="22"/>
         </w:rPr>
-        <w:t>Minor or patch change (e.g., 1.0.6 to 1.0.7): All settings are preserved.</w:t>
+        <w:t>Settings are returned to factory defaults only by the deliberate reset in Section 17, or on the very first start-up of a new clock.</w:t>
+      </w:r>
+    </w:p>
+    <w:p>
+      <w:pPr>
+        <w:pStyle w:val="Heading2"/>
+        <w:spacing w:before="0" w:after="80"/>
+        <w:rPr/>
+        <w:sectPr>
+          <w:headerReference w:type="even" r:id="rId104"/>
+          <w:headerReference w:type="default" r:id="rId105"/>
+          <w:headerReference w:type="first" r:id="rId106"/>
+          <w:footerReference w:type="even" r:id="rId107"/>
+          <w:footerReference w:type="default" r:id="rId108"/>
+          <w:footerReference w:type="first" r:id="rId109"/>
+          <w:type w:val="nextPage"/>
+          <w:pgSz w:w="12240" w:h="15840"/>
+          <w:pgMar w:left="1417" w:right="1417" w:gutter="0" w:header="720" w:top="1134" w:footer="720" w:bottom="1134"/>
+          <w:pgNumType w:start="1" w:fmt="decimal"/>
+          <w:formProt w:val="false"/>
+          <w:textDirection w:val="lrTb"/>
+          <w:docGrid w:type="default" w:linePitch="360" w:charSpace="0"/>
+        </w:sectPr>
+      </w:pPr>
+      <w:r>
+        <w:rPr>
+          <w:rFonts w:ascii="Arial" w:hAnsi="Arial"/>
+          <w:sz w:val="22"/>
+        </w:rPr>
+        <w:t>Automatic Updates</w:t>
+      </w:r>
+    </w:p>
+    <w:p>
+      <w:pPr>
+        <w:spacing w:before="0" w:after="80"/>
+        <w:rPr/>
+        <w:sectPr>
+          <w:headerReference w:type="even" r:id="rId104"/>
+          <w:headerReference w:type="default" r:id="rId105"/>
+          <w:headerReference w:type="first" r:id="rId106"/>
+          <w:footerReference w:type="even" r:id="rId107"/>
+          <w:footerReference w:type="default" r:id="rId108"/>
+          <w:footerReference w:type="first" r:id="rId109"/>
+          <w:type w:val="nextPage"/>
+          <w:pgSz w:w="12240" w:h="15840"/>
+          <w:pgMar w:left="1417" w:right="1417" w:gutter="0" w:header="720" w:top="1134" w:footer="720" w:bottom="1134"/>
+          <w:pgNumType w:start="1" w:fmt="decimal"/>
+          <w:formProt w:val="false"/>
+          <w:textDirection w:val="lrTb"/>
+          <w:docGrid w:type="default" w:linePitch="360" w:charSpace="0"/>
+        </w:sectPr>
+      </w:pPr>
+      <w:r>
+        <w:rPr>
+          <w:rFonts w:ascii="Arial" w:hAnsi="Arial"/>
+          <w:sz w:val="22"/>
+        </w:rPr>
+        <w:t>The clock can keep itself up to date. Automatic Updates, on the System page of the live settings form, is on by default. Once a week, at a time between 2:30 and 3:30 in the morning that is fixed for your particular clock, it checks whether a new release has been published and approved, and installs it if so.</w:t>
+      </w:r>
+    </w:p>
+    <w:p>
+      <w:pPr>
+        <w:spacing w:before="0" w:after="80"/>
+        <w:rPr/>
+        <w:sectPr>
+          <w:headerReference w:type="even" r:id="rId104"/>
+          <w:headerReference w:type="default" r:id="rId105"/>
+          <w:headerReference w:type="first" r:id="rId106"/>
+          <w:footerReference w:type="even" r:id="rId107"/>
+          <w:footerReference w:type="default" r:id="rId108"/>
+          <w:footerReference w:type="first" r:id="rId109"/>
+          <w:type w:val="nextPage"/>
+          <w:pgSz w:w="12240" w:h="15840"/>
+          <w:pgMar w:left="1417" w:right="1417" w:gutter="0" w:header="720" w:top="1134" w:footer="720" w:bottom="1134"/>
+          <w:pgNumType w:start="1" w:fmt="decimal"/>
+          <w:formProt w:val="false"/>
+          <w:textDirection w:val="lrTb"/>
+          <w:docGrid w:type="default" w:linePitch="360" w:charSpace="0"/>
+        </w:sectPr>
+      </w:pPr>
+      <w:r>
+        <w:rPr>
+          <w:rFonts w:ascii="Arial" w:hAnsi="Arial"/>
+          <w:sz w:val="22"/>
+        </w:rPr>
+        <w:t>These updates are silent. The display blanks for the download rather than showing progress digits, and the clock restarts without its usual version display or IP scroll - it simply shows the time again a minute or so later, with every setting intact. If anything goes wrong, no matter what, the update is abandoned quietly and retried at the next weekly check; nothing is shown and the clock keeps running the firmware it already had.</w:t>
+      </w:r>
+    </w:p>
+    <w:p>
+      <w:pPr>
+        <w:spacing w:before="0" w:after="80"/>
+        <w:rPr/>
+        <w:sectPr>
+          <w:headerReference w:type="even" r:id="rId104"/>
+          <w:headerReference w:type="default" r:id="rId105"/>
+          <w:headerReference w:type="first" r:id="rId106"/>
+          <w:footerReference w:type="even" r:id="rId107"/>
+          <w:footerReference w:type="default" r:id="rId108"/>
+          <w:footerReference w:type="first" r:id="rId109"/>
+          <w:type w:val="nextPage"/>
+          <w:pgSz w:w="12240" w:h="15840"/>
+          <w:pgMar w:left="1417" w:right="1417" w:gutter="0" w:header="720" w:top="1134" w:footer="720" w:bottom="1134"/>
+          <w:pgNumType w:start="1" w:fmt="decimal"/>
+          <w:formProt w:val="false"/>
+          <w:textDirection w:val="lrTb"/>
+          <w:docGrid w:type="default" w:linePitch="360" w:charSpace="0"/>
+        </w:sectPr>
+      </w:pPr>
+      <w:r>
+        <w:rPr>
+          <w:rFonts w:ascii="Arial" w:hAnsi="Arial"/>
+          <w:sz w:val="22"/>
+        </w:rPr>
+        <w:t>Not every release is installed automatically. A release is only picked up once it has been marked as approved for unattended installation, so a new version can be published for manual updating first and approved later. Turning Automatic Updates off leaves the clock entirely under your control; the Update Firmware button and the SW1 hold both continue to work exactly as described above.</w:t>
+      </w:r>
+    </w:p>
+    <w:p>
+      <w:pPr>
+        <w:pStyle w:val="Heading2"/>
+        <w:spacing w:before="0" w:after="80"/>
+        <w:rPr/>
+        <w:sectPr>
+          <w:headerReference w:type="even" r:id="rId104"/>
+          <w:headerReference w:type="default" r:id="rId105"/>
+          <w:headerReference w:type="first" r:id="rId106"/>
+          <w:footerReference w:type="even" r:id="rId107"/>
+          <w:footerReference w:type="default" r:id="rId108"/>
+          <w:footerReference w:type="first" r:id="rId109"/>
+          <w:type w:val="nextPage"/>
+          <w:pgSz w:w="12240" w:h="15840"/>
+          <w:pgMar w:left="1417" w:right="1417" w:gutter="0" w:header="720" w:top="1134" w:footer="720" w:bottom="1134"/>
+          <w:pgNumType w:start="1" w:fmt="decimal"/>
+          <w:formProt w:val="false"/>
+          <w:textDirection w:val="lrTb"/>
+          <w:docGrid w:type="default" w:linePitch="360" w:charSpace="0"/>
+        </w:sectPr>
+      </w:pPr>
+      <w:r>
+        <w:rPr>
+          <w:rFonts w:ascii="Arial" w:hAnsi="Arial"/>
+          <w:sz w:val="22"/>
+        </w:rPr>
+        <w:t>Automatic Recovery from a Failed Update</w:t>
+      </w:r>
+    </w:p>
+    <w:p>
+      <w:pPr>
+        <w:spacing w:before="0" w:after="80"/>
+        <w:rPr/>
+        <w:sectPr>
+          <w:headerReference w:type="even" r:id="rId104"/>
+          <w:headerReference w:type="default" r:id="rId105"/>
+          <w:headerReference w:type="first" r:id="rId106"/>
+          <w:footerReference w:type="even" r:id="rId107"/>
+          <w:footerReference w:type="default" r:id="rId108"/>
+          <w:footerReference w:type="first" r:id="rId109"/>
+          <w:type w:val="nextPage"/>
+          <w:pgSz w:w="12240" w:h="15840"/>
+          <w:pgMar w:left="1417" w:right="1417" w:gutter="0" w:header="720" w:top="1134" w:footer="720" w:bottom="1134"/>
+          <w:pgNumType w:start="1" w:fmt="decimal"/>
+          <w:formProt w:val="false"/>
+          <w:textDirection w:val="lrTb"/>
+          <w:docGrid w:type="default" w:linePitch="360" w:charSpace="0"/>
+        </w:sectPr>
+      </w:pPr>
+      <w:r>
+        <w:rPr>
+          <w:rFonts w:ascii="Arial" w:hAnsi="Arial"/>
+          <w:sz w:val="22"/>
+        </w:rPr>
+        <w:t>An update that transfers and installs correctly could still, in principle, contain a fault that stops the clock starting up. With updates able to install unattended overnight, that would be the worst possible outcome: a dark clock in the morning, with no display, no settings page and no way to send it new firmware short of connecting it to a computer.</w:t>
+      </w:r>
+    </w:p>
+    <w:p>
+      <w:pPr>
+        <w:spacing w:before="0" w:after="80"/>
+        <w:rPr/>
+        <w:sectPr>
+          <w:headerReference w:type="even" r:id="rId104"/>
+          <w:headerReference w:type="default" r:id="rId105"/>
+          <w:headerReference w:type="first" r:id="rId106"/>
+          <w:footerReference w:type="even" r:id="rId107"/>
+          <w:footerReference w:type="default" r:id="rId108"/>
+          <w:footerReference w:type="first" r:id="rId109"/>
+          <w:type w:val="nextPage"/>
+          <w:pgSz w:w="12240" w:h="15840"/>
+          <w:pgMar w:left="1417" w:right="1417" w:gutter="0" w:header="720" w:top="1134" w:footer="720" w:bottom="1134"/>
+          <w:pgNumType w:start="1" w:fmt="decimal"/>
+          <w:formProt w:val="false"/>
+          <w:textDirection w:val="lrTb"/>
+          <w:docGrid w:type="default" w:linePitch="360" w:charSpace="0"/>
+        </w:sectPr>
+      </w:pPr>
+      <w:r>
+        <w:rPr>
+          <w:rFonts w:ascii="Arial" w:hAnsi="Arial"/>
+          <w:sz w:val="22"/>
+        </w:rPr>
+        <w:t>The clock guards against this by keeping the previous firmware. A newly installed version is treated as provisional and has to prove itself by completing a full, successful start-up - reaching the point where the display is running and the clock is on the network. Only then is it accepted permanently. If it fails or restarts before getting that far, the clock discards it on the next restart and goes back to the firmware it was running before, with all settings intact. There is nothing to do and nothing to press; the clock comes back on its own.</w:t>
+      </w:r>
+    </w:p>
+    <w:p>
+      <w:pPr>
+        <w:spacing w:before="0" w:after="80"/>
+        <w:rPr/>
+        <w:sectPr>
+          <w:headerReference w:type="even" r:id="rId104"/>
+          <w:headerReference w:type="default" r:id="rId105"/>
+          <w:headerReference w:type="first" r:id="rId106"/>
+          <w:footerReference w:type="even" r:id="rId107"/>
+          <w:footerReference w:type="default" r:id="rId108"/>
+          <w:footerReference w:type="first" r:id="rId109"/>
+          <w:type w:val="nextPage"/>
+          <w:pgSz w:w="12240" w:h="15840"/>
+          <w:pgMar w:left="1417" w:right="1417" w:gutter="0" w:header="720" w:top="1134" w:footer="720" w:bottom="1134"/>
+          <w:pgNumType w:start="1" w:fmt="decimal"/>
+          <w:formProt w:val="false"/>
+          <w:textDirection w:val="lrTb"/>
+          <w:docGrid w:type="default" w:linePitch="360" w:charSpace="0"/>
+        </w:sectPr>
+      </w:pPr>
+      <w:r>
+        <w:rPr>
+          <w:rFonts w:ascii="Arial" w:hAnsi="Arial"/>
+          <w:sz w:val="22"/>
+        </w:rPr>
+        <w:t>One consequence is worth knowing. Because the checkpoint comes after the clock joins your WiFi network and sets its time, an update installed while the network is unavailable can be rolled back even though the firmware itself is sound. If an update seems not to have taken effect, check that the clock is reaching your network and run the update again.</w:t>
       </w:r>
     </w:p>
     <w:p>

</xml_diff>

<commit_message>
Zev-7 Operator Manual V5: sun anchors in keyword table + examples, revision table
</commit_message>
<xml_diff>
--- a/Zev-7 Operator Manual.docx
+++ b/Zev-7 Operator Manual.docx
@@ -179,7 +179,7 @@
           </w:tcPr>
           <w:p>
             <w:r>
-              <w:t>V4 — adds the dark rule keyword (rules that apply only while the room is dark), the Weather Display Frequency setting, and improved firmware-update status (the web page shows the update result, and the tubes show each update stage). V3 — adds Tube Healing (cathode recovery), day-of-week rule filters, and off accepted as a value. (V2 replaced Period Overrides with the Rules system and added Zev-7N numitron variants.)</w:t>
+              <w:t>V5 — adds sunrise/sunset rule anchors (a rule's time range can follow the sun, with optional offsets), Latitude and Longitude on the System page with a map picker, and documents Automatic Updates and automatic recovery from a failed update. Corrects the previous statement that a major version change resets settings to factory defaults — firmware updates now always preserve settings — and the Custom LED effect index (12 → 13). V4 — adds the dark rule keyword (rules that apply only while the room is dark), the Weather Display Frequency setting.</w:t>
             </w:r>
           </w:p>
         </w:tc>
@@ -217,7 +217,7 @@
           </w:tcPr>
           <w:p>
             <w:r>
-              <w:t>V4</w:t>
+              <w:t>V5</w:t>
             </w:r>
           </w:p>
         </w:tc>
@@ -13007,7 +13007,7 @@
                 <w:szCs w:val="22"/>
                 <w:lang w:val="en-US" w:eastAsia="en-US" w:bidi="ar-SA"/>
               </w:rPr>
-              <w:t xml:space="preserve">Time range. Specifies when the rule is active. Required in every rule. Format: HH:MM-HH:MM, H-H, HHMM-HHMM, or bare H. End time is exclusive.</w:t>
+              <w:t>Time range. Specifies when the rule is active. Required in every rule. Format: HH:MM-HH:MM, H-H, HHMM-HHMM, or bare H. End time is exclusive, and a range may cross midnight. Either end may instead be sunrise or sunset, optionally offset by minutes or hours (sunset-30m, sunrise+1h) — see Section 8. Sun anchors need Latitude and Longitude set on the System page.</w:t>
             </w:r>
           </w:p>
         </w:tc>
@@ -13267,7 +13267,7 @@
                 <w:szCs w:val="22"/>
                 <w:lang w:val="en-US" w:eastAsia="en-US" w:bidi="ar-SA"/>
               </w:rPr>
-              <w:t xml:space="preserve">Digit LED effect (0-12). See Section 9 for the effect catalog. Index 12 (Custom) renders a solid color from the lc value below; any other index runs the named animation.</w:t>
+              <w:t>Digit LED effect (0-13). See Section 9 for the effect catalog. Index 13 (Custom) renders a solid color from the lc value below; index 12 (Cycle) walks the effect order list; any other index runs the named animation.</w:t>
             </w:r>
           </w:p>
         </w:tc>
@@ -13332,7 +13332,7 @@
                 <w:szCs w:val="22"/>
                 <w:lang w:val="en-US" w:eastAsia="en-US" w:bidi="ar-SA"/>
               </w:rPr>
-              <w:t xml:space="preserve">Digit LED solid color. Hex (#RRGGBB) or color name (red, green, blue, white, yellow, cyan, magenta, orange, purple, pink, black). Honored only when le=12 (Custom). Using lc by itself auto-promotes the rule to effect 12; pairing lc with any other le value is rejected by the rule editor.</w:t>
+              <w:t>Digit LED solid color. Hex (#RRGGBB) or color name (red, green, blue, white, yellow, cyan, magenta, orange, purple, pink, black). Honored only when le=13 (Custom). Using lc by itself auto-promotes the rule to effect 13; pairing lc with any other le value is rejected by the rule editor.</w:t>
             </w:r>
           </w:p>
         </w:tc>
@@ -13859,6 +13859,28 @@
           <w:p>
             <w:r>
               <w:t>On any numeric field, off may be typed in place of 0 — for example nb=off, lb=off, ub=off, or heal=off. This is separate from the bare off shortcut above, which sets nb, lb, and ub together.</w:t>
+            </w:r>
+          </w:p>
+        </w:tc>
+      </w:tr>
+      <w:tr>
+        <w:tc>
+          <w:tcPr>
+            <w:tcW w:type="dxa" w:w="2400"/>
+          </w:tcPr>
+          <w:p>
+            <w:r>
+              <w:t>sunrise / sunset</w:t>
+            </w:r>
+          </w:p>
+        </w:tc>
+        <w:tc>
+          <w:tcPr>
+            <w:tcW w:type="dxa" w:w="7006"/>
+          </w:tcPr>
+          <w:p>
+            <w:r>
+              <w:t>Used in place of a clock time at either end of the time range, so the rule follows the season. Add an offset with + or - plus a number and a unit — m for minutes, h for hours, up to 12 hours (t=sunset-30m-23:00). The unit is required: a bare number is read as a time, so t=sunset-0700 means "sunset until 07:00". Requires Latitude and Longitude on the System page.</w:t>
             </w:r>
           </w:p>
         </w:tc>
@@ -15446,6 +15468,102 @@
           <w:p>
             <w:r>
               <w:t>Follows the room instead of the clock: whenever the room is dark, tube brightness drops to 1 and the digit LEDs turn off. Everything returns a few seconds after the lights come on.</w:t>
+            </w:r>
+          </w:p>
+        </w:tc>
+      </w:tr>
+      <w:tr>
+        <w:tc>
+          <w:tcPr>
+            <w:tcW w:type="dxa" w:w="4703"/>
+          </w:tcPr>
+          <w:p>
+            <w:r>
+              <w:t>t=sunset-sunrise, nb=3, lb=2</w:t>
+            </w:r>
+          </w:p>
+        </w:tc>
+        <w:tc>
+          <w:tcPr>
+            <w:tcW w:type="dxa" w:w="1567"/>
+          </w:tcPr>
+          <w:p>
+            <w:r>
+              <w:t>Dusk to dawn</w:t>
+            </w:r>
+          </w:p>
+        </w:tc>
+        <w:tc>
+          <w:tcPr>
+            <w:tcW w:type="dxa" w:w="3136"/>
+          </w:tcPr>
+          <w:p>
+            <w:r>
+              <w:t>Dims the tubes to 3 and the LEDs to 2 from sunset until sunrise, following the season automatically — no need to adjust the times as the nights get longer or shorter.</w:t>
+            </w:r>
+          </w:p>
+        </w:tc>
+      </w:tr>
+      <w:tr>
+        <w:tc>
+          <w:tcPr>
+            <w:tcW w:type="dxa" w:w="4703"/>
+          </w:tcPr>
+          <w:p>
+            <w:r>
+              <w:t>t=sunset-30m-23:00, nb=6, ub=3</w:t>
+            </w:r>
+          </w:p>
+        </w:tc>
+        <w:tc>
+          <w:tcPr>
+            <w:tcW w:type="dxa" w:w="1567"/>
+          </w:tcPr>
+          <w:p>
+            <w:r>
+              <w:t>Evening, sun-anchored start</w:t>
+            </w:r>
+          </w:p>
+        </w:tc>
+        <w:tc>
+          <w:tcPr>
+            <w:tcW w:type="dxa" w:w="3136"/>
+          </w:tcPr>
+          <w:p>
+            <w:r>
+              <w:t>Eases the display down half an hour before sunset and holds that until a fixed 23:00 bedtime. Mixes a sun anchor with an ordinary clock time.</w:t>
+            </w:r>
+          </w:p>
+        </w:tc>
+      </w:tr>
+      <w:tr>
+        <w:tc>
+          <w:tcPr>
+            <w:tcW w:type="dxa" w:w="4703"/>
+          </w:tcPr>
+          <w:p>
+            <w:r>
+              <w:t>t=sunrise+1h-sunset-1h, nb=9</w:t>
+            </w:r>
+          </w:p>
+        </w:tc>
+        <w:tc>
+          <w:tcPr>
+            <w:tcW w:type="dxa" w:w="1567"/>
+          </w:tcPr>
+          <w:p>
+            <w:r>
+              <w:t>Full daylight only</w:t>
+            </w:r>
+          </w:p>
+        </w:tc>
+        <w:tc>
+          <w:tcPr>
+            <w:tcW w:type="dxa" w:w="3136"/>
+          </w:tcPr>
+          <w:p>
+            <w:r>
+              <w:t>Runs the tubes at full brightness only during solidly-daylight hours, avoiding the dim half-hour at each end of the day.</w:t>
             </w:r>
           </w:p>
         </w:tc>

</xml_diff>

<commit_message>
Zev-7 Operator Manual: consistent body font (Arial throughout, no Calibri fallthrough)
</commit_message>
<xml_diff>
--- a/Zev-7 Operator Manual.docx
+++ b/Zev-7 Operator Manual.docx
@@ -9,7 +9,10 @@
         <w:rPr/>
       </w:pPr>
       <w:r>
-        <w:rPr/>
+        <w:rPr>
+          <w:rFonts w:ascii="Arial" w:hAnsi="Arial"/>
+          <w:sz w:val="22"/>
+        </w:rPr>
       </w:r>
     </w:p>
     <w:p>
@@ -22,7 +25,10 @@
         <w:rPr/>
       </w:pPr>
       <w:r>
-        <w:rPr/>
+        <w:rPr>
+          <w:rFonts w:ascii="Arial" w:hAnsi="Arial"/>
+          <w:sz w:val="22"/>
+        </w:rPr>
       </w:r>
     </w:p>
     <w:p>
@@ -89,7 +95,10 @@
         <w:rPr/>
       </w:pPr>
       <w:r>
-        <w:rPr/>
+        <w:rPr>
+          <w:rFonts w:ascii="Arial" w:hAnsi="Arial"/>
+          <w:sz w:val="22"/>
+        </w:rPr>
       </w:r>
     </w:p>
     <w:p>
@@ -179,7 +188,11 @@
           </w:tcPr>
           <w:p>
             <w:r>
-              <w:t>V5 — adds sunrise/sunset rule anchors (a rule's time range can follow the sun, with optional offsets), Latitude and Longitude on the System page with a map picker, and documents Automatic Updates and automatic recovery from a failed update. Corrects the previous statement that a major version change resets settings to factory defaults — firmware updates now always preserve settings — and the Custom LED effect index (12 → 13). V4 — adds the dark rule keyword (rules that apply only while the room is dark), the Weather Display Frequency setting.</w:t>
+              <w:rPr>
+                <w:rFonts w:ascii="Arial" w:hAnsi="Arial"/>
+                <w:sz w:val="20"/>
+              </w:rPr>
+              <w:t>V5 — adds sunrise/sunset rule anchors (a rule's time range can follow the sun, with optional offsets), Latitude and Longitude on the System page with a map picker, and documents Automatic Updates and automatic recovery from a failed update. Corrects the previous statement that a major version change resets settings to factory defaults — firmware updates now always preserve settings — and the Custom LED effect index (12 to 13). V4 — adds the dark rule keyword (rules that apply only while the room is dark), the Weather Display Frequency setting.</w:t>
             </w:r>
           </w:p>
         </w:tc>
@@ -217,6 +230,10 @@
           </w:tcPr>
           <w:p>
             <w:r>
+              <w:rPr>
+                <w:rFonts w:ascii="Arial" w:hAnsi="Arial"/>
+                <w:sz w:val="20"/>
+              </w:rPr>
               <w:t>V5</w:t>
             </w:r>
           </w:p>
@@ -284,7 +301,10 @@
         <w:rPr/>
       </w:pPr>
       <w:r>
-        <w:rPr/>
+        <w:rPr>
+          <w:rFonts w:ascii="Arial" w:hAnsi="Arial"/>
+          <w:sz w:val="22"/>
+        </w:rPr>
       </w:r>
     </w:p>
     <w:p>
@@ -314,7 +334,10 @@
         <w:rPr/>
       </w:pPr>
       <w:r>
-        <w:rPr/>
+        <w:rPr>
+          <w:rFonts w:ascii="Arial" w:hAnsi="Arial"/>
+          <w:sz w:val="22"/>
+        </w:rPr>
       </w:r>
     </w:p>
     <w:p>
@@ -324,7 +347,10 @@
         <w:rPr/>
       </w:pPr>
       <w:r>
-        <w:rPr/>
+        <w:rPr>
+          <w:rFonts w:ascii="Arial" w:hAnsi="Arial"/>
+          <w:sz w:val="22"/>
+        </w:rPr>
       </w:r>
     </w:p>
     <w:p>
@@ -998,7 +1024,10 @@
         <w:rPr/>
       </w:pPr>
       <w:r>
-        <w:rPr/>
+        <w:rPr>
+          <w:rFonts w:ascii="Arial" w:hAnsi="Arial"/>
+          <w:sz w:val="22"/>
+        </w:rPr>
       </w:r>
     </w:p>
     <w:p>
@@ -1028,7 +1057,10 @@
         <w:rPr/>
       </w:pPr>
       <w:r>
-        <w:rPr/>
+        <w:rPr>
+          <w:rFonts w:ascii="Arial" w:hAnsi="Arial"/>
+          <w:sz w:val="22"/>
+        </w:rPr>
       </w:r>
     </w:p>
     <w:p>
@@ -1038,7 +1070,10 @@
         <w:rPr/>
       </w:pPr>
       <w:r>
-        <w:rPr/>
+        <w:rPr>
+          <w:rFonts w:ascii="Arial" w:hAnsi="Arial"/>
+          <w:sz w:val="22"/>
+        </w:rPr>
       </w:r>
     </w:p>
     <w:p>
@@ -1145,7 +1180,9 @@
       </w:r>
       <w:r>
         <w:rPr>
+          <w:rFonts w:ascii="Arial" w:hAnsi="Arial"/>
           <w:color w:val="C25600"/>
+          <w:sz w:val="22"/>
         </w:rPr>
         <w:t xml:space="preserve"> </w:t>
       </w:r>
@@ -1155,7 +1192,7 @@
           <w:b w:val="false"/>
           <w:bCs w:val="false"/>
           <w:color w:val="000000"/>
-          <w:sz w:val="26"/>
+          <w:sz w:val="22"/>
         </w:rPr>
         <w:t xml:space="preserve">If </w:t>
       </w:r>
@@ -1167,7 +1204,7 @@
           <w:i w:val="false"/>
           <w:iCs w:val="false"/>
           <w:color w:val="000000"/>
-          <w:sz w:val="26"/>
+          <w:sz w:val="22"/>
         </w:rPr>
         <w:t>the</w:t>
       </w:r>
@@ -1177,7 +1214,7 @@
           <w:b w:val="false"/>
           <w:bCs w:val="false"/>
           <w:color w:val="000000"/>
-          <w:sz w:val="26"/>
+          <w:sz w:val="22"/>
         </w:rPr>
         <w:t xml:space="preserve"> display shows 00, the processor must be returned to the manufacturer for reprogramming.</w:t>
       </w:r>
@@ -1783,7 +1820,10 @@
         <w:rPr/>
       </w:pPr>
       <w:r>
-        <w:rPr/>
+        <w:rPr>
+          <w:rFonts w:ascii="Arial" w:hAnsi="Arial"/>
+          <w:sz w:val="22"/>
+        </w:rPr>
       </w:r>
     </w:p>
     <w:p>
@@ -1917,7 +1957,10 @@
         <w:rPr/>
       </w:pPr>
       <w:r>
-        <w:rPr/>
+        <w:rPr>
+          <w:rFonts w:ascii="Arial" w:hAnsi="Arial"/>
+          <w:sz w:val="22"/>
+        </w:rPr>
       </w:r>
     </w:p>
     <w:p>
@@ -1947,7 +1990,10 @@
         <w:rPr/>
       </w:pPr>
       <w:r>
-        <w:rPr/>
+        <w:rPr>
+          <w:rFonts w:ascii="Arial" w:hAnsi="Arial"/>
+          <w:sz w:val="22"/>
+        </w:rPr>
       </w:r>
     </w:p>
     <w:p>
@@ -1957,12 +2003,19 @@
         <w:rPr/>
       </w:pPr>
       <w:r>
-        <w:rPr/>
+        <w:rPr>
+          <w:rFonts w:ascii="Arial" w:hAnsi="Arial"/>
+          <w:sz w:val="22"/>
+        </w:rPr>
       </w:r>
     </w:p>
     <w:p>
       <w:pPr/>
       <w:r>
+        <w:rPr>
+          <w:rFonts w:ascii="Arial" w:hAnsi="Arial"/>
+          <w:sz w:val="22"/>
+        </w:rPr>
         <w:t>The Zev-7N is a numitron-tube variant of the Zev-7. It is functionally identical to the Zev-7 and runs the same firmware, but its seven displays are DR2010 numitron filament tubes driven by TLC59116 constant-current drivers rather than high-voltage Nixie tubes. Because numitron filaments do not suffer cathode poisoning, the Zev-7N has no anti-poison feature and no high-voltage circuitry. See Section 2 for the full list of differences.</w:t>
       </w:r>
     </w:p>
@@ -2037,7 +2090,10 @@
         <w:rPr/>
       </w:pPr>
       <w:r>
-        <w:rPr/>
+        <w:rPr>
+          <w:rFonts w:ascii="Arial" w:hAnsi="Arial"/>
+          <w:sz w:val="22"/>
+        </w:rPr>
       </w:r>
     </w:p>
     <w:p>
@@ -2067,7 +2123,10 @@
         <w:rPr/>
       </w:pPr>
       <w:r>
-        <w:rPr/>
+        <w:rPr>
+          <w:rFonts w:ascii="Arial" w:hAnsi="Arial"/>
+          <w:sz w:val="22"/>
+        </w:rPr>
       </w:r>
     </w:p>
     <w:p>
@@ -2077,7 +2136,10 @@
         <w:rPr/>
       </w:pPr>
       <w:r>
-        <w:rPr/>
+        <w:rPr>
+          <w:rFonts w:ascii="Arial" w:hAnsi="Arial"/>
+          <w:sz w:val="22"/>
+        </w:rPr>
       </w:r>
     </w:p>
     <w:p>
@@ -2447,8 +2509,9 @@
             </w:pPr>
             <w:r>
               <w:rPr>
-                <w:rFonts w:eastAsia="ＭＳ 明朝" w:cs=""/>
-                <w:kern w:val="0"/>
+                <w:rFonts w:eastAsia="ＭＳ 明朝" w:cs="" w:ascii="Arial" w:hAnsi="Arial"/>
+                <w:kern w:val="0"/>
+                <w:sz w:val="20"/>
                 <w:szCs w:val="22"/>
                 <w:lang w:val="en-US" w:eastAsia="en-US" w:bidi="ar-SA"/>
               </w:rPr>
@@ -2479,8 +2542,9 @@
             </w:pPr>
             <w:r>
               <w:rPr>
-                <w:rFonts w:eastAsia="ＭＳ 明朝" w:cs=""/>
-                <w:kern w:val="0"/>
+                <w:rFonts w:eastAsia="ＭＳ 明朝" w:cs="" w:ascii="Arial" w:hAnsi="Arial"/>
+                <w:kern w:val="0"/>
+                <w:sz w:val="20"/>
                 <w:szCs w:val="22"/>
                 <w:lang w:val="en-US" w:eastAsia="en-US" w:bidi="ar-SA"/>
               </w:rPr>
@@ -2511,8 +2575,9 @@
             </w:pPr>
             <w:r>
               <w:rPr>
-                <w:rFonts w:eastAsia="ＭＳ 明朝" w:cs=""/>
-                <w:kern w:val="0"/>
+                <w:rFonts w:eastAsia="ＭＳ 明朝" w:cs="" w:ascii="Arial" w:hAnsi="Arial"/>
+                <w:kern w:val="0"/>
+                <w:sz w:val="20"/>
                 <w:szCs w:val="22"/>
                 <w:lang w:val="en-US" w:eastAsia="en-US" w:bidi="ar-SA"/>
               </w:rPr>
@@ -2528,6 +2593,10 @@
           </w:tcPr>
           <w:p>
             <w:r>
+              <w:rPr>
+                <w:rFonts w:ascii="Arial" w:hAnsi="Arial"/>
+                <w:sz w:val="20"/>
+              </w:rPr>
               <w:t>Zev-7N (numitron)</w:t>
             </w:r>
           </w:p>
@@ -2538,6 +2607,10 @@
           </w:tcPr>
           <w:p>
             <w:r>
+              <w:rPr>
+                <w:rFonts w:ascii="Arial" w:hAnsi="Arial"/>
+                <w:sz w:val="20"/>
+              </w:rPr>
               <w:t>Zev-7N</w:t>
             </w:r>
           </w:p>
@@ -2548,6 +2621,10 @@
           </w:tcPr>
           <w:p>
             <w:r>
+              <w:rPr>
+                <w:rFonts w:ascii="Arial" w:hAnsi="Arial"/>
+                <w:sz w:val="20"/>
+              </w:rPr>
               <w:t>4–20 RGB LEDs (color, brightness, count, and chip type configurable)</w:t>
             </w:r>
           </w:p>
@@ -2560,6 +2637,10 @@
           </w:tcPr>
           <w:p>
             <w:r>
+              <w:rPr>
+                <w:rFonts w:ascii="Arial" w:hAnsi="Arial"/>
+                <w:sz w:val="20"/>
+              </w:rPr>
               <w:t>Zev-7N Mini (numitron)</w:t>
             </w:r>
           </w:p>
@@ -2570,6 +2651,10 @@
           </w:tcPr>
           <w:p>
             <w:r>
+              <w:rPr>
+                <w:rFonts w:ascii="Arial" w:hAnsi="Arial"/>
+                <w:sz w:val="20"/>
+              </w:rPr>
               <w:t>Zev-7NM</w:t>
             </w:r>
           </w:p>
@@ -2580,6 +2665,10 @@
           </w:tcPr>
           <w:p>
             <w:r>
+              <w:rPr>
+                <w:rFonts w:ascii="Arial" w:hAnsi="Arial"/>
+                <w:sz w:val="20"/>
+              </w:rPr>
               <w:t>None</w:t>
             </w:r>
           </w:p>
@@ -2592,7 +2681,10 @@
         <w:rPr/>
       </w:pPr>
       <w:r>
-        <w:rPr/>
+        <w:rPr>
+          <w:rFonts w:ascii="Arial" w:hAnsi="Arial"/>
+          <w:sz w:val="22"/>
+        </w:rPr>
       </w:r>
     </w:p>
     <w:p>
@@ -2655,7 +2747,7 @@
           <w:b w:val="false"/>
           <w:bCs w:val="false"/>
           <w:color w:val="000000"/>
-          <w:sz w:val="26"/>
+          <w:sz w:val="22"/>
         </w:rPr>
         <w:t xml:space="preserve">If </w:t>
       </w:r>
@@ -2667,7 +2759,7 @@
           <w:i w:val="false"/>
           <w:iCs w:val="false"/>
           <w:color w:val="000000"/>
-          <w:sz w:val="26"/>
+          <w:sz w:val="22"/>
         </w:rPr>
         <w:t>the</w:t>
       </w:r>
@@ -2677,7 +2769,7 @@
           <w:b w:val="false"/>
           <w:bCs w:val="false"/>
           <w:color w:val="000000"/>
-          <w:sz w:val="26"/>
+          <w:sz w:val="22"/>
         </w:rPr>
         <w:t xml:space="preserve"> display shows 00, the processor must be returned to the manufacturer for reprogramming.</w:t>
       </w:r>
@@ -2692,7 +2784,10 @@
         <w:rPr/>
       </w:pPr>
       <w:r>
-        <w:rPr/>
+        <w:rPr>
+          <w:rFonts w:ascii="Arial" w:hAnsi="Arial"/>
+          <w:sz w:val="22"/>
+        </w:rPr>
       </w:r>
     </w:p>
     <w:p>
@@ -2700,12 +2795,19 @@
         <w:pStyle w:val="Heading2"/>
       </w:pPr>
       <w:r>
+        <w:rPr>
+          <w:rFonts w:ascii="Arial" w:hAnsi="Arial"/>
+        </w:rPr>
         <w:t>Numitron Variants (Zev-7N and Zev-7N Mini)</w:t>
       </w:r>
     </w:p>
     <w:p>
       <w:pPr/>
       <w:r>
+        <w:rPr>
+          <w:rFonts w:ascii="Arial" w:hAnsi="Arial"/>
+          <w:sz w:val="22"/>
+        </w:rPr>
         <w:t>The Zev-7N runs the same firmware as the Zev-7 and shares every feature described in this manual — Rules, LED effects, colon display patterns, the info display cycle, sensors, OTA updates, and the web interface. Wherever this manual says "Nixie" (for example, "Nixie Brightness"), read it as the numitron display on these models. The differences are:</w:t>
       </w:r>
     </w:p>
@@ -2714,6 +2816,9 @@
         <w:pStyle w:val="ListBullet"/>
       </w:pPr>
       <w:r>
+        <w:rPr>
+          <w:rFonts w:ascii="Arial" w:hAnsi="Arial"/>
+        </w:rPr>
         <w:t>Display technology: seven DR2010 numitron seven-segment filament tubes driven by four TLC59116 constant-current LED drivers over I2C, in place of the Zev-7’s IN-14 Nixie tubes and HV5530 high-voltage shift drivers. The "Nixie Brightness" setting controls numitron filament brightness on these models.</w:t>
       </w:r>
     </w:p>
@@ -2722,6 +2827,9 @@
         <w:pStyle w:val="ListBullet"/>
       </w:pPr>
       <w:r>
+        <w:rPr>
+          <w:rFonts w:ascii="Arial" w:hAnsi="Arial"/>
+        </w:rPr>
         <w:t>No high voltage: the numitron display runs at low voltage with no mercury and no ~170 V supply. The high-voltage safety note in the Copyright and Disclaimer section applies to the Nixie models only.</w:t>
       </w:r>
     </w:p>
@@ -2730,6 +2838,9 @@
         <w:pStyle w:val="ListBullet"/>
       </w:pPr>
       <w:r>
+        <w:rPr>
+          <w:rFonts w:ascii="Arial" w:hAnsi="Arial"/>
+        </w:rPr>
         <w:t>No cathode anti-poisoning: filaments do not poison, so Section 14 (Cathode Anti-Poisoning), the Anti-Poison settings on the AP and live forms, the power-on conditioning runs, and the noap rule keyword have no effect on Zev-7N models. The display simply runs the time continuously.</w:t>
       </w:r>
     </w:p>
@@ -2738,6 +2849,9 @@
         <w:pStyle w:val="ListBullet"/>
       </w:pPr>
       <w:r>
+        <w:rPr>
+          <w:rFonts w:ascii="Arial" w:hAnsi="Arial"/>
+        </w:rPr>
         <w:t>Colon indicators: the colon separators are LEDs rather than neon lamps, but every colon (neon) display pattern in Section 11 works identically. Because LEDs read much brighter than the filament tubes, a Colon LED Brightness control (0–10) is provided on both the AP Settings form and the live form. It is a trim, not an absolute level: the colons still follow the Nixie Brightness setting and the light sensor, and this control only sets how bright they sit against the tubes. The default is 3. Raise it if the colons look too dim at low display brightness, lower it if they overpower the tubes.</w:t>
       </w:r>
     </w:p>
@@ -2746,6 +2860,9 @@
         <w:pStyle w:val="ListBullet"/>
       </w:pPr>
       <w:r>
+        <w:rPr>
+          <w:rFonts w:ascii="Arial" w:hAnsi="Arial"/>
+        </w:rPr>
         <w:t>Models and addressing: Zev-7N (full, with 4–20 configurable under-light LEDs) and Zev-7N Mini (no under-light). In AP mode they appear as the WiFi networks ZEV-7N and ZEV-7NM, and are reachable by name at zev-7n.local and zev-7nm.local respectively.</w:t>
       </w:r>
     </w:p>
@@ -2776,7 +2893,10 @@
         <w:rPr/>
       </w:pPr>
       <w:r>
-        <w:rPr/>
+        <w:rPr>
+          <w:rFonts w:ascii="Arial" w:hAnsi="Arial"/>
+          <w:sz w:val="22"/>
+        </w:rPr>
       </w:r>
     </w:p>
     <w:p>
@@ -2786,7 +2906,10 @@
         <w:rPr/>
       </w:pPr>
       <w:r>
-        <w:rPr/>
+        <w:rPr>
+          <w:rFonts w:ascii="Arial" w:hAnsi="Arial"/>
+          <w:sz w:val="22"/>
+        </w:rPr>
       </w:r>
     </w:p>
     <w:p>
@@ -3058,8 +3181,9 @@
             </w:pPr>
             <w:r>
               <w:rPr>
-                <w:rFonts w:eastAsia="ＭＳ 明朝" w:cs=""/>
-                <w:kern w:val="0"/>
+                <w:rFonts w:eastAsia="ＭＳ 明朝" w:cs="" w:ascii="Arial" w:hAnsi="Arial"/>
+                <w:kern w:val="0"/>
+                <w:sz w:val="20"/>
                 <w:szCs w:val="22"/>
                 <w:lang w:val="en-US" w:eastAsia="en-US" w:bidi="ar-SA"/>
               </w:rPr>
@@ -3152,8 +3276,9 @@
             </w:pPr>
             <w:r>
               <w:rPr>
-                <w:rFonts w:eastAsia="ＭＳ 明朝" w:cs=""/>
-                <w:kern w:val="0"/>
+                <w:rFonts w:eastAsia="ＭＳ 明朝" w:cs="" w:ascii="Arial" w:hAnsi="Arial"/>
+                <w:kern w:val="0"/>
+                <w:sz w:val="20"/>
                 <w:szCs w:val="22"/>
                 <w:lang w:val="en-US" w:eastAsia="en-US" w:bidi="ar-SA"/>
               </w:rPr>
@@ -3246,8 +3371,9 @@
             </w:pPr>
             <w:r>
               <w:rPr>
-                <w:rFonts w:eastAsia="ＭＳ 明朝" w:cs=""/>
-                <w:kern w:val="0"/>
+                <w:rFonts w:eastAsia="ＭＳ 明朝" w:cs="" w:ascii="Arial" w:hAnsi="Arial"/>
+                <w:kern w:val="0"/>
+                <w:sz w:val="20"/>
                 <w:szCs w:val="22"/>
                 <w:lang w:val="en-US" w:eastAsia="en-US" w:bidi="ar-SA"/>
               </w:rPr>
@@ -3340,8 +3466,9 @@
             </w:pPr>
             <w:r>
               <w:rPr>
-                <w:rFonts w:eastAsia="ＭＳ 明朝" w:cs=""/>
-                <w:kern w:val="0"/>
+                <w:rFonts w:eastAsia="ＭＳ 明朝" w:cs="" w:ascii="Arial" w:hAnsi="Arial"/>
+                <w:kern w:val="0"/>
+                <w:sz w:val="20"/>
                 <w:szCs w:val="22"/>
                 <w:lang w:val="en-US" w:eastAsia="en-US" w:bidi="ar-SA"/>
               </w:rPr>
@@ -3434,8 +3561,9 @@
             </w:pPr>
             <w:r>
               <w:rPr>
-                <w:rFonts w:eastAsia="ＭＳ 明朝" w:cs=""/>
-                <w:kern w:val="0"/>
+                <w:rFonts w:eastAsia="ＭＳ 明朝" w:cs="" w:ascii="Arial" w:hAnsi="Arial"/>
+                <w:kern w:val="0"/>
+                <w:sz w:val="20"/>
                 <w:szCs w:val="22"/>
                 <w:lang w:val="en-US" w:eastAsia="en-US" w:bidi="ar-SA"/>
               </w:rPr>
@@ -3608,7 +3736,10 @@
         <w:rPr/>
       </w:pPr>
       <w:r>
-        <w:rPr/>
+        <w:rPr>
+          <w:rFonts w:ascii="Arial" w:hAnsi="Arial"/>
+          <w:sz w:val="22"/>
+        </w:rPr>
       </w:r>
     </w:p>
     <w:p>
@@ -3954,8 +4085,9 @@
             </w:pPr>
             <w:r>
               <w:rPr>
-                <w:rFonts w:eastAsia="ＭＳ 明朝" w:cs=""/>
-                <w:kern w:val="0"/>
+                <w:rFonts w:eastAsia="ＭＳ 明朝" w:cs="" w:ascii="Arial" w:hAnsi="Arial"/>
+                <w:kern w:val="0"/>
+                <w:sz w:val="20"/>
                 <w:szCs w:val="22"/>
                 <w:lang w:val="en-US" w:eastAsia="en-US" w:bidi="ar-SA"/>
               </w:rPr>
@@ -4058,8 +4190,9 @@
             </w:pPr>
             <w:r>
               <w:rPr>
-                <w:rFonts w:eastAsia="ＭＳ 明朝" w:cs=""/>
-                <w:kern w:val="0"/>
+                <w:rFonts w:eastAsia="ＭＳ 明朝" w:cs="" w:ascii="Arial" w:hAnsi="Arial"/>
+                <w:kern w:val="0"/>
+                <w:sz w:val="20"/>
                 <w:szCs w:val="22"/>
                 <w:lang w:val="en-US" w:eastAsia="en-US" w:bidi="ar-SA"/>
               </w:rPr>
@@ -4162,8 +4295,9 @@
             </w:pPr>
             <w:r>
               <w:rPr>
-                <w:rFonts w:eastAsia="ＭＳ 明朝" w:cs=""/>
-                <w:kern w:val="0"/>
+                <w:rFonts w:eastAsia="ＭＳ 明朝" w:cs="" w:ascii="Arial" w:hAnsi="Arial"/>
+                <w:kern w:val="0"/>
+                <w:sz w:val="20"/>
                 <w:szCs w:val="22"/>
                 <w:lang w:val="en-US" w:eastAsia="en-US" w:bidi="ar-SA"/>
               </w:rPr>
@@ -4266,8 +4400,9 @@
             </w:pPr>
             <w:r>
               <w:rPr>
-                <w:rFonts w:eastAsia="ＭＳ 明朝" w:cs=""/>
-                <w:kern w:val="0"/>
+                <w:rFonts w:eastAsia="ＭＳ 明朝" w:cs="" w:ascii="Arial" w:hAnsi="Arial"/>
+                <w:kern w:val="0"/>
+                <w:sz w:val="20"/>
                 <w:szCs w:val="22"/>
                 <w:lang w:val="en-US" w:eastAsia="en-US" w:bidi="ar-SA"/>
               </w:rPr>
@@ -4370,8 +4505,9 @@
             </w:pPr>
             <w:r>
               <w:rPr>
-                <w:rFonts w:eastAsia="ＭＳ 明朝" w:cs=""/>
-                <w:kern w:val="0"/>
+                <w:rFonts w:eastAsia="ＭＳ 明朝" w:cs="" w:ascii="Arial" w:hAnsi="Arial"/>
+                <w:kern w:val="0"/>
+                <w:sz w:val="20"/>
                 <w:szCs w:val="22"/>
                 <w:lang w:val="en-US" w:eastAsia="en-US" w:bidi="ar-SA"/>
               </w:rPr>
@@ -4473,7 +4609,10 @@
               </w:rPr>
             </w:pPr>
             <w:r>
-              <w:rPr/>
+              <w:rPr>
+                <w:rFonts w:ascii="Arial" w:hAnsi="Arial"/>
+                <w:sz w:val="20"/>
+              </w:rPr>
             </w:r>
           </w:p>
         </w:tc>
@@ -4575,8 +4714,9 @@
             </w:pPr>
             <w:r>
               <w:rPr>
-                <w:rFonts w:eastAsia="ＭＳ 明朝" w:cs=""/>
-                <w:kern w:val="0"/>
+                <w:rFonts w:eastAsia="ＭＳ 明朝" w:cs="" w:ascii="Arial" w:hAnsi="Arial"/>
+                <w:kern w:val="0"/>
+                <w:sz w:val="20"/>
                 <w:szCs w:val="22"/>
                 <w:lang w:val="en-US" w:eastAsia="en-US" w:bidi="ar-SA"/>
               </w:rPr>
@@ -4607,8 +4747,9 @@
             </w:pPr>
             <w:r>
               <w:rPr>
-                <w:rFonts w:eastAsia="ＭＳ 明朝" w:cs=""/>
-                <w:kern w:val="0"/>
+                <w:rFonts w:eastAsia="ＭＳ 明朝" w:cs="" w:ascii="Arial" w:hAnsi="Arial"/>
+                <w:kern w:val="0"/>
+                <w:sz w:val="20"/>
                 <w:szCs w:val="22"/>
                 <w:lang w:val="en-US" w:eastAsia="en-US" w:bidi="ar-SA"/>
               </w:rPr>
@@ -4639,8 +4780,9 @@
             </w:pPr>
             <w:r>
               <w:rPr>
-                <w:rFonts w:eastAsia="ＭＳ 明朝" w:cs=""/>
-                <w:kern w:val="0"/>
+                <w:rFonts w:eastAsia="ＭＳ 明朝" w:cs="" w:ascii="Arial" w:hAnsi="Arial"/>
+                <w:kern w:val="0"/>
+                <w:sz w:val="20"/>
                 <w:szCs w:val="22"/>
                 <w:lang w:val="en-US" w:eastAsia="en-US" w:bidi="ar-SA"/>
               </w:rPr>
@@ -4690,7 +4832,10 @@
         <w:rPr/>
       </w:pPr>
       <w:r>
-        <w:rPr/>
+        <w:rPr>
+          <w:rFonts w:ascii="Arial" w:hAnsi="Arial"/>
+          <w:sz w:val="22"/>
+        </w:rPr>
       </w:r>
     </w:p>
     <w:p>
@@ -4720,7 +4865,10 @@
         <w:rPr/>
       </w:pPr>
       <w:r>
-        <w:rPr/>
+        <w:rPr>
+          <w:rFonts w:ascii="Arial" w:hAnsi="Arial"/>
+          <w:sz w:val="22"/>
+        </w:rPr>
       </w:r>
     </w:p>
     <w:p>
@@ -4730,7 +4878,10 @@
         <w:rPr/>
       </w:pPr>
       <w:r>
-        <w:rPr/>
+        <w:rPr>
+          <w:rFonts w:ascii="Arial" w:hAnsi="Arial"/>
+          <w:sz w:val="22"/>
+        </w:rPr>
       </w:r>
     </w:p>
     <w:p>
@@ -5058,7 +5209,10 @@
         <w:rPr/>
       </w:pPr>
       <w:r>
-        <w:rPr/>
+        <w:rPr>
+          <w:rFonts w:ascii="Arial" w:hAnsi="Arial"/>
+          <w:sz w:val="22"/>
+        </w:rPr>
       </w:r>
     </w:p>
     <w:p>
@@ -5373,7 +5527,10 @@
         <w:rPr/>
       </w:pPr>
       <w:r>
-        <w:rPr/>
+        <w:rPr>
+          <w:rFonts w:ascii="Arial" w:hAnsi="Arial"/>
+          <w:sz w:val="22"/>
+        </w:rPr>
       </w:r>
     </w:p>
     <w:p>
@@ -5435,7 +5592,10 @@
         <w:rPr/>
       </w:pPr>
       <w:r>
-        <w:rPr/>
+        <w:rPr>
+          <w:rFonts w:ascii="Arial" w:hAnsi="Arial"/>
+          <w:sz w:val="22"/>
+        </w:rPr>
       </w:r>
     </w:p>
     <w:p>
@@ -5465,7 +5625,10 @@
         <w:rPr/>
       </w:pPr>
       <w:r>
-        <w:rPr/>
+        <w:rPr>
+          <w:rFonts w:ascii="Arial" w:hAnsi="Arial"/>
+          <w:sz w:val="22"/>
+        </w:rPr>
       </w:r>
     </w:p>
     <w:p>
@@ -5475,12 +5638,19 @@
         <w:rPr/>
       </w:pPr>
       <w:r>
-        <w:rPr/>
+        <w:rPr>
+          <w:rFonts w:ascii="Arial" w:hAnsi="Arial"/>
+          <w:sz w:val="22"/>
+        </w:rPr>
       </w:r>
     </w:p>
     <w:p>
       <w:pPr/>
       <w:r>
+        <w:rPr>
+          <w:rFonts w:ascii="Arial" w:hAnsi="Arial"/>
+          <w:sz w:val="22"/>
+        </w:rPr>
         <w:t>On Zev-7N numitron models the SW1-only and SW2-only power-on functions below do nothing (there are no cathodes to condition); only the SW1 + SW2 factory reset applies.</w:t>
       </w:r>
     </w:p>
@@ -5812,7 +5982,10 @@
         <w:rPr/>
       </w:pPr>
       <w:r>
-        <w:rPr/>
+        <w:rPr>
+          <w:rFonts w:ascii="Arial" w:hAnsi="Arial"/>
+          <w:sz w:val="22"/>
+        </w:rPr>
       </w:r>
     </w:p>
     <w:p>
@@ -5842,7 +6015,10 @@
         <w:rPr/>
       </w:pPr>
       <w:r>
-        <w:rPr/>
+        <w:rPr>
+          <w:rFonts w:ascii="Arial" w:hAnsi="Arial"/>
+          <w:sz w:val="22"/>
+        </w:rPr>
       </w:r>
     </w:p>
     <w:p>
@@ -5852,7 +6028,10 @@
         <w:rPr/>
       </w:pPr>
       <w:r>
-        <w:rPr/>
+        <w:rPr>
+          <w:rFonts w:ascii="Arial" w:hAnsi="Arial"/>
+          <w:sz w:val="22"/>
+        </w:rPr>
       </w:r>
     </w:p>
     <w:p>
@@ -6631,7 +6810,10 @@
         <w:rPr/>
       </w:pPr>
       <w:r>
-        <w:rPr/>
+        <w:rPr>
+          <w:rFonts w:ascii="Arial" w:hAnsi="Arial"/>
+          <w:sz w:val="22"/>
+        </w:rPr>
       </w:r>
     </w:p>
     <w:p>
@@ -7020,7 +7202,10 @@
               <w:rPr/>
             </w:pPr>
             <w:r>
-              <w:rPr/>
+              <w:rPr>
+                <w:rFonts w:ascii="Arial" w:hAnsi="Arial"/>
+                <w:sz w:val="20"/>
+              </w:rPr>
               <w:t>Fade, Scroll, Wave, Spin Wave</w:t>
             </w:r>
           </w:p>
@@ -7041,7 +7226,10 @@
               <w:rPr/>
             </w:pPr>
             <w:r>
-              <w:rPr/>
+              <w:rPr>
+                <w:rFonts w:ascii="Arial" w:hAnsi="Arial"/>
+                <w:sz w:val="20"/>
+              </w:rPr>
               <w:t>Spin Wave</w:t>
             </w:r>
           </w:p>
@@ -7415,7 +7603,10 @@
               <w:rPr/>
             </w:pPr>
             <w:r>
-              <w:rPr/>
+              <w:rPr>
+                <w:rFonts w:ascii="Arial" w:hAnsi="Arial"/>
+                <w:sz w:val="20"/>
+              </w:rPr>
               <w:t>4</w:t>
             </w:r>
           </w:p>
@@ -7524,7 +7715,10 @@
         <w:rPr/>
       </w:pPr>
       <w:r>
-        <w:rPr/>
+        <w:rPr>
+          <w:rFonts w:ascii="Arial" w:hAnsi="Arial"/>
+          <w:sz w:val="22"/>
+        </w:rPr>
       </w:r>
     </w:p>
     <w:p>
@@ -7904,7 +8098,10 @@
         <w:rPr/>
       </w:pPr>
       <w:r>
-        <w:rPr/>
+        <w:rPr>
+          <w:rFonts w:ascii="Arial" w:hAnsi="Arial"/>
+          <w:sz w:val="22"/>
+        </w:rPr>
       </w:r>
     </w:p>
     <w:p>
@@ -8083,7 +8280,10 @@
               <w:rPr/>
             </w:pPr>
             <w:r>
-              <w:rPr/>
+              <w:rPr>
+                <w:rFonts w:ascii="Arial" w:hAnsi="Arial"/>
+                <w:sz w:val="20"/>
+              </w:rPr>
               <w:t>Anti-Poison Cycle</w:t>
             </w:r>
           </w:p>
@@ -8104,7 +8304,10 @@
               <w:rPr/>
             </w:pPr>
             <w:r>
-              <w:rPr/>
+              <w:rPr>
+                <w:rFonts w:ascii="Arial" w:hAnsi="Arial"/>
+                <w:sz w:val="20"/>
+              </w:rPr>
               <w:t>Off, 5 Seconds Every Minute, 10 Seconds Every Minute, 1 Minute Every 10 Minutes, 1 Minute Every Hour, 10 Minutes Every Hour, 30 Minutes at Midnight</w:t>
             </w:r>
           </w:p>
@@ -8125,7 +8328,10 @@
               <w:rPr/>
             </w:pPr>
             <w:r>
-              <w:rPr/>
+              <w:rPr>
+                <w:rFonts w:ascii="Arial" w:hAnsi="Arial"/>
+                <w:sz w:val="20"/>
+              </w:rPr>
               <w:t>5 Seconds Every Minute</w:t>
             </w:r>
           </w:p>
@@ -8234,7 +8440,10 @@
         <w:rPr/>
       </w:pPr>
       <w:r>
-        <w:rPr/>
+        <w:rPr>
+          <w:rFonts w:ascii="Arial" w:hAnsi="Arial"/>
+          <w:sz w:val="22"/>
+        </w:rPr>
       </w:r>
     </w:p>
     <w:p>
@@ -8710,7 +8919,10 @@
         <w:rPr/>
       </w:pPr>
       <w:r>
-        <w:rPr/>
+        <w:rPr>
+          <w:rFonts w:ascii="Arial" w:hAnsi="Arial"/>
+          <w:sz w:val="22"/>
+        </w:rPr>
       </w:r>
     </w:p>
     <w:p>
@@ -9441,7 +9653,10 @@
         <w:rPr/>
       </w:pPr>
       <w:r>
-        <w:rPr/>
+        <w:rPr>
+          <w:rFonts w:ascii="Arial" w:hAnsi="Arial"/>
+          <w:sz w:val="22"/>
+        </w:rPr>
       </w:r>
     </w:p>
     <w:p>
@@ -9980,7 +10195,10 @@
         <w:rPr/>
       </w:pPr>
       <w:r>
-        <w:rPr/>
+        <w:rPr>
+          <w:rFonts w:ascii="Arial" w:hAnsi="Arial"/>
+          <w:sz w:val="22"/>
+        </w:rPr>
       </w:r>
     </w:p>
     <w:p>
@@ -10542,7 +10760,10 @@
         <w:rPr/>
       </w:pPr>
       <w:r>
-        <w:rPr/>
+        <w:rPr>
+          <w:rFonts w:ascii="Arial" w:hAnsi="Arial"/>
+          <w:sz w:val="22"/>
+        </w:rPr>
       </w:r>
     </w:p>
     <w:p>
@@ -10866,7 +11087,10 @@
               <w:rPr/>
             </w:pPr>
             <w:r>
-              <w:rPr/>
+              <w:rPr>
+                <w:rFonts w:ascii="Arial" w:hAnsi="Arial"/>
+                <w:sz w:val="20"/>
+              </w:rPr>
               <w:t>4</w:t>
             </w:r>
           </w:p>
@@ -10952,7 +11176,10 @@
               <w:rPr/>
             </w:pPr>
             <w:r>
-              <w:rPr/>
+              <w:rPr>
+                <w:rFonts w:ascii="Arial" w:hAnsi="Arial"/>
+                <w:sz w:val="20"/>
+              </w:rPr>
               <w:t>4</w:t>
             </w:r>
           </w:p>
@@ -10965,7 +11192,10 @@
         <w:rPr/>
       </w:pPr>
       <w:r>
-        <w:rPr/>
+        <w:rPr>
+          <w:rFonts w:ascii="Arial" w:hAnsi="Arial"/>
+          <w:sz w:val="22"/>
+        </w:rPr>
       </w:r>
     </w:p>
     <w:p>
@@ -11312,7 +11542,10 @@
         <w:rPr/>
       </w:pPr>
       <w:r>
-        <w:rPr/>
+        <w:rPr>
+          <w:rFonts w:ascii="Arial" w:hAnsi="Arial"/>
+          <w:sz w:val="22"/>
+        </w:rPr>
       </w:r>
     </w:p>
     <w:p>
@@ -11540,7 +11773,10 @@
               <w:rPr/>
             </w:pPr>
             <w:r>
-              <w:rPr/>
+              <w:rPr>
+                <w:rFonts w:ascii="Arial" w:hAnsi="Arial"/>
+                <w:sz w:val="20"/>
+              </w:rPr>
               <w:t>4</w:t>
             </w:r>
           </w:p>
@@ -11649,7 +11885,10 @@
         <w:rPr/>
       </w:pPr>
       <w:r>
-        <w:rPr/>
+        <w:rPr>
+          <w:rFonts w:ascii="Arial" w:hAnsi="Arial"/>
+          <w:sz w:val="22"/>
+        </w:rPr>
       </w:r>
     </w:p>
     <w:p>
@@ -12092,7 +12331,10 @@
         <w:rPr/>
       </w:pPr>
       <w:r>
-        <w:rPr/>
+        <w:rPr>
+          <w:rFonts w:ascii="Arial" w:hAnsi="Arial"/>
+          <w:sz w:val="22"/>
+        </w:rPr>
       </w:r>
     </w:p>
     <w:p>
@@ -12134,7 +12376,10 @@
         <w:rPr/>
       </w:pPr>
       <w:r>
-        <w:rPr/>
+        <w:rPr>
+          <w:rFonts w:ascii="Arial" w:hAnsi="Arial"/>
+          <w:sz w:val="22"/>
+        </w:rPr>
       </w:r>
     </w:p>
     <w:p>
@@ -12164,7 +12409,10 @@
         <w:rPr/>
       </w:pPr>
       <w:r>
-        <w:rPr/>
+        <w:rPr>
+          <w:rFonts w:ascii="Arial" w:hAnsi="Arial"/>
+          <w:sz w:val="22"/>
+        </w:rPr>
       </w:r>
     </w:p>
     <w:p>
@@ -12174,7 +12422,10 @@
         <w:rPr/>
       </w:pPr>
       <w:r>
-        <w:rPr/>
+        <w:rPr>
+          <w:rFonts w:ascii="Arial" w:hAnsi="Arial"/>
+          <w:sz w:val="22"/>
+        </w:rPr>
       </w:r>
     </w:p>
     <w:p>
@@ -12280,24 +12531,39 @@
         <w:pStyle w:val="Heading2"/>
       </w:pPr>
       <w:r>
+        <w:rPr>
+          <w:rFonts w:ascii="Arial" w:hAnsi="Arial"/>
+        </w:rPr>
         <w:t>Install as a Home-Screen App (Add to Home Screen)</w:t>
       </w:r>
     </w:p>
     <w:p>
       <w:pPr/>
       <w:r>
+        <w:rPr>
+          <w:rFonts w:ascii="Arial" w:hAnsi="Arial"/>
+          <w:sz w:val="22"/>
+        </w:rPr>
         <w:t>The live web interface can be added to a phone or tablet home screen so it launches full-screen like an app, showing the clock’s own nixie-tube icon and name. From the live home page, open the System page and tap Add to Home Screen. On Android this offers to install the page directly; on iPhone and iPad it reminds you to use Safari’s Share button and choose “Add to Home Screen” (Apple requires that step to be done from the browser’s Share menu). Either way, an icon appears on the home screen that opens straight to the clock’s settings.</w:t>
       </w:r>
     </w:p>
     <w:p>
       <w:pPr/>
       <w:r>
+        <w:rPr>
+          <w:rFonts w:ascii="Arial" w:hAnsi="Arial"/>
+          <w:sz w:val="22"/>
+        </w:rPr>
         <w:t>The icon is labeled with the clock’s Access Point Name, so in a multi-clock home each unit gets its own recognizable icon — for example “Kitchen Clock.”</w:t>
       </w:r>
     </w:p>
     <w:p>
       <w:pPr/>
       <w:r>
+        <w:rPr>
+          <w:rFonts w:ascii="Arial" w:hAnsi="Arial"/>
+          <w:sz w:val="22"/>
+        </w:rPr>
         <w:t>A home-screen icon remembers whichever address was open when it was created. For an icon that keeps working, add it from the clock’s name address (http://&lt;name&gt;.local/, see above) or give the clock a fixed IP address, so a changing DHCP lease cannot leave the icon pointing at the wrong place. If an icon ever stops opening, delete it and add it again from a working address.</w:t>
       </w:r>
     </w:p>
@@ -12497,7 +12763,9 @@
         <w:rPr/>
       </w:pPr>
       <w:r>
-        <w:rPr/>
+        <w:rPr>
+          <w:rFonts w:ascii="Arial" w:hAnsi="Arial"/>
+        </w:rPr>
         <w:t>Anti-Poison Cycle, Start Second</w:t>
       </w:r>
     </w:p>
@@ -12664,7 +12932,10 @@
         <w:rPr/>
       </w:pPr>
       <w:r>
-        <w:rPr/>
+        <w:rPr>
+          <w:rFonts w:ascii="Arial" w:hAnsi="Arial"/>
+          <w:sz w:val="22"/>
+        </w:rPr>
       </w:r>
     </w:p>
     <w:p>
@@ -12691,7 +12962,10 @@
         <w:rPr/>
       </w:pPr>
       <w:r>
-        <w:rPr/>
+        <w:rPr>
+          <w:rFonts w:ascii="Arial" w:hAnsi="Arial"/>
+          <w:sz w:val="22"/>
+        </w:rPr>
       </w:r>
     </w:p>
     <w:p>
@@ -12713,7 +12987,10 @@
         <w:rPr/>
       </w:pPr>
       <w:r>
-        <w:rPr/>
+        <w:rPr>
+          <w:rFonts w:ascii="Arial" w:hAnsi="Arial"/>
+          <w:sz w:val="22"/>
+        </w:rPr>
       </w:r>
     </w:p>
     <w:p>
@@ -12766,7 +13043,7 @@
           <w:rFonts w:ascii="Arial" w:hAnsi="Arial"/>
           <w:sz w:val="22"/>
         </w:rPr>
-        <w:t>Syntax. A rule starts with a time range (t=...) followed by any combination of field overrides, separated by commas or spaces. Time ranges use a 24-hour clock and the end time is exclusive (t=5-7 covers 5:00 through 6:59). Times may be written as a bare hour (t=5 → 5:00-5:59), an hour range (t=5-7), exact minutes (t=5:30-6:00), or in compact four-digit form (t=0530-0600 = 5:30-6:00). Cross-midnight ranges are allowed: t=22-6 means 10:00 PM through 5:59 AM.</w:t>
+        <w:t>Syntax. A rule starts with a time range (t=...) followed by any combination of field overrides, separated by commas or spaces. Time ranges use a 24-hour clock and the end time is exclusive (t=5-7 covers 5:00 through 6:59). Times may be written as a bare hour (t=5 to 5:00-5:59), an hour range (t=5-7), exact minutes (t=5:30-6:00), or in compact four-digit form (t=0530-0600 = 5:30-6:00). Cross-midnight ranges are allowed: t=22-6 means 10:00 PM through 5:59 AM.</w:t>
       </w:r>
     </w:p>
     <w:p>
@@ -12785,36 +13062,60 @@
     <w:p>
       <w:pPr/>
       <w:r>
+        <w:rPr>
+          <w:rFonts w:ascii="Arial" w:hAnsi="Arial"/>
+          <w:sz w:val="22"/>
+        </w:rPr>
         <w:t>Days of the week. Beyond the wd (weekday) and we (weekend) shortcuts, a rule can target specific days by name — sun, mon, tue, wed, thu, fri, sat, or the full names such as tuesday. A day range like tue-thu covers a span and may wrap the week (sat-mon covers Saturday, Sunday, Monday); a single day name limits the rule to that day. Day terms are combined as a union and may be mixed with wd/we. Separately, the value off may be used in place of 0 on any numeric field — nb=off, lb=off, and so on.</w:t>
       </w:r>
     </w:p>
     <w:p>
       <w:pPr/>
       <w:r>
+        <w:rPr>
+          <w:rFonts w:ascii="Arial" w:hAnsi="Arial"/>
+          <w:sz w:val="22"/>
+        </w:rPr>
         <w:t>Dark rules. The bare dark keyword makes a rule apply only while the room is dark. It requires the Light Sensor (Section 13) to be enabled. The clock waits for about a minute of continuous darkness before dark rules engage — brief shadows, headlights, or a passing cloud will not trigger them — and releases them within a few seconds once the room is lit again. dark combines with time ranges and day filters; use t=all with dark for a rule that follows the room rather than the clock. A dark rule on a clock whose Light Sensor is disabled stays dormant — it is accepted but never fires.</w:t>
       </w:r>
     </w:p>
     <w:p>
       <w:pPr/>
       <w:r>
+        <w:rPr>
+          <w:rFonts w:ascii="Arial" w:hAnsi="Arial"/>
+          <w:sz w:val="22"/>
+        </w:rPr>
         <w:t>Sunrise and sunset. Instead of a clock time, either end of a rule's time range can be anchored to today's sunrise or sunset, so a seasonal rule keeps following the sky instead of needing an edit twice a year. t=18:00-7:00 is right in December and two hours wrong in June; t=sunset-sunrise is right all year. Both ends may be anchors, and anchors mix freely with clock times: t=sunset-sunrise, t=sunrise-sunset, t=sunset-23:00, t=23:00-sunrise. Everything else about the rule is unchanged - day filters, dark, noap and the full field list all work the same way.</w:t>
       </w:r>
     </w:p>
     <w:p>
       <w:pPr/>
       <w:r>
+        <w:rPr>
+          <w:rFonts w:ascii="Arial" w:hAnsi="Arial"/>
+          <w:sz w:val="22"/>
+        </w:rPr>
         <w:t>Offsets. An anchor can be shifted by writing + or - followed by a number and a unit: m for minutes, h for hours, up to 12 hours either way. For example t=sunset-30m-23:00 starts 30 minutes before sunset and runs to 23:00, and t=sunrise+1h-sunset-1h covers only the solidly-daylight hours. The unit is required. A bare number after the keyword is read as a time, not an offset - t=sunset-0700 means "sunset until 07:00" - so an offset without its unit is rejected, with a message showing the corrected text.</w:t>
       </w:r>
     </w:p>
     <w:p>
       <w:pPr/>
       <w:r>
+        <w:rPr>
+          <w:rFonts w:ascii="Arial" w:hAnsi="Arial"/>
+          <w:sz w:val="22"/>
+        </w:rPr>
         <w:t>Location. Sunrise and sunset depend on where the clock is, so set Latitude and Longitude on the System page of the live settings form before using these rules. A map above the two fields lets you tap your location rather than typing it; it starts locked, so uncheck Lock Map first. The map needs an internet connection and is only available on the live form, not the initial AP setup form - the two text fields work either way. A sunrise or sunset rule entered with no location set is refused rather than silently ignored, and clearing the location warns that any such rules are paused.</w:t>
       </w:r>
     </w:p>
     <w:p>
       <w:pPr/>
       <w:r>
+        <w:rPr>
+          <w:rFonts w:ascii="Arial" w:hAnsi="Arial"/>
+          <w:sz w:val="22"/>
+        </w:rPr>
         <w:t>How the times are found. The clock calculates sunrise and sunset itself, from your latitude, longitude and the date - there is no internet lookup and nothing to subscribe to. It uses the standard NOAA sunrise equation: from the number of days since the year 2000 it finds where the Earth is in its orbit, corrects for the orbit being an ellipse rather than a circle, and from that gets the sun's position for the day - the moment of local solar noon and how far north or south of the equator the sun stands. Combining that with your latitude gives how long the sun takes to travel from overhead to the horizon, which is subtracted from solar noon for sunrise and added for sunset. The horizon is taken as 0.833 degrees below level, which allows for the width of the sun's disc and the way the atmosphere bends its light - the sun has really already set when you watch it touch the horizon. The result is accurate to well under a minute. Times are recalculated each day at midnight, and immediately whenever you change a rule or the location. At extreme latitudes, on days when the sun never rises or never sets, sunrise and sunset rules simply do not fire.</w:t>
       </w:r>
     </w:p>
@@ -13702,6 +14003,10 @@
           </w:tcPr>
           <w:p>
             <w:r>
+              <w:rPr>
+                <w:rFonts w:ascii="Arial" w:hAnsi="Arial"/>
+                <w:sz w:val="20"/>
+              </w:rPr>
               <w:t>Bare keyword (no = value). Suppresses anti-poison cycles during this rule's window. Useful for quiet/dim windows where a full-brightness anti-poison run would be disruptive. Nixie models only; ignored on Zev-7N numitron models.</w:t>
             </w:r>
           </w:p>
@@ -13716,6 +14021,10 @@
           </w:tcPr>
           <w:p>
             <w:r>
+              <w:rPr>
+                <w:rFonts w:ascii="Arial" w:hAnsi="Arial"/>
+                <w:sz w:val="20"/>
+              </w:rPr>
               <w:t>dark</w:t>
             </w:r>
           </w:p>
@@ -13727,6 +14036,10 @@
           </w:tcPr>
           <w:p>
             <w:r>
+              <w:rPr>
+                <w:rFonts w:ascii="Arial" w:hAnsi="Arial"/>
+                <w:sz w:val="20"/>
+              </w:rPr>
               <w:t>Bare keyword (no = value). The rule applies only while the room is dark, as measured by the light sensor. Engages after about a minute of continuous darkness; releases within a few seconds when the room lights up. Requires the Light Sensor to be enabled.</w:t>
             </w:r>
           </w:p>
@@ -13804,6 +14117,10 @@
           </w:tcPr>
           <w:p>
             <w:r>
+              <w:rPr>
+                <w:rFonts w:ascii="Arial" w:hAnsi="Arial"/>
+                <w:sz w:val="20"/>
+              </w:rPr>
               <w:t>Day names / ranges</w:t>
             </w:r>
           </w:p>
@@ -13814,6 +14131,10 @@
           </w:tcPr>
           <w:p>
             <w:r>
+              <w:rPr>
+                <w:rFonts w:ascii="Arial" w:hAnsi="Arial"/>
+                <w:sz w:val="20"/>
+              </w:rPr>
               <w:t>Bare day tokens restrict a rule to specific days of the week: sun, mon, tue, wed, thu, fri, sat (full names such as tuesday also work). A range spans consecutive days and may wrap the week — tue-thu means Tuesday through Thursday; sat-mon means Saturday, Sunday, Monday. A single token means that one day only. Day terms combine as a union and may be mixed with wd/we — for example wd, sat covers Monday through Saturday.</w:t>
             </w:r>
           </w:p>
@@ -13826,6 +14147,10 @@
           </w:tcPr>
           <w:p>
             <w:r>
+              <w:rPr>
+                <w:rFonts w:ascii="Arial" w:hAnsi="Arial"/>
+                <w:sz w:val="20"/>
+              </w:rPr>
               <w:t>he / heal</w:t>
             </w:r>
           </w:p>
@@ -13836,6 +14161,10 @@
           </w:tcPr>
           <w:p>
             <w:r>
+              <w:rPr>
+                <w:rFonts w:ascii="Arial" w:hAnsi="Arial"/>
+                <w:sz w:val="20"/>
+              </w:rPr>
               <w:t>Marks the time range as a Tube Healing window and sets the session length in days (1–99; a bare heal means 30 days; heal=0 cancels healing inside a higher-priority window). During a healing window the cathodes selected on the Tube Healing page glow to recover from poisoning while every other tube stays dark, and the motion sensor is held off for the window. See Section 15. Nixie models only.</w:t>
             </w:r>
           </w:p>
@@ -13848,6 +14177,10 @@
           </w:tcPr>
           <w:p>
             <w:r>
+              <w:rPr>
+                <w:rFonts w:ascii="Arial" w:hAnsi="Arial"/>
+                <w:sz w:val="20"/>
+              </w:rPr>
               <w:t>off (as a value)</w:t>
             </w:r>
           </w:p>
@@ -13858,6 +14191,10 @@
           </w:tcPr>
           <w:p>
             <w:r>
+              <w:rPr>
+                <w:rFonts w:ascii="Arial" w:hAnsi="Arial"/>
+                <w:sz w:val="20"/>
+              </w:rPr>
               <w:t>On any numeric field, off may be typed in place of 0 — for example nb=off, lb=off, ub=off, or heal=off. This is separate from the bare off shortcut above, which sets nb, lb, and ub together.</w:t>
             </w:r>
           </w:p>
@@ -13870,6 +14207,10 @@
           </w:tcPr>
           <w:p>
             <w:r>
+              <w:rPr>
+                <w:rFonts w:ascii="Arial" w:hAnsi="Arial"/>
+                <w:sz w:val="20"/>
+              </w:rPr>
               <w:t>sunrise / sunset</w:t>
             </w:r>
           </w:p>
@@ -13880,6 +14221,10 @@
           </w:tcPr>
           <w:p>
             <w:r>
+              <w:rPr>
+                <w:rFonts w:ascii="Arial" w:hAnsi="Arial"/>
+                <w:sz w:val="20"/>
+              </w:rPr>
               <w:t>Used in place of a clock time at either end of the time range, so the rule follows the season. Add an offset with + or - plus a number and a unit — m for minutes, h for hours, up to 12 hours (t=sunset-30m-23:00). The unit is required: a bare number is read as a time, so t=sunset-0700 means "sunset until 07:00". Requires Latitude and Longitude on the System page.</w:t>
             </w:r>
           </w:p>
@@ -15383,6 +15728,10 @@
           </w:tcPr>
           <w:p>
             <w:r>
+              <w:rPr>
+                <w:rFonts w:ascii="Arial" w:hAnsi="Arial"/>
+                <w:sz w:val="20"/>
+              </w:rPr>
               <w:t>t=7-9, tue-thu, nb=9</w:t>
             </w:r>
           </w:p>
@@ -15393,6 +15742,10 @@
           </w:tcPr>
           <w:p>
             <w:r>
+              <w:rPr>
+                <w:rFonts w:ascii="Arial" w:hAnsi="Arial"/>
+                <w:sz w:val="20"/>
+              </w:rPr>
               <w:t>Day range</w:t>
             </w:r>
           </w:p>
@@ -15403,6 +15756,10 @@
           </w:tcPr>
           <w:p>
             <w:r>
+              <w:rPr>
+                <w:rFonts w:ascii="Arial" w:hAnsi="Arial"/>
+                <w:sz w:val="20"/>
+              </w:rPr>
               <w:t>Full Nixie brightness from 7:00 through 8:59 AM, but only on Tuesday, Wednesday, and Thursday. Day names and ranges may be combined and mixed with wd/we.</w:t>
             </w:r>
           </w:p>
@@ -15415,6 +15772,10 @@
           </w:tcPr>
           <w:p>
             <w:r>
+              <w:rPr>
+                <w:rFonts w:ascii="Arial" w:hAnsi="Arial"/>
+                <w:sz w:val="20"/>
+              </w:rPr>
               <w:t>t=0:00-6:30, heal=30</w:t>
             </w:r>
           </w:p>
@@ -15425,6 +15786,10 @@
           </w:tcPr>
           <w:p>
             <w:r>
+              <w:rPr>
+                <w:rFonts w:ascii="Arial" w:hAnsi="Arial"/>
+                <w:sz w:val="20"/>
+              </w:rPr>
               <w:t>Healing window</w:t>
             </w:r>
           </w:p>
@@ -15435,6 +15800,10 @@
           </w:tcPr>
           <w:p>
             <w:r>
+              <w:rPr>
+                <w:rFonts w:ascii="Arial" w:hAnsi="Arial"/>
+                <w:sz w:val="20"/>
+              </w:rPr>
               <w:t>Runs a 30-day Tube Healing session every night from midnight through 6:29 AM: the digits selected on the Tube Healing page glow to recover poisoned cathodes while the rest of the display is dark. See Section 15.</w:t>
             </w:r>
           </w:p>
@@ -15447,6 +15816,10 @@
           </w:tcPr>
           <w:p>
             <w:r>
+              <w:rPr>
+                <w:rFonts w:ascii="Arial" w:hAnsi="Arial"/>
+                <w:sz w:val="20"/>
+              </w:rPr>
               <w:t>t=all, dark, nb=1, lb=0</w:t>
             </w:r>
           </w:p>
@@ -15457,6 +15830,10 @@
           </w:tcPr>
           <w:p>
             <w:r>
+              <w:rPr>
+                <w:rFonts w:ascii="Arial" w:hAnsi="Arial"/>
+                <w:sz w:val="20"/>
+              </w:rPr>
               <w:t>Whenever dark</w:t>
             </w:r>
           </w:p>
@@ -15467,6 +15844,10 @@
           </w:tcPr>
           <w:p>
             <w:r>
+              <w:rPr>
+                <w:rFonts w:ascii="Arial" w:hAnsi="Arial"/>
+                <w:sz w:val="20"/>
+              </w:rPr>
               <w:t>Follows the room instead of the clock: whenever the room is dark, tube brightness drops to 1 and the digit LEDs turn off. Everything returns a few seconds after the lights come on.</w:t>
             </w:r>
           </w:p>
@@ -15479,6 +15860,10 @@
           </w:tcPr>
           <w:p>
             <w:r>
+              <w:rPr>
+                <w:rFonts w:ascii="Arial" w:hAnsi="Arial"/>
+                <w:sz w:val="20"/>
+              </w:rPr>
               <w:t>t=sunset-sunrise, nb=3, lb=2</w:t>
             </w:r>
           </w:p>
@@ -15489,6 +15874,10 @@
           </w:tcPr>
           <w:p>
             <w:r>
+              <w:rPr>
+                <w:rFonts w:ascii="Arial" w:hAnsi="Arial"/>
+                <w:sz w:val="20"/>
+              </w:rPr>
               <w:t>Dusk to dawn</w:t>
             </w:r>
           </w:p>
@@ -15499,6 +15888,10 @@
           </w:tcPr>
           <w:p>
             <w:r>
+              <w:rPr>
+                <w:rFonts w:ascii="Arial" w:hAnsi="Arial"/>
+                <w:sz w:val="20"/>
+              </w:rPr>
               <w:t>Dims the tubes to 3 and the LEDs to 2 from sunset until sunrise, following the season automatically — no need to adjust the times as the nights get longer or shorter.</w:t>
             </w:r>
           </w:p>
@@ -15511,6 +15904,10 @@
           </w:tcPr>
           <w:p>
             <w:r>
+              <w:rPr>
+                <w:rFonts w:ascii="Arial" w:hAnsi="Arial"/>
+                <w:sz w:val="20"/>
+              </w:rPr>
               <w:t>t=sunset-30m-23:00, nb=6, ub=3</w:t>
             </w:r>
           </w:p>
@@ -15521,6 +15918,10 @@
           </w:tcPr>
           <w:p>
             <w:r>
+              <w:rPr>
+                <w:rFonts w:ascii="Arial" w:hAnsi="Arial"/>
+                <w:sz w:val="20"/>
+              </w:rPr>
               <w:t>Evening, sun-anchored start</w:t>
             </w:r>
           </w:p>
@@ -15531,6 +15932,10 @@
           </w:tcPr>
           <w:p>
             <w:r>
+              <w:rPr>
+                <w:rFonts w:ascii="Arial" w:hAnsi="Arial"/>
+                <w:sz w:val="20"/>
+              </w:rPr>
               <w:t>Eases the display down half an hour before sunset and holds that until a fixed 23:00 bedtime. Mixes a sun anchor with an ordinary clock time.</w:t>
             </w:r>
           </w:p>
@@ -15543,6 +15948,10 @@
           </w:tcPr>
           <w:p>
             <w:r>
+              <w:rPr>
+                <w:rFonts w:ascii="Arial" w:hAnsi="Arial"/>
+                <w:sz w:val="20"/>
+              </w:rPr>
               <w:t>t=sunrise+1h-sunset-1h, nb=9</w:t>
             </w:r>
           </w:p>
@@ -15553,6 +15962,10 @@
           </w:tcPr>
           <w:p>
             <w:r>
+              <w:rPr>
+                <w:rFonts w:ascii="Arial" w:hAnsi="Arial"/>
+                <w:sz w:val="20"/>
+              </w:rPr>
               <w:t>Full daylight only</w:t>
             </w:r>
           </w:p>
@@ -15563,6 +15976,10 @@
           </w:tcPr>
           <w:p>
             <w:r>
+              <w:rPr>
+                <w:rFonts w:ascii="Arial" w:hAnsi="Arial"/>
+                <w:sz w:val="20"/>
+              </w:rPr>
               <w:t>Runs the tubes at full brightness only during solidly-daylight hours, avoiding the dim half-hour at each end of the day.</w:t>
             </w:r>
           </w:p>
@@ -15579,7 +15996,10 @@
         <w:rPr/>
       </w:pPr>
       <w:r>
-        <w:rPr/>
+        <w:rPr>
+          <w:rFonts w:ascii="Arial" w:hAnsi="Arial"/>
+          <w:sz w:val="22"/>
+        </w:rPr>
       </w:r>
     </w:p>
     <w:p>
@@ -15609,7 +16029,10 @@
         <w:rPr/>
       </w:pPr>
       <w:r>
-        <w:rPr/>
+        <w:rPr>
+          <w:rFonts w:ascii="Arial" w:hAnsi="Arial"/>
+          <w:sz w:val="22"/>
+        </w:rPr>
       </w:r>
     </w:p>
     <w:p>
@@ -15619,7 +16042,10 @@
         <w:rPr/>
       </w:pPr>
       <w:r>
-        <w:rPr/>
+        <w:rPr>
+          <w:rFonts w:ascii="Arial" w:hAnsi="Arial"/>
+          <w:sz w:val="22"/>
+        </w:rPr>
       </w:r>
     </w:p>
     <w:p>
@@ -17051,7 +17477,10 @@
         <w:rPr/>
       </w:pPr>
       <w:r>
-        <w:rPr/>
+        <w:rPr>
+          <w:rFonts w:ascii="Arial" w:hAnsi="Arial"/>
+          <w:sz w:val="22"/>
+        </w:rPr>
       </w:r>
     </w:p>
     <w:p>
@@ -17081,7 +17510,10 @@
         <w:rPr/>
       </w:pPr>
       <w:r>
-        <w:rPr/>
+        <w:rPr>
+          <w:rFonts w:ascii="Arial" w:hAnsi="Arial"/>
+          <w:sz w:val="22"/>
+        </w:rPr>
       </w:r>
     </w:p>
     <w:p>
@@ -17091,7 +17523,10 @@
         <w:rPr/>
       </w:pPr>
       <w:r>
-        <w:rPr/>
+        <w:rPr>
+          <w:rFonts w:ascii="Arial" w:hAnsi="Arial"/>
+          <w:sz w:val="22"/>
+        </w:rPr>
       </w:r>
     </w:p>
     <w:p>
@@ -17464,7 +17899,10 @@
         <w:rPr/>
       </w:pPr>
       <w:r>
-        <w:rPr/>
+        <w:rPr>
+          <w:rFonts w:ascii="Arial" w:hAnsi="Arial"/>
+          <w:sz w:val="22"/>
+        </w:rPr>
       </w:r>
     </w:p>
     <w:p>
@@ -17509,7 +17947,10 @@
         <w:rPr/>
       </w:pPr>
       <w:r>
-        <w:rPr/>
+        <w:rPr>
+          <w:rFonts w:ascii="Arial" w:hAnsi="Arial"/>
+          <w:sz w:val="22"/>
+        </w:rPr>
       </w:r>
     </w:p>
     <w:p>
@@ -17539,7 +17980,10 @@
         <w:rPr/>
       </w:pPr>
       <w:r>
-        <w:rPr/>
+        <w:rPr>
+          <w:rFonts w:ascii="Arial" w:hAnsi="Arial"/>
+          <w:sz w:val="22"/>
+        </w:rPr>
       </w:r>
     </w:p>
     <w:p>
@@ -17549,7 +17993,10 @@
         <w:rPr/>
       </w:pPr>
       <w:r>
-        <w:rPr/>
+        <w:rPr>
+          <w:rFonts w:ascii="Arial" w:hAnsi="Arial"/>
+          <w:sz w:val="22"/>
+        </w:rPr>
       </w:r>
     </w:p>
     <w:p>
@@ -18584,7 +19031,10 @@
         <w:rPr/>
       </w:pPr>
       <w:r>
-        <w:rPr/>
+        <w:rPr>
+          <w:rFonts w:ascii="Arial" w:hAnsi="Arial"/>
+          <w:sz w:val="22"/>
+        </w:rPr>
       </w:r>
     </w:p>
     <w:p>
@@ -18614,7 +19064,10 @@
         <w:rPr/>
       </w:pPr>
       <w:r>
-        <w:rPr/>
+        <w:rPr>
+          <w:rFonts w:ascii="Arial" w:hAnsi="Arial"/>
+          <w:sz w:val="22"/>
+        </w:rPr>
       </w:r>
     </w:p>
     <w:p>
@@ -18624,7 +19077,10 @@
         <w:rPr/>
       </w:pPr>
       <w:r>
-        <w:rPr/>
+        <w:rPr>
+          <w:rFonts w:ascii="Arial" w:hAnsi="Arial"/>
+          <w:sz w:val="22"/>
+        </w:rPr>
       </w:r>
     </w:p>
     <w:p>
@@ -18751,7 +19207,10 @@
         <w:rPr/>
       </w:pPr>
       <w:r>
-        <w:rPr/>
+        <w:rPr>
+          <w:rFonts w:ascii="Arial" w:hAnsi="Arial"/>
+          <w:sz w:val="22"/>
+        </w:rPr>
       </w:r>
     </w:p>
     <w:p>
@@ -18781,7 +19240,10 @@
         <w:rPr/>
       </w:pPr>
       <w:r>
-        <w:rPr/>
+        <w:rPr>
+          <w:rFonts w:ascii="Arial" w:hAnsi="Arial"/>
+          <w:sz w:val="22"/>
+        </w:rPr>
       </w:r>
     </w:p>
     <w:p>
@@ -18791,7 +19253,10 @@
         <w:rPr/>
       </w:pPr>
       <w:r>
-        <w:rPr/>
+        <w:rPr>
+          <w:rFonts w:ascii="Arial" w:hAnsi="Arial"/>
+          <w:sz w:val="22"/>
+        </w:rPr>
       </w:r>
     </w:p>
     <w:p>
@@ -18873,6 +19338,10 @@
         <w:t>Calibration: The clock automatically dims its display to match the ambient light in the room, and you can teach it the brightness range of your location. Triple-click SW2 to enter calibration mode. The clock runs a 30-second calibration during which the four left-hand tubes show a live sensor reading (0–4095; note that brighter light produces a lower number). While calibration is running, expose the sensor to the brightest light at which you want the display at full brightness — for example, turn on the room lights or open the blinds — then cover or shade the sensor to register the darkest condition at which you want it dimmed to minimum. The clock tracks the brightest and darkest readings it sees during the 30 seconds; there is no button to press to finish. When the timer expires, calibration ends automatically, the new range is saved to memory, and the clock returns to showing the time. If too small a light range is captured, the clock keeps its previous calibration unchanged. The calibration is stored permanently and survives power loss, so it only needs to be repeated if the clock is moved to a location with noticeably different lighting.</w:t>
       </w:r>
       <w:r>
+        <w:rPr>
+          <w:rFonts w:ascii="Arial" w:hAnsi="Arial"/>
+          <w:sz w:val="22"/>
+        </w:rPr>
         <w:t xml:space="preserve"> The light sensor also drives dark rules — rules that apply only while the room is dark (see Section 8).</w:t>
       </w:r>
     </w:p>
@@ -18948,7 +19417,10 @@
         <w:rPr/>
       </w:pPr>
       <w:r>
-        <w:rPr/>
+        <w:rPr>
+          <w:rFonts w:ascii="Arial" w:hAnsi="Arial"/>
+          <w:sz w:val="22"/>
+        </w:rPr>
       </w:r>
     </w:p>
     <w:p>
@@ -18978,7 +19450,10 @@
         <w:rPr/>
       </w:pPr>
       <w:r>
-        <w:rPr/>
+        <w:rPr>
+          <w:rFonts w:ascii="Arial" w:hAnsi="Arial"/>
+          <w:sz w:val="22"/>
+        </w:rPr>
       </w:r>
     </w:p>
     <w:p>
@@ -18988,12 +19463,19 @@
         <w:rPr/>
       </w:pPr>
       <w:r>
-        <w:rPr/>
+        <w:rPr>
+          <w:rFonts w:ascii="Arial" w:hAnsi="Arial"/>
+          <w:sz w:val="22"/>
+        </w:rPr>
       </w:r>
     </w:p>
     <w:p>
       <w:pPr/>
       <w:r>
+        <w:rPr>
+          <w:rFonts w:ascii="Arial" w:hAnsi="Arial"/>
+          <w:sz w:val="22"/>
+        </w:rPr>
         <w:t>Applies to Nixie models only. The Zev-7N numitron variants use filament seven-segment tubes that do not suffer cathode poisoning. On those models this entire section, the Anti-Poison settings, the power-on conditioning runs, and the noap rule keyword have no effect.</w:t>
       </w:r>
     </w:p>
@@ -19017,12 +19499,17 @@
       </w:pPr>
       <w:r>
         <w:rPr>
+          <w:rFonts w:ascii="Arial" w:hAnsi="Arial"/>
           <w:b/>
+          <w:sz w:val="22"/>
         </w:rPr>
         <w:t>Anti-Poison Cycle</w:t>
       </w:r>
       <w:r>
-        <w:rPr/>
+        <w:rPr>
+          <w:rFonts w:ascii="Arial" w:hAnsi="Arial"/>
+          <w:sz w:val="22"/>
+        </w:rPr>
         <w:t xml:space="preserve"> is a single setting that picks a paired duration and schedule. The available cycles are 5 Seconds Every Minute, 10 Seconds Every Minute, 1 Minute Every 10 Minutes, 1 Minute Every Hour, 10 Minutes Every Hour, and 30 Minutes at Midnight.</w:t>
       </w:r>
     </w:p>
@@ -19033,12 +19520,17 @@
       </w:pPr>
       <w:r>
         <w:rPr>
+          <w:rFonts w:ascii="Arial" w:hAnsi="Arial"/>
           <w:b/>
+          <w:sz w:val="22"/>
         </w:rPr>
         <w:t>Trigger conditions: all cycles fire at the configured Start Second. The five non-Midnight cycles only run when the tubes are currently on — if an active rule has the display off, or the PIR motion timeout has blanked it, the cycle is skipped that interval. The Midnight cycle is the exception: it always runs, even when the display is otherwise off.</w:t>
       </w:r>
       <w:r>
-        <w:rPr/>
+        <w:rPr>
+          <w:rFonts w:ascii="Arial" w:hAnsi="Arial"/>
+          <w:sz w:val="22"/>
+        </w:rPr>
       </w:r>
     </w:p>
     <w:p>
@@ -19048,12 +19540,17 @@
       </w:pPr>
       <w:r>
         <w:rPr>
+          <w:rFonts w:ascii="Arial" w:hAnsi="Arial"/>
           <w:b/>
+          <w:sz w:val="22"/>
         </w:rPr>
         <w:t>During a cycle: tubes run at full brightness regardless of any active rule. RGB LEDs continue running their configured effect and brightness. With LED Follows Digit enabled, the under-tube LEDs follow whichever tubes are lit — since the cycle keeps all tubes lit, the LEDs stay on through the cycle. Both colon neons are lit. If PIR turns the tubes off mid-run on a non-Midnight cycle, the cycle aborts cleanly and the display goes back to its off state.</w:t>
       </w:r>
       <w:r>
-        <w:rPr/>
+        <w:rPr>
+          <w:rFonts w:ascii="Arial" w:hAnsi="Arial"/>
+          <w:sz w:val="22"/>
+        </w:rPr>
       </w:r>
     </w:p>
     <w:p>
@@ -19245,7 +19742,10 @@
         <w:rPr/>
       </w:pPr>
       <w:r>
-        <w:rPr/>
+        <w:rPr>
+          <w:rFonts w:ascii="Arial" w:hAnsi="Arial"/>
+          <w:sz w:val="22"/>
+        </w:rPr>
       </w:r>
     </w:p>
     <w:p>
@@ -19253,48 +19753,79 @@
         <w:pStyle w:val="Heading1"/>
       </w:pPr>
       <w:r>
+        <w:rPr>
+          <w:rFonts w:ascii="Arial" w:hAnsi="Arial"/>
+        </w:rPr>
         <w:t>15. Tube Healing</w:t>
       </w:r>
     </w:p>
     <w:p>
       <w:pPr/>
       <w:r>
+        <w:rPr>
+          <w:rFonts w:ascii="Arial" w:hAnsi="Arial"/>
+          <w:sz w:val="22"/>
+        </w:rPr>
         <w:t>Anti-poisoning (Section 14) prevents cathode poisoning; Tube Healing recovers a cathode that is already poisoned. If a particular digit on a particular tube looks faded or ghosted even after the regular anti-poison schedule has been running, Tube Healing lets you glow just that cathode for an extended period to burn the deposit off. Like anti-poisoning, this is a Nixie-only feature: the Zev-7N numitron models use filament tubes that do not poison, and have no Tube Healing page.</w:t>
       </w:r>
     </w:p>
     <w:p>
       <w:pPr/>
       <w:r>
+        <w:rPr>
+          <w:rFonts w:ascii="Arial" w:hAnsi="Arial"/>
+          <w:sz w:val="22"/>
+        </w:rPr>
         <w:t>Where it is. Tube Healing lives on the live web interface, not the AP setup form. From the live home page, open the System page and tap Tube Healing. The page has three parts: a Healing on/off switch, a row of digit-test buttons (0–9), and a grid of checkboxes with one column per tube and one row per digit.</w:t>
       </w:r>
     </w:p>
     <w:p>
       <w:pPr/>
       <w:r>
+        <w:rPr>
+          <w:rFonts w:ascii="Arial" w:hAnsi="Arial"/>
+          <w:sz w:val="22"/>
+        </w:rPr>
         <w:t>1. Find the weak cathodes. Tap a digit-test button and that digit is shown on every tube for a few seconds while the button turns blue. Step through the digits and note which tube-and-digit combinations look dim or patchy compared with the rest.</w:t>
       </w:r>
     </w:p>
     <w:p>
       <w:pPr/>
       <w:r>
+        <w:rPr>
+          <w:rFonts w:ascii="Arial" w:hAnsi="Arial"/>
+          <w:sz w:val="22"/>
+        </w:rPr>
         <w:t>2. Select and arm. In the grid, tick each weak digit under its tube (tube 1 is the leftmost). Turn the Healing switch on. Selections are saved immediately and survive a reboot.</w:t>
       </w:r>
     </w:p>
     <w:p>
       <w:pPr/>
       <w:r>
+        <w:rPr>
+          <w:rFonts w:ascii="Arial" w:hAnsi="Arial"/>
+          <w:sz w:val="22"/>
+        </w:rPr>
         <w:t>3. Schedule when it runs. Healing only treats during a rule window that carries the heal keyword (see Section 8). Add a rule such as t=0:00-6:30, heal=30 to heal every night from midnight to 6:30 AM for a 30-day session. A bare heal means 30 days; heal=N sets any length from 1 to 99 days. An overnight window keeps the clock readable during the day.</w:t>
       </w:r>
     </w:p>
     <w:p>
       <w:pPr/>
       <w:r>
+        <w:rPr>
+          <w:rFonts w:ascii="Arial" w:hAnsi="Arial"/>
+          <w:sz w:val="22"/>
+        </w:rPr>
         <w:t>What you see during a window. The clock stops showing the time entirely: only the selected cathodes glow, on their own tubes, and every other tube is dark. This is deliberate — a healing digit held in place of a time digit would be unreadable and would dilute the treatment. If more than one digit is selected on the same tube, that tube rotates through them, five minutes each. The motion sensor, the scheduled anti-poison cycles, and the date and weather info displays are all suspended for the duration of the window so the treatment runs uninterrupted. Outside the window the clock behaves normally.</w:t>
       </w:r>
     </w:p>
     <w:p>
       <w:pPr/>
       <w:r>
+        <w:rPr>
+          <w:rFonts w:ascii="Arial" w:hAnsi="Arial"/>
+          <w:sz w:val="22"/>
+        </w:rPr>
         <w:t>When it ends. The session ends automatically after the number of days set by heal=N (30 by default); the Healing switch then turns itself off, while the digit selections stay ticked so a follow-up session only needs the switch turned back on again. Turning the switch off at any time ends the session immediately. Light poisoning typically clears in about 30 days; heavy poisoning may need a second session. Note: a faded glow only along the bottom of a digit usually indicates a tube air leak rather than poisoning, and cannot be healed.</w:t>
       </w:r>
     </w:p>
@@ -19325,7 +19856,10 @@
         <w:rPr/>
       </w:pPr>
       <w:r>
-        <w:rPr/>
+        <w:rPr>
+          <w:rFonts w:ascii="Arial" w:hAnsi="Arial"/>
+          <w:sz w:val="22"/>
+        </w:rPr>
       </w:r>
     </w:p>
     <w:p>
@@ -19335,7 +19869,10 @@
         <w:rPr/>
       </w:pPr>
       <w:r>
-        <w:rPr/>
+        <w:rPr>
+          <w:rFonts w:ascii="Arial" w:hAnsi="Arial"/>
+          <w:sz w:val="22"/>
+        </w:rPr>
       </w:r>
     </w:p>
     <w:p>
@@ -19754,7 +20291,10 @@
         <w:rPr/>
       </w:pPr>
       <w:r>
-        <w:rPr/>
+        <w:rPr>
+          <w:rFonts w:ascii="Arial" w:hAnsi="Arial"/>
+          <w:sz w:val="22"/>
+        </w:rPr>
       </w:r>
     </w:p>
     <w:p>
@@ -20147,7 +20687,10 @@
         <w:rPr/>
       </w:pPr>
       <w:r>
-        <w:rPr/>
+        <w:rPr>
+          <w:rFonts w:ascii="Arial" w:hAnsi="Arial"/>
+          <w:sz w:val="22"/>
+        </w:rPr>
       </w:r>
     </w:p>
     <w:p>
@@ -20236,7 +20779,8 @@
       <w:r>
         <w:rPr>
           <w:rFonts w:ascii="Arial" w:hAnsi="Arial"/>
-          <w:sz w:val="22"/>
+          <w:b/>
+          <w:sz w:val="26"/>
         </w:rPr>
         <w:t>Automatic Updates</w:t>
       </w:r>
@@ -20349,7 +20893,8 @@
       <w:r>
         <w:rPr>
           <w:rFonts w:ascii="Arial" w:hAnsi="Arial"/>
-          <w:sz w:val="22"/>
+          <w:b/>
+          <w:sz w:val="26"/>
         </w:rPr>
         <w:t>Automatic Recovery from a Failed Update</w:t>
       </w:r>
@@ -20448,7 +20993,10 @@
         <w:rPr/>
       </w:pPr>
       <w:r>
-        <w:rPr/>
+        <w:rPr>
+          <w:rFonts w:ascii="Arial" w:hAnsi="Arial"/>
+          <w:sz w:val="22"/>
+        </w:rPr>
       </w:r>
     </w:p>
     <w:p>
@@ -20478,7 +21026,10 @@
         <w:rPr/>
       </w:pPr>
       <w:r>
-        <w:rPr/>
+        <w:rPr>
+          <w:rFonts w:ascii="Arial" w:hAnsi="Arial"/>
+          <w:sz w:val="22"/>
+        </w:rPr>
       </w:r>
     </w:p>
     <w:p>
@@ -20488,7 +21039,10 @@
         <w:rPr/>
       </w:pPr>
       <w:r>
-        <w:rPr/>
+        <w:rPr>
+          <w:rFonts w:ascii="Arial" w:hAnsi="Arial"/>
+          <w:sz w:val="22"/>
+        </w:rPr>
       </w:r>
     </w:p>
     <w:p>
@@ -20608,7 +21162,10 @@
         <w:rPr/>
       </w:pPr>
       <w:r>
-        <w:rPr/>
+        <w:rPr>
+          <w:rFonts w:ascii="Arial" w:hAnsi="Arial"/>
+          <w:sz w:val="22"/>
+        </w:rPr>
       </w:r>
     </w:p>
     <w:p>
@@ -20638,7 +21195,10 @@
         <w:rPr/>
       </w:pPr>
       <w:r>
-        <w:rPr/>
+        <w:rPr>
+          <w:rFonts w:ascii="Arial" w:hAnsi="Arial"/>
+          <w:sz w:val="22"/>
+        </w:rPr>
       </w:r>
     </w:p>
     <w:p>
@@ -20648,7 +21208,10 @@
         <w:rPr/>
       </w:pPr>
       <w:r>
-        <w:rPr/>
+        <w:rPr>
+          <w:rFonts w:ascii="Arial" w:hAnsi="Arial"/>
+          <w:sz w:val="22"/>
+        </w:rPr>
       </w:r>
     </w:p>
     <w:tbl>
@@ -22054,7 +22617,10 @@
         <w:rPr/>
       </w:pPr>
       <w:r>
-        <w:rPr/>
+        <w:rPr>
+          <w:rFonts w:ascii="Arial" w:hAnsi="Arial"/>
+          <w:sz w:val="22"/>
+        </w:rPr>
       </w:r>
     </w:p>
     <w:p>
@@ -22084,7 +22650,10 @@
         <w:rPr/>
       </w:pPr>
       <w:r>
-        <w:rPr/>
+        <w:rPr>
+          <w:rFonts w:ascii="Arial" w:hAnsi="Arial"/>
+          <w:sz w:val="22"/>
+        </w:rPr>
       </w:r>
     </w:p>
     <w:p>
@@ -22094,7 +22663,10 @@
         <w:rPr/>
       </w:pPr>
       <w:r>
-        <w:rPr/>
+        <w:rPr>
+          <w:rFonts w:ascii="Arial" w:hAnsi="Arial"/>
+          <w:sz w:val="22"/>
+        </w:rPr>
       </w:r>
     </w:p>
     <w:p>
@@ -27143,7 +27715,7 @@
       <w:jc w:val="start"/>
     </w:pPr>
     <w:rPr>
-      <w:rFonts w:ascii="Calibri" w:hAnsi="Calibri" w:eastAsia="" w:cs="" w:cstheme="minorBidi" w:eastAsiaTheme="minorEastAsia"/>
+      <w:rFonts w:ascii="Arial" w:hAnsi="Arial" w:eastAsia="" w:cs="" w:cstheme="minorBidi" w:eastAsiaTheme="minorEastAsia"/>
       <w:color w:val="auto"/>
       <w:kern w:val="0"/>
       <w:sz w:val="21"/>

</xml_diff>

<commit_message>
Zev-7 Operator Manual V6: sr / ss short forms
</commit_message>
<xml_diff>
--- a/Zev-7 Operator Manual.docx
+++ b/Zev-7 Operator Manual.docx
@@ -192,7 +192,7 @@
                 <w:rFonts w:ascii="Arial" w:hAnsi="Arial"/>
                 <w:sz w:val="20"/>
               </w:rPr>
-              <w:t>V5 — adds sunrise/sunset rule anchors (a rule's time range can follow the sun, with optional offsets), Latitude and Longitude on the System page with a map picker, and documents Automatic Updates and automatic recovery from a failed update. Corrects the previous statement that a major version change resets settings to factory defaults — firmware updates now always preserve settings — and the Custom LED effect index (12 to 13). V4 — adds the dark rule keyword (rules that apply only while the room is dark), the Weather Display Frequency setting.</w:t>
+              <w:t>V6 — sunrise and sunset may be abbreviated sr and ss. V5 — adds sunrise/sunset rule anchors (a rule's time range can follow the sun, with optional offsets), Latitude and Longitude on the System page with a map picker, and documents Automatic Updates and automatic recovery from a failed update. Corrects the previous statement that a major version change resets settings to factory defaults — firmware updates now always preserve settings — and the Custom LED effect index (12 to 13). V4 — adds the dark rule keyword (rules that apply only while the room is dark), the Weather Display Frequency setting.</w:t>
             </w:r>
           </w:p>
         </w:tc>
@@ -234,7 +234,7 @@
                 <w:rFonts w:ascii="Arial" w:hAnsi="Arial"/>
                 <w:sz w:val="20"/>
               </w:rPr>
-              <w:t>V5</w:t>
+              <w:t>V6</w:t>
             </w:r>
           </w:p>
         </w:tc>
@@ -13086,7 +13086,7 @@
           <w:rFonts w:ascii="Arial" w:hAnsi="Arial"/>
           <w:sz w:val="22"/>
         </w:rPr>
-        <w:t>Sunrise and sunset. Instead of a clock time, either end of a rule's time range can be anchored to today's sunrise or sunset, so a seasonal rule keeps following the sky instead of needing an edit twice a year. t=18:00-7:00 is right in December and two hours wrong in June; t=sunset-sunrise is right all year. Both ends may be anchors, and anchors mix freely with clock times: t=sunset-sunrise, t=sunrise-sunset, t=sunset-23:00, t=23:00-sunrise. Everything else about the rule is unchanged - day filters, dark, noap and the full field list all work the same way.</w:t>
+        <w:t>Sunrise and sunset. Instead of a clock time, either end of a rule's time range can be anchored to today's sunrise or sunset, so a seasonal rule keeps following the sky instead of needing an edit twice a year. t=18:00-7:00 is right in December and two hours wrong in June; t=sunset-sunrise is right all year. Both ends may be anchors, and anchors mix freely with clock times: t=sunset-sunrise, t=sunrise-sunset, t=sunset-23:00, t=23:00-sunrise. Both keywords may be shortened to sr and ss - t=ss-sr is the same rule as t=sunset-sunrise, and the long and short forms may be mixed freely; the schedule table always shows the long form. Everything else about the rule is unchanged - day filters, dark, noap and the full field list all work the same way.</w:t>
       </w:r>
     </w:p>
     <w:p>
@@ -14211,7 +14211,7 @@
                 <w:rFonts w:ascii="Arial" w:hAnsi="Arial"/>
                 <w:sz w:val="20"/>
               </w:rPr>
-              <w:t>sunrise / sunset</w:t>
+              <w:t>sunrise / sunset (sr / ss)</w:t>
             </w:r>
           </w:p>
         </w:tc>
@@ -14225,7 +14225,7 @@
                 <w:rFonts w:ascii="Arial" w:hAnsi="Arial"/>
                 <w:sz w:val="20"/>
               </w:rPr>
-              <w:t>Used in place of a clock time at either end of the time range, so the rule follows the season. Add an offset with + or - plus a number and a unit — m for minutes, h for hours, up to 12 hours (t=sunset-30m-23:00). The unit is required: a bare number is read as a time, so t=sunset-0700 means "sunset until 07:00". Requires Latitude and Longitude on the System page.</w:t>
+              <w:t>Used in place of a clock time at either end of the time range, so the rule follows the season. May be written in full or as the two-letter short forms sr and ss - t=ss-sr is the same rule as t=sunset-sunrise, and the two forms may be mixed. The schedule table always shows the long form. Add an offset with + or - plus a number and a unit - m for minutes, h for hours, up to 12 hours (t=ss-30m-23:00). The unit is required: a bare number is read as a time, so t=sunset-0700 means "sunset until 07:00". Requires Latitude and Longitude on the System page.</w:t>
             </w:r>
           </w:p>
         </w:tc>

</xml_diff>

<commit_message>
Zev-7 Operator Manual V7: rule priority is per setting; warning icon only on a real contest
</commit_message>
<xml_diff>
--- a/Zev-7 Operator Manual.docx
+++ b/Zev-7 Operator Manual.docx
@@ -192,7 +192,7 @@
                 <w:rFonts w:ascii="Arial" w:hAnsi="Arial"/>
                 <w:sz w:val="20"/>
               </w:rPr>
-              <w:t>V6 — sunrise and sunset may be abbreviated sr and ss. V5 — adds sunrise/sunset rule anchors (a rule's time range can follow the sun, with optional offsets), Latitude and Longitude on the System page with a map picker, and documents Automatic Updates and automatic recovery from a failed update. Corrects the previous statement that a major version change resets settings to factory defaults — firmware updates now always preserve settings — and the Custom LED effect index (12 to 13). V4 — adds the dark rule keyword (rules that apply only while the room is dark), the Weather Display Frequency setting.</w:t>
+              <w:t>V7 — clarifies rule priority: overlapping rules are combined setting by setting, and the warning icon now appears only where an overlap actually contests a setting. V6 — sunrise and sunset may be abbreviated sr and ss. V5 — adds sunrise/sunset rule anchors (a rule's time range can follow the sun, with optional offsets), Latitude and Longitude on the System page with a map picker, and documents Automatic Updates and automatic recovery from a failed update. Corrects the previous statement that a major version change resets settings to factory defaults — firmware updates now always preserve settings — and the Custom LED effect index (12 to 13). V4 — adds the dark rule keyword (rules that apply only while the room is dark), the Weather Display Frequency setting.</w:t>
             </w:r>
           </w:p>
         </w:tc>
@@ -234,7 +234,7 @@
                 <w:rFonts w:ascii="Arial" w:hAnsi="Arial"/>
                 <w:sz w:val="20"/>
               </w:rPr>
-              <w:t>V6</w:t>
+              <w:t>V7</w:t>
             </w:r>
           </w:p>
         </w:tc>
@@ -13003,7 +13003,7 @@
           <w:rFonts w:ascii="Arial" w:hAnsi="Arial"/>
           <w:sz w:val="22"/>
         </w:rPr>
-        <w:t>Priority: when two rules overlap in time, the rule listed higher in the schedule wins for the overlapping window. Use the up and down arrows on the right of each row to change a rule's priority (up = higher priority). The Rule Editor flags overlapping rules with a warning icon (⚠) so unintended interactions are visible at a glance.</w:t>
+        <w:t>Priority: rules are applied setting by setting, not as whole rules. Where two rules overlap in time, each setting is taken from the rule that sets it, and only when both rules set the SAME setting does the one listed higher in the schedule win. So a rule that dims the tubes and a rule that changes the under-light colour both take full effect during an overlap - they touch different settings and neither cancels the other. Layering a broad rule with a narrower exception above it is the normal way to build a schedule. Use the up and down arrows on the right of each row to change a rule’s priority (up = higher priority). The Rule Editor shows a warning icon (⚠) only where an overlap actually contests a setting; hover or tap it to see which setting and which rule. A rule marked this way is not disabled - everything else in it still applies, including that setting outside the overlapping window.</w:t>
       </w:r>
     </w:p>
     <w:p>

</xml_diff>

<commit_message>
Zev-7 Operator Manual rev 2.1: new section 18, REST Programming
Documents the /fields JSON inventory and URL-based field control
(/?field=&value=, /?save=1) with browser and curl examples.
Troubleshooting renumbered to section 19.

Claude-Session: https://claude.ai/code/session_01GGwNQ91Yox3fU38pt73NjX
</commit_message>
<xml_diff>
--- a/Zev-7 Operator Manual.docx
+++ b/Zev-7 Operator Manual.docx
@@ -137,113 +137,10 @@
         <w:t>This manual describes the installation, configuration, and day-to-day operation of the Zev-7 and Metronome clocks. It covers the Nixie-tube models (Zev-7, Zev-7 Mini, Metronome) and the numitron-tube models (Zev-7N, Zev-7N Mini). Throughout this manual all models are referred to as Zev-7, and "Nixie" refers to the time display in general; see Section 2 for how the Zev-7N numitron models differ.</w:t>
       </w:r>
     </w:p>
-    <w:tbl>
-      <w:tblPr>
-        <w:tblW w:w="8064" w:type="dxa"/>
-        <w:jc w:val="start"/>
-        <w:tblInd w:w="108" w:type="dxa"/>
-        <w:tblLayout w:type="fixed"/>
-        <w:tblCellMar>
-          <w:top w:w="0" w:type="dxa"/>
-          <w:start w:w="108" w:type="dxa"/>
-          <w:bottom w:w="0" w:type="dxa"/>
-          <w:end w:w="108" w:type="dxa"/>
-        </w:tblCellMar>
-        <w:tblLook w:firstRow="1" w:noVBand="1" w:lastRow="0" w:firstColumn="1" w:lastColumn="0" w:noHBand="0" w:val="04a0"/>
-      </w:tblPr>
-      <w:tblGrid>
-        <w:gridCol w:w="3744"/>
-        <w:gridCol w:w="4320"/>
-      </w:tblGrid>
-      <w:tr>
-        <w:trPr/>
-        <w:tc>
-          <w:tcPr>
-            <w:tcW w:w="3744" w:type="dxa"/>
-            <w:tcBorders/>
-          </w:tcPr>
-          <w:p>
-            <w:pPr>
-              <w:pStyle w:val="Normal"/>
-              <w:widowControl/>
-              <w:bidi w:val="0"/>
-              <w:spacing w:lineRule="auto" w:line="276" w:before="0" w:after="80"/>
-              <w:jc w:val="start"/>
-              <w:rPr/>
-            </w:pPr>
-            <w:r>
-              <w:rPr>
-                <w:rFonts w:ascii="Arial" w:hAnsi="Arial"/>
-                <w:b/>
-                <w:sz w:val="22"/>
-              </w:rPr>
-              <w:t>Revision/Update Information:</w:t>
-            </w:r>
-          </w:p>
-        </w:tc>
-        <w:tc>
-          <w:tcPr>
-            <w:tcW w:w="4320" w:type="dxa"/>
-            <w:tcBorders/>
-          </w:tcPr>
-          <w:p>
-            <w:r>
-              <w:rPr>
-                <w:rFonts w:ascii="Arial" w:hAnsi="Arial"/>
-                <w:sz w:val="20"/>
-              </w:rPr>
-              <w:t>V7 — clarifies rule priority: overlapping rules are combined setting by setting, and the warning icon now appears only where an overlap actually contests a setting. V6 — sunrise and sunset may be abbreviated sr and ss. V5 — adds sunrise/sunset rule anchors (a rule's time range can follow the sun, with optional offsets), Latitude and Longitude on the System page with a map picker, and documents Automatic Updates and automatic recovery from a failed update. Corrects the previous statement that a major version change resets settings to factory defaults — firmware updates now always preserve settings — and the Custom LED effect index (12 to 13). V4 — adds the dark rule keyword (rules that apply only while the room is dark), the Weather Display Frequency setting.</w:t>
-            </w:r>
-          </w:p>
-        </w:tc>
-      </w:tr>
-      <w:tr>
-        <w:trPr/>
-        <w:tc>
-          <w:tcPr>
-            <w:tcW w:w="3744" w:type="dxa"/>
-            <w:tcBorders/>
-          </w:tcPr>
-          <w:p>
-            <w:pPr>
-              <w:pStyle w:val="Normal"/>
-              <w:widowControl/>
-              <w:bidi w:val="0"/>
-              <w:spacing w:lineRule="auto" w:line="276" w:before="0" w:after="80"/>
-              <w:jc w:val="start"/>
-              <w:rPr/>
-            </w:pPr>
-            <w:r>
-              <w:rPr>
-                <w:rFonts w:ascii="Arial" w:hAnsi="Arial"/>
-                <w:b/>
-                <w:sz w:val="22"/>
-              </w:rPr>
-              <w:t>Clock Firmware:</w:t>
-            </w:r>
-          </w:p>
-        </w:tc>
-        <w:tc>
-          <w:tcPr>
-            <w:tcW w:w="4320" w:type="dxa"/>
-            <w:tcBorders/>
-          </w:tcPr>
-          <w:p>
-            <w:r>
-              <w:rPr>
-                <w:rFonts w:ascii="Arial" w:hAnsi="Arial"/>
-                <w:sz w:val="20"/>
-              </w:rPr>
-              <w:t>V7</w:t>
-            </w:r>
-          </w:p>
-        </w:tc>
-      </w:tr>
-    </w:tbl>
     <w:p>
       <w:pPr>
         <w:pStyle w:val="Normal"/>
-        <w:spacing w:before="2800" w:after="40"/>
+        <w:spacing w:before="3800" w:after="40"/>
         <w:jc w:val="start"/>
         <w:rPr/>
       </w:pPr>
@@ -996,9 +893,58 @@
           <w:color w:val="000000"/>
           <w:sz w:val="22"/>
         </w:rPr>
-        <w:t>18. Troubleshooting</w:t>
+        <w:t>18. REST Programming</w:t>
         <w:tab/>
         <w:t>18-1</w:t>
+      </w:r>
+      <w:r>
+        <w:rPr>
+          <w:rFonts w:ascii="Arial" w:hAnsi="Arial"/>
+          <w:sz w:val="22"/>
+        </w:rPr>
+      </w:r>
+      <w:r>
+        <w:rPr>
+          <w:rFonts w:ascii="Arial" w:hAnsi="Arial"/>
+          <w:color w:val="000000"/>
+          <w:sz w:val="22"/>
+        </w:rPr>
+      </w:r>
+    </w:p>
+    <w:p>
+      <w:pPr>
+        <w:pStyle w:val="Normal"/>
+        <w:tabs>
+          <w:tab w:val="clear" w:pos="720"/>
+          <w:tab w:val="right" w:pos="9072" w:leader="dot"/>
+        </w:tabs>
+        <w:spacing w:before="40" w:after="80"/>
+        <w:rPr/>
+        <w:sectPr>
+          <w:headerReference w:type="even" r:id="rId8"/>
+          <w:headerReference w:type="default" r:id="rId9"/>
+          <w:headerReference w:type="first" r:id="rId10"/>
+          <w:footerReference w:type="even" r:id="rId11"/>
+          <w:footerReference w:type="default" r:id="rId12"/>
+          <w:footerReference w:type="first" r:id="rId13"/>
+          <w:type w:val="nextPage"/>
+          <w:pgSz w:w="12240" w:h="15840"/>
+          <w:pgMar w:left="1417" w:right="1417" w:gutter="0" w:header="720" w:top="1134" w:footer="720" w:bottom="1134"/>
+          <w:pgNumType w:start="1" w:fmt="lowerRoman"/>
+          <w:formProt w:val="false"/>
+          <w:textDirection w:val="lrTb"/>
+          <w:docGrid w:type="default" w:linePitch="360" w:charSpace="0"/>
+        </w:sectPr>
+      </w:pPr>
+      <w:r>
+        <w:rPr>
+          <w:rFonts w:ascii="Arial" w:hAnsi="Arial"/>
+          <w:color w:val="000000"/>
+          <w:sz w:val="22"/>
+        </w:rPr>
+        <w:t>19. Troubleshooting</w:t>
+        <w:tab/>
+        <w:t>19-1</w:t>
       </w:r>
       <w:r>
         <w:rPr>
@@ -2032,7 +1978,7 @@
           <w:rFonts w:ascii="Arial" w:hAnsi="Arial"/>
           <w:sz w:val="22"/>
         </w:rPr>
-        <w:t>Zev-7 is a seven-tube Nixie clock and the Metronome is its fifteen-tube companion. Both are driven by an ESP32 microcontroller and share the same firmware, web interface, and rule-based scheduling. They display hours, minutes, seconds, and tenths of a second using IN-14 Nixie tubes with HV5530 shift-register drivers. The clocks feature RGB backlighting behind the tubes, neon colon indicators, WiFi connectivity with NTP time sync, an optional motion sensor, an optional light sensor, and (Zev-7 only) an optional weather sensor and under-light strip.</w:t>
+        <w:t>Zev-7 is a seven-tube Nixie clock and the Metronome is its fifteen-tube companion. Both are driven by an ESP32 microcontroller and share the same firmware, web interface, and rule-based scheduling. They display hours, minutes, seconds, and tenths of a second using IN-14 Nixie tubes with HV5530 shift-register drivers. The clocks feature RGB backlighting behind the tubes, neon colon indicators, WiFi connectivity with NTP time sync, an optional motion sensor, an optional light sensor, an optional weather sensor, and (Zev-7 only) an under-light strip.</w:t>
       </w:r>
     </w:p>
     <w:p>
@@ -2696,13 +2642,160 @@
         <w:spacing w:before="120" w:after="120"/>
         <w:ind w:start="216"/>
         <w:rPr/>
+      </w:pPr>
+      <w:r>
+        <w:rPr>
+          <w:rFonts w:ascii="Arial" w:hAnsi="Arial"/>
+          <w:b/>
+          <w:bCs/>
+          <w:color w:val="C25600"/>
+          <w:sz w:val="24"/>
+          <w:szCs w:val="24"/>
+        </w:rPr>
+        <w:t>NOTICE</w:t>
+      </w:r>
+      <w:r>
+        <w:rPr>
+          <w:rFonts w:ascii="Arial" w:hAnsi="Arial"/>
+          <w:b/>
+          <w:bCs/>
+          <w:color w:val="C25600"/>
+          <w:sz w:val="22"/>
+        </w:rPr>
+        <w:t>:</w:t>
+      </w:r>
+      <w:r>
+        <w:rPr>
+          <w:rFonts w:ascii="Arial" w:hAnsi="Arial"/>
+          <w:color w:val="C25600"/>
+          <w:sz w:val="22"/>
+        </w:rPr>
+        <w:t xml:space="preserve"> </w:t>
+      </w:r>
+      <w:r>
+        <w:rPr>
+          <w:rFonts w:ascii="Arial" w:hAnsi="Arial"/>
+          <w:b w:val="false"/>
+          <w:bCs w:val="false"/>
+          <w:color w:val="000000"/>
+          <w:sz w:val="22"/>
+        </w:rPr>
+        <w:t xml:space="preserve">If </w:t>
+      </w:r>
+      <w:r>
+        <w:rPr>
+          <w:rFonts w:ascii="Arial" w:hAnsi="Arial"/>
+          <w:b w:val="false"/>
+          <w:bCs w:val="false"/>
+          <w:i w:val="false"/>
+          <w:iCs w:val="false"/>
+          <w:color w:val="000000"/>
+          <w:sz w:val="22"/>
+        </w:rPr>
+        <w:t>the</w:t>
+      </w:r>
+      <w:r>
+        <w:rPr>
+          <w:rFonts w:ascii="Arial" w:hAnsi="Arial"/>
+          <w:b w:val="false"/>
+          <w:bCs w:val="false"/>
+          <w:color w:val="000000"/>
+          <w:sz w:val="22"/>
+        </w:rPr>
+        <w:t xml:space="preserve"> display shows 00, the processor must be returned to the manufacturer for reprogramming.</w:t>
+      </w:r>
+    </w:p>
+    <w:p>
+      <w:pPr>
+        <w:pStyle w:val="Normal"/>
+        <w:pBdr>
+          <w:bottom w:val="single" w:sz="18" w:space="1" w:color="000000"/>
+        </w:pBdr>
+        <w:spacing w:before="0" w:after="0"/>
+        <w:rPr/>
+      </w:pPr>
+      <w:r>
+        <w:rPr>
+          <w:rFonts w:ascii="Arial" w:hAnsi="Arial"/>
+          <w:sz w:val="22"/>
+        </w:rPr>
+      </w:r>
+    </w:p>
+    <w:p>
+      <w:pPr>
+        <w:pStyle w:val="Heading2"/>
+      </w:pPr>
+      <w:r>
+        <w:rPr>
+          <w:rFonts w:ascii="Arial" w:hAnsi="Arial"/>
+        </w:rPr>
+        <w:t>Numitron Variants (Zev-7N and Zev-7N Mini)</w:t>
+      </w:r>
+    </w:p>
+    <w:p>
+      <w:pPr/>
+      <w:r>
+        <w:rPr>
+          <w:rFonts w:ascii="Arial" w:hAnsi="Arial"/>
+          <w:sz w:val="22"/>
+        </w:rPr>
+        <w:t>The Zev-7N runs the same firmware as the Zev-7 and shares every feature described in this manual — Rules, LED effects, colon display patterns, the info display cycle, sensors, OTA updates, and the web interface. Wherever this manual says "Nixie" (for example, "Nixie Brightness"), read it as the numitron display on these models. The differences are:</w:t>
+      </w:r>
+    </w:p>
+    <w:p>
+      <w:pPr>
+        <w:pStyle w:val="ListBullet"/>
+      </w:pPr>
+      <w:r>
+        <w:rPr>
+          <w:rFonts w:ascii="Arial" w:hAnsi="Arial"/>
+        </w:rPr>
+        <w:t>Display technology: seven DR2010 numitron seven-segment filament tubes driven by four TLC59116 constant-current LED drivers over I2C, in place of the Zev-7’s IN-14 Nixie tubes and HV5530 high-voltage shift drivers. The "Nixie Brightness" setting controls numitron filament brightness on these models.</w:t>
+      </w:r>
+    </w:p>
+    <w:p>
+      <w:pPr>
+        <w:pStyle w:val="ListBullet"/>
+      </w:pPr>
+      <w:r>
+        <w:rPr>
+          <w:rFonts w:ascii="Arial" w:hAnsi="Arial"/>
+        </w:rPr>
+        <w:t>No high voltage: the numitron display runs at low voltage with no mercury and no ~170 V supply. The high-voltage safety note in the Copyright and Disclaimer section applies to the Nixie models only.</w:t>
+      </w:r>
+    </w:p>
+    <w:p>
+      <w:pPr>
+        <w:pStyle w:val="ListBullet"/>
+      </w:pPr>
+      <w:r>
+        <w:rPr>
+          <w:rFonts w:ascii="Arial" w:hAnsi="Arial"/>
+        </w:rPr>
+        <w:t>No cathode anti-poisoning: filaments do not poison, so Section 14 (Cathode Anti-Poisoning), the Anti-Poison settings on the AP and live forms, the power-on conditioning runs, and the noap rule keyword have no effect on Zev-7N models. The display simply runs the time continuously.</w:t>
+      </w:r>
+    </w:p>
+    <w:p>
+      <w:pPr>
+        <w:pStyle w:val="ListBullet"/>
+      </w:pPr>
+      <w:r>
+        <w:rPr>
+          <w:rFonts w:ascii="Arial" w:hAnsi="Arial"/>
+        </w:rPr>
+        <w:t>Colon indicators: the colon separators are LEDs rather than neon lamps, but every colon (neon) display pattern in Section 11 works identically. Because LEDs read much brighter than the filament tubes, a Colon LED Brightness control (0–10) is provided on both the AP Settings form and the live form. It is a trim, not an absolute level: the colons still follow the Nixie Brightness setting and the light sensor, and this control only sets how bright they sit against the tubes. The default is 3. Raise it if the colons look too dim at low display brightness, lower it if they overpower the tubes.</w:t>
+      </w:r>
+    </w:p>
+    <w:p>
+      <w:pPr>
+        <w:pStyle w:val="ListBullet"/>
         <w:sectPr>
           <w:headerReference w:type="even" r:id="rId26"/>
+          <w:footerReference w:type="even" r:id="rId29"/>
           <w:headerReference w:type="default" r:id="rId27"/>
-          <w:headerReference w:type="first" r:id="rId28"/>
-          <w:footerReference w:type="even" r:id="rId29"/>
+          <w:headerReference w:type="first" r:id="rId27"/>
           <w:footerReference w:type="default" r:id="rId30"/>
-          <w:footerReference w:type="first" r:id="rId31"/>
+          <w:footerReference w:type="first" r:id="rId30"/>
           <w:type w:val="nextPage"/>
           <w:pgSz w:w="12240" w:h="15840"/>
           <w:pgMar w:left="1417" w:right="1417" w:gutter="0" w:header="720" w:top="1134" w:footer="720" w:bottom="1134"/>
@@ -2711,153 +2804,6 @@
           <w:textDirection w:val="lrTb"/>
           <w:docGrid w:type="default" w:linePitch="360" w:charSpace="0"/>
         </w:sectPr>
-      </w:pPr>
-      <w:r>
-        <w:rPr>
-          <w:rFonts w:ascii="Arial" w:hAnsi="Arial"/>
-          <w:b/>
-          <w:bCs/>
-          <w:color w:val="C25600"/>
-          <w:sz w:val="24"/>
-          <w:szCs w:val="24"/>
-        </w:rPr>
-        <w:t>NOTICE</w:t>
-      </w:r>
-      <w:r>
-        <w:rPr>
-          <w:rFonts w:ascii="Arial" w:hAnsi="Arial"/>
-          <w:b/>
-          <w:bCs/>
-          <w:color w:val="C25600"/>
-          <w:sz w:val="22"/>
-        </w:rPr>
-        <w:t>:</w:t>
-      </w:r>
-      <w:r>
-        <w:rPr>
-          <w:rFonts w:ascii="Arial" w:hAnsi="Arial"/>
-          <w:color w:val="C25600"/>
-          <w:sz w:val="22"/>
-        </w:rPr>
-        <w:t xml:space="preserve"> </w:t>
-      </w:r>
-      <w:r>
-        <w:rPr>
-          <w:rFonts w:ascii="Arial" w:hAnsi="Arial"/>
-          <w:b w:val="false"/>
-          <w:bCs w:val="false"/>
-          <w:color w:val="000000"/>
-          <w:sz w:val="22"/>
-        </w:rPr>
-        <w:t xml:space="preserve">If </w:t>
-      </w:r>
-      <w:r>
-        <w:rPr>
-          <w:rFonts w:ascii="Arial" w:hAnsi="Arial"/>
-          <w:b w:val="false"/>
-          <w:bCs w:val="false"/>
-          <w:i w:val="false"/>
-          <w:iCs w:val="false"/>
-          <w:color w:val="000000"/>
-          <w:sz w:val="22"/>
-        </w:rPr>
-        <w:t>the</w:t>
-      </w:r>
-      <w:r>
-        <w:rPr>
-          <w:rFonts w:ascii="Arial" w:hAnsi="Arial"/>
-          <w:b w:val="false"/>
-          <w:bCs w:val="false"/>
-          <w:color w:val="000000"/>
-          <w:sz w:val="22"/>
-        </w:rPr>
-        <w:t xml:space="preserve"> display shows 00, the processor must be returned to the manufacturer for reprogramming.</w:t>
-      </w:r>
-    </w:p>
-    <w:p>
-      <w:pPr>
-        <w:pStyle w:val="Normal"/>
-        <w:pBdr>
-          <w:bottom w:val="single" w:sz="18" w:space="1" w:color="000000"/>
-        </w:pBdr>
-        <w:spacing w:before="0" w:after="0"/>
-        <w:rPr/>
-      </w:pPr>
-      <w:r>
-        <w:rPr>
-          <w:rFonts w:ascii="Arial" w:hAnsi="Arial"/>
-          <w:sz w:val="22"/>
-        </w:rPr>
-      </w:r>
-    </w:p>
-    <w:p>
-      <w:pPr>
-        <w:pStyle w:val="Heading2"/>
-      </w:pPr>
-      <w:r>
-        <w:rPr>
-          <w:rFonts w:ascii="Arial" w:hAnsi="Arial"/>
-        </w:rPr>
-        <w:t>Numitron Variants (Zev-7N and Zev-7N Mini)</w:t>
-      </w:r>
-    </w:p>
-    <w:p>
-      <w:pPr/>
-      <w:r>
-        <w:rPr>
-          <w:rFonts w:ascii="Arial" w:hAnsi="Arial"/>
-          <w:sz w:val="22"/>
-        </w:rPr>
-        <w:t>The Zev-7N runs the same firmware as the Zev-7 and shares every feature described in this manual — Rules, LED effects, colon display patterns, the info display cycle, sensors, OTA updates, and the web interface. Wherever this manual says "Nixie" (for example, "Nixie Brightness"), read it as the numitron display on these models. The differences are:</w:t>
-      </w:r>
-    </w:p>
-    <w:p>
-      <w:pPr>
-        <w:pStyle w:val="ListBullet"/>
-      </w:pPr>
-      <w:r>
-        <w:rPr>
-          <w:rFonts w:ascii="Arial" w:hAnsi="Arial"/>
-        </w:rPr>
-        <w:t>Display technology: seven DR2010 numitron seven-segment filament tubes driven by four TLC59116 constant-current LED drivers over I2C, in place of the Zev-7’s IN-14 Nixie tubes and HV5530 high-voltage shift drivers. The "Nixie Brightness" setting controls numitron filament brightness on these models.</w:t>
-      </w:r>
-    </w:p>
-    <w:p>
-      <w:pPr>
-        <w:pStyle w:val="ListBullet"/>
-      </w:pPr>
-      <w:r>
-        <w:rPr>
-          <w:rFonts w:ascii="Arial" w:hAnsi="Arial"/>
-        </w:rPr>
-        <w:t>No high voltage: the numitron display runs at low voltage with no mercury and no ~170 V supply. The high-voltage safety note in the Copyright and Disclaimer section applies to the Nixie models only.</w:t>
-      </w:r>
-    </w:p>
-    <w:p>
-      <w:pPr>
-        <w:pStyle w:val="ListBullet"/>
-      </w:pPr>
-      <w:r>
-        <w:rPr>
-          <w:rFonts w:ascii="Arial" w:hAnsi="Arial"/>
-        </w:rPr>
-        <w:t>No cathode anti-poisoning: filaments do not poison, so Section 14 (Cathode Anti-Poisoning), the Anti-Poison settings on the AP and live forms, the power-on conditioning runs, and the noap rule keyword have no effect on Zev-7N models. The display simply runs the time continuously.</w:t>
-      </w:r>
-    </w:p>
-    <w:p>
-      <w:pPr>
-        <w:pStyle w:val="ListBullet"/>
-      </w:pPr>
-      <w:r>
-        <w:rPr>
-          <w:rFonts w:ascii="Arial" w:hAnsi="Arial"/>
-        </w:rPr>
-        <w:t>Colon indicators: the colon separators are LEDs rather than neon lamps, but every colon (neon) display pattern in Section 11 works identically. Because LEDs read much brighter than the filament tubes, a Colon LED Brightness control (0–10) is provided on both the AP Settings form and the live form. It is a trim, not an absolute level: the colons still follow the Nixie Brightness setting and the light sensor, and this control only sets how bright they sit against the tubes. The default is 3. Raise it if the colons look too dim at low display brightness, lower it if they overpower the tubes.</w:t>
-      </w:r>
-    </w:p>
-    <w:p>
-      <w:pPr>
-        <w:pStyle w:val="ListBullet"/>
       </w:pPr>
       <w:r>
         <w:rPr>
@@ -10231,7 +10177,7 @@
           <w:color w:val="000000"/>
           <w:sz w:val="26"/>
         </w:rPr>
-        <w:t>Weather Sensor (BME280, Zev-7 only)</w:t>
+        <w:t>Weather Sensor (BME280)</w:t>
       </w:r>
     </w:p>
     <w:tbl>
@@ -13047,19 +12993,6 @@
       </w:r>
     </w:p>
     <w:p>
-      <w:pPr>
-        <w:spacing w:before="0" w:after="80"/>
-        <w:rPr/>
-      </w:pPr>
-      <w:r>
-        <w:rPr>
-          <w:rFonts w:ascii="Arial" w:hAnsi="Arial"/>
-          <w:sz w:val="22"/>
-        </w:rPr>
-        <w:t>Field keys. Each override uses a 2-letter short key (or its full descriptive name) followed by "=" and a value. The supported keys are: nb / nixiebrightness (Nixie brightness 0-9), cd / colondisplay (colon neon pattern 0-8, see Section 11), lb / ledbrightness (LED brightness 0-9), le / ledeffect (LED effect 0-12, see Section 9), lc / ledcolor (LED color, hex #RRGGBB or color name), ub / underbrightness (under-light brightness 0-9, Zev-7 full only), uc / undercolor (under-light color, Zev-7 full only), and pir / passiveinfrared (motion-sensor timeout 0-9 - same scale as the Motion Sensor Timeout dropdown: 0=Off, 1=10s, 2=20s, 3=30s, 4=1m, 5=5m, 6=10m, 7=15m, 8=30m, 9=1hr). Add the bare keyword "wd" / "weekday" to restrict the rule to weekdays (Mon-Fri) or "we" / "weekend" to restrict it to weekends (Sat-Sun). Fields may appear in any order - the time range does not need to be first.</w:t>
-      </w:r>
-    </w:p>
-    <w:p>
       <w:pPr/>
       <w:r>
         <w:rPr>
@@ -13155,7 +13088,7 @@
           <w:rFonts w:ascii="Arial" w:hAnsi="Arial"/>
           <w:sz w:val="22"/>
         </w:rPr>
-        <w:t xml:space="preserve">Keyword reference. Each rule may use any combination of the following keys. The short and long forms are interchangeable.</w:t>
+        <w:t>Keyword reference. Each rule may use any combination of the following keys. An override is written as a key, an equals sign and a value. Short and long forms are interchangeable, and fields may appear in any order; the time range does not have to come first.</w:t>
       </w:r>
     </w:p>
     <w:tbl>
@@ -15994,6 +15927,21 @@
         </w:pBdr>
         <w:spacing w:before="0" w:after="0"/>
         <w:rPr/>
+        <w:sectPr>
+          <w:headerReference w:type="even" r:id="rId68"/>
+          <w:footerReference w:type="even" r:id="rId71"/>
+          <w:headerReference w:type="default" r:id="rId133"/>
+          <w:headerReference w:type="first" r:id="rId133"/>
+          <w:footerReference w:type="default" r:id="rId134"/>
+          <w:footerReference w:type="first" r:id="rId134"/>
+          <w:type w:val="nextPage"/>
+          <w:pgSz w:w="12240" w:h="15840"/>
+          <w:pgMar w:left="1417" w:right="1417" w:gutter="0" w:header="720" w:top="1134" w:footer="720" w:bottom="1134"/>
+          <w:pgNumType w:start="1" w:fmt="decimal"/>
+          <w:formProt w:val="false"/>
+          <w:textDirection w:val="lrTb"/>
+          <w:docGrid w:type="default" w:linePitch="360" w:charSpace="0"/>
+        </w:sectPr>
       </w:pPr>
       <w:r>
         <w:rPr>
@@ -19276,7 +19224,7 @@
           <w:color w:val="000000"/>
           <w:sz w:val="26"/>
         </w:rPr>
-        <w:t>Temperature / Pressure / Humidity (BME280, Zev-7 only)</w:t>
+        <w:t>Temperature / Pressure / Humidity (BME280)</w:t>
       </w:r>
     </w:p>
     <w:p>
@@ -19820,7 +19768,23 @@
       </w:r>
     </w:p>
     <w:p>
-      <w:pPr/>
+      <w:pPr>
+        <w:sectPr>
+          <w:headerReference w:type="even" r:id="rId104"/>
+          <w:footerReference w:type="even" r:id="rId107"/>
+          <w:headerReference w:type="default" r:id="rId135"/>
+          <w:headerReference w:type="first" r:id="rId135"/>
+          <w:footerReference w:type="default" r:id="rId136"/>
+          <w:footerReference w:type="first" r:id="rId136"/>
+          <w:type w:val="nextPage"/>
+          <w:pgSz w:w="12240" w:h="15840"/>
+          <w:pgMar w:left="1417" w:right="1417" w:gutter="0" w:header="720" w:top="1134" w:footer="720" w:bottom="1134"/>
+          <w:pgNumType w:start="1" w:fmt="decimal"/>
+          <w:formProt w:val="false"/>
+          <w:textDirection w:val="lrTb"/>
+          <w:docGrid w:type="default" w:linePitch="360" w:charSpace="0"/>
+        </w:sectPr>
+      </w:pPr>
       <w:r>
         <w:rPr>
           <w:rFonts w:ascii="Arial" w:hAnsi="Arial"/>
@@ -20723,7 +20687,7 @@
           <w:rFonts w:ascii="Arial" w:hAnsi="Arial"/>
           <w:sz w:val="22"/>
         </w:rPr>
-        <w:t>Firmware updates never reset your settings. Every update - patch, minor or major - preserves your configuration and WiFi credentials. (Earlier firmware wiped settings on a major version change; that behavior was removed.)</w:t>
+        <w:t>Firmware updates never reset your settings. Every update - patch, minor or major - preserves your configuration and WiFi credentials.</w:t>
       </w:r>
     </w:p>
     <w:p>
@@ -20731,21 +20695,6 @@
         <w:pStyle w:val="Normal"/>
         <w:spacing w:before="0" w:after="80"/>
         <w:rPr/>
-        <w:sectPr>
-          <w:headerReference w:type="even" r:id="rId104"/>
-          <w:headerReference w:type="default" r:id="rId105"/>
-          <w:headerReference w:type="first" r:id="rId106"/>
-          <w:footerReference w:type="even" r:id="rId107"/>
-          <w:footerReference w:type="default" r:id="rId108"/>
-          <w:footerReference w:type="first" r:id="rId109"/>
-          <w:type w:val="nextPage"/>
-          <w:pgSz w:w="12240" w:h="15840"/>
-          <w:pgMar w:left="1417" w:right="1417" w:gutter="0" w:header="720" w:top="1134" w:footer="720" w:bottom="1134"/>
-          <w:pgNumType w:start="1" w:fmt="decimal"/>
-          <w:formProt w:val="false"/>
-          <w:textDirection w:val="lrTb"/>
-          <w:docGrid w:type="default" w:linePitch="360" w:charSpace="0"/>
-        </w:sectPr>
       </w:pPr>
       <w:r>
         <w:rPr>
@@ -20760,21 +20709,6 @@
         <w:pStyle w:val="Heading2"/>
         <w:spacing w:before="0" w:after="80"/>
         <w:rPr/>
-        <w:sectPr>
-          <w:headerReference w:type="even" r:id="rId104"/>
-          <w:headerReference w:type="default" r:id="rId105"/>
-          <w:headerReference w:type="first" r:id="rId106"/>
-          <w:footerReference w:type="even" r:id="rId107"/>
-          <w:footerReference w:type="default" r:id="rId108"/>
-          <w:footerReference w:type="first" r:id="rId109"/>
-          <w:type w:val="nextPage"/>
-          <w:pgSz w:w="12240" w:h="15840"/>
-          <w:pgMar w:left="1417" w:right="1417" w:gutter="0" w:header="720" w:top="1134" w:footer="720" w:bottom="1134"/>
-          <w:pgNumType w:start="1" w:fmt="decimal"/>
-          <w:formProt w:val="false"/>
-          <w:textDirection w:val="lrTb"/>
-          <w:docGrid w:type="default" w:linePitch="360" w:charSpace="0"/>
-        </w:sectPr>
       </w:pPr>
       <w:r>
         <w:rPr>
@@ -20789,21 +20723,6 @@
       <w:pPr>
         <w:spacing w:before="0" w:after="80"/>
         <w:rPr/>
-        <w:sectPr>
-          <w:headerReference w:type="even" r:id="rId104"/>
-          <w:headerReference w:type="default" r:id="rId105"/>
-          <w:headerReference w:type="first" r:id="rId106"/>
-          <w:footerReference w:type="even" r:id="rId107"/>
-          <w:footerReference w:type="default" r:id="rId108"/>
-          <w:footerReference w:type="first" r:id="rId109"/>
-          <w:type w:val="nextPage"/>
-          <w:pgSz w:w="12240" w:h="15840"/>
-          <w:pgMar w:left="1417" w:right="1417" w:gutter="0" w:header="720" w:top="1134" w:footer="720" w:bottom="1134"/>
-          <w:pgNumType w:start="1" w:fmt="decimal"/>
-          <w:formProt w:val="false"/>
-          <w:textDirection w:val="lrTb"/>
-          <w:docGrid w:type="default" w:linePitch="360" w:charSpace="0"/>
-        </w:sectPr>
       </w:pPr>
       <w:r>
         <w:rPr>
@@ -20817,21 +20736,6 @@
       <w:pPr>
         <w:spacing w:before="0" w:after="80"/>
         <w:rPr/>
-        <w:sectPr>
-          <w:headerReference w:type="even" r:id="rId104"/>
-          <w:headerReference w:type="default" r:id="rId105"/>
-          <w:headerReference w:type="first" r:id="rId106"/>
-          <w:footerReference w:type="even" r:id="rId107"/>
-          <w:footerReference w:type="default" r:id="rId108"/>
-          <w:footerReference w:type="first" r:id="rId109"/>
-          <w:type w:val="nextPage"/>
-          <w:pgSz w:w="12240" w:h="15840"/>
-          <w:pgMar w:left="1417" w:right="1417" w:gutter="0" w:header="720" w:top="1134" w:footer="720" w:bottom="1134"/>
-          <w:pgNumType w:start="1" w:fmt="decimal"/>
-          <w:formProt w:val="false"/>
-          <w:textDirection w:val="lrTb"/>
-          <w:docGrid w:type="default" w:linePitch="360" w:charSpace="0"/>
-        </w:sectPr>
       </w:pPr>
       <w:r>
         <w:rPr>
@@ -20845,21 +20749,6 @@
       <w:pPr>
         <w:spacing w:before="0" w:after="80"/>
         <w:rPr/>
-        <w:sectPr>
-          <w:headerReference w:type="even" r:id="rId104"/>
-          <w:headerReference w:type="default" r:id="rId105"/>
-          <w:headerReference w:type="first" r:id="rId106"/>
-          <w:footerReference w:type="even" r:id="rId107"/>
-          <w:footerReference w:type="default" r:id="rId108"/>
-          <w:footerReference w:type="first" r:id="rId109"/>
-          <w:type w:val="nextPage"/>
-          <w:pgSz w:w="12240" w:h="15840"/>
-          <w:pgMar w:left="1417" w:right="1417" w:gutter="0" w:header="720" w:top="1134" w:footer="720" w:bottom="1134"/>
-          <w:pgNumType w:start="1" w:fmt="decimal"/>
-          <w:formProt w:val="false"/>
-          <w:textDirection w:val="lrTb"/>
-          <w:docGrid w:type="default" w:linePitch="360" w:charSpace="0"/>
-        </w:sectPr>
       </w:pPr>
       <w:r>
         <w:rPr>
@@ -20874,21 +20763,6 @@
         <w:pStyle w:val="Heading2"/>
         <w:spacing w:before="0" w:after="80"/>
         <w:rPr/>
-        <w:sectPr>
-          <w:headerReference w:type="even" r:id="rId104"/>
-          <w:headerReference w:type="default" r:id="rId105"/>
-          <w:headerReference w:type="first" r:id="rId106"/>
-          <w:footerReference w:type="even" r:id="rId107"/>
-          <w:footerReference w:type="default" r:id="rId108"/>
-          <w:footerReference w:type="first" r:id="rId109"/>
-          <w:type w:val="nextPage"/>
-          <w:pgSz w:w="12240" w:h="15840"/>
-          <w:pgMar w:left="1417" w:right="1417" w:gutter="0" w:header="720" w:top="1134" w:footer="720" w:bottom="1134"/>
-          <w:pgNumType w:start="1" w:fmt="decimal"/>
-          <w:formProt w:val="false"/>
-          <w:textDirection w:val="lrTb"/>
-          <w:docGrid w:type="default" w:linePitch="360" w:charSpace="0"/>
-        </w:sectPr>
       </w:pPr>
       <w:r>
         <w:rPr>
@@ -20903,21 +20777,6 @@
       <w:pPr>
         <w:spacing w:before="0" w:after="80"/>
         <w:rPr/>
-        <w:sectPr>
-          <w:headerReference w:type="even" r:id="rId104"/>
-          <w:headerReference w:type="default" r:id="rId105"/>
-          <w:headerReference w:type="first" r:id="rId106"/>
-          <w:footerReference w:type="even" r:id="rId107"/>
-          <w:footerReference w:type="default" r:id="rId108"/>
-          <w:footerReference w:type="first" r:id="rId109"/>
-          <w:type w:val="nextPage"/>
-          <w:pgSz w:w="12240" w:h="15840"/>
-          <w:pgMar w:left="1417" w:right="1417" w:gutter="0" w:header="720" w:top="1134" w:footer="720" w:bottom="1134"/>
-          <w:pgNumType w:start="1" w:fmt="decimal"/>
-          <w:formProt w:val="false"/>
-          <w:textDirection w:val="lrTb"/>
-          <w:docGrid w:type="default" w:linePitch="360" w:charSpace="0"/>
-        </w:sectPr>
       </w:pPr>
       <w:r>
         <w:rPr>
@@ -20931,21 +20790,6 @@
       <w:pPr>
         <w:spacing w:before="0" w:after="80"/>
         <w:rPr/>
-        <w:sectPr>
-          <w:headerReference w:type="even" r:id="rId104"/>
-          <w:headerReference w:type="default" r:id="rId105"/>
-          <w:headerReference w:type="first" r:id="rId106"/>
-          <w:footerReference w:type="even" r:id="rId107"/>
-          <w:footerReference w:type="default" r:id="rId108"/>
-          <w:footerReference w:type="first" r:id="rId109"/>
-          <w:type w:val="nextPage"/>
-          <w:pgSz w:w="12240" w:h="15840"/>
-          <w:pgMar w:left="1417" w:right="1417" w:gutter="0" w:header="720" w:top="1134" w:footer="720" w:bottom="1134"/>
-          <w:pgNumType w:start="1" w:fmt="decimal"/>
-          <w:formProt w:val="false"/>
-          <w:textDirection w:val="lrTb"/>
-          <w:docGrid w:type="default" w:linePitch="360" w:charSpace="0"/>
-        </w:sectPr>
       </w:pPr>
       <w:r>
         <w:rPr>
@@ -21171,6 +21015,457 @@
     <w:p>
       <w:pPr>
         <w:pStyle w:val="Heading1"/>
+      </w:pPr>
+      <w:r>
+        <w:rPr>
+          <w:b w:val="0"/>
+        </w:rPr>
+        <w:t>18. REST Programming</w:t>
+      </w:r>
+    </w:p>
+    <w:p>
+      <w:pPr/>
+      <w:r>
+        <w:rPr>
+          <w:b w:val="0"/>
+        </w:rPr>
+        <w:t>Every control on the live settings form can also be operated directly by URL, with no browser form involved. This style of interface is called REST (Representational State Transfer) — the web's convention for controlling things through plain URLs and standard web requests. Each setting is a named field, and a plain web request sets it — the same mechanism the form itself uses. This makes the clock scriptable from anything that can fetch a URL: a browser address bar, curl, a shell script, a phone shortcut, or a home-automation system such as Home Assistant.</w:t>
+      </w:r>
+    </w:p>
+    <w:p>
+      <w:pPr/>
+      <w:r>
+        <w:rPr>
+          <w:b/>
+        </w:rPr>
+        <w:t xml:space="preserve">Discovering the available fields. </w:t>
+      </w:r>
+      <w:r>
+        <w:rPr>
+          <w:b w:val="0"/>
+        </w:rPr>
+        <w:t xml:space="preserve">Browse to </w:t>
+      </w:r>
+      <w:r>
+        <w:rPr>
+          <w:rFonts w:ascii="Courier New" w:hAnsi="Courier New"/>
+          <w:b w:val="0"/>
+          <w:sz w:val="18"/>
+        </w:rPr>
+        <w:t>http://&lt;clock-address&gt;/fields</w:t>
+      </w:r>
+      <w:r>
+        <w:rPr>
+          <w:b w:val="0"/>
+        </w:rPr>
+        <w:t xml:space="preserve"> to get a machine-readable (JSON) list of every controllable field. Each entry shows the field's name, its label as it appears on the form, its type, its current value, and what values it accepts — the minimum/maximum for sliders, or the full option list for dropdowns. For example, an entry like</w:t>
+      </w:r>
+    </w:p>
+    <w:p>
+      <w:pPr/>
+      <w:r>
+        <w:rPr>
+          <w:rFonts w:ascii="Courier New" w:hAnsi="Courier New"/>
+          <w:b w:val="0"/>
+          <w:sz w:val="18"/>
+        </w:rPr>
+        <w:t>{"name":"brightness","label":"Nixie Brightness","type":"range",</w:t>
+      </w:r>
+    </w:p>
+    <w:p>
+      <w:pPr/>
+      <w:r>
+        <w:rPr>
+          <w:rFonts w:ascii="Courier New" w:hAnsi="Courier New"/>
+          <w:b w:val="0"/>
+          <w:sz w:val="18"/>
+        </w:rPr>
+        <w:t xml:space="preserve"> "page":1,"value":7,"min":1,"max":9,"step":1}</w:t>
+      </w:r>
+    </w:p>
+    <w:p>
+      <w:pPr/>
+      <w:r>
+        <w:rPr>
+          <w:b w:val="0"/>
+        </w:rPr>
+        <w:t xml:space="preserve">says the field </w:t>
+      </w:r>
+      <w:r>
+        <w:rPr>
+          <w:rFonts w:ascii="Courier New" w:hAnsi="Courier New"/>
+          <w:b w:val="0"/>
+          <w:sz w:val="18"/>
+        </w:rPr>
+        <w:t>brightness</w:t>
+      </w:r>
+      <w:r>
+        <w:rPr>
+          <w:b w:val="0"/>
+        </w:rPr>
+        <w:t xml:space="preserve"> is a slider currently set to 7 that accepts 1–9. Dropdown entries include an </w:t>
+      </w:r>
+      <w:r>
+        <w:rPr>
+          <w:rFonts w:ascii="Courier New" w:hAnsi="Courier New"/>
+          <w:b w:val="0"/>
+          <w:sz w:val="18"/>
+        </w:rPr>
+        <w:t>options</w:t>
+      </w:r>
+      <w:r>
+        <w:rPr>
+          <w:b w:val="0"/>
+        </w:rPr>
+        <w:t xml:space="preserve"> array; the value to send is the option's position in that list, starting at 0 (or, where an </w:t>
+      </w:r>
+      <w:r>
+        <w:rPr>
+          <w:rFonts w:ascii="Courier New" w:hAnsi="Courier New"/>
+          <w:b w:val="0"/>
+          <w:sz w:val="18"/>
+        </w:rPr>
+        <w:t>offset</w:t>
+      </w:r>
+      <w:r>
+        <w:rPr>
+          <w:b w:val="0"/>
+        </w:rPr>
+        <w:t xml:space="preserve"> is shown, the position plus that offset). Password fields are never included in the list.</w:t>
+      </w:r>
+    </w:p>
+    <w:p>
+      <w:pPr/>
+      <w:r>
+        <w:rPr>
+          <w:b/>
+        </w:rPr>
+        <w:t xml:space="preserve">Setting a field. </w:t>
+      </w:r>
+      <w:r>
+        <w:rPr>
+          <w:b w:val="0"/>
+        </w:rPr>
+        <w:t xml:space="preserve">Request </w:t>
+      </w:r>
+      <w:r>
+        <w:rPr>
+          <w:rFonts w:ascii="Courier New" w:hAnsi="Courier New"/>
+          <w:b w:val="0"/>
+          <w:sz w:val="18"/>
+        </w:rPr>
+        <w:t>http://&lt;clock-address&gt;/?field=&lt;name&gt;&amp;value=&lt;value&gt;</w:t>
+      </w:r>
+      <w:r>
+        <w:rPr>
+          <w:b w:val="0"/>
+        </w:rPr>
+        <w:t>. The change takes effect immediately, exactly as if the control had been moved on the form. Examples, using the clock's name address (an IP address works the same):</w:t>
+      </w:r>
+    </w:p>
+    <w:p>
+      <w:pPr/>
+      <w:r>
+        <w:rPr>
+          <w:rFonts w:ascii="Courier New" w:hAnsi="Courier New"/>
+          <w:b w:val="0"/>
+          <w:sz w:val="18"/>
+        </w:rPr>
+        <w:t xml:space="preserve">http://zev-7s.local/?field=brightness&amp;value=3       </w:t>
+      </w:r>
+      <w:r>
+        <w:rPr>
+          <w:b w:val="0"/>
+        </w:rPr>
+        <w:t>Nixie brightness to 3</w:t>
+      </w:r>
+    </w:p>
+    <w:p>
+      <w:pPr/>
+      <w:r>
+        <w:rPr>
+          <w:rFonts w:ascii="Courier New" w:hAnsi="Courier New"/>
+          <w:b w:val="0"/>
+          <w:sz w:val="18"/>
+        </w:rPr>
+        <w:t xml:space="preserve">http://zev-7s.local/?field=ledbr&amp;value=0            </w:t>
+      </w:r>
+      <w:r>
+        <w:rPr>
+          <w:b w:val="0"/>
+        </w:rPr>
+        <w:t>Digit LEDs off</w:t>
+      </w:r>
+    </w:p>
+    <w:p>
+      <w:pPr/>
+      <w:r>
+        <w:rPr>
+          <w:rFonts w:ascii="Courier New" w:hAnsi="Courier New"/>
+          <w:b w:val="0"/>
+          <w:sz w:val="18"/>
+        </w:rPr>
+        <w:t xml:space="preserve">http://zev-7s.local/?field=ledmode&amp;value=13         </w:t>
+      </w:r>
+      <w:r>
+        <w:rPr>
+          <w:b w:val="0"/>
+        </w:rPr>
+        <w:t>LED Effect to Custom</w:t>
+      </w:r>
+    </w:p>
+    <w:p>
+      <w:pPr/>
+      <w:r>
+        <w:rPr>
+          <w:rFonts w:ascii="Courier New" w:hAnsi="Courier New"/>
+          <w:b w:val="0"/>
+          <w:sz w:val="18"/>
+        </w:rPr>
+        <w:t xml:space="preserve">http://zev-7s.local/?field=ledcolor&amp;value=16711680  </w:t>
+      </w:r>
+      <w:r>
+        <w:rPr>
+          <w:b w:val="0"/>
+        </w:rPr>
+        <w:t>LED color to red</w:t>
+      </w:r>
+    </w:p>
+    <w:p>
+      <w:pPr/>
+      <w:r>
+        <w:rPr>
+          <w:rFonts w:ascii="Courier New" w:hAnsi="Courier New"/>
+          <w:b w:val="0"/>
+          <w:sz w:val="18"/>
+        </w:rPr>
+        <w:t xml:space="preserve">http://zev-7s.local/?field=tempen&amp;value=1           </w:t>
+      </w:r>
+      <w:r>
+        <w:rPr>
+          <w:b w:val="0"/>
+        </w:rPr>
+        <w:t>Temperature display on</w:t>
+      </w:r>
+    </w:p>
+    <w:p>
+      <w:pPr/>
+      <w:r>
+        <w:rPr>
+          <w:b w:val="0"/>
+        </w:rPr>
+        <w:t xml:space="preserve">Value conventions: toggles take </w:t>
+      </w:r>
+      <w:r>
+        <w:rPr>
+          <w:rFonts w:ascii="Courier New" w:hAnsi="Courier New"/>
+          <w:b w:val="0"/>
+          <w:sz w:val="18"/>
+        </w:rPr>
+        <w:t>0</w:t>
+      </w:r>
+      <w:r>
+        <w:rPr>
+          <w:b w:val="0"/>
+        </w:rPr>
+        <w:t xml:space="preserve"> (off) or </w:t>
+      </w:r>
+      <w:r>
+        <w:rPr>
+          <w:rFonts w:ascii="Courier New" w:hAnsi="Courier New"/>
+          <w:b w:val="0"/>
+          <w:sz w:val="18"/>
+        </w:rPr>
+        <w:t>1</w:t>
+      </w:r>
+      <w:r>
+        <w:rPr>
+          <w:b w:val="0"/>
+        </w:rPr>
+        <w:t xml:space="preserve"> (on); colors take a single decimal RGB number (red = 255×65536 = 16711680, green = 65280, blue = 255); time fields take HHMM (e.g. </w:t>
+      </w:r>
+      <w:r>
+        <w:rPr>
+          <w:rFonts w:ascii="Courier New" w:hAnsi="Courier New"/>
+          <w:b w:val="0"/>
+          <w:sz w:val="18"/>
+        </w:rPr>
+        <w:t>2130</w:t>
+      </w:r>
+      <w:r>
+        <w:rPr>
+          <w:b w:val="0"/>
+        </w:rPr>
+        <w:t xml:space="preserve"> for 9:30 PM); buttons listed with type </w:t>
+      </w:r>
+      <w:r>
+        <w:rPr>
+          <w:rFonts w:ascii="Courier New" w:hAnsi="Courier New"/>
+          <w:b w:val="0"/>
+          <w:sz w:val="18"/>
+        </w:rPr>
+        <w:t>action</w:t>
+      </w:r>
+      <w:r>
+        <w:rPr>
+          <w:b w:val="0"/>
+        </w:rPr>
+        <w:t xml:space="preserve"> or </w:t>
+      </w:r>
+      <w:r>
+        <w:rPr>
+          <w:rFonts w:ascii="Courier New" w:hAnsi="Courier New"/>
+          <w:b w:val="0"/>
+          <w:sz w:val="18"/>
+        </w:rPr>
+        <w:t>button</w:t>
+      </w:r>
+      <w:r>
+        <w:rPr>
+          <w:b w:val="0"/>
+        </w:rPr>
+        <w:t xml:space="preserve"> are pressed by sending </w:t>
+      </w:r>
+      <w:r>
+        <w:rPr>
+          <w:rFonts w:ascii="Courier New" w:hAnsi="Courier New"/>
+          <w:b w:val="0"/>
+          <w:sz w:val="18"/>
+        </w:rPr>
+        <w:t>value=1</w:t>
+      </w:r>
+      <w:r>
+        <w:rPr>
+          <w:b w:val="0"/>
+        </w:rPr>
+        <w:t>.</w:t>
+      </w:r>
+    </w:p>
+    <w:p>
+      <w:pPr/>
+      <w:r>
+        <w:rPr>
+          <w:b/>
+        </w:rPr>
+        <w:t xml:space="preserve">Saving. </w:t>
+      </w:r>
+      <w:r>
+        <w:rPr>
+          <w:b w:val="0"/>
+        </w:rPr>
+        <w:t xml:space="preserve">Changes made this way are live but temporary — like the form, they last until the next power cycle unless saved. Request </w:t>
+      </w:r>
+      <w:r>
+        <w:rPr>
+          <w:rFonts w:ascii="Courier New" w:hAnsi="Courier New"/>
+          <w:b w:val="0"/>
+          <w:sz w:val="18"/>
+        </w:rPr>
+        <w:t>http://&lt;clock-address&gt;/?save=1</w:t>
+      </w:r>
+      <w:r>
+        <w:rPr>
+          <w:b w:val="0"/>
+        </w:rPr>
+        <w:t xml:space="preserve"> to persist everything changed since the last save, the equivalent of pressing Save to Memory.</w:t>
+      </w:r>
+    </w:p>
+    <w:p>
+      <w:pPr/>
+      <w:r>
+        <w:rPr>
+          <w:b/>
+        </w:rPr>
+        <w:t>From the command line or a script:</w:t>
+      </w:r>
+    </w:p>
+    <w:p>
+      <w:pPr/>
+      <w:r>
+        <w:rPr>
+          <w:rFonts w:ascii="Courier New" w:hAnsi="Courier New"/>
+          <w:b w:val="0"/>
+          <w:sz w:val="18"/>
+        </w:rPr>
+        <w:t>curl "http://zev-7s.local/?field=brightness&amp;value=3"</w:t>
+      </w:r>
+    </w:p>
+    <w:p>
+      <w:pPr/>
+      <w:r>
+        <w:rPr>
+          <w:rFonts w:ascii="Courier New" w:hAnsi="Courier New"/>
+          <w:b w:val="0"/>
+          <w:sz w:val="18"/>
+        </w:rPr>
+        <w:t>curl "http://zev-7s.local/?save=1"</w:t>
+      </w:r>
+    </w:p>
+    <w:p>
+      <w:pPr/>
+      <w:r>
+        <w:rPr>
+          <w:b w:val="0"/>
+        </w:rPr>
+        <w:t>If a Live Form Password is set, include it as the password of a standard HTTP login (the username is ignored):</w:t>
+      </w:r>
+    </w:p>
+    <w:p>
+      <w:pPr/>
+      <w:r>
+        <w:rPr>
+          <w:rFonts w:ascii="Courier New" w:hAnsi="Courier New"/>
+          <w:b w:val="0"/>
+          <w:sz w:val="18"/>
+        </w:rPr>
+        <w:t>curl -u :mypassword "http://zev-7s.local/?field=brightness&amp;value=3"</w:t>
+      </w:r>
+    </w:p>
+    <w:p>
+      <w:pPr/>
+      <w:r>
+        <w:rPr>
+          <w:b/>
+        </w:rPr>
+        <w:t>Things to know:</w:t>
+      </w:r>
+    </w:p>
+    <w:p>
+      <w:pPr>
+        <w:pStyle w:val="ListBullet"/>
+      </w:pPr>
+      <w:r>
+        <w:rPr>
+          <w:b w:val="0"/>
+        </w:rPr>
+        <w:t>Setting any display field while a rule is active disables the rules, exactly as a change on the form does (see Section 8). For schedules the clock can handle itself — dimming at night, changing colors by time of day — rules are the better tool; REST control is for triggers the clock cannot know about, such as presence detection, sunset lighting scenes, or a "movie mode" button in a home-automation dashboard.</w:t>
+      </w:r>
+    </w:p>
+    <w:p>
+      <w:pPr>
+        <w:pStyle w:val="ListBullet"/>
+      </w:pPr>
+      <w:r>
+        <w:rPr>
+          <w:b w:val="0"/>
+        </w:rPr>
+        <w:t>Field values are applied but not range-checked beyond the form's own limits; stay within the min/max shown by /fields.</w:t>
+      </w:r>
+    </w:p>
+    <w:p>
+      <w:pPr>
+        <w:pStyle w:val="ListBullet"/>
+      </w:pPr>
+      <w:r>
+        <w:rPr>
+          <w:b w:val="0"/>
+        </w:rPr>
+        <w:t>The interface is plain HTTP on the home network. The Live Form Password protects it from casual access, but as with the form itself, do not expose the clock directly to the internet.</w:t>
+      </w:r>
+    </w:p>
+    <w:p>
+      <w:pPr>
+        <w:pStyle w:val="Heading1"/>
         <w:keepNext w:val="true"/>
         <w:spacing w:before="160" w:after="160"/>
         <w:rPr/>
@@ -21182,7 +21477,7 @@
           <w:color w:val="C25600"/>
           <w:sz w:val="40"/>
         </w:rPr>
-        <w:t>18. Troubleshooting</w:t>
+        <w:t>19. Troubleshooting</w:t>
       </w:r>
     </w:p>
     <w:p>
@@ -22790,7 +23085,7 @@
         <w:color w:val="555555"/>
         <w:sz w:val="20"/>
       </w:rPr>
-      <w:t>Revision 1 — April 2026</w:t>
+      <w:t>Revision 2.1 — August 2026</w:t>
     </w:r>
     <w:r>
       <w:rPr>
@@ -22849,7 +23144,7 @@
         <w:color w:val="555555"/>
         <w:sz w:val="20"/>
       </w:rPr>
-      <w:t>Revision 1 — April 2026</w:t>
+      <w:t>Revision 2 — April 2026</w:t>
     </w:r>
     <w:r>
       <w:rPr>
@@ -22922,7 +23217,7 @@
         <w:color w:val="555555"/>
         <w:sz w:val="20"/>
       </w:rPr>
-      <w:t>Revision 1 — April 2026</w:t>
+      <w:t>Revision 2.1 — August 2026</w:t>
     </w:r>
     <w:r>
       <w:rPr>
@@ -23054,7 +23349,7 @@
         <w:color w:val="555555"/>
         <w:sz w:val="20"/>
       </w:rPr>
-      <w:t>Revision 1 — April 2026</w:t>
+      <w:t>Revision 2.1 — August 2026</w:t>
     </w:r>
     <w:r>
       <w:rPr>
@@ -23113,7 +23408,7 @@
         <w:color w:val="555555"/>
         <w:sz w:val="20"/>
       </w:rPr>
-      <w:t>Revision 1 — April 2026</w:t>
+      <w:t>Revision 2 — April 2026</w:t>
     </w:r>
     <w:r>
       <w:rPr>
@@ -23205,7 +23500,7 @@
         <w:color w:val="555555"/>
         <w:sz w:val="20"/>
       </w:rPr>
-      <w:t>Revision 1 — April 2026</w:t>
+      <w:t>Revision 2.1 — August 2026</w:t>
     </w:r>
     <w:r>
       <w:rPr>
@@ -23264,7 +23559,7 @@
         <w:color w:val="555555"/>
         <w:sz w:val="20"/>
       </w:rPr>
-      <w:t>Revision 1 — April 2026</w:t>
+      <w:t>Revision 2 — April 2026</w:t>
     </w:r>
     <w:r>
       <w:rPr>
@@ -23337,7 +23632,7 @@
         <w:color w:val="555555"/>
         <w:sz w:val="20"/>
       </w:rPr>
-      <w:t>Revision 1 — April 2026</w:t>
+      <w:t>Revision 2.1 — August 2026</w:t>
     </w:r>
     <w:r>
       <w:rPr>
@@ -23396,7 +23691,7 @@
         <w:color w:val="555555"/>
         <w:sz w:val="20"/>
       </w:rPr>
-      <w:t>Revision 1 — April 2026</w:t>
+      <w:t>Revision 2.1 — April 2026</w:t>
     </w:r>
     <w:r>
       <w:rPr>
@@ -23469,7 +23764,7 @@
         <w:color w:val="555555"/>
         <w:sz w:val="20"/>
       </w:rPr>
-      <w:t>Revision 1 — April 2026</w:t>
+      <w:t>Revision 2.1 — August 2026</w:t>
     </w:r>
     <w:r>
       <w:rPr>
@@ -23528,7 +23823,7 @@
         <w:color w:val="555555"/>
         <w:sz w:val="20"/>
       </w:rPr>
-      <w:t>Revision 1 — April 2026</w:t>
+      <w:t>Revision 2.1 — April 2026</w:t>
     </w:r>
     <w:r>
       <w:rPr>
@@ -23601,7 +23896,7 @@
         <w:color w:val="555555"/>
         <w:sz w:val="20"/>
       </w:rPr>
-      <w:t>Revision 1 — April 2026</w:t>
+      <w:t>Revision 2.1 — August 2026</w:t>
     </w:r>
     <w:r>
       <w:rPr>
@@ -23679,7 +23974,7 @@
         <w:color w:val="555555"/>
         <w:sz w:val="20"/>
       </w:rPr>
-      <w:t>Revision 1 — April 2026</w:t>
+      <w:t>Revision 2 — April 2026</w:t>
     </w:r>
     <w:r>
       <w:rPr>
@@ -23884,7 +24179,7 @@
         <w:color w:val="555555"/>
         <w:sz w:val="20"/>
       </w:rPr>
-      <w:t>Revision 1 — April 2026</w:t>
+      <w:t>Revision 2 — August 2026</w:t>
     </w:r>
     <w:r>
       <w:rPr>
@@ -23943,7 +24238,7 @@
         <w:color w:val="555555"/>
         <w:sz w:val="20"/>
       </w:rPr>
-      <w:t>Revision 1 — April 2026</w:t>
+      <w:t>Revision 2 — April 2026</w:t>
     </w:r>
     <w:r>
       <w:rPr>
@@ -24016,7 +24311,7 @@
         <w:color w:val="555555"/>
         <w:sz w:val="20"/>
       </w:rPr>
-      <w:t>Revision 1 — April 2026</w:t>
+      <w:t>Revision 2 — August 2026</w:t>
     </w:r>
     <w:r>
       <w:rPr>
@@ -24075,7 +24370,7 @@
         <w:color w:val="555555"/>
         <w:sz w:val="20"/>
       </w:rPr>
-      <w:t>Revision 1 — April 2026</w:t>
+      <w:t>Revision 2.1 — April 2026</w:t>
     </w:r>
     <w:r>
       <w:rPr>
@@ -24162,7 +24457,7 @@
         <w:color w:val="555555"/>
         <w:sz w:val="20"/>
       </w:rPr>
-      <w:t>Revision 1 — April 2026</w:t>
+      <w:t>Revision 2.1 — August 2026</w:t>
     </w:r>
     <w:r>
       <w:rPr>
@@ -24221,7 +24516,7 @@
         <w:color w:val="555555"/>
         <w:sz w:val="20"/>
       </w:rPr>
-      <w:t>Revision 1 — April 2026</w:t>
+      <w:t>Revision 2 — April 2026</w:t>
     </w:r>
     <w:r>
       <w:rPr>
@@ -24294,7 +24589,7 @@
         <w:color w:val="555555"/>
         <w:sz w:val="20"/>
       </w:rPr>
-      <w:t>Revision 1 — April 2026</w:t>
+      <w:t>Revision 2.1 — August 2026</w:t>
     </w:r>
     <w:r>
       <w:rPr>
@@ -24353,7 +24648,7 @@
         <w:color w:val="555555"/>
         <w:sz w:val="20"/>
       </w:rPr>
-      <w:t>Revision 1 — April 2026</w:t>
+      <w:t>Revision 2.1 — April 2026</w:t>
     </w:r>
     <w:r>
       <w:rPr>
@@ -24426,7 +24721,7 @@
         <w:color w:val="555555"/>
         <w:sz w:val="20"/>
       </w:rPr>
-      <w:t>Revision 1 — April 2026</w:t>
+      <w:t>Revision 2.1 — August 2026</w:t>
     </w:r>
     <w:r>
       <w:rPr>
@@ -24485,7 +24780,7 @@
         <w:color w:val="555555"/>
         <w:sz w:val="20"/>
       </w:rPr>
-      <w:t>Revision 1 — April 2026</w:t>
+      <w:t>Revision 2 — April 2026</w:t>
     </w:r>
     <w:r>
       <w:rPr>
@@ -24558,7 +24853,7 @@
         <w:color w:val="555555"/>
         <w:sz w:val="20"/>
       </w:rPr>
-      <w:t>Revision 1 — April 2026</w:t>
+      <w:t>Revision 2.1 — August 2026</w:t>
     </w:r>
     <w:r>
       <w:rPr>
@@ -24609,7 +24904,7 @@
         <w:color w:val="555555"/>
         <w:sz w:val="20"/>
       </w:rPr>
-      <w:t>Revision 1 — April 2026</w:t>
+      <w:t>Revision 2.1 — August 2026</w:t>
     </w:r>
     <w:r>
       <w:rPr>
@@ -24668,7 +24963,7 @@
         <w:color w:val="555555"/>
         <w:sz w:val="20"/>
       </w:rPr>
-      <w:t>Revision 1 — April 2026</w:t>
+      <w:t>Revision 2 — April 2026</w:t>
     </w:r>
     <w:r>
       <w:rPr>
@@ -24741,7 +25036,7 @@
         <w:color w:val="555555"/>
         <w:sz w:val="20"/>
       </w:rPr>
-      <w:t>Revision 1 — April 2026</w:t>
+      <w:t>Revision 2 — August 2026</w:t>
     </w:r>
     <w:r>
       <w:rPr>
@@ -24756,7 +25051,7 @@
         <w:color w:val="555555"/>
         <w:sz w:val="20"/>
       </w:rPr>
-      <w:t>15-</w:t>
+      <w:t>16-</w:t>
     </w:r>
     <w:r>
       <w:rPr/>
@@ -24800,7 +25095,7 @@
         <w:color w:val="555555"/>
         <w:sz w:val="20"/>
       </w:rPr>
-      <w:t>Revision 1 — April 2026</w:t>
+      <w:t>Revision 2 — April 2026</w:t>
     </w:r>
     <w:r>
       <w:rPr>
@@ -24873,7 +25168,7 @@
         <w:color w:val="555555"/>
         <w:sz w:val="20"/>
       </w:rPr>
-      <w:t>Revision 1 — April 2026</w:t>
+      <w:t>Revision 2 — August 2026</w:t>
     </w:r>
     <w:r>
       <w:rPr>
@@ -24888,7 +25183,7 @@
         <w:color w:val="555555"/>
         <w:sz w:val="20"/>
       </w:rPr>
-      <w:t>16-</w:t>
+      <w:t>17-</w:t>
     </w:r>
     <w:r>
       <w:rPr/>
@@ -24932,7 +25227,7 @@
         <w:color w:val="555555"/>
         <w:sz w:val="20"/>
       </w:rPr>
-      <w:t>Revision 1 — April 2026</w:t>
+      <w:t>Revision 2 — April 2026</w:t>
     </w:r>
     <w:r>
       <w:rPr>
@@ -25005,7 +25300,7 @@
         <w:color w:val="555555"/>
         <w:sz w:val="20"/>
       </w:rPr>
-      <w:t>Revision 1 — April 2026</w:t>
+      <w:t>Revision 2.1 — August 2026</w:t>
     </w:r>
     <w:r>
       <w:rPr>
@@ -25020,7 +25315,7 @@
         <w:color w:val="555555"/>
         <w:sz w:val="20"/>
       </w:rPr>
-      <w:t>17-</w:t>
+      <w:t>18-</w:t>
     </w:r>
     <w:r>
       <w:rPr/>
@@ -25064,7 +25359,7 @@
         <w:color w:val="555555"/>
         <w:sz w:val="20"/>
       </w:rPr>
-      <w:t>Revision 1 — April 2026</w:t>
+      <w:t>Revision 2.1 — April 2026</w:t>
     </w:r>
     <w:r>
       <w:rPr>
@@ -25115,7 +25410,7 @@
         <w:color w:val="555555"/>
         <w:sz w:val="20"/>
       </w:rPr>
-      <w:t>Revision 1 — April 2026</w:t>
+      <w:t>Revision 2 — April 2026</w:t>
     </w:r>
     <w:r>
       <w:rPr>
@@ -25188,7 +25483,7 @@
         <w:color w:val="555555"/>
         <w:sz w:val="20"/>
       </w:rPr>
-      <w:t>Revision 1 — April 2026</w:t>
+      <w:t>Revision 2 — August 2026</w:t>
     </w:r>
   </w:p>
 </w:ftr>
@@ -25212,7 +25507,125 @@
         <w:color w:val="555555"/>
         <w:sz w:val="20"/>
       </w:rPr>
-      <w:t>Revision 1 — April 2026</w:t>
+      <w:t>Revision 2 — April 2026</w:t>
+    </w:r>
+  </w:p>
+</w:ftr>
+</file>
+
+<file path=word/footer64.xml><?xml version="1.0" encoding="utf-8"?>
+<w:ftr xmlns:m="http://schemas.openxmlformats.org/officeDocument/2006/math" xmlns:mc="http://schemas.openxmlformats.org/markup-compatibility/2006" xmlns:mo="http://schemas.microsoft.com/office/mac/office/2008/main" xmlns:mv="urn:schemas-microsoft-com:mac:vml" xmlns:o="urn:schemas-microsoft-com:office:office" xmlns:r="http://schemas.openxmlformats.org/officeDocument/2006/relationships" xmlns:v="urn:schemas-microsoft-com:vml" xmlns:w10="urn:schemas-microsoft-com:office:word" xmlns:w14="http://schemas.microsoft.com/office/word/2010/wordml" xmlns:w="http://schemas.openxmlformats.org/wordprocessingml/2006/main" xmlns:wne="http://schemas.microsoft.com/office/word/2006/wordml" xmlns:wp14="http://schemas.microsoft.com/office/word/2010/wordprocessingDrawing" xmlns:wp="http://schemas.openxmlformats.org/drawingml/2006/wordprocessingDrawing" xmlns:wpc="http://schemas.microsoft.com/office/word/2010/wordprocessingCanvas" xmlns:wpg="http://schemas.microsoft.com/office/word/2010/wordprocessingGroup" xmlns:wpi="http://schemas.microsoft.com/office/word/2010/wordprocessingInk" xmlns:wps="http://schemas.microsoft.com/office/word/2010/wordprocessingShape" mc:Ignorable="w14 wp14">
+  <w:p>
+    <w:pPr>
+      <w:pStyle w:val="Footer"/>
+      <w:pBdr>
+        <w:top w:val="single" w:sz="4" w:space="2" w:color="808080"/>
+      </w:pBdr>
+      <w:spacing w:before="40" w:after="0"/>
+      <w:jc w:val="start"/>
+      <w:rPr/>
+    </w:pPr>
+    <w:r>
+      <w:rPr>
+        <w:rFonts w:ascii="Arial" w:hAnsi="Arial"/>
+        <w:color w:val="555555"/>
+        <w:sz w:val="20"/>
+      </w:rPr>
+      <w:t>Revision 2.1 — August 2026</w:t>
+    </w:r>
+    <w:r>
+      <w:rPr>
+        <w:rFonts w:ascii="Arial" w:hAnsi="Arial"/>
+      </w:rPr>
+      <w:tab/>
+      <w:tab/>
+    </w:r>
+    <w:r>
+      <w:rPr>
+        <w:rFonts w:ascii="Arial" w:hAnsi="Arial"/>
+        <w:color w:val="555555"/>
+        <w:sz w:val="20"/>
+      </w:rPr>
+      <w:t>8-</w:t>
+    </w:r>
+    <w:r>
+      <w:rPr/>
+      <w:fldChar w:fldCharType="begin"/>
+    </w:r>
+    <w:r>
+      <w:rPr/>
+      <w:instrText xml:space="preserve"> PAGE </w:instrText>
+    </w:r>
+    <w:r>
+      <w:rPr/>
+      <w:fldChar w:fldCharType="separate"/>
+    </w:r>
+    <w:r>
+      <w:rPr/>
+      <w:t>1</w:t>
+    </w:r>
+    <w:r>
+      <w:rPr/>
+      <w:fldChar w:fldCharType="end"/>
+    </w:r>
+  </w:p>
+</w:ftr>
+</file>
+
+<file path=word/footer65.xml><?xml version="1.0" encoding="utf-8"?>
+<w:ftr xmlns:m="http://schemas.openxmlformats.org/officeDocument/2006/math" xmlns:mc="http://schemas.openxmlformats.org/markup-compatibility/2006" xmlns:mo="http://schemas.microsoft.com/office/mac/office/2008/main" xmlns:mv="urn:schemas-microsoft-com:mac:vml" xmlns:o="urn:schemas-microsoft-com:office:office" xmlns:r="http://schemas.openxmlformats.org/officeDocument/2006/relationships" xmlns:v="urn:schemas-microsoft-com:vml" xmlns:w10="urn:schemas-microsoft-com:office:word" xmlns:w14="http://schemas.microsoft.com/office/word/2010/wordml" xmlns:w="http://schemas.openxmlformats.org/wordprocessingml/2006/main" xmlns:wne="http://schemas.microsoft.com/office/word/2006/wordml" xmlns:wp14="http://schemas.microsoft.com/office/word/2010/wordprocessingDrawing" xmlns:wp="http://schemas.openxmlformats.org/drawingml/2006/wordprocessingDrawing" xmlns:wpc="http://schemas.microsoft.com/office/word/2010/wordprocessingCanvas" xmlns:wpg="http://schemas.microsoft.com/office/word/2010/wordprocessingGroup" xmlns:wpi="http://schemas.microsoft.com/office/word/2010/wordprocessingInk" xmlns:wps="http://schemas.microsoft.com/office/word/2010/wordprocessingShape" mc:Ignorable="w14 wp14">
+  <w:p>
+    <w:pPr>
+      <w:pStyle w:val="Footer"/>
+      <w:pBdr>
+        <w:top w:val="single" w:sz="4" w:space="2" w:color="808080"/>
+      </w:pBdr>
+      <w:spacing w:before="40" w:after="0"/>
+      <w:jc w:val="start"/>
+      <w:rPr/>
+    </w:pPr>
+    <w:r>
+      <w:rPr>
+        <w:rFonts w:ascii="Arial" w:hAnsi="Arial"/>
+        <w:color w:val="555555"/>
+        <w:sz w:val="20"/>
+      </w:rPr>
+      <w:t>Revision 2 — August 2026</w:t>
+    </w:r>
+    <w:r>
+      <w:rPr>
+        <w:rFonts w:ascii="Arial" w:hAnsi="Arial"/>
+      </w:rPr>
+      <w:tab/>
+      <w:tab/>
+    </w:r>
+    <w:r>
+      <w:rPr>
+        <w:rFonts w:ascii="Arial" w:hAnsi="Arial"/>
+        <w:color w:val="555555"/>
+        <w:sz w:val="20"/>
+      </w:rPr>
+      <w:t>15-</w:t>
+    </w:r>
+    <w:r>
+      <w:rPr/>
+      <w:fldChar w:fldCharType="begin"/>
+    </w:r>
+    <w:r>
+      <w:rPr/>
+      <w:instrText xml:space="preserve"> PAGE </w:instrText>
+    </w:r>
+    <w:r>
+      <w:rPr/>
+      <w:fldChar w:fldCharType="separate"/>
+    </w:r>
+    <w:r>
+      <w:rPr/>
+      <w:t>1</w:t>
+    </w:r>
+    <w:r>
+      <w:rPr/>
+      <w:fldChar w:fldCharType="end"/>
     </w:r>
   </w:p>
 </w:ftr>
@@ -25250,7 +25663,7 @@
         <w:color w:val="555555"/>
         <w:sz w:val="20"/>
       </w:rPr>
-      <w:t>Revision 1 — April 2026</w:t>
+      <w:t>Revision 2.1 — August 2026</w:t>
     </w:r>
     <w:r>
       <w:rPr>
@@ -25309,7 +25722,7 @@
         <w:color w:val="555555"/>
         <w:sz w:val="20"/>
       </w:rPr>
-      <w:t>Revision 1 — April 2026</w:t>
+      <w:t>Revision 2.1 — April 2026</w:t>
     </w:r>
     <w:r>
       <w:rPr>
@@ -26370,7 +26783,7 @@
         <w:color w:val="555555"/>
         <w:sz w:val="20"/>
       </w:rPr>
-      <w:t>15. OTA Firmware Update</w:t>
+      <w:t>16. OTA Firmware Update</w:t>
     </w:r>
   </w:p>
 </w:hdr>
@@ -26434,7 +26847,7 @@
         <w:color w:val="555555"/>
         <w:sz w:val="20"/>
       </w:rPr>
-      <w:t>16. Factory Reset</w:t>
+      <w:t>17. Factory Reset</w:t>
     </w:r>
   </w:p>
 </w:hdr>
@@ -26498,7 +26911,7 @@
         <w:color w:val="555555"/>
         <w:sz w:val="20"/>
       </w:rPr>
-      <w:t>17. Troubleshooting</w:t>
+      <w:t>18. Troubleshooting</w:t>
     </w:r>
   </w:p>
 </w:hdr>
@@ -26613,6 +27026,56 @@
         <w:sz w:val="20"/>
       </w:rPr>
       <w:t>Copyright and Disclaimer</w:t>
+    </w:r>
+  </w:p>
+</w:hdr>
+</file>
+
+<file path=word/header64.xml><?xml version="1.0" encoding="utf-8"?>
+<w:hdr xmlns:m="http://schemas.openxmlformats.org/officeDocument/2006/math" xmlns:mc="http://schemas.openxmlformats.org/markup-compatibility/2006" xmlns:mo="http://schemas.microsoft.com/office/mac/office/2008/main" xmlns:mv="urn:schemas-microsoft-com:mac:vml" xmlns:o="urn:schemas-microsoft-com:office:office" xmlns:r="http://schemas.openxmlformats.org/officeDocument/2006/relationships" xmlns:v="urn:schemas-microsoft-com:vml" xmlns:w10="urn:schemas-microsoft-com:office:word" xmlns:w14="http://schemas.microsoft.com/office/word/2010/wordml" xmlns:w="http://schemas.openxmlformats.org/wordprocessingml/2006/main" xmlns:wne="http://schemas.microsoft.com/office/word/2006/wordml" xmlns:wp14="http://schemas.microsoft.com/office/word/2010/wordprocessingDrawing" xmlns:wp="http://schemas.openxmlformats.org/drawingml/2006/wordprocessingDrawing" xmlns:wpc="http://schemas.microsoft.com/office/word/2010/wordprocessingCanvas" xmlns:wpg="http://schemas.microsoft.com/office/word/2010/wordprocessingGroup" xmlns:wpi="http://schemas.microsoft.com/office/word/2010/wordprocessingInk" xmlns:wps="http://schemas.microsoft.com/office/word/2010/wordprocessingShape" mc:Ignorable="w14 wp14">
+  <w:p>
+    <w:pPr>
+      <w:pStyle w:val="Header"/>
+      <w:pBdr>
+        <w:bottom w:val="single" w:sz="4" w:space="2" w:color="808080"/>
+      </w:pBdr>
+      <w:spacing w:before="0" w:after="40"/>
+      <w:jc w:val="end"/>
+      <w:rPr/>
+    </w:pPr>
+    <w:r>
+      <w:rPr>
+        <w:rFonts w:ascii="Arial" w:hAnsi="Arial"/>
+        <w:b/>
+        <w:color w:val="555555"/>
+        <w:sz w:val="20"/>
+      </w:rPr>
+      <w:t>8. Rules</w:t>
+    </w:r>
+  </w:p>
+</w:hdr>
+</file>
+
+<file path=word/header65.xml><?xml version="1.0" encoding="utf-8"?>
+<w:hdr xmlns:m="http://schemas.openxmlformats.org/officeDocument/2006/math" xmlns:mc="http://schemas.openxmlformats.org/markup-compatibility/2006" xmlns:mo="http://schemas.microsoft.com/office/mac/office/2008/main" xmlns:mv="urn:schemas-microsoft-com:mac:vml" xmlns:o="urn:schemas-microsoft-com:office:office" xmlns:r="http://schemas.openxmlformats.org/officeDocument/2006/relationships" xmlns:v="urn:schemas-microsoft-com:vml" xmlns:w10="urn:schemas-microsoft-com:office:word" xmlns:w14="http://schemas.microsoft.com/office/word/2010/wordml" xmlns:w="http://schemas.openxmlformats.org/wordprocessingml/2006/main" xmlns:wne="http://schemas.microsoft.com/office/word/2006/wordml" xmlns:wp14="http://schemas.microsoft.com/office/word/2010/wordprocessingDrawing" xmlns:wp="http://schemas.openxmlformats.org/drawingml/2006/wordprocessingDrawing" xmlns:wpc="http://schemas.microsoft.com/office/word/2010/wordprocessingCanvas" xmlns:wpg="http://schemas.microsoft.com/office/word/2010/wordprocessingGroup" xmlns:wpi="http://schemas.microsoft.com/office/word/2010/wordprocessingInk" xmlns:wps="http://schemas.microsoft.com/office/word/2010/wordprocessingShape" mc:Ignorable="w14 wp14">
+  <w:p>
+    <w:pPr>
+      <w:pStyle w:val="Header"/>
+      <w:pBdr>
+        <w:bottom w:val="single" w:sz="4" w:space="2" w:color="808080"/>
+      </w:pBdr>
+      <w:spacing w:before="0" w:after="40"/>
+      <w:jc w:val="end"/>
+      <w:rPr/>
+    </w:pPr>
+    <w:r>
+      <w:rPr>
+        <w:rFonts w:ascii="Arial" w:hAnsi="Arial"/>
+        <w:b/>
+        <w:color w:val="555555"/>
+        <w:sz w:val="20"/>
+      </w:rPr>
+      <w:t>15. Tube Healing</w:t>
     </w:r>
   </w:p>
 </w:hdr>

</xml_diff>

<commit_message>
Zev-7 Operator Manual rev 2.2: healing runs at full brightness
Section 15 "What you see during a window" and the he / heal keyword row now
state that the tubes run at full brightness for the whole window regardless
of the brightness setting, an nb value in another rule, the light sensor or
the motion sensor - the glow is the treatment, so a dimmed cathode heals
slowly or not at all. Also notes that every tube with a digit selected takes
part, including the tenths tube even when it is normally switched off, and
that the brightness setting and rules take over again when the window ends.

Matches Zev-7S v2.7.0. Revision bumped to 2.2 (September 2026), which also
normalises the footers that still read "Revision 2".

Claude-Session: https://claude.ai/code/session_019ATiXkov9EfBfPjyg6ppQc
</commit_message>
<xml_diff>
--- a/Zev-7 Operator Manual.docx
+++ b/Zev-7 Operator Manual.docx
@@ -116,7 +116,7 @@
           <w:color w:val="000000"/>
           <w:sz w:val="24"/>
         </w:rPr>
-        <w:t>August 2026</w:t>
+        <w:t>September 2026</w:t>
       </w:r>
     </w:p>
     <w:p>
@@ -14098,7 +14098,7 @@
                 <w:rFonts w:ascii="Arial" w:hAnsi="Arial"/>
                 <w:sz w:val="20"/>
               </w:rPr>
-              <w:t>Marks the time range as a Tube Healing window and sets the session length in days (1–99; a bare heal means 30 days; heal=0 cancels healing inside a higher-priority window). During a healing window the cathodes selected on the Tube Healing page glow to recover from poisoning while every other tube stays dark, and the motion sensor is held off for the window. See Section 15. Nixie models only.</w:t>
+              <w:t>Marks the time range as a Tube Healing window and sets the session length in days (1–99; a bare heal means 30 days; heal=0 cancels healing inside a higher-priority window). During a healing window the cathodes selected on the Tube Healing page glow to recover from poisoning while every other tube stays dark, and the motion sensor is held off for the window. See Section 15. The tubes run at full brightness for the window regardless of the brightness setting, an nb value in another rule, or the light sensor. Nixie models only.</w:t>
             </w:r>
           </w:p>
         </w:tc>
@@ -19764,7 +19764,7 @@
           <w:rFonts w:ascii="Arial" w:hAnsi="Arial"/>
           <w:sz w:val="22"/>
         </w:rPr>
-        <w:t>What you see during a window. The clock stops showing the time entirely: only the selected cathodes glow, on their own tubes, and every other tube is dark. This is deliberate — a healing digit held in place of a time digit would be unreadable and would dilute the treatment. If more than one digit is selected on the same tube, that tube rotates through them, five minutes each. The motion sensor, the scheduled anti-poison cycles, and the date and weather info displays are all suspended for the duration of the window so the treatment runs uninterrupted. Outside the window the clock behaves normally.</w:t>
+        <w:t>What you see during a window. The clock stops showing the time entirely: only the selected cathodes glow, on their own tubes, and every other tube is dark. This is deliberate — a healing digit held in place of a time digit would be unreadable and would dilute the treatment. If more than one digit is selected on the same tube, that tube rotates through them, five minutes each. The motion sensor, the scheduled anti-poison cycles, and the date and weather info displays are all suspended for the duration of the window so the treatment runs uninterrupted. The tubes run at full brightness for the whole window, regardless of the brightness setting, an nb value in any rule, the light sensor, or the motion sensor — the glow itself is the treatment, so a dimmed cathode heals slowly or not at all. Every tube with a digit selected takes part, including the tenths tube, even if it is normally switched off. Outside the window the clock behaves normally, with the brightness setting and any rules back in charge.</w:t>
       </w:r>
     </w:p>
     <w:p>
@@ -23085,7 +23085,7 @@
         <w:color w:val="555555"/>
         <w:sz w:val="20"/>
       </w:rPr>
-      <w:t>Revision 2.1 — August 2026</w:t>
+      <w:t>Revision 2.2 — September 2026</w:t>
     </w:r>
     <w:r>
       <w:rPr>
@@ -23217,7 +23217,7 @@
         <w:color w:val="555555"/>
         <w:sz w:val="20"/>
       </w:rPr>
-      <w:t>Revision 2.1 — August 2026</w:t>
+      <w:t>Revision 2.2 — September 2026</w:t>
     </w:r>
     <w:r>
       <w:rPr>
@@ -23349,7 +23349,7 @@
         <w:color w:val="555555"/>
         <w:sz w:val="20"/>
       </w:rPr>
-      <w:t>Revision 2.1 — August 2026</w:t>
+      <w:t>Revision 2.2 — September 2026</w:t>
     </w:r>
     <w:r>
       <w:rPr>
@@ -23500,7 +23500,7 @@
         <w:color w:val="555555"/>
         <w:sz w:val="20"/>
       </w:rPr>
-      <w:t>Revision 2.1 — August 2026</w:t>
+      <w:t>Revision 2.2 — September 2026</w:t>
     </w:r>
     <w:r>
       <w:rPr>
@@ -23632,7 +23632,7 @@
         <w:color w:val="555555"/>
         <w:sz w:val="20"/>
       </w:rPr>
-      <w:t>Revision 2.1 — August 2026</w:t>
+      <w:t>Revision 2.2 — September 2026</w:t>
     </w:r>
     <w:r>
       <w:rPr>
@@ -23764,7 +23764,7 @@
         <w:color w:val="555555"/>
         <w:sz w:val="20"/>
       </w:rPr>
-      <w:t>Revision 2.1 — August 2026</w:t>
+      <w:t>Revision 2.2 — September 2026</w:t>
     </w:r>
     <w:r>
       <w:rPr>
@@ -23896,7 +23896,7 @@
         <w:color w:val="555555"/>
         <w:sz w:val="20"/>
       </w:rPr>
-      <w:t>Revision 2.1 — August 2026</w:t>
+      <w:t>Revision 2.2 — September 2026</w:t>
     </w:r>
     <w:r>
       <w:rPr>
@@ -24179,7 +24179,7 @@
         <w:color w:val="555555"/>
         <w:sz w:val="20"/>
       </w:rPr>
-      <w:t>Revision 2 — August 2026</w:t>
+      <w:t>Revision 2.2 — September 2026</w:t>
     </w:r>
     <w:r>
       <w:rPr>
@@ -24311,7 +24311,7 @@
         <w:color w:val="555555"/>
         <w:sz w:val="20"/>
       </w:rPr>
-      <w:t>Revision 2 — August 2026</w:t>
+      <w:t>Revision 2.2 — September 2026</w:t>
     </w:r>
     <w:r>
       <w:rPr>
@@ -24457,7 +24457,7 @@
         <w:color w:val="555555"/>
         <w:sz w:val="20"/>
       </w:rPr>
-      <w:t>Revision 2.1 — August 2026</w:t>
+      <w:t>Revision 2.2 — September 2026</w:t>
     </w:r>
     <w:r>
       <w:rPr>
@@ -24589,7 +24589,7 @@
         <w:color w:val="555555"/>
         <w:sz w:val="20"/>
       </w:rPr>
-      <w:t>Revision 2.1 — August 2026</w:t>
+      <w:t>Revision 2.2 — September 2026</w:t>
     </w:r>
     <w:r>
       <w:rPr>
@@ -24721,7 +24721,7 @@
         <w:color w:val="555555"/>
         <w:sz w:val="20"/>
       </w:rPr>
-      <w:t>Revision 2.1 — August 2026</w:t>
+      <w:t>Revision 2.2 — September 2026</w:t>
     </w:r>
     <w:r>
       <w:rPr>
@@ -24853,7 +24853,7 @@
         <w:color w:val="555555"/>
         <w:sz w:val="20"/>
       </w:rPr>
-      <w:t>Revision 2.1 — August 2026</w:t>
+      <w:t>Revision 2.2 — September 2026</w:t>
     </w:r>
     <w:r>
       <w:rPr>
@@ -24904,7 +24904,7 @@
         <w:color w:val="555555"/>
         <w:sz w:val="20"/>
       </w:rPr>
-      <w:t>Revision 2.1 — August 2026</w:t>
+      <w:t>Revision 2.2 — September 2026</w:t>
     </w:r>
     <w:r>
       <w:rPr>
@@ -25036,7 +25036,7 @@
         <w:color w:val="555555"/>
         <w:sz w:val="20"/>
       </w:rPr>
-      <w:t>Revision 2 — August 2026</w:t>
+      <w:t>Revision 2.2 — September 2026</w:t>
     </w:r>
     <w:r>
       <w:rPr>
@@ -25168,7 +25168,7 @@
         <w:color w:val="555555"/>
         <w:sz w:val="20"/>
       </w:rPr>
-      <w:t>Revision 2 — August 2026</w:t>
+      <w:t>Revision 2.2 — September 2026</w:t>
     </w:r>
     <w:r>
       <w:rPr>
@@ -25300,7 +25300,7 @@
         <w:color w:val="555555"/>
         <w:sz w:val="20"/>
       </w:rPr>
-      <w:t>Revision 2.1 — August 2026</w:t>
+      <w:t>Revision 2.2 — September 2026</w:t>
     </w:r>
     <w:r>
       <w:rPr>
@@ -25483,7 +25483,7 @@
         <w:color w:val="555555"/>
         <w:sz w:val="20"/>
       </w:rPr>
-      <w:t>Revision 2 — August 2026</w:t>
+      <w:t>Revision 2.2 — September 2026</w:t>
     </w:r>
   </w:p>
 </w:ftr>
@@ -25531,7 +25531,7 @@
         <w:color w:val="555555"/>
         <w:sz w:val="20"/>
       </w:rPr>
-      <w:t>Revision 2.1 — August 2026</w:t>
+      <w:t>Revision 2.2 — September 2026</w:t>
     </w:r>
     <w:r>
       <w:rPr>
@@ -25590,7 +25590,7 @@
         <w:color w:val="555555"/>
         <w:sz w:val="20"/>
       </w:rPr>
-      <w:t>Revision 2 — August 2026</w:t>
+      <w:t>Revision 2.2 — September 2026</w:t>
     </w:r>
     <w:r>
       <w:rPr>
@@ -25663,7 +25663,7 @@
         <w:color w:val="555555"/>
         <w:sz w:val="20"/>
       </w:rPr>
-      <w:t>Revision 2.1 — August 2026</w:t>
+      <w:t>Revision 2.2 — September 2026</w:t>
     </w:r>
     <w:r>
       <w:rPr>

</xml_diff>

<commit_message>
Zev-7 Operator Manual: split section 18/19 running header and page numbers
Rev 2.1 added "18. REST Programming" inside the Troubleshooting Word section
without splitting it, so both chapters rendered under the running header
"18. Troubleshooting" and shared one 18-N page sequence - the TOC promised
18-1 and 19-1, and only 18-1 existed.

A section break at the end of the REST chapter gives each its own header and
page prefix (18. REST Programming / 18-N, 19. Troubleshooting / 19-N), both
restarting at 1 like every other chapter. Troubleshooting now starts on its
own page as the other chapters do, so the manual is 39 pages rather than 38.

Claude-Session: https://claude.ai/code/session_019ATiXkov9EfBfPjyg6ppQc
</commit_message>
<xml_diff>
--- a/Zev-7 Operator Manual.docx
+++ b/Zev-7 Operator Manual.docx
@@ -21455,6 +21455,21 @@
     <w:p>
       <w:pPr>
         <w:pStyle w:val="ListBullet"/>
+        <w:sectPr>
+          <w:headerReference w:type="even" r:id="rId116"/>
+          <w:headerReference w:type="default" r:id="rId137"/>
+          <w:headerReference w:type="first" r:id="rId118"/>
+          <w:footerReference w:type="even" r:id="rId119"/>
+          <w:footerReference w:type="default" r:id="rId138"/>
+          <w:footerReference w:type="first" r:id="rId121"/>
+          <w:type w:val="nextPage"/>
+          <w:pgSz w:w="12240" w:h="15840"/>
+          <w:pgMar w:left="1417" w:right="1417" w:gutter="0" w:header="720" w:top="1134" w:footer="720" w:bottom="1134"/>
+          <w:pgNumType w:start="1" w:fmt="decimal"/>
+          <w:formProt w:val="false"/>
+          <w:textDirection w:val="lrTb"/>
+          <w:docGrid w:type="default" w:linePitch="360" w:charSpace="0"/>
+        </w:sectPr>
       </w:pPr>
       <w:r>
         <w:rPr>
@@ -25315,7 +25330,7 @@
         <w:color w:val="555555"/>
         <w:sz w:val="20"/>
       </w:rPr>
-      <w:t>18-</w:t>
+      <w:t>19-</w:t>
     </w:r>
     <w:r>
       <w:rPr/>
@@ -25631,6 +25646,65 @@
 </w:ftr>
 </file>
 
+<file path=word/footer66.xml><?xml version="1.0" encoding="utf-8"?>
+<w:ftr xmlns:m="http://schemas.openxmlformats.org/officeDocument/2006/math" xmlns:mc="http://schemas.openxmlformats.org/markup-compatibility/2006" xmlns:mo="http://schemas.microsoft.com/office/mac/office/2008/main" xmlns:mv="urn:schemas-microsoft-com:mac:vml" xmlns:o="urn:schemas-microsoft-com:office:office" xmlns:r="http://schemas.openxmlformats.org/officeDocument/2006/relationships" xmlns:v="urn:schemas-microsoft-com:vml" xmlns:w10="urn:schemas-microsoft-com:office:word" xmlns:w14="http://schemas.microsoft.com/office/word/2010/wordml" xmlns:w="http://schemas.openxmlformats.org/wordprocessingml/2006/main" xmlns:wne="http://schemas.microsoft.com/office/word/2006/wordml" xmlns:wp14="http://schemas.microsoft.com/office/word/2010/wordprocessingDrawing" xmlns:wp="http://schemas.openxmlformats.org/drawingml/2006/wordprocessingDrawing" xmlns:wpc="http://schemas.microsoft.com/office/word/2010/wordprocessingCanvas" xmlns:wpg="http://schemas.microsoft.com/office/word/2010/wordprocessingGroup" xmlns:wpi="http://schemas.microsoft.com/office/word/2010/wordprocessingInk" xmlns:wps="http://schemas.microsoft.com/office/word/2010/wordprocessingShape" mc:Ignorable="w14 wp14">
+  <w:p>
+    <w:pPr>
+      <w:pStyle w:val="Footer"/>
+      <w:pBdr>
+        <w:top w:val="single" w:sz="4" w:space="2" w:color="808080"/>
+      </w:pBdr>
+      <w:spacing w:before="40" w:after="0"/>
+      <w:jc w:val="start"/>
+      <w:rPr/>
+    </w:pPr>
+    <w:r>
+      <w:rPr>
+        <w:rFonts w:ascii="Arial" w:hAnsi="Arial"/>
+        <w:color w:val="555555"/>
+        <w:sz w:val="20"/>
+      </w:rPr>
+      <w:t>Revision 2.2 — September 2026</w:t>
+    </w:r>
+    <w:r>
+      <w:rPr>
+        <w:rFonts w:ascii="Arial" w:hAnsi="Arial"/>
+      </w:rPr>
+      <w:tab/>
+      <w:tab/>
+    </w:r>
+    <w:r>
+      <w:rPr>
+        <w:rFonts w:ascii="Arial" w:hAnsi="Arial"/>
+        <w:color w:val="555555"/>
+        <w:sz w:val="20"/>
+      </w:rPr>
+      <w:t>18-</w:t>
+    </w:r>
+    <w:r>
+      <w:rPr/>
+      <w:fldChar w:fldCharType="begin"/>
+    </w:r>
+    <w:r>
+      <w:rPr/>
+      <w:instrText xml:space="preserve"> PAGE </w:instrText>
+    </w:r>
+    <w:r>
+      <w:rPr/>
+      <w:fldChar w:fldCharType="separate"/>
+    </w:r>
+    <w:r>
+      <w:rPr/>
+      <w:t>2</w:t>
+    </w:r>
+    <w:r>
+      <w:rPr/>
+      <w:fldChar w:fldCharType="end"/>
+    </w:r>
+  </w:p>
+</w:ftr>
+</file>
+
 <file path=word/footer7.xml><?xml version="1.0" encoding="utf-8"?>
 <w:ftr xmlns:o="urn:schemas-microsoft-com:office:office" xmlns:r="http://schemas.openxmlformats.org/officeDocument/2006/relationships" xmlns:v="urn:schemas-microsoft-com:vml" xmlns:w="http://schemas.openxmlformats.org/wordprocessingml/2006/main" xmlns:w10="urn:schemas-microsoft-com:office:word" xmlns:wp="http://schemas.openxmlformats.org/drawingml/2006/wordprocessingDrawing" xmlns:pic="http://schemas.openxmlformats.org/drawingml/2006/picture" xmlns:wps="http://schemas.microsoft.com/office/word/2010/wordprocessingShape" xmlns:wpg="http://schemas.microsoft.com/office/word/2010/wordprocessingGroup" xmlns:mc="http://schemas.openxmlformats.org/markup-compatibility/2006" xmlns:wp14="http://schemas.microsoft.com/office/word/2010/wordprocessingDrawing" xmlns:w14="http://schemas.microsoft.com/office/word/2010/wordml" xmlns:w15="http://schemas.microsoft.com/office/word/2012/wordml" mc:Ignorable="w14 wp14 w15">
   <w:p>
@@ -26911,7 +26985,7 @@
         <w:color w:val="555555"/>
         <w:sz w:val="20"/>
       </w:rPr>
-      <w:t>18. Troubleshooting</w:t>
+      <w:t>19. Troubleshooting</w:t>
     </w:r>
   </w:p>
 </w:hdr>
@@ -27076,6 +27150,31 @@
         <w:sz w:val="20"/>
       </w:rPr>
       <w:t>15. Tube Healing</w:t>
+    </w:r>
+  </w:p>
+</w:hdr>
+</file>
+
+<file path=word/header66.xml><?xml version="1.0" encoding="utf-8"?>
+<w:hdr xmlns:m="http://schemas.openxmlformats.org/officeDocument/2006/math" xmlns:mc="http://schemas.openxmlformats.org/markup-compatibility/2006" xmlns:mo="http://schemas.microsoft.com/office/mac/office/2008/main" xmlns:mv="urn:schemas-microsoft-com:mac:vml" xmlns:o="urn:schemas-microsoft-com:office:office" xmlns:r="http://schemas.openxmlformats.org/officeDocument/2006/relationships" xmlns:v="urn:schemas-microsoft-com:vml" xmlns:w10="urn:schemas-microsoft-com:office:word" xmlns:w14="http://schemas.microsoft.com/office/word/2010/wordml" xmlns:w="http://schemas.openxmlformats.org/wordprocessingml/2006/main" xmlns:wne="http://schemas.microsoft.com/office/word/2006/wordml" xmlns:wp14="http://schemas.microsoft.com/office/word/2010/wordprocessingDrawing" xmlns:wp="http://schemas.openxmlformats.org/drawingml/2006/wordprocessingDrawing" xmlns:wpc="http://schemas.microsoft.com/office/word/2010/wordprocessingCanvas" xmlns:wpg="http://schemas.microsoft.com/office/word/2010/wordprocessingGroup" xmlns:wpi="http://schemas.microsoft.com/office/word/2010/wordprocessingInk" xmlns:wps="http://schemas.microsoft.com/office/word/2010/wordprocessingShape" mc:Ignorable="w14 wp14">
+  <w:p>
+    <w:pPr>
+      <w:pStyle w:val="Header"/>
+      <w:pBdr>
+        <w:bottom w:val="single" w:sz="4" w:space="2" w:color="808080"/>
+      </w:pBdr>
+      <w:spacing w:before="0" w:after="40"/>
+      <w:jc w:val="end"/>
+      <w:rPr/>
+    </w:pPr>
+    <w:r>
+      <w:rPr>
+        <w:rFonts w:ascii="Arial" w:hAnsi="Arial"/>
+        <w:b/>
+        <w:color w:val="555555"/>
+        <w:sz w:val="20"/>
+      </w:rPr>
+      <w:t>18. REST Programming</w:t>
     </w:r>
   </w:p>
 </w:hdr>

</xml_diff>

<commit_message>
Zev-7 Operator Manual: retire the stale first-page headers and footers
Every section carried a separate "first page" header/footer part holding an
April 2026 snapshot - "Revision 2 - April 2026", and chapter names one number
behind from section 15 on ("15. OTA Firmware Update", "17. Troubleshooting").
Nothing rendered them, because no section sets titlePg, so they had drifted
unnoticed through several revisions and would have surfaced the moment anyone
enabled a different first page.

Each first-page reference now points at the same part as its section's default,
which is what sections 5, 11 and 18 already did. Rendered output is unchanged:
39 pages, no text difference on any page. The cover section is untouched.

Claude-Session: https://claude.ai/code/session_019ATiXkov9EfBfPjyg6ppQc
</commit_message>
<xml_diff>
--- a/Zev-7 Operator Manual.docx
+++ b/Zev-7 Operator Manual.docx
@@ -874,10 +874,10 @@
         <w:sectPr>
           <w:headerReference w:type="even" r:id="rId8"/>
           <w:headerReference w:type="default" r:id="rId9"/>
-          <w:headerReference w:type="first" r:id="rId10"/>
+          <w:headerReference w:type="first" r:id="rId9"/>
           <w:footerReference w:type="even" r:id="rId11"/>
           <w:footerReference w:type="default" r:id="rId12"/>
-          <w:footerReference w:type="first" r:id="rId13"/>
+          <w:footerReference w:type="first" r:id="rId12"/>
           <w:type w:val="nextPage"/>
           <w:pgSz w:w="12240" w:h="15840"/>
           <w:pgMar w:left="1417" w:right="1417" w:gutter="0" w:header="720" w:top="1134" w:footer="720" w:bottom="1134"/>
@@ -923,10 +923,10 @@
         <w:sectPr>
           <w:headerReference w:type="even" r:id="rId8"/>
           <w:headerReference w:type="default" r:id="rId9"/>
-          <w:headerReference w:type="first" r:id="rId10"/>
+          <w:headerReference w:type="first" r:id="rId9"/>
           <w:footerReference w:type="even" r:id="rId11"/>
           <w:footerReference w:type="default" r:id="rId12"/>
-          <w:footerReference w:type="first" r:id="rId13"/>
+          <w:footerReference w:type="first" r:id="rId12"/>
           <w:type w:val="nextPage"/>
           <w:pgSz w:w="12240" w:h="15840"/>
           <w:pgMar w:left="1417" w:right="1417" w:gutter="0" w:header="720" w:top="1134" w:footer="720" w:bottom="1134"/>
@@ -1872,10 +1872,10 @@
         <w:sectPr>
           <w:headerReference w:type="even" r:id="rId14"/>
           <w:headerReference w:type="default" r:id="rId15"/>
-          <w:headerReference w:type="first" r:id="rId16"/>
+          <w:headerReference w:type="first" r:id="rId15"/>
           <w:footerReference w:type="even" r:id="rId17"/>
           <w:footerReference w:type="default" r:id="rId18"/>
-          <w:footerReference w:type="first" r:id="rId19"/>
+          <w:footerReference w:type="first" r:id="rId18"/>
           <w:type w:val="nextPage"/>
           <w:pgSz w:w="12240" w:h="15840"/>
           <w:pgMar w:left="1417" w:right="1417" w:gutter="0" w:header="720" w:top="1134" w:footer="720" w:bottom="1134"/>
@@ -2005,10 +2005,10 @@
         <w:sectPr>
           <w:headerReference w:type="even" r:id="rId20"/>
           <w:headerReference w:type="default" r:id="rId21"/>
-          <w:headerReference w:type="first" r:id="rId22"/>
+          <w:headerReference w:type="first" r:id="rId21"/>
           <w:footerReference w:type="even" r:id="rId23"/>
           <w:footerReference w:type="default" r:id="rId24"/>
-          <w:footerReference w:type="first" r:id="rId25"/>
+          <w:footerReference w:type="first" r:id="rId24"/>
           <w:type w:val="nextPage"/>
           <w:pgSz w:w="12240" w:h="15840"/>
           <w:pgMar w:left="1417" w:right="1417" w:gutter="0" w:header="720" w:top="1134" w:footer="720" w:bottom="1134"/>
@@ -4748,10 +4748,10 @@
         <w:sectPr>
           <w:headerReference w:type="even" r:id="rId32"/>
           <w:headerReference w:type="default" r:id="rId33"/>
-          <w:headerReference w:type="first" r:id="rId34"/>
+          <w:headerReference w:type="first" r:id="rId33"/>
           <w:footerReference w:type="even" r:id="rId35"/>
           <w:footerReference w:type="default" r:id="rId36"/>
-          <w:footerReference w:type="first" r:id="rId37"/>
+          <w:footerReference w:type="first" r:id="rId36"/>
           <w:type w:val="nextPage"/>
           <w:pgSz w:w="12240" w:h="15840"/>
           <w:pgMar w:left="1417" w:right="1417" w:gutter="0" w:header="720" w:top="1134" w:footer="720" w:bottom="1134"/>
@@ -5507,10 +5507,10 @@
         <w:sectPr>
           <w:headerReference w:type="even" r:id="rId38"/>
           <w:headerReference w:type="default" r:id="rId39"/>
-          <w:headerReference w:type="first" r:id="rId40"/>
+          <w:headerReference w:type="first" r:id="rId39"/>
           <w:footerReference w:type="even" r:id="rId41"/>
           <w:footerReference w:type="default" r:id="rId42"/>
-          <w:footerReference w:type="first" r:id="rId43"/>
+          <w:footerReference w:type="first" r:id="rId42"/>
           <w:type w:val="nextPage"/>
           <w:pgSz w:w="12240" w:h="15840"/>
           <w:pgMar w:left="1417" w:right="1417" w:gutter="0" w:header="720" w:top="1134" w:footer="720" w:bottom="1134"/>
@@ -5904,10 +5904,10 @@
         <w:sectPr>
           <w:headerReference w:type="even" r:id="rId44"/>
           <w:headerReference w:type="default" r:id="rId45"/>
-          <w:headerReference w:type="first" r:id="rId46"/>
+          <w:headerReference w:type="first" r:id="rId45"/>
           <w:footerReference w:type="even" r:id="rId47"/>
           <w:footerReference w:type="default" r:id="rId48"/>
-          <w:footerReference w:type="first" r:id="rId49"/>
+          <w:footerReference w:type="first" r:id="rId48"/>
           <w:type w:val="nextPage"/>
           <w:pgSz w:w="12240" w:h="15840"/>
           <w:pgMar w:left="1417" w:right="1417" w:gutter="0" w:header="720" w:top="1134" w:footer="720" w:bottom="1134"/>
@@ -12291,10 +12291,10 @@
         <w:sectPr>
           <w:headerReference w:type="even" r:id="rId50"/>
           <w:headerReference w:type="default" r:id="rId51"/>
-          <w:headerReference w:type="first" r:id="rId52"/>
+          <w:headerReference w:type="first" r:id="rId51"/>
           <w:footerReference w:type="even" r:id="rId53"/>
           <w:footerReference w:type="default" r:id="rId54"/>
-          <w:footerReference w:type="first" r:id="rId55"/>
+          <w:footerReference w:type="first" r:id="rId54"/>
           <w:type w:val="nextPage"/>
           <w:pgSz w:w="12240" w:h="15840"/>
           <w:pgMar w:left="1417" w:right="1417" w:gutter="0" w:header="720" w:top="1134" w:footer="720" w:bottom="1134"/>
@@ -12847,10 +12847,10 @@
         <w:sectPr>
           <w:headerReference w:type="even" r:id="rId56"/>
           <w:headerReference w:type="default" r:id="rId57"/>
-          <w:headerReference w:type="first" r:id="rId58"/>
+          <w:headerReference w:type="first" r:id="rId57"/>
           <w:footerReference w:type="even" r:id="rId59"/>
           <w:footerReference w:type="default" r:id="rId60"/>
-          <w:footerReference w:type="first" r:id="rId61"/>
+          <w:footerReference w:type="first" r:id="rId60"/>
           <w:type w:val="nextPage"/>
           <w:pgSz w:w="12240" w:h="15840"/>
           <w:pgMar w:left="1417" w:right="1417" w:gutter="0" w:header="720" w:top="1134" w:footer="720" w:bottom="1134"/>
@@ -17401,10 +17401,10 @@
         <w:sectPr>
           <w:headerReference w:type="even" r:id="rId68"/>
           <w:headerReference w:type="default" r:id="rId69"/>
-          <w:headerReference w:type="first" r:id="rId70"/>
+          <w:headerReference w:type="first" r:id="rId69"/>
           <w:footerReference w:type="even" r:id="rId71"/>
           <w:footerReference w:type="default" r:id="rId72"/>
-          <w:footerReference w:type="first" r:id="rId73"/>
+          <w:footerReference w:type="first" r:id="rId72"/>
           <w:type w:val="nextPage"/>
           <w:pgSz w:w="12240" w:h="15840"/>
           <w:pgMar w:left="1417" w:right="1417" w:gutter="0" w:header="720" w:top="1134" w:footer="720" w:bottom="1134"/>
@@ -17864,10 +17864,10 @@
         <w:sectPr>
           <w:headerReference w:type="even" r:id="rId74"/>
           <w:headerReference w:type="default" r:id="rId75"/>
-          <w:headerReference w:type="first" r:id="rId76"/>
+          <w:headerReference w:type="first" r:id="rId75"/>
           <w:footerReference w:type="even" r:id="rId77"/>
           <w:footerReference w:type="default" r:id="rId78"/>
-          <w:footerReference w:type="first" r:id="rId79"/>
+          <w:footerReference w:type="first" r:id="rId78"/>
           <w:type w:val="nextPage"/>
           <w:pgSz w:w="12240" w:h="15840"/>
           <w:pgMar w:left="1417" w:right="1417" w:gutter="0" w:header="720" w:top="1134" w:footer="720" w:bottom="1134"/>
@@ -18955,10 +18955,10 @@
         <w:sectPr>
           <w:headerReference w:type="even" r:id="rId80"/>
           <w:headerReference w:type="default" r:id="rId81"/>
-          <w:headerReference w:type="first" r:id="rId82"/>
+          <w:headerReference w:type="first" r:id="rId81"/>
           <w:footerReference w:type="even" r:id="rId83"/>
           <w:footerReference w:type="default" r:id="rId84"/>
-          <w:footerReference w:type="first" r:id="rId85"/>
+          <w:footerReference w:type="first" r:id="rId84"/>
           <w:type w:val="nextPage"/>
           <w:pgSz w:w="12240" w:h="15840"/>
           <w:pgMar w:left="1417" w:right="1417" w:gutter="0" w:header="720" w:top="1134" w:footer="720" w:bottom="1134"/>
@@ -19124,10 +19124,10 @@
         <w:sectPr>
           <w:headerReference w:type="even" r:id="rId86"/>
           <w:headerReference w:type="default" r:id="rId87"/>
-          <w:headerReference w:type="first" r:id="rId88"/>
+          <w:headerReference w:type="first" r:id="rId87"/>
           <w:footerReference w:type="even" r:id="rId89"/>
           <w:footerReference w:type="default" r:id="rId90"/>
-          <w:footerReference w:type="first" r:id="rId91"/>
+          <w:footerReference w:type="first" r:id="rId90"/>
           <w:type w:val="nextPage"/>
           <w:pgSz w:w="12240" w:h="15840"/>
           <w:pgMar w:left="1417" w:right="1417" w:gutter="0" w:header="720" w:top="1134" w:footer="720" w:bottom="1134"/>
@@ -19334,10 +19334,10 @@
         <w:sectPr>
           <w:headerReference w:type="even" r:id="rId92"/>
           <w:headerReference w:type="default" r:id="rId93"/>
-          <w:headerReference w:type="first" r:id="rId94"/>
+          <w:headerReference w:type="first" r:id="rId93"/>
           <w:footerReference w:type="even" r:id="rId95"/>
           <w:footerReference w:type="default" r:id="rId96"/>
-          <w:footerReference w:type="first" r:id="rId97"/>
+          <w:footerReference w:type="first" r:id="rId96"/>
           <w:type w:val="nextPage"/>
           <w:pgSz w:w="12240" w:h="15840"/>
           <w:pgMar w:left="1417" w:right="1417" w:gutter="0" w:header="720" w:top="1134" w:footer="720" w:bottom="1134"/>
@@ -19659,10 +19659,10 @@
         <w:sectPr>
           <w:headerReference w:type="even" r:id="rId98"/>
           <w:headerReference w:type="default" r:id="rId99"/>
-          <w:headerReference w:type="first" r:id="rId100"/>
+          <w:headerReference w:type="first" r:id="rId99"/>
           <w:footerReference w:type="even" r:id="rId101"/>
           <w:footerReference w:type="default" r:id="rId102"/>
-          <w:footerReference w:type="first" r:id="rId103"/>
+          <w:footerReference w:type="first" r:id="rId102"/>
           <w:type w:val="nextPage"/>
           <w:pgSz w:w="12240" w:h="15840"/>
           <w:pgMar w:left="1417" w:right="1417" w:gutter="0" w:header="720" w:top="1134" w:footer="720" w:bottom="1134"/>
@@ -20806,10 +20806,10 @@
         <w:sectPr>
           <w:headerReference w:type="even" r:id="rId104"/>
           <w:headerReference w:type="default" r:id="rId105"/>
-          <w:headerReference w:type="first" r:id="rId106"/>
+          <w:headerReference w:type="first" r:id="rId105"/>
           <w:footerReference w:type="even" r:id="rId107"/>
           <w:footerReference w:type="default" r:id="rId108"/>
-          <w:footerReference w:type="first" r:id="rId109"/>
+          <w:footerReference w:type="first" r:id="rId108"/>
           <w:type w:val="nextPage"/>
           <w:pgSz w:w="12240" w:h="15840"/>
           <w:pgMar w:left="1417" w:right="1417" w:gutter="0" w:header="720" w:top="1134" w:footer="720" w:bottom="1134"/>
@@ -20975,10 +20975,10 @@
         <w:sectPr>
           <w:headerReference w:type="even" r:id="rId110"/>
           <w:headerReference w:type="default" r:id="rId111"/>
-          <w:headerReference w:type="first" r:id="rId112"/>
+          <w:headerReference w:type="first" r:id="rId111"/>
           <w:footerReference w:type="even" r:id="rId113"/>
           <w:footerReference w:type="default" r:id="rId114"/>
-          <w:footerReference w:type="first" r:id="rId115"/>
+          <w:footerReference w:type="first" r:id="rId114"/>
           <w:type w:val="nextPage"/>
           <w:pgSz w:w="12240" w:h="15840"/>
           <w:pgMar w:left="1417" w:right="1417" w:gutter="0" w:header="720" w:top="1134" w:footer="720" w:bottom="1134"/>
@@ -21458,10 +21458,10 @@
         <w:sectPr>
           <w:headerReference w:type="even" r:id="rId116"/>
           <w:headerReference w:type="default" r:id="rId137"/>
-          <w:headerReference w:type="first" r:id="rId118"/>
+          <w:headerReference w:type="first" r:id="rId137"/>
           <w:footerReference w:type="even" r:id="rId119"/>
           <w:footerReference w:type="default" r:id="rId138"/>
-          <w:footerReference w:type="first" r:id="rId121"/>
+          <w:footerReference w:type="first" r:id="rId138"/>
           <w:type w:val="nextPage"/>
           <w:pgSz w:w="12240" w:h="15840"/>
           <w:pgMar w:left="1417" w:right="1417" w:gutter="0" w:header="720" w:top="1134" w:footer="720" w:bottom="1134"/>
@@ -22903,10 +22903,10 @@
         <w:sectPr>
           <w:headerReference w:type="even" r:id="rId116"/>
           <w:headerReference w:type="default" r:id="rId117"/>
-          <w:headerReference w:type="first" r:id="rId118"/>
+          <w:headerReference w:type="first" r:id="rId117"/>
           <w:footerReference w:type="even" r:id="rId119"/>
           <w:footerReference w:type="default" r:id="rId120"/>
-          <w:footerReference w:type="first" r:id="rId121"/>
+          <w:footerReference w:type="first" r:id="rId120"/>
           <w:type w:val="nextPage"/>
           <w:pgSz w:w="12240" w:h="15840"/>
           <w:pgMar w:left="1417" w:right="1417" w:gutter="0" w:header="720" w:top="1134" w:footer="720" w:bottom="1134"/>
@@ -23038,10 +23038,10 @@
     <w:sectPr>
       <w:headerReference w:type="even" r:id="rId122"/>
       <w:headerReference w:type="default" r:id="rId123"/>
-      <w:headerReference w:type="first" r:id="rId124"/>
+      <w:headerReference w:type="first" r:id="rId123"/>
       <w:footerReference w:type="even" r:id="rId125"/>
       <w:footerReference w:type="default" r:id="rId126"/>
-      <w:footerReference w:type="first" r:id="rId127"/>
+      <w:footerReference w:type="first" r:id="rId126"/>
       <w:type w:val="nextPage"/>
       <w:pgSz w:w="12240" w:h="15840"/>
       <w:pgMar w:left="1417" w:right="1417" w:gutter="0" w:header="720" w:top="1134" w:footer="720" w:bottom="1134"/>

</xml_diff>

<commit_message>
Zev-7 Operator Manual: even-page headers and footers follow the default
The even-page header/footer parts were empty in every section. Nothing renders
them (evenAndOddHeaders is off in settings), but switching on odd/even headers
would have dropped the running chapter name and the revision line from every
even page.

Each even-page reference now points at the same part as its section's default,
matching the first-page cleanup in the previous commit. Rendered output is
unchanged: 39 pages, no text difference on any page. The cover is untouched.

Claude-Session: https://claude.ai/code/session_019ATiXkov9EfBfPjyg6ppQc
</commit_message>
<xml_diff>
--- a/Zev-7 Operator Manual.docx
+++ b/Zev-7 Operator Manual.docx
@@ -872,10 +872,10 @@
         <w:spacing w:before="40" w:after="80"/>
         <w:rPr/>
         <w:sectPr>
-          <w:headerReference w:type="even" r:id="rId8"/>
+          <w:headerReference w:type="even" r:id="rId9"/>
           <w:headerReference w:type="default" r:id="rId9"/>
           <w:headerReference w:type="first" r:id="rId9"/>
-          <w:footerReference w:type="even" r:id="rId11"/>
+          <w:footerReference w:type="even" r:id="rId12"/>
           <w:footerReference w:type="default" r:id="rId12"/>
           <w:footerReference w:type="first" r:id="rId12"/>
           <w:type w:val="nextPage"/>
@@ -921,10 +921,10 @@
         <w:spacing w:before="40" w:after="80"/>
         <w:rPr/>
         <w:sectPr>
-          <w:headerReference w:type="even" r:id="rId8"/>
+          <w:headerReference w:type="even" r:id="rId9"/>
           <w:headerReference w:type="default" r:id="rId9"/>
           <w:headerReference w:type="first" r:id="rId9"/>
-          <w:footerReference w:type="even" r:id="rId11"/>
+          <w:footerReference w:type="even" r:id="rId12"/>
           <w:footerReference w:type="default" r:id="rId12"/>
           <w:footerReference w:type="first" r:id="rId12"/>
           <w:type w:val="nextPage"/>
@@ -1870,10 +1870,10 @@
         <w:contextualSpacing/>
         <w:rPr/>
         <w:sectPr>
-          <w:headerReference w:type="even" r:id="rId14"/>
+          <w:headerReference w:type="even" r:id="rId15"/>
           <w:headerReference w:type="default" r:id="rId15"/>
           <w:headerReference w:type="first" r:id="rId15"/>
-          <w:footerReference w:type="even" r:id="rId17"/>
+          <w:footerReference w:type="even" r:id="rId18"/>
           <w:footerReference w:type="default" r:id="rId18"/>
           <w:footerReference w:type="first" r:id="rId18"/>
           <w:type w:val="nextPage"/>
@@ -2003,10 +2003,10 @@
         <w:spacing w:before="0" w:after="80"/>
         <w:rPr/>
         <w:sectPr>
-          <w:headerReference w:type="even" r:id="rId20"/>
+          <w:headerReference w:type="even" r:id="rId21"/>
           <w:headerReference w:type="default" r:id="rId21"/>
           <w:headerReference w:type="first" r:id="rId21"/>
-          <w:footerReference w:type="even" r:id="rId23"/>
+          <w:footerReference w:type="even" r:id="rId24"/>
           <w:footerReference w:type="default" r:id="rId24"/>
           <w:footerReference w:type="first" r:id="rId24"/>
           <w:type w:val="nextPage"/>
@@ -2790,8 +2790,8 @@
       <w:pPr>
         <w:pStyle w:val="ListBullet"/>
         <w:sectPr>
-          <w:headerReference w:type="even" r:id="rId26"/>
-          <w:footerReference w:type="even" r:id="rId29"/>
+          <w:headerReference w:type="even" r:id="rId27"/>
+          <w:footerReference w:type="even" r:id="rId30"/>
           <w:headerReference w:type="default" r:id="rId27"/>
           <w:headerReference w:type="first" r:id="rId27"/>
           <w:footerReference w:type="default" r:id="rId30"/>
@@ -4746,10 +4746,10 @@
           <w:sz w:val="22"/>
         </w:rPr>
         <w:sectPr>
-          <w:headerReference w:type="even" r:id="rId32"/>
+          <w:headerReference w:type="even" r:id="rId33"/>
           <w:headerReference w:type="default" r:id="rId33"/>
           <w:headerReference w:type="first" r:id="rId33"/>
-          <w:footerReference w:type="even" r:id="rId35"/>
+          <w:footerReference w:type="even" r:id="rId36"/>
           <w:footerReference w:type="default" r:id="rId36"/>
           <w:footerReference w:type="first" r:id="rId36"/>
           <w:type w:val="nextPage"/>
@@ -5505,10 +5505,10 @@
         <w:spacing w:before="0" w:after="80"/>
         <w:rPr/>
         <w:sectPr>
-          <w:headerReference w:type="even" r:id="rId38"/>
+          <w:headerReference w:type="even" r:id="rId39"/>
           <w:headerReference w:type="default" r:id="rId39"/>
           <w:headerReference w:type="first" r:id="rId39"/>
-          <w:footerReference w:type="even" r:id="rId41"/>
+          <w:footerReference w:type="even" r:id="rId42"/>
           <w:footerReference w:type="default" r:id="rId42"/>
           <w:footerReference w:type="first" r:id="rId42"/>
           <w:type w:val="nextPage"/>
@@ -5902,10 +5902,10 @@
     <w:p>
       <w:pPr>
         <w:sectPr>
-          <w:headerReference w:type="even" r:id="rId44"/>
+          <w:headerReference w:type="even" r:id="rId45"/>
           <w:headerReference w:type="default" r:id="rId45"/>
           <w:headerReference w:type="first" r:id="rId45"/>
-          <w:footerReference w:type="even" r:id="rId47"/>
+          <w:footerReference w:type="even" r:id="rId48"/>
           <w:footerReference w:type="default" r:id="rId48"/>
           <w:footerReference w:type="first" r:id="rId48"/>
           <w:type w:val="nextPage"/>
@@ -12289,10 +12289,10 @@
         <w:spacing w:before="0" w:after="80"/>
         <w:rPr/>
         <w:sectPr>
-          <w:headerReference w:type="even" r:id="rId50"/>
+          <w:headerReference w:type="even" r:id="rId51"/>
           <w:headerReference w:type="default" r:id="rId51"/>
           <w:headerReference w:type="first" r:id="rId51"/>
-          <w:footerReference w:type="even" r:id="rId53"/>
+          <w:footerReference w:type="even" r:id="rId54"/>
           <w:footerReference w:type="default" r:id="rId54"/>
           <w:footerReference w:type="first" r:id="rId54"/>
           <w:type w:val="nextPage"/>
@@ -12845,10 +12845,10 @@
         <w:contextualSpacing/>
         <w:rPr/>
         <w:sectPr>
-          <w:headerReference w:type="even" r:id="rId56"/>
+          <w:headerReference w:type="even" r:id="rId57"/>
           <w:headerReference w:type="default" r:id="rId57"/>
           <w:headerReference w:type="first" r:id="rId57"/>
-          <w:footerReference w:type="even" r:id="rId59"/>
+          <w:footerReference w:type="even" r:id="rId60"/>
           <w:footerReference w:type="default" r:id="rId60"/>
           <w:footerReference w:type="first" r:id="rId60"/>
           <w:type w:val="nextPage"/>
@@ -15928,8 +15928,8 @@
         <w:spacing w:before="0" w:after="0"/>
         <w:rPr/>
         <w:sectPr>
-          <w:headerReference w:type="even" r:id="rId68"/>
-          <w:footerReference w:type="even" r:id="rId71"/>
+          <w:headerReference w:type="even" r:id="rId133"/>
+          <w:footerReference w:type="even" r:id="rId134"/>
           <w:headerReference w:type="default" r:id="rId133"/>
           <w:headerReference w:type="first" r:id="rId133"/>
           <w:footerReference w:type="default" r:id="rId134"/>
@@ -17399,10 +17399,10 @@
     <w:p>
       <w:pPr>
         <w:sectPr>
-          <w:headerReference w:type="even" r:id="rId68"/>
+          <w:headerReference w:type="even" r:id="rId69"/>
           <w:headerReference w:type="default" r:id="rId69"/>
           <w:headerReference w:type="first" r:id="rId69"/>
-          <w:footerReference w:type="even" r:id="rId71"/>
+          <w:footerReference w:type="even" r:id="rId72"/>
           <w:footerReference w:type="default" r:id="rId72"/>
           <w:footerReference w:type="first" r:id="rId72"/>
           <w:type w:val="nextPage"/>
@@ -17862,10 +17862,10 @@
           <w:sz w:val="22"/>
         </w:rPr>
         <w:sectPr>
-          <w:headerReference w:type="even" r:id="rId74"/>
+          <w:headerReference w:type="even" r:id="rId75"/>
           <w:headerReference w:type="default" r:id="rId75"/>
           <w:headerReference w:type="first" r:id="rId75"/>
-          <w:footerReference w:type="even" r:id="rId77"/>
+          <w:footerReference w:type="even" r:id="rId78"/>
           <w:footerReference w:type="default" r:id="rId78"/>
           <w:footerReference w:type="first" r:id="rId78"/>
           <w:type w:val="nextPage"/>
@@ -18953,10 +18953,10 @@
     <w:p>
       <w:pPr>
         <w:sectPr>
-          <w:headerReference w:type="even" r:id="rId80"/>
+          <w:headerReference w:type="even" r:id="rId81"/>
           <w:headerReference w:type="default" r:id="rId81"/>
           <w:headerReference w:type="first" r:id="rId81"/>
-          <w:footerReference w:type="even" r:id="rId83"/>
+          <w:footerReference w:type="even" r:id="rId84"/>
           <w:footerReference w:type="default" r:id="rId84"/>
           <w:footerReference w:type="first" r:id="rId84"/>
           <w:type w:val="nextPage"/>
@@ -19122,10 +19122,10 @@
         <w:spacing w:before="0" w:after="80"/>
         <w:rPr/>
         <w:sectPr>
-          <w:headerReference w:type="even" r:id="rId86"/>
+          <w:headerReference w:type="even" r:id="rId87"/>
           <w:headerReference w:type="default" r:id="rId87"/>
           <w:headerReference w:type="first" r:id="rId87"/>
-          <w:footerReference w:type="even" r:id="rId89"/>
+          <w:footerReference w:type="even" r:id="rId90"/>
           <w:footerReference w:type="default" r:id="rId90"/>
           <w:footerReference w:type="first" r:id="rId90"/>
           <w:type w:val="nextPage"/>
@@ -19332,10 +19332,10 @@
         <w:spacing w:before="0" w:after="80"/>
         <w:rPr/>
         <w:sectPr>
-          <w:headerReference w:type="even" r:id="rId92"/>
+          <w:headerReference w:type="even" r:id="rId93"/>
           <w:headerReference w:type="default" r:id="rId93"/>
           <w:headerReference w:type="first" r:id="rId93"/>
-          <w:footerReference w:type="even" r:id="rId95"/>
+          <w:footerReference w:type="even" r:id="rId96"/>
           <w:footerReference w:type="default" r:id="rId96"/>
           <w:footerReference w:type="first" r:id="rId96"/>
           <w:type w:val="nextPage"/>
@@ -19657,10 +19657,10 @@
         <w:spacing w:before="0" w:after="80"/>
         <w:rPr/>
         <w:sectPr>
-          <w:headerReference w:type="even" r:id="rId98"/>
+          <w:headerReference w:type="even" r:id="rId99"/>
           <w:headerReference w:type="default" r:id="rId99"/>
           <w:headerReference w:type="first" r:id="rId99"/>
-          <w:footerReference w:type="even" r:id="rId101"/>
+          <w:footerReference w:type="even" r:id="rId102"/>
           <w:footerReference w:type="default" r:id="rId102"/>
           <w:footerReference w:type="first" r:id="rId102"/>
           <w:type w:val="nextPage"/>
@@ -19770,8 +19770,8 @@
     <w:p>
       <w:pPr>
         <w:sectPr>
-          <w:headerReference w:type="even" r:id="rId104"/>
-          <w:footerReference w:type="even" r:id="rId107"/>
+          <w:headerReference w:type="even" r:id="rId135"/>
+          <w:footerReference w:type="even" r:id="rId136"/>
           <w:headerReference w:type="default" r:id="rId135"/>
           <w:headerReference w:type="first" r:id="rId135"/>
           <w:footerReference w:type="default" r:id="rId136"/>
@@ -20804,10 +20804,10 @@
         <w:spacing w:before="0" w:after="80"/>
         <w:rPr/>
         <w:sectPr>
-          <w:headerReference w:type="even" r:id="rId104"/>
+          <w:headerReference w:type="even" r:id="rId105"/>
           <w:headerReference w:type="default" r:id="rId105"/>
           <w:headerReference w:type="first" r:id="rId105"/>
-          <w:footerReference w:type="even" r:id="rId107"/>
+          <w:footerReference w:type="even" r:id="rId108"/>
           <w:footerReference w:type="default" r:id="rId108"/>
           <w:footerReference w:type="first" r:id="rId108"/>
           <w:type w:val="nextPage"/>
@@ -20973,10 +20973,10 @@
         <w:spacing w:before="0" w:after="80"/>
         <w:rPr/>
         <w:sectPr>
-          <w:headerReference w:type="even" r:id="rId110"/>
+          <w:headerReference w:type="even" r:id="rId111"/>
           <w:headerReference w:type="default" r:id="rId111"/>
           <w:headerReference w:type="first" r:id="rId111"/>
-          <w:footerReference w:type="even" r:id="rId113"/>
+          <w:footerReference w:type="even" r:id="rId114"/>
           <w:footerReference w:type="default" r:id="rId114"/>
           <w:footerReference w:type="first" r:id="rId114"/>
           <w:type w:val="nextPage"/>
@@ -21456,10 +21456,10 @@
       <w:pPr>
         <w:pStyle w:val="ListBullet"/>
         <w:sectPr>
-          <w:headerReference w:type="even" r:id="rId116"/>
+          <w:headerReference w:type="even" r:id="rId137"/>
           <w:headerReference w:type="default" r:id="rId137"/>
           <w:headerReference w:type="first" r:id="rId137"/>
-          <w:footerReference w:type="even" r:id="rId119"/>
+          <w:footerReference w:type="even" r:id="rId138"/>
           <w:footerReference w:type="default" r:id="rId138"/>
           <w:footerReference w:type="first" r:id="rId138"/>
           <w:type w:val="nextPage"/>
@@ -22901,10 +22901,10 @@
     <w:p>
       <w:pPr>
         <w:sectPr>
-          <w:headerReference w:type="even" r:id="rId116"/>
+          <w:headerReference w:type="even" r:id="rId117"/>
           <w:headerReference w:type="default" r:id="rId117"/>
           <w:headerReference w:type="first" r:id="rId117"/>
-          <w:footerReference w:type="even" r:id="rId119"/>
+          <w:footerReference w:type="even" r:id="rId120"/>
           <w:footerReference w:type="default" r:id="rId120"/>
           <w:footerReference w:type="first" r:id="rId120"/>
           <w:type w:val="nextPage"/>
@@ -23036,10 +23036,10 @@
       </w:r>
     </w:p>
     <w:sectPr>
-      <w:headerReference w:type="even" r:id="rId122"/>
+      <w:headerReference w:type="even" r:id="rId123"/>
       <w:headerReference w:type="default" r:id="rId123"/>
       <w:headerReference w:type="first" r:id="rId123"/>
-      <w:footerReference w:type="even" r:id="rId125"/>
+      <w:footerReference w:type="even" r:id="rId126"/>
       <w:footerReference w:type="default" r:id="rId126"/>
       <w:footerReference w:type="first" r:id="rId126"/>
       <w:type w:val="nextPage"/>

</xml_diff>

<commit_message>
Zev-7 Operator Manual: models table covers the S3 products
The table listed the first-generation Pico boards as "Zev-7" and "Zev-7 Mini".
Per Mitch, that generation is out of scope and Zev-7 is the application name,
not a model. The Nixie rows are now the S3 products: Zev-7S, Zev-7 Mini S3,
Zev-7-18, Zev-7-18 2-LED and Zev-7RZ, with Metronome and the two numitron
models unchanged.

Under-light column taken from the firmware, not assumed: 4-20 configurable
underboard LEDs with a chip-type choice on every S3 Nixie model except the
Zev-7RZ, whose single 21-LED chain is fixed and whose Underboard LED Type and
Count controls are hidden. Display LED Grouping is called out on the two-LED
models.

The sentence introducing the table was updated in step, since it named the
retired models. No provisioning codes appear anywhere in the manual.

Claude-Session: https://claude.ai/code/session_019ATiXkov9EfBfPjyg6ppQc
</commit_message>
<xml_diff>
--- a/Zev-7 Operator Manual.docx
+++ b/Zev-7 Operator Manual.docx
@@ -2098,7 +2098,7 @@
           <w:rFonts w:ascii="Arial" w:hAnsi="Arial"/>
           <w:sz w:val="22"/>
         </w:rPr>
-        <w:t>Several model variants share this firmware. The model is set at the factory and cannot be changed by the user. The Zev-7 and Zev-7 Mini are Nixie-tube clocks; the Zev-7NS and Zev-7ND are the equivalent numitron-tube clocks. The Metronome uses a separate but operationally similar version of the software.</w:t>
+        <w:t>Several model variants share this firmware. The model is set at the factory and cannot be changed by the user. The Zev-7S, Zev-7 Mini S3, Zev-7-18 and Zev-7RZ are Nixie-tube clocks; the Zev-7NS and Zev-7ND are the equivalent numitron-tube clocks. The Metronome uses a separate but operationally similar version of the software.</w:t>
       </w:r>
       <w:r>
         <w:rPr>
@@ -2261,7 +2261,7 @@
                 <w:szCs w:val="22"/>
                 <w:lang w:val="en-US" w:eastAsia="en-US" w:bidi="ar-SA"/>
               </w:rPr>
-              <w:t>Zev-7</w:t>
+              <w:t>Zev-7S</w:t>
             </w:r>
           </w:p>
         </w:tc>
@@ -2292,7 +2292,7 @@
                 <w:szCs w:val="22"/>
                 <w:lang w:val="en-US" w:eastAsia="en-US" w:bidi="ar-SA"/>
               </w:rPr>
-              <w:t>Zev-7</w:t>
+              <w:t>Zev-7S</w:t>
             </w:r>
           </w:p>
         </w:tc>
@@ -2323,7 +2323,7 @@
                 <w:szCs w:val="22"/>
                 <w:lang w:val="en-US" w:eastAsia="en-US" w:bidi="ar-SA"/>
               </w:rPr>
-              <w:t>4 RGB LEDs (color and brightness configurable)</w:t>
+              <w:t>4–20 RGB LEDs (chip type, color, brightness and count configurable); one LED under each tube</w:t>
             </w:r>
           </w:p>
         </w:tc>
@@ -2359,7 +2359,7 @@
                 <w:szCs w:val="22"/>
                 <w:lang w:val="en-US" w:eastAsia="en-US" w:bidi="ar-SA"/>
               </w:rPr>
-              <w:t>Zev-7 Mini</w:t>
+              <w:t>Zev-7 Mini S3</w:t>
             </w:r>
           </w:p>
         </w:tc>
@@ -2392,7 +2392,7 @@
                 <w:szCs w:val="22"/>
                 <w:lang w:val="en-US" w:eastAsia="en-US" w:bidi="ar-SA"/>
               </w:rPr>
-              <w:t>Zev-7M</w:t>
+              <w:t>Zev-7S</w:t>
             </w:r>
           </w:p>
         </w:tc>
@@ -2425,7 +2425,7 @@
                 <w:szCs w:val="22"/>
                 <w:lang w:val="en-US" w:eastAsia="en-US" w:bidi="ar-SA"/>
               </w:rPr>
-              <w:t>None</w:t>
+              <w:t>4–20 RGB LEDs (chip type, color, brightness and count configurable); one LED under each tube</w:t>
             </w:r>
           </w:p>
         </w:tc>
@@ -2461,7 +2461,7 @@
                 <w:szCs w:val="22"/>
                 <w:lang w:val="en-US" w:eastAsia="en-US" w:bidi="ar-SA"/>
               </w:rPr>
-              <w:t>Metronome</w:t>
+              <w:t>Zev-7-18</w:t>
             </w:r>
           </w:p>
         </w:tc>
@@ -2494,7 +2494,7 @@
                 <w:szCs w:val="22"/>
                 <w:lang w:val="en-US" w:eastAsia="en-US" w:bidi="ar-SA"/>
               </w:rPr>
-              <w:t>Metronome</w:t>
+              <w:t>Zev-7-18</w:t>
             </w:r>
           </w:p>
         </w:tc>
@@ -2527,7 +2527,7 @@
                 <w:szCs w:val="22"/>
                 <w:lang w:val="en-US" w:eastAsia="en-US" w:bidi="ar-SA"/>
               </w:rPr>
-              <w:t>None</w:t>
+              <w:t>4–20 RGB LEDs (chip type, color, brightness and count configurable); one LED under each tube</w:t>
             </w:r>
           </w:p>
         </w:tc>
@@ -2543,7 +2543,7 @@
                 <w:rFonts w:ascii="Arial" w:hAnsi="Arial"/>
                 <w:sz w:val="20"/>
               </w:rPr>
-              <w:t>Zev-7NS (numitron)</w:t>
+              <w:t>Zev-7-18 2-LED</w:t>
             </w:r>
           </w:p>
         </w:tc>
@@ -2557,7 +2557,7 @@
                 <w:rFonts w:ascii="Arial" w:hAnsi="Arial"/>
                 <w:sz w:val="20"/>
               </w:rPr>
-              <w:t>Zev-7NS</w:t>
+              <w:t>Zev-7-18</w:t>
             </w:r>
           </w:p>
         </w:tc>
@@ -2571,7 +2571,7 @@
                 <w:rFonts w:ascii="Arial" w:hAnsi="Arial"/>
                 <w:sz w:val="20"/>
               </w:rPr>
-              <w:t>4–20 RGB LEDs (color, brightness, and count configurable)</w:t>
+              <w:t>4–20 RGB LEDs (chip type, color, brightness and count configurable); two LEDs under each tube (adds Display LED Grouping)</w:t>
             </w:r>
           </w:p>
         </w:tc>
@@ -2587,19 +2587,290 @@
                 <w:rFonts w:ascii="Arial" w:hAnsi="Arial"/>
                 <w:sz w:val="20"/>
               </w:rPr>
+              <w:t>Zev-7RZ</w:t>
+            </w:r>
+          </w:p>
+        </w:tc>
+        <w:tc>
+          <w:tcPr>
+            <w:tcW w:type="dxa" w:w="3135"/>
+          </w:tcPr>
+          <w:p>
+            <w:r>
+              <w:rPr>
+                <w:rFonts w:ascii="Arial" w:hAnsi="Arial"/>
+                <w:sz w:val="20"/>
+              </w:rPr>
+              <w:t>Zev-7RZ</w:t>
+            </w:r>
+          </w:p>
+        </w:tc>
+        <w:tc>
+          <w:tcPr>
+            <w:tcW w:type="dxa" w:w="3135"/>
+          </w:tcPr>
+          <w:p>
+            <w:r>
+              <w:rPr>
+                <w:rFonts w:ascii="Arial" w:hAnsi="Arial"/>
+                <w:sz w:val="20"/>
+              </w:rPr>
+              <w:t>Fixed 21-LED chain — two LEDs under each tube plus seven under the board. Not configurable.</w:t>
+            </w:r>
+          </w:p>
+        </w:tc>
+      </w:tr>
+      <w:tr>
+        <w:trPr/>
+        <w:tc>
+          <w:tcPr>
+            <w:tcW w:w="3135" w:type="dxa"/>
+            <w:tcBorders/>
+          </w:tcPr>
+          <w:p>
+            <w:pPr>
+              <w:pStyle w:val="Normal"/>
+              <w:widowControl/>
+              <w:suppressAutoHyphens w:val="true"/>
+              <w:spacing w:before="0" w:after="80"/>
+              <w:jc w:val="start"/>
+              <w:rPr>
+                <w:rFonts w:eastAsia="ＭＳ 明朝" w:cs=""/>
+                <w:kern w:val="0"/>
+                <w:szCs w:val="22"/>
+                <w:lang w:val="en-US" w:eastAsia="en-US" w:bidi="ar-SA"/>
+              </w:rPr>
+            </w:pPr>
+            <w:r>
+              <w:rPr>
+                <w:rFonts w:eastAsia="ＭＳ 明朝" w:cs="" w:ascii="Arial" w:hAnsi="Arial"/>
+                <w:kern w:val="0"/>
+                <w:sz w:val="20"/>
+                <w:szCs w:val="22"/>
+                <w:lang w:val="en-US" w:eastAsia="en-US" w:bidi="ar-SA"/>
+              </w:rPr>
+              <w:t>Metronome</w:t>
+            </w:r>
+          </w:p>
+        </w:tc>
+        <w:tc>
+          <w:tcPr>
+            <w:tcW w:w="3135" w:type="dxa"/>
+            <w:tcBorders/>
+          </w:tcPr>
+          <w:p>
+            <w:pPr>
+              <w:pStyle w:val="Normal"/>
+              <w:widowControl/>
+              <w:suppressAutoHyphens w:val="true"/>
+              <w:spacing w:before="0" w:after="80"/>
+              <w:jc w:val="start"/>
+              <w:rPr>
+                <w:rFonts w:eastAsia="ＭＳ 明朝" w:cs=""/>
+                <w:kern w:val="0"/>
+                <w:szCs w:val="22"/>
+                <w:lang w:val="en-US" w:eastAsia="en-US" w:bidi="ar-SA"/>
+              </w:rPr>
+            </w:pPr>
+            <w:r>
+              <w:rPr>
+                <w:rFonts w:eastAsia="ＭＳ 明朝" w:cs="" w:ascii="Arial" w:hAnsi="Arial"/>
+                <w:kern w:val="0"/>
+                <w:sz w:val="20"/>
+                <w:szCs w:val="22"/>
+                <w:lang w:val="en-US" w:eastAsia="en-US" w:bidi="ar-SA"/>
+              </w:rPr>
+              <w:t>Metronome</w:t>
+            </w:r>
+          </w:p>
+        </w:tc>
+        <w:tc>
+          <w:tcPr>
+            <w:tcW w:w="3135" w:type="dxa"/>
+            <w:tcBorders/>
+          </w:tcPr>
+          <w:p>
+            <w:pPr>
+              <w:pStyle w:val="Normal"/>
+              <w:widowControl/>
+              <w:suppressAutoHyphens w:val="true"/>
+              <w:spacing w:before="0" w:after="80"/>
+              <w:jc w:val="start"/>
+              <w:rPr>
+                <w:rFonts w:eastAsia="ＭＳ 明朝" w:cs=""/>
+                <w:kern w:val="0"/>
+                <w:szCs w:val="22"/>
+                <w:lang w:val="en-US" w:eastAsia="en-US" w:bidi="ar-SA"/>
+              </w:rPr>
+            </w:pPr>
+            <w:r>
+              <w:rPr>
+                <w:rFonts w:eastAsia="ＭＳ 明朝" w:cs="" w:ascii="Arial" w:hAnsi="Arial"/>
+                <w:kern w:val="0"/>
+                <w:sz w:val="20"/>
+                <w:szCs w:val="22"/>
+                <w:lang w:val="en-US" w:eastAsia="en-US" w:bidi="ar-SA"/>
+              </w:rPr>
+              <w:t>None</w:t>
+            </w:r>
+          </w:p>
+        </w:tc>
+      </w:tr>
+      <w:tr>
+        <w:trPr/>
+        <w:tc>
+          <w:tcPr>
+            <w:tcW w:w="3135" w:type="dxa"/>
+            <w:tcBorders/>
+          </w:tcPr>
+          <w:p>
+            <w:pPr>
+              <w:pStyle w:val="Normal"/>
+              <w:widowControl/>
+              <w:suppressAutoHyphens w:val="true"/>
+              <w:spacing w:before="0" w:after="80"/>
+              <w:jc w:val="start"/>
+              <w:rPr>
+                <w:rFonts w:eastAsia="ＭＳ 明朝" w:cs=""/>
+                <w:kern w:val="0"/>
+                <w:szCs w:val="22"/>
+                <w:lang w:val="en-US" w:eastAsia="en-US" w:bidi="ar-SA"/>
+              </w:rPr>
+            </w:pPr>
+            <w:r>
+              <w:rPr>
+                <w:rFonts w:eastAsia="ＭＳ 明朝" w:cs="" w:ascii="Arial" w:hAnsi="Arial"/>
+                <w:kern w:val="0"/>
+                <w:sz w:val="20"/>
+                <w:szCs w:val="22"/>
+                <w:lang w:val="en-US" w:eastAsia="en-US" w:bidi="ar-SA"/>
+              </w:rPr>
+              <w:t>Zev-7NS (numitron)</w:t>
+            </w:r>
+          </w:p>
+        </w:tc>
+        <w:tc>
+          <w:tcPr>
+            <w:tcW w:w="3135" w:type="dxa"/>
+            <w:tcBorders/>
+          </w:tcPr>
+          <w:p>
+            <w:pPr>
+              <w:pStyle w:val="Normal"/>
+              <w:widowControl/>
+              <w:suppressAutoHyphens w:val="true"/>
+              <w:spacing w:before="0" w:after="80"/>
+              <w:jc w:val="start"/>
+              <w:rPr>
+                <w:rFonts w:eastAsia="ＭＳ 明朝" w:cs=""/>
+                <w:kern w:val="0"/>
+                <w:szCs w:val="22"/>
+                <w:lang w:val="en-US" w:eastAsia="en-US" w:bidi="ar-SA"/>
+              </w:rPr>
+            </w:pPr>
+            <w:r>
+              <w:rPr>
+                <w:rFonts w:eastAsia="ＭＳ 明朝" w:cs="" w:ascii="Arial" w:hAnsi="Arial"/>
+                <w:kern w:val="0"/>
+                <w:sz w:val="20"/>
+                <w:szCs w:val="22"/>
+                <w:lang w:val="en-US" w:eastAsia="en-US" w:bidi="ar-SA"/>
+              </w:rPr>
+              <w:t>Zev-7NS</w:t>
+            </w:r>
+          </w:p>
+        </w:tc>
+        <w:tc>
+          <w:tcPr>
+            <w:tcW w:w="3135" w:type="dxa"/>
+            <w:tcBorders/>
+          </w:tcPr>
+          <w:p>
+            <w:pPr>
+              <w:pStyle w:val="Normal"/>
+              <w:widowControl/>
+              <w:suppressAutoHyphens w:val="true"/>
+              <w:spacing w:before="0" w:after="80"/>
+              <w:jc w:val="start"/>
+              <w:rPr>
+                <w:rFonts w:eastAsia="ＭＳ 明朝" w:cs=""/>
+                <w:kern w:val="0"/>
+                <w:szCs w:val="22"/>
+                <w:lang w:val="en-US" w:eastAsia="en-US" w:bidi="ar-SA"/>
+              </w:rPr>
+            </w:pPr>
+            <w:r>
+              <w:rPr>
+                <w:rFonts w:eastAsia="ＭＳ 明朝" w:cs="" w:ascii="Arial" w:hAnsi="Arial"/>
+                <w:kern w:val="0"/>
+                <w:sz w:val="20"/>
+                <w:szCs w:val="22"/>
+                <w:lang w:val="en-US" w:eastAsia="en-US" w:bidi="ar-SA"/>
+              </w:rPr>
+              <w:t>4–20 RGB LEDs (color, brightness and count configurable); one LED under each display</w:t>
+            </w:r>
+          </w:p>
+        </w:tc>
+      </w:tr>
+      <w:tr>
+        <w:trPr/>
+        <w:tc>
+          <w:tcPr>
+            <w:tcW w:w="3135" w:type="dxa"/>
+            <w:tcBorders/>
+          </w:tcPr>
+          <w:p>
+            <w:pPr>
+              <w:pStyle w:val="Normal"/>
+              <w:widowControl/>
+              <w:suppressAutoHyphens w:val="true"/>
+              <w:spacing w:before="0" w:after="80"/>
+              <w:jc w:val="start"/>
+              <w:rPr>
+                <w:rFonts w:eastAsia="ＭＳ 明朝" w:cs=""/>
+                <w:kern w:val="0"/>
+                <w:szCs w:val="22"/>
+                <w:lang w:val="en-US" w:eastAsia="en-US" w:bidi="ar-SA"/>
+              </w:rPr>
+            </w:pPr>
+            <w:r>
+              <w:rPr>
+                <w:rFonts w:eastAsia="ＭＳ 明朝" w:cs="" w:ascii="Arial" w:hAnsi="Arial"/>
+                <w:kern w:val="0"/>
+                <w:sz w:val="20"/>
+                <w:szCs w:val="22"/>
+                <w:lang w:val="en-US" w:eastAsia="en-US" w:bidi="ar-SA"/>
+              </w:rPr>
               <w:t>Zev-7ND (numitron)</w:t>
             </w:r>
           </w:p>
         </w:tc>
         <w:tc>
           <w:tcPr>
-            <w:tcW w:type="dxa" w:w="3135"/>
-          </w:tcPr>
-          <w:p>
-            <w:r>
-              <w:rPr>
-                <w:rFonts w:ascii="Arial" w:hAnsi="Arial"/>
-                <w:sz w:val="20"/>
+            <w:tcW w:w="3135" w:type="dxa"/>
+            <w:tcBorders/>
+          </w:tcPr>
+          <w:p>
+            <w:pPr>
+              <w:pStyle w:val="Normal"/>
+              <w:widowControl/>
+              <w:suppressAutoHyphens w:val="true"/>
+              <w:spacing w:before="0" w:after="80"/>
+              <w:jc w:val="start"/>
+              <w:rPr>
+                <w:rFonts w:eastAsia="ＭＳ 明朝" w:cs=""/>
+                <w:kern w:val="0"/>
+                <w:szCs w:val="22"/>
+                <w:lang w:val="en-US" w:eastAsia="en-US" w:bidi="ar-SA"/>
+              </w:rPr>
+            </w:pPr>
+            <w:r>
+              <w:rPr>
+                <w:rFonts w:eastAsia="ＭＳ 明朝" w:cs="" w:ascii="Arial" w:hAnsi="Arial"/>
+                <w:kern w:val="0"/>
+                <w:sz w:val="20"/>
+                <w:szCs w:val="22"/>
+                <w:lang w:val="en-US" w:eastAsia="en-US" w:bidi="ar-SA"/>
               </w:rPr>
               <w:t>Zev-7ND</w:t>
             </w:r>
@@ -2607,13 +2878,30 @@
         </w:tc>
         <w:tc>
           <w:tcPr>
-            <w:tcW w:type="dxa" w:w="3135"/>
-          </w:tcPr>
-          <w:p>
-            <w:r>
-              <w:rPr>
-                <w:rFonts w:ascii="Arial" w:hAnsi="Arial"/>
-                <w:sz w:val="20"/>
+            <w:tcW w:w="3135" w:type="dxa"/>
+            <w:tcBorders/>
+          </w:tcPr>
+          <w:p>
+            <w:pPr>
+              <w:pStyle w:val="Normal"/>
+              <w:widowControl/>
+              <w:suppressAutoHyphens w:val="true"/>
+              <w:spacing w:before="0" w:after="80"/>
+              <w:jc w:val="start"/>
+              <w:rPr>
+                <w:rFonts w:eastAsia="ＭＳ 明朝" w:cs=""/>
+                <w:kern w:val="0"/>
+                <w:szCs w:val="22"/>
+                <w:lang w:val="en-US" w:eastAsia="en-US" w:bidi="ar-SA"/>
+              </w:rPr>
+            </w:pPr>
+            <w:r>
+              <w:rPr>
+                <w:rFonts w:eastAsia="ＭＳ 明朝" w:cs="" w:ascii="Arial" w:hAnsi="Arial"/>
+                <w:kern w:val="0"/>
+                <w:sz w:val="20"/>
+                <w:szCs w:val="22"/>
+                <w:lang w:val="en-US" w:eastAsia="en-US" w:bidi="ar-SA"/>
               </w:rPr>
               <w:t>None (two under-tube LEDs per display)</w:t>
             </w:r>

</xml_diff>

<commit_message>
Zev-7 Operator Manual: drop the models table, correct the AP names
Per Mitch the table earns no place in the manual, so section 2 is now prose.
Nothing referenced it, and the surrounding text stands on its own.

The AP name was the one thing the table carried that a reader needs, and both
places that already state it were wrong - Quick Start and section 6 listed the
retired Pico names (Zev-7, Zev-7M for the Mini) and named the numitron models
ZEV-7N / ZEV-7NM, which is the firmware, not a product. Both now list the real
set: Zev-7S, Zev-7M, Zev-7-18, Zev-7RZ, Zev-7NS, Zev-7ND, Metronome.

Section 2's opening sentence drops the "S3" suffix, so the Mini reads Zev-7 Mini
throughout. 38 pages, down one; chapter-relative page numbers are unaffected
because each chapter restarts its own numbering.

Claude-Session: https://claude.ai/code/session_019ATiXkov9EfBfPjyg6ppQc
</commit_message>
<xml_diff>
--- a/Zev-7 Operator Manual.docx
+++ b/Zev-7 Operator Manual.docx
@@ -1208,7 +1208,7 @@
           <w:rFonts w:ascii="Arial" w:hAnsi="Arial"/>
           <w:sz w:val="22"/>
         </w:rPr>
-        <w:t>With the AP-mode bouncing tube visible, from a phone or computer, open the WiFi settings and connect to the network named Zev-7 (or Zev-7M for the Mini, ZEV-7N / ZEV-7NM for the numitron models, or Metronome for the Metronome model). No password is required.</w:t>
+        <w:t>With the AP-mode bouncing tube visible, from a phone or computer, open the WiFi settings and connect to the network named for your model — Zev-7S, Zev-7M (Mini), Zev-7-18, Zev-7RZ, Zev-7NS or Zev-7ND (numitron), or Metronome. No password is required.</w:t>
       </w:r>
     </w:p>
     <w:p>
@@ -2098,13 +2098,275 @@
           <w:rFonts w:ascii="Arial" w:hAnsi="Arial"/>
           <w:sz w:val="22"/>
         </w:rPr>
-        <w:t>Several model variants share this firmware. The model is set at the factory and cannot be changed by the user. The Zev-7S, Zev-7 Mini S3, Zev-7-18 and Zev-7RZ are Nixie-tube clocks; the Zev-7NS and Zev-7ND are the equivalent numitron-tube clocks. The Metronome uses a separate but operationally similar version of the software.</w:t>
+        <w:t>Several model variants share this firmware. The model is set at the factory and cannot be changed by the user. The Zev-7S, Zev-7 Mini, Zev-7-18 and Zev-7RZ are Nixie-tube clocks; the Zev-7NS and Zev-7ND are the equivalent numitron-tube clocks. The Metronome uses a separate but operationally similar version of the software.</w:t>
       </w:r>
       <w:r>
         <w:rPr>
           <w:rFonts w:ascii="Arial" w:hAnsi="Arial"/>
           <w:sz w:val="22"/>
         </w:rPr>
+      </w:r>
+    </w:p>
+    <w:p>
+      <w:pPr>
+        <w:pStyle w:val="Normal"/>
+        <w:rPr/>
+      </w:pPr>
+      <w:r>
+        <w:rPr>
+          <w:rFonts w:ascii="Arial" w:hAnsi="Arial"/>
+          <w:sz w:val="22"/>
+        </w:rPr>
+      </w:r>
+    </w:p>
+    <w:p>
+      <w:pPr>
+        <w:pStyle w:val="Normal"/>
+        <w:pBdr>
+          <w:left w:val="single" w:sz="24" w:space="8" w:color="C25600"/>
+        </w:pBdr>
+        <w:spacing w:before="120" w:after="120"/>
+        <w:ind w:start="216"/>
+        <w:rPr/>
+      </w:pPr>
+      <w:r>
+        <w:rPr>
+          <w:rFonts w:ascii="Arial" w:hAnsi="Arial"/>
+          <w:b/>
+          <w:bCs/>
+          <w:color w:val="C25600"/>
+          <w:sz w:val="24"/>
+          <w:szCs w:val="24"/>
+        </w:rPr>
+        <w:t>NOTICE</w:t>
+      </w:r>
+      <w:r>
+        <w:rPr>
+          <w:rFonts w:ascii="Arial" w:hAnsi="Arial"/>
+          <w:b/>
+          <w:bCs/>
+          <w:color w:val="C25600"/>
+          <w:sz w:val="22"/>
+        </w:rPr>
+        <w:t>:</w:t>
+      </w:r>
+      <w:r>
+        <w:rPr>
+          <w:rFonts w:ascii="Arial" w:hAnsi="Arial"/>
+          <w:color w:val="C25600"/>
+          <w:sz w:val="22"/>
+        </w:rPr>
+        <w:t xml:space="preserve"> </w:t>
+      </w:r>
+      <w:r>
+        <w:rPr>
+          <w:rFonts w:ascii="Arial" w:hAnsi="Arial"/>
+          <w:b w:val="false"/>
+          <w:bCs w:val="false"/>
+          <w:color w:val="000000"/>
+          <w:sz w:val="22"/>
+        </w:rPr>
+        <w:t xml:space="preserve">If </w:t>
+      </w:r>
+      <w:r>
+        <w:rPr>
+          <w:rFonts w:ascii="Arial" w:hAnsi="Arial"/>
+          <w:b w:val="false"/>
+          <w:bCs w:val="false"/>
+          <w:i w:val="false"/>
+          <w:iCs w:val="false"/>
+          <w:color w:val="000000"/>
+          <w:sz w:val="22"/>
+        </w:rPr>
+        <w:t>the</w:t>
+      </w:r>
+      <w:r>
+        <w:rPr>
+          <w:rFonts w:ascii="Arial" w:hAnsi="Arial"/>
+          <w:b w:val="false"/>
+          <w:bCs w:val="false"/>
+          <w:color w:val="000000"/>
+          <w:sz w:val="22"/>
+        </w:rPr>
+        <w:t xml:space="preserve"> display shows 00, the processor must be returned to the manufacturer for reprogramming.</w:t>
+      </w:r>
+    </w:p>
+    <w:p>
+      <w:pPr>
+        <w:pStyle w:val="Normal"/>
+        <w:pBdr>
+          <w:bottom w:val="single" w:sz="18" w:space="1" w:color="000000"/>
+        </w:pBdr>
+        <w:spacing w:before="0" w:after="0"/>
+        <w:rPr/>
+      </w:pPr>
+      <w:r>
+        <w:rPr>
+          <w:rFonts w:ascii="Arial" w:hAnsi="Arial"/>
+          <w:sz w:val="22"/>
+        </w:rPr>
+      </w:r>
+    </w:p>
+    <w:p>
+      <w:pPr>
+        <w:pStyle w:val="Heading2"/>
+      </w:pPr>
+      <w:r>
+        <w:rPr>
+          <w:rFonts w:ascii="Arial" w:hAnsi="Arial"/>
+        </w:rPr>
+        <w:t>Numitron Variants (Zev-7NS and Zev-7ND)</w:t>
+      </w:r>
+    </w:p>
+    <w:p>
+      <w:pPr/>
+      <w:r>
+        <w:rPr>
+          <w:rFonts w:ascii="Arial" w:hAnsi="Arial"/>
+          <w:sz w:val="22"/>
+        </w:rPr>
+        <w:t>The numitron models run the same firmware as the Zev-7 and share every feature described in this manual — Rules, LED effects, colon display patterns, the info display cycle, sensors, OTA updates, and the web interface. Wherever this manual says "Nixie" (for example, "Nixie Brightness"), read it as the numitron display on these models. The differences are:</w:t>
+      </w:r>
+    </w:p>
+    <w:p>
+      <w:pPr>
+        <w:pStyle w:val="ListBullet"/>
+      </w:pPr>
+      <w:r>
+        <w:rPr>
+          <w:rFonts w:ascii="Arial" w:hAnsi="Arial"/>
+        </w:rPr>
+        <w:t>Display technology: seven numitron seven-segment filament tubes — DR2010 on the Zev-7NS, DTF-104B on the Zev-7ND — driven by four TLC59116 constant-current LED drivers over I2C, in place of the Zev-7’s IN-14 Nixie tubes and HV5530 high-voltage shift drivers. The "Nixie Brightness" setting controls numitron filament brightness on these models.</w:t>
+      </w:r>
+    </w:p>
+    <w:p>
+      <w:pPr>
+        <w:pStyle w:val="ListBullet"/>
+      </w:pPr>
+      <w:r>
+        <w:rPr>
+          <w:rFonts w:ascii="Arial" w:hAnsi="Arial"/>
+        </w:rPr>
+        <w:t>No high voltage: the numitron display runs at low voltage with no mercury and no ~170 V supply. The high-voltage safety note in the Copyright and Disclaimer section applies to the Nixie models only.</w:t>
+      </w:r>
+    </w:p>
+    <w:p>
+      <w:pPr>
+        <w:pStyle w:val="ListBullet"/>
+      </w:pPr>
+      <w:r>
+        <w:rPr>
+          <w:rFonts w:ascii="Arial" w:hAnsi="Arial"/>
+        </w:rPr>
+        <w:t>No cathode anti-poisoning: filaments do not poison, so Section 14 (Cathode Anti-Poisoning), the Anti-Poison settings on the AP and live forms, the power-on conditioning runs, and the noap rule keyword have no effect on the numitron models. The display simply runs the time continuously.</w:t>
+      </w:r>
+    </w:p>
+    <w:p>
+      <w:pPr>
+        <w:pStyle w:val="ListBullet"/>
+      </w:pPr>
+      <w:r>
+        <w:rPr>
+          <w:rFonts w:ascii="Arial" w:hAnsi="Arial"/>
+        </w:rPr>
+        <w:t>Colon indicators: the colon separators are LEDs rather than neon lamps, but every colon (neon) display pattern in Section 11 works identically. Because LEDs read much brighter than the filament tubes, a Colon LED Brightness control (0–10) is provided on both the AP Settings form and the live form. It is a trim, not an absolute level: the colons still follow the Nixie Brightness setting and the light sensor, and this control only sets how bright they sit against the tubes. The default is 3. Raise it if the colons look too dim at low display brightness, lower it if they overpower the tubes.</w:t>
+      </w:r>
+    </w:p>
+    <w:p>
+      <w:pPr>
+        <w:pStyle w:val="ListBullet"/>
+        <w:sectPr>
+          <w:headerReference w:type="even" r:id="rId27"/>
+          <w:footerReference w:type="even" r:id="rId30"/>
+          <w:headerReference w:type="default" r:id="rId27"/>
+          <w:headerReference w:type="first" r:id="rId27"/>
+          <w:footerReference w:type="default" r:id="rId30"/>
+          <w:footerReference w:type="first" r:id="rId30"/>
+          <w:type w:val="nextPage"/>
+          <w:pgSz w:w="12240" w:h="15840"/>
+          <w:pgMar w:left="1417" w:right="1417" w:gutter="0" w:header="720" w:top="1134" w:footer="720" w:bottom="1134"/>
+          <w:pgNumType w:start="1" w:fmt="decimal"/>
+          <w:formProt w:val="false"/>
+          <w:textDirection w:val="lrTb"/>
+          <w:docGrid w:type="default" w:linePitch="360" w:charSpace="0"/>
+        </w:sectPr>
+      </w:pPr>
+      <w:r>
+        <w:rPr>
+          <w:rFonts w:ascii="Arial" w:hAnsi="Arial"/>
+        </w:rPr>
+        <w:t>Models and addressing: Zev-7NS (DR2010 tubes, one under-tube LED per display, plus a separate under-board light string of 4–20 LEDs) and Zev-7ND (DTF-104B tubes, two under-tube LEDs per display, no under-board string — the Under Lighting settings are hidden on that model). In AP mode they appear as the WiFi networks Zev-7NS and Zev-7ND, and are reachable by name at zev-7ns.local and zev-7nd.local respectively.</w:t>
+      </w:r>
+    </w:p>
+    <w:p>
+      <w:pPr>
+        <w:pStyle w:val="Heading1"/>
+        <w:keepNext w:val="true"/>
+        <w:spacing w:before="160" w:after="160"/>
+        <w:rPr/>
+      </w:pPr>
+      <w:r>
+        <w:rPr>
+          <w:rFonts w:ascii="Arial" w:hAnsi="Arial"/>
+          <w:b/>
+          <w:color w:val="C25600"/>
+          <w:sz w:val="40"/>
+        </w:rPr>
+        <w:t>3. Display</w:t>
+      </w:r>
+    </w:p>
+    <w:p>
+      <w:pPr>
+        <w:pStyle w:val="Normal"/>
+        <w:pBdr>
+          <w:bottom w:val="single" w:sz="18" w:space="1" w:color="000000"/>
+        </w:pBdr>
+        <w:spacing w:before="0" w:after="0"/>
+        <w:rPr/>
+      </w:pPr>
+      <w:r>
+        <w:rPr>
+          <w:rFonts w:ascii="Arial" w:hAnsi="Arial"/>
+          <w:sz w:val="22"/>
+        </w:rPr>
+      </w:r>
+    </w:p>
+    <w:p>
+      <w:pPr>
+        <w:pStyle w:val="Normal"/>
+        <w:spacing w:before="0" w:after="80"/>
+        <w:rPr/>
+      </w:pPr>
+      <w:r>
+        <w:rPr>
+          <w:rFonts w:ascii="Arial" w:hAnsi="Arial"/>
+          <w:sz w:val="22"/>
+        </w:rPr>
+      </w:r>
+    </w:p>
+    <w:p>
+      <w:pPr>
+        <w:pStyle w:val="Normal"/>
+        <w:rPr/>
+      </w:pPr>
+      <w:r>
+        <w:rPr>
+          <w:rFonts w:ascii="Arial" w:hAnsi="Arial"/>
+          <w:sz w:val="22"/>
+        </w:rPr>
+      </w:r>
+      <w:r>
+        <w:rPr>
+          <w:rFonts w:ascii="Arial" w:hAnsi="Arial"/>
+          <w:sz w:val="22"/>
+        </w:rPr>
+      </w:r>
+      <w:r>
+        <w:rPr>
+          <w:rFonts w:ascii="Arial" w:hAnsi="Arial"/>
+          <w:sz w:val="22"/>
+        </w:rPr>
+        <w:t>The Zev-7 has seven Nixie tubes; the Metronome has fifteen. Both have a set of neon indicator lamps:</w:t>
       </w:r>
     </w:p>
     <w:tbl>
@@ -2159,7 +2421,7 @@
                 <w:szCs w:val="22"/>
                 <w:lang w:val="en-US" w:eastAsia="en-US" w:bidi="ar-SA"/>
               </w:rPr>
-              <w:t>Model</w:t>
+              <w:t>Position</w:t>
             </w:r>
           </w:p>
         </w:tc>
@@ -2193,7 +2455,7 @@
                 <w:szCs w:val="22"/>
                 <w:lang w:val="en-US" w:eastAsia="en-US" w:bidi="ar-SA"/>
               </w:rPr>
-              <w:t>Identifier in AP / page header</w:t>
+              <w:t>Tube</w:t>
             </w:r>
           </w:p>
         </w:tc>
@@ -2227,7 +2489,7 @@
                 <w:szCs w:val="22"/>
                 <w:lang w:val="en-US" w:eastAsia="en-US" w:bidi="ar-SA"/>
               </w:rPr>
-              <w:t>Under-light</w:t>
+              <w:t>Shows</w:t>
             </w:r>
           </w:p>
         </w:tc>
@@ -2261,7 +2523,7 @@
                 <w:szCs w:val="22"/>
                 <w:lang w:val="en-US" w:eastAsia="en-US" w:bidi="ar-SA"/>
               </w:rPr>
-              <w:t>Zev-7S</w:t>
+              <w:t>Left</w:t>
             </w:r>
           </w:p>
         </w:tc>
@@ -2292,7 +2554,7 @@
                 <w:szCs w:val="22"/>
                 <w:lang w:val="en-US" w:eastAsia="en-US" w:bidi="ar-SA"/>
               </w:rPr>
-              <w:t>Zev-7S</w:t>
+              <w:t>NX1</w:t>
             </w:r>
           </w:p>
         </w:tc>
@@ -2323,7 +2585,7 @@
                 <w:szCs w:val="22"/>
                 <w:lang w:val="en-US" w:eastAsia="en-US" w:bidi="ar-SA"/>
               </w:rPr>
-              <w:t>4–20 RGB LEDs (chip type, color, brightness and count configurable); one LED under each tube</w:t>
+              <w:t>Hours tens</w:t>
             </w:r>
           </w:p>
         </w:tc>
@@ -2333,99 +2595,92 @@
         <w:tc>
           <w:tcPr>
             <w:tcW w:w="3135" w:type="dxa"/>
-            <w:tcBorders>
-              <w:top w:val="nil"/>
-            </w:tcBorders>
-          </w:tcPr>
-          <w:p>
-            <w:pPr>
-              <w:pStyle w:val="Normal"/>
-              <w:widowControl/>
-              <w:suppressAutoHyphens w:val="true"/>
-              <w:spacing w:before="0" w:after="80"/>
-              <w:jc w:val="start"/>
-              <w:rPr>
-                <w:rFonts w:eastAsia="ＭＳ 明朝" w:cs=""/>
-                <w:kern w:val="0"/>
-                <w:szCs w:val="22"/>
-                <w:lang w:val="en-US" w:eastAsia="en-US" w:bidi="ar-SA"/>
-              </w:rPr>
-            </w:pPr>
-            <w:r>
-              <w:rPr>
-                <w:rFonts w:eastAsia="ＭＳ 明朝" w:cs="" w:ascii="Arial" w:hAnsi="Arial"/>
-                <w:kern w:val="0"/>
-                <w:sz w:val="20"/>
-                <w:szCs w:val="22"/>
-                <w:lang w:val="en-US" w:eastAsia="en-US" w:bidi="ar-SA"/>
-              </w:rPr>
-              <w:t>Zev-7 Mini S3</w:t>
+            <w:tcBorders/>
+          </w:tcPr>
+          <w:p>
+            <w:pPr>
+              <w:pStyle w:val="Normal"/>
+              <w:widowControl/>
+              <w:suppressAutoHyphens w:val="true"/>
+              <w:spacing w:before="0" w:after="80"/>
+              <w:jc w:val="start"/>
+              <w:rPr>
+                <w:rFonts w:eastAsia="ＭＳ 明朝" w:cs=""/>
+                <w:kern w:val="0"/>
+                <w:szCs w:val="22"/>
+                <w:lang w:val="en-US" w:eastAsia="en-US" w:bidi="ar-SA"/>
+              </w:rPr>
+            </w:pPr>
+            <w:r>
+              <w:rPr>
+                <w:rFonts w:eastAsia="ＭＳ 明朝" w:cs="" w:ascii="Arial" w:hAnsi="Arial"/>
+                <w:kern w:val="0"/>
+                <w:sz w:val="20"/>
+                <w:szCs w:val="22"/>
+                <w:lang w:val="en-US" w:eastAsia="en-US" w:bidi="ar-SA"/>
+              </w:rPr>
             </w:r>
           </w:p>
         </w:tc>
         <w:tc>
           <w:tcPr>
             <w:tcW w:w="3135" w:type="dxa"/>
-            <w:tcBorders>
-              <w:top w:val="nil"/>
-            </w:tcBorders>
-          </w:tcPr>
-          <w:p>
-            <w:pPr>
-              <w:pStyle w:val="Normal"/>
-              <w:widowControl/>
-              <w:suppressAutoHyphens w:val="true"/>
-              <w:spacing w:before="0" w:after="80"/>
-              <w:jc w:val="start"/>
-              <w:rPr>
-                <w:rFonts w:eastAsia="ＭＳ 明朝" w:cs=""/>
-                <w:kern w:val="0"/>
-                <w:szCs w:val="22"/>
-                <w:lang w:val="en-US" w:eastAsia="en-US" w:bidi="ar-SA"/>
-              </w:rPr>
-            </w:pPr>
-            <w:r>
-              <w:rPr>
-                <w:rFonts w:eastAsia="ＭＳ 明朝" w:cs="" w:ascii="Arial" w:hAnsi="Arial"/>
-                <w:kern w:val="0"/>
-                <w:sz w:val="20"/>
-                <w:szCs w:val="22"/>
-                <w:lang w:val="en-US" w:eastAsia="en-US" w:bidi="ar-SA"/>
-              </w:rPr>
-              <w:t>Zev-7S</w:t>
+            <w:tcBorders/>
+          </w:tcPr>
+          <w:p>
+            <w:pPr>
+              <w:pStyle w:val="Normal"/>
+              <w:widowControl/>
+              <w:suppressAutoHyphens w:val="true"/>
+              <w:spacing w:before="0" w:after="80"/>
+              <w:jc w:val="start"/>
+              <w:rPr>
+                <w:rFonts w:eastAsia="ＭＳ 明朝" w:cs=""/>
+                <w:kern w:val="0"/>
+                <w:szCs w:val="22"/>
+                <w:lang w:val="en-US" w:eastAsia="en-US" w:bidi="ar-SA"/>
+              </w:rPr>
+            </w:pPr>
+            <w:r>
+              <w:rPr>
+                <w:rFonts w:eastAsia="ＭＳ 明朝" w:cs="" w:ascii="Arial" w:hAnsi="Arial"/>
+                <w:kern w:val="0"/>
+                <w:sz w:val="20"/>
+                <w:szCs w:val="22"/>
+                <w:lang w:val="en-US" w:eastAsia="en-US" w:bidi="ar-SA"/>
+              </w:rPr>
+              <w:t>NX2</w:t>
             </w:r>
           </w:p>
         </w:tc>
         <w:tc>
           <w:tcPr>
             <w:tcW w:w="3135" w:type="dxa"/>
-            <w:tcBorders>
-              <w:top w:val="nil"/>
-            </w:tcBorders>
-          </w:tcPr>
-          <w:p>
-            <w:pPr>
-              <w:pStyle w:val="Normal"/>
-              <w:widowControl/>
-              <w:suppressAutoHyphens w:val="true"/>
-              <w:spacing w:before="0" w:after="80"/>
-              <w:jc w:val="start"/>
-              <w:rPr>
-                <w:rFonts w:eastAsia="ＭＳ 明朝" w:cs=""/>
-                <w:kern w:val="0"/>
-                <w:szCs w:val="22"/>
-                <w:lang w:val="en-US" w:eastAsia="en-US" w:bidi="ar-SA"/>
-              </w:rPr>
-            </w:pPr>
-            <w:r>
-              <w:rPr>
-                <w:rFonts w:eastAsia="ＭＳ 明朝" w:cs="" w:ascii="Arial" w:hAnsi="Arial"/>
-                <w:kern w:val="0"/>
-                <w:sz w:val="20"/>
-                <w:szCs w:val="22"/>
-                <w:lang w:val="en-US" w:eastAsia="en-US" w:bidi="ar-SA"/>
-              </w:rPr>
-              <w:t>4–20 RGB LEDs (chip type, color, brightness and count configurable); one LED under each tube</w:t>
+            <w:tcBorders/>
+          </w:tcPr>
+          <w:p>
+            <w:pPr>
+              <w:pStyle w:val="Normal"/>
+              <w:widowControl/>
+              <w:suppressAutoHyphens w:val="true"/>
+              <w:spacing w:before="0" w:after="80"/>
+              <w:jc w:val="start"/>
+              <w:rPr>
+                <w:rFonts w:eastAsia="ＭＳ 明朝" w:cs=""/>
+                <w:kern w:val="0"/>
+                <w:szCs w:val="22"/>
+                <w:lang w:val="en-US" w:eastAsia="en-US" w:bidi="ar-SA"/>
+              </w:rPr>
+            </w:pPr>
+            <w:r>
+              <w:rPr>
+                <w:rFonts w:eastAsia="ＭＳ 明朝" w:cs="" w:ascii="Arial" w:hAnsi="Arial"/>
+                <w:kern w:val="0"/>
+                <w:sz w:val="20"/>
+                <w:szCs w:val="22"/>
+                <w:lang w:val="en-US" w:eastAsia="en-US" w:bidi="ar-SA"/>
+              </w:rPr>
+              <w:t>Hours ones</w:t>
             </w:r>
           </w:p>
         </w:tc>
@@ -2435,187 +2690,92 @@
         <w:tc>
           <w:tcPr>
             <w:tcW w:w="3135" w:type="dxa"/>
-            <w:tcBorders>
-              <w:top w:val="nil"/>
-            </w:tcBorders>
-          </w:tcPr>
-          <w:p>
-            <w:pPr>
-              <w:pStyle w:val="Normal"/>
-              <w:widowControl/>
-              <w:suppressAutoHyphens w:val="true"/>
-              <w:spacing w:before="0" w:after="80"/>
-              <w:jc w:val="start"/>
-              <w:rPr>
-                <w:rFonts w:eastAsia="ＭＳ 明朝" w:cs=""/>
-                <w:kern w:val="0"/>
-                <w:szCs w:val="22"/>
-                <w:lang w:val="en-US" w:eastAsia="en-US" w:bidi="ar-SA"/>
-              </w:rPr>
-            </w:pPr>
-            <w:r>
-              <w:rPr>
-                <w:rFonts w:eastAsia="ＭＳ 明朝" w:cs="" w:ascii="Arial" w:hAnsi="Arial"/>
-                <w:kern w:val="0"/>
-                <w:sz w:val="20"/>
-                <w:szCs w:val="22"/>
-                <w:lang w:val="en-US" w:eastAsia="en-US" w:bidi="ar-SA"/>
-              </w:rPr>
-              <w:t>Zev-7-18</w:t>
+            <w:tcBorders/>
+          </w:tcPr>
+          <w:p>
+            <w:pPr>
+              <w:pStyle w:val="Normal"/>
+              <w:widowControl/>
+              <w:suppressAutoHyphens w:val="true"/>
+              <w:spacing w:before="0" w:after="80"/>
+              <w:jc w:val="start"/>
+              <w:rPr>
+                <w:rFonts w:eastAsia="ＭＳ 明朝" w:cs=""/>
+                <w:kern w:val="0"/>
+                <w:szCs w:val="22"/>
+                <w:lang w:val="en-US" w:eastAsia="en-US" w:bidi="ar-SA"/>
+              </w:rPr>
+            </w:pPr>
+            <w:r>
+              <w:rPr>
+                <w:rFonts w:eastAsia="ＭＳ 明朝" w:cs="" w:ascii="Arial" w:hAnsi="Arial"/>
+                <w:kern w:val="0"/>
+                <w:sz w:val="20"/>
+                <w:szCs w:val="22"/>
+                <w:lang w:val="en-US" w:eastAsia="en-US" w:bidi="ar-SA"/>
+              </w:rPr>
             </w:r>
           </w:p>
         </w:tc>
         <w:tc>
           <w:tcPr>
             <w:tcW w:w="3135" w:type="dxa"/>
-            <w:tcBorders>
-              <w:top w:val="nil"/>
-            </w:tcBorders>
-          </w:tcPr>
-          <w:p>
-            <w:pPr>
-              <w:pStyle w:val="Normal"/>
-              <w:widowControl/>
-              <w:suppressAutoHyphens w:val="true"/>
-              <w:spacing w:before="0" w:after="80"/>
-              <w:jc w:val="start"/>
-              <w:rPr>
-                <w:rFonts w:eastAsia="ＭＳ 明朝" w:cs=""/>
-                <w:kern w:val="0"/>
-                <w:szCs w:val="22"/>
-                <w:lang w:val="en-US" w:eastAsia="en-US" w:bidi="ar-SA"/>
-              </w:rPr>
-            </w:pPr>
-            <w:r>
-              <w:rPr>
-                <w:rFonts w:eastAsia="ＭＳ 明朝" w:cs="" w:ascii="Arial" w:hAnsi="Arial"/>
-                <w:kern w:val="0"/>
-                <w:sz w:val="20"/>
-                <w:szCs w:val="22"/>
-                <w:lang w:val="en-US" w:eastAsia="en-US" w:bidi="ar-SA"/>
-              </w:rPr>
-              <w:t>Zev-7-18</w:t>
+            <w:tcBorders/>
+          </w:tcPr>
+          <w:p>
+            <w:pPr>
+              <w:pStyle w:val="Normal"/>
+              <w:widowControl/>
+              <w:suppressAutoHyphens w:val="true"/>
+              <w:spacing w:before="0" w:after="80"/>
+              <w:jc w:val="start"/>
+              <w:rPr>
+                <w:rFonts w:eastAsia="ＭＳ 明朝" w:cs=""/>
+                <w:kern w:val="0"/>
+                <w:szCs w:val="22"/>
+                <w:lang w:val="en-US" w:eastAsia="en-US" w:bidi="ar-SA"/>
+              </w:rPr>
+            </w:pPr>
+            <w:r>
+              <w:rPr>
+                <w:rFonts w:eastAsia="ＭＳ 明朝" w:cs="" w:ascii="Arial" w:hAnsi="Arial"/>
+                <w:kern w:val="0"/>
+                <w:sz w:val="20"/>
+                <w:szCs w:val="22"/>
+                <w:lang w:val="en-US" w:eastAsia="en-US" w:bidi="ar-SA"/>
+              </w:rPr>
+              <w:t>NX3</w:t>
             </w:r>
           </w:p>
         </w:tc>
         <w:tc>
           <w:tcPr>
             <w:tcW w:w="3135" w:type="dxa"/>
-            <w:tcBorders>
-              <w:top w:val="nil"/>
-            </w:tcBorders>
-          </w:tcPr>
-          <w:p>
-            <w:pPr>
-              <w:pStyle w:val="Normal"/>
-              <w:widowControl/>
-              <w:suppressAutoHyphens w:val="true"/>
-              <w:spacing w:before="0" w:after="80"/>
-              <w:jc w:val="start"/>
-              <w:rPr>
-                <w:rFonts w:eastAsia="ＭＳ 明朝" w:cs=""/>
-                <w:kern w:val="0"/>
-                <w:szCs w:val="22"/>
-                <w:lang w:val="en-US" w:eastAsia="en-US" w:bidi="ar-SA"/>
-              </w:rPr>
-            </w:pPr>
-            <w:r>
-              <w:rPr>
-                <w:rFonts w:eastAsia="ＭＳ 明朝" w:cs="" w:ascii="Arial" w:hAnsi="Arial"/>
-                <w:kern w:val="0"/>
-                <w:sz w:val="20"/>
-                <w:szCs w:val="22"/>
-                <w:lang w:val="en-US" w:eastAsia="en-US" w:bidi="ar-SA"/>
-              </w:rPr>
-              <w:t>4–20 RGB LEDs (chip type, color, brightness and count configurable); one LED under each tube</w:t>
-            </w:r>
-          </w:p>
-        </w:tc>
-      </w:tr>
-      <w:tr>
-        <w:tc>
-          <w:tcPr>
-            <w:tcW w:type="dxa" w:w="3135"/>
-          </w:tcPr>
-          <w:p>
-            <w:r>
-              <w:rPr>
-                <w:rFonts w:ascii="Arial" w:hAnsi="Arial"/>
-                <w:sz w:val="20"/>
-              </w:rPr>
-              <w:t>Zev-7-18 2-LED</w:t>
-            </w:r>
-          </w:p>
-        </w:tc>
-        <w:tc>
-          <w:tcPr>
-            <w:tcW w:type="dxa" w:w="3135"/>
-          </w:tcPr>
-          <w:p>
-            <w:r>
-              <w:rPr>
-                <w:rFonts w:ascii="Arial" w:hAnsi="Arial"/>
-                <w:sz w:val="20"/>
-              </w:rPr>
-              <w:t>Zev-7-18</w:t>
-            </w:r>
-          </w:p>
-        </w:tc>
-        <w:tc>
-          <w:tcPr>
-            <w:tcW w:type="dxa" w:w="3135"/>
-          </w:tcPr>
-          <w:p>
-            <w:r>
-              <w:rPr>
-                <w:rFonts w:ascii="Arial" w:hAnsi="Arial"/>
-                <w:sz w:val="20"/>
-              </w:rPr>
-              <w:t>4–20 RGB LEDs (chip type, color, brightness and count configurable); two LEDs under each tube (adds Display LED Grouping)</w:t>
-            </w:r>
-          </w:p>
-        </w:tc>
-      </w:tr>
-      <w:tr>
-        <w:tc>
-          <w:tcPr>
-            <w:tcW w:type="dxa" w:w="3135"/>
-          </w:tcPr>
-          <w:p>
-            <w:r>
-              <w:rPr>
-                <w:rFonts w:ascii="Arial" w:hAnsi="Arial"/>
-                <w:sz w:val="20"/>
-              </w:rPr>
-              <w:t>Zev-7RZ</w:t>
-            </w:r>
-          </w:p>
-        </w:tc>
-        <w:tc>
-          <w:tcPr>
-            <w:tcW w:type="dxa" w:w="3135"/>
-          </w:tcPr>
-          <w:p>
-            <w:r>
-              <w:rPr>
-                <w:rFonts w:ascii="Arial" w:hAnsi="Arial"/>
-                <w:sz w:val="20"/>
-              </w:rPr>
-              <w:t>Zev-7RZ</w:t>
-            </w:r>
-          </w:p>
-        </w:tc>
-        <w:tc>
-          <w:tcPr>
-            <w:tcW w:type="dxa" w:w="3135"/>
-          </w:tcPr>
-          <w:p>
-            <w:r>
-              <w:rPr>
-                <w:rFonts w:ascii="Arial" w:hAnsi="Arial"/>
-                <w:sz w:val="20"/>
-              </w:rPr>
-              <w:t>Fixed 21-LED chain — two LEDs under each tube plus seven under the board. Not configurable.</w:t>
+            <w:tcBorders/>
+          </w:tcPr>
+          <w:p>
+            <w:pPr>
+              <w:pStyle w:val="Normal"/>
+              <w:widowControl/>
+              <w:suppressAutoHyphens w:val="true"/>
+              <w:spacing w:before="0" w:after="80"/>
+              <w:jc w:val="start"/>
+              <w:rPr>
+                <w:rFonts w:eastAsia="ＭＳ 明朝" w:cs=""/>
+                <w:kern w:val="0"/>
+                <w:szCs w:val="22"/>
+                <w:lang w:val="en-US" w:eastAsia="en-US" w:bidi="ar-SA"/>
+              </w:rPr>
+            </w:pPr>
+            <w:r>
+              <w:rPr>
+                <w:rFonts w:eastAsia="ＭＳ 明朝" w:cs="" w:ascii="Arial" w:hAnsi="Arial"/>
+                <w:kern w:val="0"/>
+                <w:sz w:val="20"/>
+                <w:szCs w:val="22"/>
+                <w:lang w:val="en-US" w:eastAsia="en-US" w:bidi="ar-SA"/>
+              </w:rPr>
+              <w:t>Minutes tens</w:t>
             </w:r>
           </w:p>
         </w:tc>
@@ -2649,7 +2809,6 @@
                 <w:szCs w:val="22"/>
                 <w:lang w:val="en-US" w:eastAsia="en-US" w:bidi="ar-SA"/>
               </w:rPr>
-              <w:t>Metronome</w:t>
             </w:r>
           </w:p>
         </w:tc>
@@ -2680,7 +2839,7 @@
                 <w:szCs w:val="22"/>
                 <w:lang w:val="en-US" w:eastAsia="en-US" w:bidi="ar-SA"/>
               </w:rPr>
-              <w:t>Metronome</w:t>
+              <w:t>NX4</w:t>
             </w:r>
           </w:p>
         </w:tc>
@@ -2711,7 +2870,7 @@
                 <w:szCs w:val="22"/>
                 <w:lang w:val="en-US" w:eastAsia="en-US" w:bidi="ar-SA"/>
               </w:rPr>
-              <w:t>None</w:t>
+              <w:t>Minutes ones</w:t>
             </w:r>
           </w:p>
         </w:tc>
@@ -2745,7 +2904,6 @@
                 <w:szCs w:val="22"/>
                 <w:lang w:val="en-US" w:eastAsia="en-US" w:bidi="ar-SA"/>
               </w:rPr>
-              <w:t>Zev-7NS (numitron)</w:t>
             </w:r>
           </w:p>
         </w:tc>
@@ -2776,7 +2934,7 @@
                 <w:szCs w:val="22"/>
                 <w:lang w:val="en-US" w:eastAsia="en-US" w:bidi="ar-SA"/>
               </w:rPr>
-              <w:t>Zev-7NS</w:t>
+              <w:t>NX5</w:t>
             </w:r>
           </w:p>
         </w:tc>
@@ -2807,7 +2965,7 @@
                 <w:szCs w:val="22"/>
                 <w:lang w:val="en-US" w:eastAsia="en-US" w:bidi="ar-SA"/>
               </w:rPr>
-              <w:t>4–20 RGB LEDs (color, brightness and count configurable); one LED under each display</w:t>
+              <w:t>Seconds tens</w:t>
             </w:r>
           </w:p>
         </w:tc>
@@ -2841,7 +2999,6 @@
                 <w:szCs w:val="22"/>
                 <w:lang w:val="en-US" w:eastAsia="en-US" w:bidi="ar-SA"/>
               </w:rPr>
-              <w:t>Zev-7ND (numitron)</w:t>
             </w:r>
           </w:p>
         </w:tc>
@@ -2872,7 +3029,7 @@
                 <w:szCs w:val="22"/>
                 <w:lang w:val="en-US" w:eastAsia="en-US" w:bidi="ar-SA"/>
               </w:rPr>
-              <w:t>Zev-7ND</w:t>
+              <w:t>NX6</w:t>
             </w:r>
           </w:p>
         </w:tc>
@@ -2903,7 +3060,103 @@
                 <w:szCs w:val="22"/>
                 <w:lang w:val="en-US" w:eastAsia="en-US" w:bidi="ar-SA"/>
               </w:rPr>
-              <w:t>None (two under-tube LEDs per display)</w:t>
+              <w:t>Seconds ones</w:t>
+            </w:r>
+          </w:p>
+        </w:tc>
+      </w:tr>
+      <w:tr>
+        <w:trPr/>
+        <w:tc>
+          <w:tcPr>
+            <w:tcW w:w="3135" w:type="dxa"/>
+            <w:tcBorders/>
+          </w:tcPr>
+          <w:p>
+            <w:pPr>
+              <w:pStyle w:val="Normal"/>
+              <w:widowControl/>
+              <w:suppressAutoHyphens w:val="true"/>
+              <w:spacing w:before="0" w:after="80"/>
+              <w:jc w:val="start"/>
+              <w:rPr>
+                <w:rFonts w:eastAsia="ＭＳ 明朝" w:cs=""/>
+                <w:kern w:val="0"/>
+                <w:szCs w:val="22"/>
+                <w:lang w:val="en-US" w:eastAsia="en-US" w:bidi="ar-SA"/>
+              </w:rPr>
+            </w:pPr>
+            <w:r>
+              <w:rPr>
+                <w:rFonts w:eastAsia="ＭＳ 明朝" w:cs="" w:ascii="Arial" w:hAnsi="Arial"/>
+                <w:kern w:val="0"/>
+                <w:sz w:val="20"/>
+                <w:szCs w:val="22"/>
+                <w:lang w:val="en-US" w:eastAsia="en-US" w:bidi="ar-SA"/>
+              </w:rPr>
+              <w:t>Right</w:t>
+            </w:r>
+          </w:p>
+        </w:tc>
+        <w:tc>
+          <w:tcPr>
+            <w:tcW w:w="3135" w:type="dxa"/>
+            <w:tcBorders/>
+          </w:tcPr>
+          <w:p>
+            <w:pPr>
+              <w:pStyle w:val="Normal"/>
+              <w:widowControl/>
+              <w:suppressAutoHyphens w:val="true"/>
+              <w:spacing w:before="0" w:after="80"/>
+              <w:jc w:val="start"/>
+              <w:rPr>
+                <w:rFonts w:eastAsia="ＭＳ 明朝" w:cs=""/>
+                <w:kern w:val="0"/>
+                <w:szCs w:val="22"/>
+                <w:lang w:val="en-US" w:eastAsia="en-US" w:bidi="ar-SA"/>
+              </w:rPr>
+            </w:pPr>
+            <w:r>
+              <w:rPr>
+                <w:rFonts w:eastAsia="ＭＳ 明朝" w:cs="" w:ascii="Arial" w:hAnsi="Arial"/>
+                <w:kern w:val="0"/>
+                <w:sz w:val="20"/>
+                <w:szCs w:val="22"/>
+                <w:lang w:val="en-US" w:eastAsia="en-US" w:bidi="ar-SA"/>
+              </w:rPr>
+              <w:t>NX7</w:t>
+            </w:r>
+          </w:p>
+        </w:tc>
+        <w:tc>
+          <w:tcPr>
+            <w:tcW w:w="3135" w:type="dxa"/>
+            <w:tcBorders/>
+          </w:tcPr>
+          <w:p>
+            <w:pPr>
+              <w:pStyle w:val="Normal"/>
+              <w:widowControl/>
+              <w:suppressAutoHyphens w:val="true"/>
+              <w:spacing w:before="0" w:after="80"/>
+              <w:jc w:val="start"/>
+              <w:rPr>
+                <w:rFonts w:eastAsia="ＭＳ 明朝" w:cs=""/>
+                <w:kern w:val="0"/>
+                <w:szCs w:val="22"/>
+                <w:lang w:val="en-US" w:eastAsia="en-US" w:bidi="ar-SA"/>
+              </w:rPr>
+            </w:pPr>
+            <w:r>
+              <w:rPr>
+                <w:rFonts w:eastAsia="ＭＳ 明朝" w:cs="" w:ascii="Arial" w:hAnsi="Arial"/>
+                <w:kern w:val="0"/>
+                <w:sz w:val="20"/>
+                <w:szCs w:val="22"/>
+                <w:lang w:val="en-US" w:eastAsia="en-US" w:bidi="ar-SA"/>
+              </w:rPr>
+              <w:t>Tenths of a second</w:t>
             </w:r>
           </w:p>
         </w:tc>
@@ -2924,251 +3177,74 @@
     <w:p>
       <w:pPr>
         <w:pStyle w:val="Normal"/>
-        <w:pBdr>
-          <w:left w:val="single" w:sz="24" w:space="8" w:color="C25600"/>
-        </w:pBdr>
-        <w:spacing w:before="120" w:after="120"/>
-        <w:ind w:start="216"/>
         <w:rPr/>
       </w:pPr>
       <w:r>
         <w:rPr>
           <w:rFonts w:ascii="Arial" w:hAnsi="Arial"/>
-          <w:b/>
-          <w:bCs/>
-          <w:color w:val="C25600"/>
-          <w:sz w:val="24"/>
-          <w:szCs w:val="24"/>
-        </w:rPr>
-        <w:t>NOTICE</w:t>
-      </w:r>
-      <w:r>
-        <w:rPr>
-          <w:rFonts w:ascii="Arial" w:hAnsi="Arial"/>
-          <w:b/>
-          <w:bCs/>
-          <w:color w:val="C25600"/>
           <w:sz w:val="22"/>
         </w:rPr>
-        <w:t>:</w:t>
-      </w:r>
-      <w:r>
-        <w:rPr>
-          <w:rFonts w:ascii="Arial" w:hAnsi="Arial"/>
-          <w:color w:val="C25600"/>
-          <w:sz w:val="22"/>
-        </w:rPr>
-        <w:t xml:space="preserve"> </w:t>
-      </w:r>
-      <w:r>
-        <w:rPr>
-          <w:rFonts w:ascii="Arial" w:hAnsi="Arial"/>
-          <w:b w:val="false"/>
-          <w:bCs w:val="false"/>
-          <w:color w:val="000000"/>
-          <w:sz w:val="22"/>
-        </w:rPr>
-        <w:t xml:space="preserve">If </w:t>
-      </w:r>
-      <w:r>
-        <w:rPr>
-          <w:rFonts w:ascii="Arial" w:hAnsi="Arial"/>
-          <w:b w:val="false"/>
-          <w:bCs w:val="false"/>
-          <w:i w:val="false"/>
-          <w:iCs w:val="false"/>
-          <w:color w:val="000000"/>
-          <w:sz w:val="22"/>
-        </w:rPr>
-        <w:t>the</w:t>
-      </w:r>
-      <w:r>
-        <w:rPr>
-          <w:rFonts w:ascii="Arial" w:hAnsi="Arial"/>
-          <w:b w:val="false"/>
-          <w:bCs w:val="false"/>
-          <w:color w:val="000000"/>
-          <w:sz w:val="22"/>
-        </w:rPr>
-        <w:t xml:space="preserve"> display shows 00, the processor must be returned to the manufacturer for reprogramming.</w:t>
+        <w:t>Neon indicators between the tube pairs serve as colon separators (H:M and M:S) and status indicators. A separate "BR" neon is used for additional indication and blinks off briefly if the clock loses its WiFi connection.</w:t>
       </w:r>
     </w:p>
     <w:p>
       <w:pPr>
         <w:pStyle w:val="Normal"/>
-        <w:pBdr>
-          <w:bottom w:val="single" w:sz="18" w:space="1" w:color="000000"/>
-        </w:pBdr>
-        <w:spacing w:before="0" w:after="0"/>
-        <w:rPr/>
-      </w:pPr>
-      <w:r>
+        <w:spacing w:before="0" w:after="80"/>
         <w:rPr>
           <w:rFonts w:ascii="Arial" w:hAnsi="Arial"/>
           <w:sz w:val="22"/>
         </w:rPr>
+      </w:pPr>
+      <w:r>
+        <w:rPr>
+          <w:rFonts w:ascii="Arial" w:hAnsi="Arial"/>
+          <w:sz w:val="22"/>
+        </w:rPr>
+        <w:t>The tenths-of-a-second digit updates live at 10 Hz.</w:t>
       </w:r>
     </w:p>
     <w:p>
       <w:pPr>
-        <w:pStyle w:val="Heading2"/>
-      </w:pPr>
-      <w:r>
+        <w:pStyle w:val="Normal"/>
+        <w:spacing w:before="0" w:after="80"/>
         <w:rPr>
           <w:rFonts w:ascii="Arial" w:hAnsi="Arial"/>
-        </w:rPr>
-        <w:t>Numitron Variants (Zev-7NS and Zev-7ND)</w:t>
+          <w:sz w:val="22"/>
+        </w:rPr>
+      </w:pPr>
+      <w:r>
+        <w:rPr>
+          <w:rFonts w:ascii="Arial" w:hAnsi="Arial"/>
+          <w:sz w:val="22"/>
+        </w:rPr>
       </w:r>
     </w:p>
     <w:p>
-      <w:pPr/>
-      <w:r>
+      <w:pPr>
+        <w:pStyle w:val="Normal"/>
+        <w:spacing w:before="0" w:after="80"/>
         <w:rPr>
           <w:rFonts w:ascii="Arial" w:hAnsi="Arial"/>
           <w:sz w:val="22"/>
         </w:rPr>
-        <w:t>The numitron models run the same firmware as the Zev-7 and share every feature described in this manual — Rules, LED effects, colon display patterns, the info display cycle, sensors, OTA updates, and the web interface. Wherever this manual says "Nixie" (for example, "Nixie Brightness"), read it as the numitron display on these models. The differences are:</w:t>
-      </w:r>
-    </w:p>
-    <w:p>
-      <w:pPr>
-        <w:pStyle w:val="ListBullet"/>
-      </w:pPr>
-      <w:r>
-        <w:rPr>
-          <w:rFonts w:ascii="Arial" w:hAnsi="Arial"/>
-        </w:rPr>
-        <w:t>Display technology: seven numitron seven-segment filament tubes — DR2010 on the Zev-7NS, DTF-104B on the Zev-7ND — driven by four TLC59116 constant-current LED drivers over I2C, in place of the Zev-7’s IN-14 Nixie tubes and HV5530 high-voltage shift drivers. The "Nixie Brightness" setting controls numitron filament brightness on these models.</w:t>
-      </w:r>
-    </w:p>
-    <w:p>
-      <w:pPr>
-        <w:pStyle w:val="ListBullet"/>
-      </w:pPr>
-      <w:r>
-        <w:rPr>
-          <w:rFonts w:ascii="Arial" w:hAnsi="Arial"/>
-        </w:rPr>
-        <w:t>No high voltage: the numitron display runs at low voltage with no mercury and no ~170 V supply. The high-voltage safety note in the Copyright and Disclaimer section applies to the Nixie models only.</w:t>
-      </w:r>
-    </w:p>
-    <w:p>
-      <w:pPr>
-        <w:pStyle w:val="ListBullet"/>
-      </w:pPr>
-      <w:r>
-        <w:rPr>
-          <w:rFonts w:ascii="Arial" w:hAnsi="Arial"/>
-        </w:rPr>
-        <w:t>No cathode anti-poisoning: filaments do not poison, so Section 14 (Cathode Anti-Poisoning), the Anti-Poison settings on the AP and live forms, the power-on conditioning runs, and the noap rule keyword have no effect on the numitron models. The display simply runs the time continuously.</w:t>
-      </w:r>
-    </w:p>
-    <w:p>
-      <w:pPr>
-        <w:pStyle w:val="ListBullet"/>
-      </w:pPr>
-      <w:r>
-        <w:rPr>
-          <w:rFonts w:ascii="Arial" w:hAnsi="Arial"/>
-        </w:rPr>
-        <w:t>Colon indicators: the colon separators are LEDs rather than neon lamps, but every colon (neon) display pattern in Section 11 works identically. Because LEDs read much brighter than the filament tubes, a Colon LED Brightness control (0–10) is provided on both the AP Settings form and the live form. It is a trim, not an absolute level: the colons still follow the Nixie Brightness setting and the light sensor, and this control only sets how bright they sit against the tubes. The default is 3. Raise it if the colons look too dim at low display brightness, lower it if they overpower the tubes.</w:t>
-      </w:r>
-    </w:p>
-    <w:p>
-      <w:pPr>
-        <w:pStyle w:val="ListBullet"/>
-        <w:sectPr>
-          <w:headerReference w:type="even" r:id="rId27"/>
-          <w:footerReference w:type="even" r:id="rId30"/>
-          <w:headerReference w:type="default" r:id="rId27"/>
-          <w:headerReference w:type="first" r:id="rId27"/>
-          <w:footerReference w:type="default" r:id="rId30"/>
-          <w:footerReference w:type="first" r:id="rId30"/>
-          <w:type w:val="nextPage"/>
-          <w:pgSz w:w="12240" w:h="15840"/>
-          <w:pgMar w:left="1417" w:right="1417" w:gutter="0" w:header="720" w:top="1134" w:footer="720" w:bottom="1134"/>
-          <w:pgNumType w:start="1" w:fmt="decimal"/>
-          <w:formProt w:val="false"/>
-          <w:textDirection w:val="lrTb"/>
-          <w:docGrid w:type="default" w:linePitch="360" w:charSpace="0"/>
-        </w:sectPr>
-      </w:pPr>
-      <w:r>
-        <w:rPr>
-          <w:rFonts w:ascii="Arial" w:hAnsi="Arial"/>
-        </w:rPr>
-        <w:t>Models and addressing: Zev-7NS (DR2010 tubes, one under-tube LED per display, plus a separate under-board light string of 4–20 LEDs) and Zev-7ND (DTF-104B tubes, two under-tube LEDs per display, no under-board string — the Under Lighting settings are hidden on that model). In AP mode they appear as the WiFi networks Zev-7NS and Zev-7ND, and are reachable by name at zev-7ns.local and zev-7nd.local respectively.</w:t>
-      </w:r>
-    </w:p>
-    <w:p>
-      <w:pPr>
-        <w:pStyle w:val="Heading1"/>
-        <w:keepNext w:val="true"/>
-        <w:spacing w:before="160" w:after="160"/>
-        <w:rPr/>
-      </w:pPr>
-      <w:r>
-        <w:rPr>
-          <w:rFonts w:ascii="Arial" w:hAnsi="Arial"/>
-          <w:b/>
-          <w:color w:val="C25600"/>
-          <w:sz w:val="40"/>
-        </w:rPr>
-        <w:t>3. Display</w:t>
-      </w:r>
-    </w:p>
-    <w:p>
-      <w:pPr>
-        <w:pStyle w:val="Normal"/>
-        <w:pBdr>
-          <w:bottom w:val="single" w:sz="18" w:space="1" w:color="000000"/>
-        </w:pBdr>
-        <w:spacing w:before="0" w:after="0"/>
-        <w:rPr/>
       </w:pPr>
       <w:r>
         <w:rPr>
           <w:rFonts w:ascii="Arial" w:hAnsi="Arial"/>
           <w:sz w:val="22"/>
         </w:rPr>
-      </w:r>
-    </w:p>
-    <w:p>
-      <w:pPr>
-        <w:pStyle w:val="Normal"/>
-        <w:spacing w:before="0" w:after="80"/>
-        <w:rPr/>
-      </w:pPr>
-      <w:r>
-        <w:rPr>
-          <w:rFonts w:ascii="Arial" w:hAnsi="Arial"/>
+        <w:t xml:space="preserve">The Metronome display adds an additional eight displays. </w:t>
+      </w:r>
+      <w:r>
+        <w:rPr>
+          <w:rFonts w:eastAsia="ＭＳ 明朝" w:cs="" w:ascii="Arial" w:hAnsi="Arial"/>
+          <w:kern w:val="0"/>
           <w:sz w:val="22"/>
-        </w:rPr>
-      </w:r>
-    </w:p>
-    <w:p>
-      <w:pPr>
-        <w:pStyle w:val="Normal"/>
-        <w:rPr/>
-      </w:pPr>
-      <w:r>
-        <w:rPr>
-          <w:rFonts w:ascii="Arial" w:hAnsi="Arial"/>
-          <w:sz w:val="22"/>
-        </w:rPr>
-      </w:r>
-      <w:r>
-        <w:rPr>
-          <w:rFonts w:ascii="Arial" w:hAnsi="Arial"/>
-          <w:sz w:val="22"/>
-        </w:rPr>
-      </w:r>
-      <w:r>
-        <w:rPr>
-          <w:rFonts w:ascii="Arial" w:hAnsi="Arial"/>
-          <w:sz w:val="22"/>
-        </w:rPr>
-        <w:t>The Zev-7 has seven Nixie tubes; the Metronome has fifteen. Both have a set of neon indicator lamps:</w:t>
+          <w:szCs w:val="22"/>
+          <w:lang w:val="en-US" w:eastAsia="en-US" w:bidi="ar-SA"/>
+        </w:rPr>
+        <w:t>The following tubes count down the time to midnight.</w:t>
       </w:r>
     </w:p>
     <w:tbl>
@@ -3301,884 +3377,6 @@
         <w:tc>
           <w:tcPr>
             <w:tcW w:w="3135" w:type="dxa"/>
-            <w:tcBorders/>
-          </w:tcPr>
-          <w:p>
-            <w:pPr>
-              <w:pStyle w:val="Normal"/>
-              <w:widowControl/>
-              <w:suppressAutoHyphens w:val="true"/>
-              <w:spacing w:before="0" w:after="80"/>
-              <w:jc w:val="start"/>
-              <w:rPr>
-                <w:rFonts w:eastAsia="ＭＳ 明朝" w:cs=""/>
-                <w:kern w:val="0"/>
-                <w:szCs w:val="22"/>
-                <w:lang w:val="en-US" w:eastAsia="en-US" w:bidi="ar-SA"/>
-              </w:rPr>
-            </w:pPr>
-            <w:r>
-              <w:rPr>
-                <w:rFonts w:eastAsia="ＭＳ 明朝" w:cs="" w:ascii="Arial" w:hAnsi="Arial"/>
-                <w:kern w:val="0"/>
-                <w:sz w:val="20"/>
-                <w:szCs w:val="22"/>
-                <w:lang w:val="en-US" w:eastAsia="en-US" w:bidi="ar-SA"/>
-              </w:rPr>
-              <w:t>Left</w:t>
-            </w:r>
-          </w:p>
-        </w:tc>
-        <w:tc>
-          <w:tcPr>
-            <w:tcW w:w="3135" w:type="dxa"/>
-            <w:tcBorders/>
-          </w:tcPr>
-          <w:p>
-            <w:pPr>
-              <w:pStyle w:val="Normal"/>
-              <w:widowControl/>
-              <w:suppressAutoHyphens w:val="true"/>
-              <w:spacing w:before="0" w:after="80"/>
-              <w:jc w:val="start"/>
-              <w:rPr>
-                <w:rFonts w:eastAsia="ＭＳ 明朝" w:cs=""/>
-                <w:kern w:val="0"/>
-                <w:szCs w:val="22"/>
-                <w:lang w:val="en-US" w:eastAsia="en-US" w:bidi="ar-SA"/>
-              </w:rPr>
-            </w:pPr>
-            <w:r>
-              <w:rPr>
-                <w:rFonts w:eastAsia="ＭＳ 明朝" w:cs="" w:ascii="Arial" w:hAnsi="Arial"/>
-                <w:kern w:val="0"/>
-                <w:sz w:val="20"/>
-                <w:szCs w:val="22"/>
-                <w:lang w:val="en-US" w:eastAsia="en-US" w:bidi="ar-SA"/>
-              </w:rPr>
-              <w:t>NX1</w:t>
-            </w:r>
-          </w:p>
-        </w:tc>
-        <w:tc>
-          <w:tcPr>
-            <w:tcW w:w="3135" w:type="dxa"/>
-            <w:tcBorders/>
-          </w:tcPr>
-          <w:p>
-            <w:pPr>
-              <w:pStyle w:val="Normal"/>
-              <w:widowControl/>
-              <w:suppressAutoHyphens w:val="true"/>
-              <w:spacing w:before="0" w:after="80"/>
-              <w:jc w:val="start"/>
-              <w:rPr>
-                <w:rFonts w:eastAsia="ＭＳ 明朝" w:cs=""/>
-                <w:kern w:val="0"/>
-                <w:szCs w:val="22"/>
-                <w:lang w:val="en-US" w:eastAsia="en-US" w:bidi="ar-SA"/>
-              </w:rPr>
-            </w:pPr>
-            <w:r>
-              <w:rPr>
-                <w:rFonts w:eastAsia="ＭＳ 明朝" w:cs="" w:ascii="Arial" w:hAnsi="Arial"/>
-                <w:kern w:val="0"/>
-                <w:sz w:val="20"/>
-                <w:szCs w:val="22"/>
-                <w:lang w:val="en-US" w:eastAsia="en-US" w:bidi="ar-SA"/>
-              </w:rPr>
-              <w:t>Hours tens</w:t>
-            </w:r>
-          </w:p>
-        </w:tc>
-      </w:tr>
-      <w:tr>
-        <w:trPr/>
-        <w:tc>
-          <w:tcPr>
-            <w:tcW w:w="3135" w:type="dxa"/>
-            <w:tcBorders/>
-          </w:tcPr>
-          <w:p>
-            <w:pPr>
-              <w:pStyle w:val="Normal"/>
-              <w:widowControl/>
-              <w:suppressAutoHyphens w:val="true"/>
-              <w:spacing w:before="0" w:after="80"/>
-              <w:jc w:val="start"/>
-              <w:rPr>
-                <w:rFonts w:eastAsia="ＭＳ 明朝" w:cs=""/>
-                <w:kern w:val="0"/>
-                <w:szCs w:val="22"/>
-                <w:lang w:val="en-US" w:eastAsia="en-US" w:bidi="ar-SA"/>
-              </w:rPr>
-            </w:pPr>
-            <w:r>
-              <w:rPr>
-                <w:rFonts w:eastAsia="ＭＳ 明朝" w:cs="" w:ascii="Arial" w:hAnsi="Arial"/>
-                <w:kern w:val="0"/>
-                <w:sz w:val="20"/>
-                <w:szCs w:val="22"/>
-                <w:lang w:val="en-US" w:eastAsia="en-US" w:bidi="ar-SA"/>
-              </w:rPr>
-            </w:r>
-          </w:p>
-        </w:tc>
-        <w:tc>
-          <w:tcPr>
-            <w:tcW w:w="3135" w:type="dxa"/>
-            <w:tcBorders/>
-          </w:tcPr>
-          <w:p>
-            <w:pPr>
-              <w:pStyle w:val="Normal"/>
-              <w:widowControl/>
-              <w:suppressAutoHyphens w:val="true"/>
-              <w:spacing w:before="0" w:after="80"/>
-              <w:jc w:val="start"/>
-              <w:rPr>
-                <w:rFonts w:eastAsia="ＭＳ 明朝" w:cs=""/>
-                <w:kern w:val="0"/>
-                <w:szCs w:val="22"/>
-                <w:lang w:val="en-US" w:eastAsia="en-US" w:bidi="ar-SA"/>
-              </w:rPr>
-            </w:pPr>
-            <w:r>
-              <w:rPr>
-                <w:rFonts w:eastAsia="ＭＳ 明朝" w:cs="" w:ascii="Arial" w:hAnsi="Arial"/>
-                <w:kern w:val="0"/>
-                <w:sz w:val="20"/>
-                <w:szCs w:val="22"/>
-                <w:lang w:val="en-US" w:eastAsia="en-US" w:bidi="ar-SA"/>
-              </w:rPr>
-              <w:t>NX2</w:t>
-            </w:r>
-          </w:p>
-        </w:tc>
-        <w:tc>
-          <w:tcPr>
-            <w:tcW w:w="3135" w:type="dxa"/>
-            <w:tcBorders/>
-          </w:tcPr>
-          <w:p>
-            <w:pPr>
-              <w:pStyle w:val="Normal"/>
-              <w:widowControl/>
-              <w:suppressAutoHyphens w:val="true"/>
-              <w:spacing w:before="0" w:after="80"/>
-              <w:jc w:val="start"/>
-              <w:rPr>
-                <w:rFonts w:eastAsia="ＭＳ 明朝" w:cs=""/>
-                <w:kern w:val="0"/>
-                <w:szCs w:val="22"/>
-                <w:lang w:val="en-US" w:eastAsia="en-US" w:bidi="ar-SA"/>
-              </w:rPr>
-            </w:pPr>
-            <w:r>
-              <w:rPr>
-                <w:rFonts w:eastAsia="ＭＳ 明朝" w:cs="" w:ascii="Arial" w:hAnsi="Arial"/>
-                <w:kern w:val="0"/>
-                <w:sz w:val="20"/>
-                <w:szCs w:val="22"/>
-                <w:lang w:val="en-US" w:eastAsia="en-US" w:bidi="ar-SA"/>
-              </w:rPr>
-              <w:t>Hours ones</w:t>
-            </w:r>
-          </w:p>
-        </w:tc>
-      </w:tr>
-      <w:tr>
-        <w:trPr/>
-        <w:tc>
-          <w:tcPr>
-            <w:tcW w:w="3135" w:type="dxa"/>
-            <w:tcBorders/>
-          </w:tcPr>
-          <w:p>
-            <w:pPr>
-              <w:pStyle w:val="Normal"/>
-              <w:widowControl/>
-              <w:suppressAutoHyphens w:val="true"/>
-              <w:spacing w:before="0" w:after="80"/>
-              <w:jc w:val="start"/>
-              <w:rPr>
-                <w:rFonts w:eastAsia="ＭＳ 明朝" w:cs=""/>
-                <w:kern w:val="0"/>
-                <w:szCs w:val="22"/>
-                <w:lang w:val="en-US" w:eastAsia="en-US" w:bidi="ar-SA"/>
-              </w:rPr>
-            </w:pPr>
-            <w:r>
-              <w:rPr>
-                <w:rFonts w:eastAsia="ＭＳ 明朝" w:cs="" w:ascii="Arial" w:hAnsi="Arial"/>
-                <w:kern w:val="0"/>
-                <w:sz w:val="20"/>
-                <w:szCs w:val="22"/>
-                <w:lang w:val="en-US" w:eastAsia="en-US" w:bidi="ar-SA"/>
-              </w:rPr>
-            </w:r>
-          </w:p>
-        </w:tc>
-        <w:tc>
-          <w:tcPr>
-            <w:tcW w:w="3135" w:type="dxa"/>
-            <w:tcBorders/>
-          </w:tcPr>
-          <w:p>
-            <w:pPr>
-              <w:pStyle w:val="Normal"/>
-              <w:widowControl/>
-              <w:suppressAutoHyphens w:val="true"/>
-              <w:spacing w:before="0" w:after="80"/>
-              <w:jc w:val="start"/>
-              <w:rPr>
-                <w:rFonts w:eastAsia="ＭＳ 明朝" w:cs=""/>
-                <w:kern w:val="0"/>
-                <w:szCs w:val="22"/>
-                <w:lang w:val="en-US" w:eastAsia="en-US" w:bidi="ar-SA"/>
-              </w:rPr>
-            </w:pPr>
-            <w:r>
-              <w:rPr>
-                <w:rFonts w:eastAsia="ＭＳ 明朝" w:cs="" w:ascii="Arial" w:hAnsi="Arial"/>
-                <w:kern w:val="0"/>
-                <w:sz w:val="20"/>
-                <w:szCs w:val="22"/>
-                <w:lang w:val="en-US" w:eastAsia="en-US" w:bidi="ar-SA"/>
-              </w:rPr>
-              <w:t>NX3</w:t>
-            </w:r>
-          </w:p>
-        </w:tc>
-        <w:tc>
-          <w:tcPr>
-            <w:tcW w:w="3135" w:type="dxa"/>
-            <w:tcBorders/>
-          </w:tcPr>
-          <w:p>
-            <w:pPr>
-              <w:pStyle w:val="Normal"/>
-              <w:widowControl/>
-              <w:suppressAutoHyphens w:val="true"/>
-              <w:spacing w:before="0" w:after="80"/>
-              <w:jc w:val="start"/>
-              <w:rPr>
-                <w:rFonts w:eastAsia="ＭＳ 明朝" w:cs=""/>
-                <w:kern w:val="0"/>
-                <w:szCs w:val="22"/>
-                <w:lang w:val="en-US" w:eastAsia="en-US" w:bidi="ar-SA"/>
-              </w:rPr>
-            </w:pPr>
-            <w:r>
-              <w:rPr>
-                <w:rFonts w:eastAsia="ＭＳ 明朝" w:cs="" w:ascii="Arial" w:hAnsi="Arial"/>
-                <w:kern w:val="0"/>
-                <w:sz w:val="20"/>
-                <w:szCs w:val="22"/>
-                <w:lang w:val="en-US" w:eastAsia="en-US" w:bidi="ar-SA"/>
-              </w:rPr>
-              <w:t>Minutes tens</w:t>
-            </w:r>
-          </w:p>
-        </w:tc>
-      </w:tr>
-      <w:tr>
-        <w:trPr/>
-        <w:tc>
-          <w:tcPr>
-            <w:tcW w:w="3135" w:type="dxa"/>
-            <w:tcBorders/>
-          </w:tcPr>
-          <w:p>
-            <w:pPr>
-              <w:pStyle w:val="Normal"/>
-              <w:widowControl/>
-              <w:suppressAutoHyphens w:val="true"/>
-              <w:spacing w:before="0" w:after="80"/>
-              <w:jc w:val="start"/>
-              <w:rPr>
-                <w:rFonts w:eastAsia="ＭＳ 明朝" w:cs=""/>
-                <w:kern w:val="0"/>
-                <w:szCs w:val="22"/>
-                <w:lang w:val="en-US" w:eastAsia="en-US" w:bidi="ar-SA"/>
-              </w:rPr>
-            </w:pPr>
-            <w:r>
-              <w:rPr>
-                <w:rFonts w:eastAsia="ＭＳ 明朝" w:cs="" w:ascii="Arial" w:hAnsi="Arial"/>
-                <w:kern w:val="0"/>
-                <w:sz w:val="20"/>
-                <w:szCs w:val="22"/>
-                <w:lang w:val="en-US" w:eastAsia="en-US" w:bidi="ar-SA"/>
-              </w:rPr>
-            </w:r>
-          </w:p>
-        </w:tc>
-        <w:tc>
-          <w:tcPr>
-            <w:tcW w:w="3135" w:type="dxa"/>
-            <w:tcBorders/>
-          </w:tcPr>
-          <w:p>
-            <w:pPr>
-              <w:pStyle w:val="Normal"/>
-              <w:widowControl/>
-              <w:suppressAutoHyphens w:val="true"/>
-              <w:spacing w:before="0" w:after="80"/>
-              <w:jc w:val="start"/>
-              <w:rPr>
-                <w:rFonts w:eastAsia="ＭＳ 明朝" w:cs=""/>
-                <w:kern w:val="0"/>
-                <w:szCs w:val="22"/>
-                <w:lang w:val="en-US" w:eastAsia="en-US" w:bidi="ar-SA"/>
-              </w:rPr>
-            </w:pPr>
-            <w:r>
-              <w:rPr>
-                <w:rFonts w:eastAsia="ＭＳ 明朝" w:cs="" w:ascii="Arial" w:hAnsi="Arial"/>
-                <w:kern w:val="0"/>
-                <w:sz w:val="20"/>
-                <w:szCs w:val="22"/>
-                <w:lang w:val="en-US" w:eastAsia="en-US" w:bidi="ar-SA"/>
-              </w:rPr>
-              <w:t>NX4</w:t>
-            </w:r>
-          </w:p>
-        </w:tc>
-        <w:tc>
-          <w:tcPr>
-            <w:tcW w:w="3135" w:type="dxa"/>
-            <w:tcBorders/>
-          </w:tcPr>
-          <w:p>
-            <w:pPr>
-              <w:pStyle w:val="Normal"/>
-              <w:widowControl/>
-              <w:suppressAutoHyphens w:val="true"/>
-              <w:spacing w:before="0" w:after="80"/>
-              <w:jc w:val="start"/>
-              <w:rPr>
-                <w:rFonts w:eastAsia="ＭＳ 明朝" w:cs=""/>
-                <w:kern w:val="0"/>
-                <w:szCs w:val="22"/>
-                <w:lang w:val="en-US" w:eastAsia="en-US" w:bidi="ar-SA"/>
-              </w:rPr>
-            </w:pPr>
-            <w:r>
-              <w:rPr>
-                <w:rFonts w:eastAsia="ＭＳ 明朝" w:cs="" w:ascii="Arial" w:hAnsi="Arial"/>
-                <w:kern w:val="0"/>
-                <w:sz w:val="20"/>
-                <w:szCs w:val="22"/>
-                <w:lang w:val="en-US" w:eastAsia="en-US" w:bidi="ar-SA"/>
-              </w:rPr>
-              <w:t>Minutes ones</w:t>
-            </w:r>
-          </w:p>
-        </w:tc>
-      </w:tr>
-      <w:tr>
-        <w:trPr/>
-        <w:tc>
-          <w:tcPr>
-            <w:tcW w:w="3135" w:type="dxa"/>
-            <w:tcBorders/>
-          </w:tcPr>
-          <w:p>
-            <w:pPr>
-              <w:pStyle w:val="Normal"/>
-              <w:widowControl/>
-              <w:suppressAutoHyphens w:val="true"/>
-              <w:spacing w:before="0" w:after="80"/>
-              <w:jc w:val="start"/>
-              <w:rPr>
-                <w:rFonts w:eastAsia="ＭＳ 明朝" w:cs=""/>
-                <w:kern w:val="0"/>
-                <w:szCs w:val="22"/>
-                <w:lang w:val="en-US" w:eastAsia="en-US" w:bidi="ar-SA"/>
-              </w:rPr>
-            </w:pPr>
-            <w:r>
-              <w:rPr>
-                <w:rFonts w:eastAsia="ＭＳ 明朝" w:cs="" w:ascii="Arial" w:hAnsi="Arial"/>
-                <w:kern w:val="0"/>
-                <w:sz w:val="20"/>
-                <w:szCs w:val="22"/>
-                <w:lang w:val="en-US" w:eastAsia="en-US" w:bidi="ar-SA"/>
-              </w:rPr>
-            </w:r>
-          </w:p>
-        </w:tc>
-        <w:tc>
-          <w:tcPr>
-            <w:tcW w:w="3135" w:type="dxa"/>
-            <w:tcBorders/>
-          </w:tcPr>
-          <w:p>
-            <w:pPr>
-              <w:pStyle w:val="Normal"/>
-              <w:widowControl/>
-              <w:suppressAutoHyphens w:val="true"/>
-              <w:spacing w:before="0" w:after="80"/>
-              <w:jc w:val="start"/>
-              <w:rPr>
-                <w:rFonts w:eastAsia="ＭＳ 明朝" w:cs=""/>
-                <w:kern w:val="0"/>
-                <w:szCs w:val="22"/>
-                <w:lang w:val="en-US" w:eastAsia="en-US" w:bidi="ar-SA"/>
-              </w:rPr>
-            </w:pPr>
-            <w:r>
-              <w:rPr>
-                <w:rFonts w:eastAsia="ＭＳ 明朝" w:cs="" w:ascii="Arial" w:hAnsi="Arial"/>
-                <w:kern w:val="0"/>
-                <w:sz w:val="20"/>
-                <w:szCs w:val="22"/>
-                <w:lang w:val="en-US" w:eastAsia="en-US" w:bidi="ar-SA"/>
-              </w:rPr>
-              <w:t>NX5</w:t>
-            </w:r>
-          </w:p>
-        </w:tc>
-        <w:tc>
-          <w:tcPr>
-            <w:tcW w:w="3135" w:type="dxa"/>
-            <w:tcBorders/>
-          </w:tcPr>
-          <w:p>
-            <w:pPr>
-              <w:pStyle w:val="Normal"/>
-              <w:widowControl/>
-              <w:suppressAutoHyphens w:val="true"/>
-              <w:spacing w:before="0" w:after="80"/>
-              <w:jc w:val="start"/>
-              <w:rPr>
-                <w:rFonts w:eastAsia="ＭＳ 明朝" w:cs=""/>
-                <w:kern w:val="0"/>
-                <w:szCs w:val="22"/>
-                <w:lang w:val="en-US" w:eastAsia="en-US" w:bidi="ar-SA"/>
-              </w:rPr>
-            </w:pPr>
-            <w:r>
-              <w:rPr>
-                <w:rFonts w:eastAsia="ＭＳ 明朝" w:cs="" w:ascii="Arial" w:hAnsi="Arial"/>
-                <w:kern w:val="0"/>
-                <w:sz w:val="20"/>
-                <w:szCs w:val="22"/>
-                <w:lang w:val="en-US" w:eastAsia="en-US" w:bidi="ar-SA"/>
-              </w:rPr>
-              <w:t>Seconds tens</w:t>
-            </w:r>
-          </w:p>
-        </w:tc>
-      </w:tr>
-      <w:tr>
-        <w:trPr/>
-        <w:tc>
-          <w:tcPr>
-            <w:tcW w:w="3135" w:type="dxa"/>
-            <w:tcBorders/>
-          </w:tcPr>
-          <w:p>
-            <w:pPr>
-              <w:pStyle w:val="Normal"/>
-              <w:widowControl/>
-              <w:suppressAutoHyphens w:val="true"/>
-              <w:spacing w:before="0" w:after="80"/>
-              <w:jc w:val="start"/>
-              <w:rPr>
-                <w:rFonts w:eastAsia="ＭＳ 明朝" w:cs=""/>
-                <w:kern w:val="0"/>
-                <w:szCs w:val="22"/>
-                <w:lang w:val="en-US" w:eastAsia="en-US" w:bidi="ar-SA"/>
-              </w:rPr>
-            </w:pPr>
-            <w:r>
-              <w:rPr>
-                <w:rFonts w:eastAsia="ＭＳ 明朝" w:cs="" w:ascii="Arial" w:hAnsi="Arial"/>
-                <w:kern w:val="0"/>
-                <w:sz w:val="20"/>
-                <w:szCs w:val="22"/>
-                <w:lang w:val="en-US" w:eastAsia="en-US" w:bidi="ar-SA"/>
-              </w:rPr>
-            </w:r>
-          </w:p>
-        </w:tc>
-        <w:tc>
-          <w:tcPr>
-            <w:tcW w:w="3135" w:type="dxa"/>
-            <w:tcBorders/>
-          </w:tcPr>
-          <w:p>
-            <w:pPr>
-              <w:pStyle w:val="Normal"/>
-              <w:widowControl/>
-              <w:suppressAutoHyphens w:val="true"/>
-              <w:spacing w:before="0" w:after="80"/>
-              <w:jc w:val="start"/>
-              <w:rPr>
-                <w:rFonts w:eastAsia="ＭＳ 明朝" w:cs=""/>
-                <w:kern w:val="0"/>
-                <w:szCs w:val="22"/>
-                <w:lang w:val="en-US" w:eastAsia="en-US" w:bidi="ar-SA"/>
-              </w:rPr>
-            </w:pPr>
-            <w:r>
-              <w:rPr>
-                <w:rFonts w:eastAsia="ＭＳ 明朝" w:cs="" w:ascii="Arial" w:hAnsi="Arial"/>
-                <w:kern w:val="0"/>
-                <w:sz w:val="20"/>
-                <w:szCs w:val="22"/>
-                <w:lang w:val="en-US" w:eastAsia="en-US" w:bidi="ar-SA"/>
-              </w:rPr>
-              <w:t>NX6</w:t>
-            </w:r>
-          </w:p>
-        </w:tc>
-        <w:tc>
-          <w:tcPr>
-            <w:tcW w:w="3135" w:type="dxa"/>
-            <w:tcBorders/>
-          </w:tcPr>
-          <w:p>
-            <w:pPr>
-              <w:pStyle w:val="Normal"/>
-              <w:widowControl/>
-              <w:suppressAutoHyphens w:val="true"/>
-              <w:spacing w:before="0" w:after="80"/>
-              <w:jc w:val="start"/>
-              <w:rPr>
-                <w:rFonts w:eastAsia="ＭＳ 明朝" w:cs=""/>
-                <w:kern w:val="0"/>
-                <w:szCs w:val="22"/>
-                <w:lang w:val="en-US" w:eastAsia="en-US" w:bidi="ar-SA"/>
-              </w:rPr>
-            </w:pPr>
-            <w:r>
-              <w:rPr>
-                <w:rFonts w:eastAsia="ＭＳ 明朝" w:cs="" w:ascii="Arial" w:hAnsi="Arial"/>
-                <w:kern w:val="0"/>
-                <w:sz w:val="20"/>
-                <w:szCs w:val="22"/>
-                <w:lang w:val="en-US" w:eastAsia="en-US" w:bidi="ar-SA"/>
-              </w:rPr>
-              <w:t>Seconds ones</w:t>
-            </w:r>
-          </w:p>
-        </w:tc>
-      </w:tr>
-      <w:tr>
-        <w:trPr/>
-        <w:tc>
-          <w:tcPr>
-            <w:tcW w:w="3135" w:type="dxa"/>
-            <w:tcBorders/>
-          </w:tcPr>
-          <w:p>
-            <w:pPr>
-              <w:pStyle w:val="Normal"/>
-              <w:widowControl/>
-              <w:suppressAutoHyphens w:val="true"/>
-              <w:spacing w:before="0" w:after="80"/>
-              <w:jc w:val="start"/>
-              <w:rPr>
-                <w:rFonts w:eastAsia="ＭＳ 明朝" w:cs=""/>
-                <w:kern w:val="0"/>
-                <w:szCs w:val="22"/>
-                <w:lang w:val="en-US" w:eastAsia="en-US" w:bidi="ar-SA"/>
-              </w:rPr>
-            </w:pPr>
-            <w:r>
-              <w:rPr>
-                <w:rFonts w:eastAsia="ＭＳ 明朝" w:cs="" w:ascii="Arial" w:hAnsi="Arial"/>
-                <w:kern w:val="0"/>
-                <w:sz w:val="20"/>
-                <w:szCs w:val="22"/>
-                <w:lang w:val="en-US" w:eastAsia="en-US" w:bidi="ar-SA"/>
-              </w:rPr>
-              <w:t>Right</w:t>
-            </w:r>
-          </w:p>
-        </w:tc>
-        <w:tc>
-          <w:tcPr>
-            <w:tcW w:w="3135" w:type="dxa"/>
-            <w:tcBorders/>
-          </w:tcPr>
-          <w:p>
-            <w:pPr>
-              <w:pStyle w:val="Normal"/>
-              <w:widowControl/>
-              <w:suppressAutoHyphens w:val="true"/>
-              <w:spacing w:before="0" w:after="80"/>
-              <w:jc w:val="start"/>
-              <w:rPr>
-                <w:rFonts w:eastAsia="ＭＳ 明朝" w:cs=""/>
-                <w:kern w:val="0"/>
-                <w:szCs w:val="22"/>
-                <w:lang w:val="en-US" w:eastAsia="en-US" w:bidi="ar-SA"/>
-              </w:rPr>
-            </w:pPr>
-            <w:r>
-              <w:rPr>
-                <w:rFonts w:eastAsia="ＭＳ 明朝" w:cs="" w:ascii="Arial" w:hAnsi="Arial"/>
-                <w:kern w:val="0"/>
-                <w:sz w:val="20"/>
-                <w:szCs w:val="22"/>
-                <w:lang w:val="en-US" w:eastAsia="en-US" w:bidi="ar-SA"/>
-              </w:rPr>
-              <w:t>NX7</w:t>
-            </w:r>
-          </w:p>
-        </w:tc>
-        <w:tc>
-          <w:tcPr>
-            <w:tcW w:w="3135" w:type="dxa"/>
-            <w:tcBorders/>
-          </w:tcPr>
-          <w:p>
-            <w:pPr>
-              <w:pStyle w:val="Normal"/>
-              <w:widowControl/>
-              <w:suppressAutoHyphens w:val="true"/>
-              <w:spacing w:before="0" w:after="80"/>
-              <w:jc w:val="start"/>
-              <w:rPr>
-                <w:rFonts w:eastAsia="ＭＳ 明朝" w:cs=""/>
-                <w:kern w:val="0"/>
-                <w:szCs w:val="22"/>
-                <w:lang w:val="en-US" w:eastAsia="en-US" w:bidi="ar-SA"/>
-              </w:rPr>
-            </w:pPr>
-            <w:r>
-              <w:rPr>
-                <w:rFonts w:eastAsia="ＭＳ 明朝" w:cs="" w:ascii="Arial" w:hAnsi="Arial"/>
-                <w:kern w:val="0"/>
-                <w:sz w:val="20"/>
-                <w:szCs w:val="22"/>
-                <w:lang w:val="en-US" w:eastAsia="en-US" w:bidi="ar-SA"/>
-              </w:rPr>
-              <w:t>Tenths of a second</w:t>
-            </w:r>
-          </w:p>
-        </w:tc>
-      </w:tr>
-    </w:tbl>
-    <w:p>
-      <w:pPr>
-        <w:pStyle w:val="Normal"/>
-        <w:rPr/>
-      </w:pPr>
-      <w:r>
-        <w:rPr>
-          <w:rFonts w:ascii="Arial" w:hAnsi="Arial"/>
-          <w:sz w:val="22"/>
-        </w:rPr>
-      </w:r>
-    </w:p>
-    <w:p>
-      <w:pPr>
-        <w:pStyle w:val="Normal"/>
-        <w:rPr/>
-      </w:pPr>
-      <w:r>
-        <w:rPr>
-          <w:rFonts w:ascii="Arial" w:hAnsi="Arial"/>
-          <w:sz w:val="22"/>
-        </w:rPr>
-        <w:t>Neon indicators between the tube pairs serve as colon separators (H:M and M:S) and status indicators. A separate "BR" neon is used for additional indication and blinks off briefly if the clock loses its WiFi connection.</w:t>
-      </w:r>
-    </w:p>
-    <w:p>
-      <w:pPr>
-        <w:pStyle w:val="Normal"/>
-        <w:spacing w:before="0" w:after="80"/>
-        <w:rPr>
-          <w:rFonts w:ascii="Arial" w:hAnsi="Arial"/>
-          <w:sz w:val="22"/>
-        </w:rPr>
-      </w:pPr>
-      <w:r>
-        <w:rPr>
-          <w:rFonts w:ascii="Arial" w:hAnsi="Arial"/>
-          <w:sz w:val="22"/>
-        </w:rPr>
-        <w:t>The tenths-of-a-second digit updates live at 10 Hz.</w:t>
-      </w:r>
-    </w:p>
-    <w:p>
-      <w:pPr>
-        <w:pStyle w:val="Normal"/>
-        <w:spacing w:before="0" w:after="80"/>
-        <w:rPr>
-          <w:rFonts w:ascii="Arial" w:hAnsi="Arial"/>
-          <w:sz w:val="22"/>
-        </w:rPr>
-      </w:pPr>
-      <w:r>
-        <w:rPr>
-          <w:rFonts w:ascii="Arial" w:hAnsi="Arial"/>
-          <w:sz w:val="22"/>
-        </w:rPr>
-      </w:r>
-    </w:p>
-    <w:p>
-      <w:pPr>
-        <w:pStyle w:val="Normal"/>
-        <w:spacing w:before="0" w:after="80"/>
-        <w:rPr>
-          <w:rFonts w:ascii="Arial" w:hAnsi="Arial"/>
-          <w:sz w:val="22"/>
-        </w:rPr>
-      </w:pPr>
-      <w:r>
-        <w:rPr>
-          <w:rFonts w:ascii="Arial" w:hAnsi="Arial"/>
-          <w:sz w:val="22"/>
-        </w:rPr>
-        <w:t xml:space="preserve">The Metronome display adds an additional eight displays. </w:t>
-      </w:r>
-      <w:r>
-        <w:rPr>
-          <w:rFonts w:eastAsia="ＭＳ 明朝" w:cs="" w:ascii="Arial" w:hAnsi="Arial"/>
-          <w:kern w:val="0"/>
-          <w:sz w:val="22"/>
-          <w:szCs w:val="22"/>
-          <w:lang w:val="en-US" w:eastAsia="en-US" w:bidi="ar-SA"/>
-        </w:rPr>
-        <w:t>The following tubes count down the time to midnight.</w:t>
-      </w:r>
-    </w:p>
-    <w:tbl>
-      <w:tblPr>
-        <w:tblStyle w:val="TableGrid"/>
-        <w:tblW w:w="9405" w:type="dxa"/>
-        <w:jc w:val="start"/>
-        <w:tblInd w:w="0" w:type="dxa"/>
-        <w:tblLayout w:type="fixed"/>
-        <w:tblCellMar>
-          <w:top w:w="0" w:type="dxa"/>
-          <w:start w:w="108" w:type="dxa"/>
-          <w:bottom w:w="0" w:type="dxa"/>
-          <w:end w:w="108" w:type="dxa"/>
-        </w:tblCellMar>
-        <w:tblLook w:firstRow="1" w:noVBand="1" w:lastRow="0" w:firstColumn="1" w:lastColumn="0" w:noHBand="0" w:val="04a0"/>
-      </w:tblPr>
-      <w:tblGrid>
-        <w:gridCol w:w="3135"/>
-        <w:gridCol w:w="3135"/>
-        <w:gridCol w:w="3135"/>
-      </w:tblGrid>
-      <w:tr>
-        <w:trPr/>
-        <w:tc>
-          <w:tcPr>
-            <w:tcW w:w="3135" w:type="dxa"/>
-            <w:tcBorders/>
-            <w:shd w:color="auto" w:fill="C25600" w:val="clear"/>
-          </w:tcPr>
-          <w:p>
-            <w:pPr>
-              <w:pStyle w:val="Normal"/>
-              <w:widowControl/>
-              <w:suppressAutoHyphens w:val="true"/>
-              <w:spacing w:before="0" w:after="80"/>
-              <w:jc w:val="start"/>
-              <w:rPr>
-                <w:rFonts w:eastAsia="ＭＳ 明朝" w:cs=""/>
-                <w:kern w:val="0"/>
-                <w:szCs w:val="22"/>
-                <w:lang w:val="en-US" w:eastAsia="en-US" w:bidi="ar-SA"/>
-              </w:rPr>
-            </w:pPr>
-            <w:r>
-              <w:rPr>
-                <w:rFonts w:eastAsia="ＭＳ 明朝" w:cs="" w:ascii="Arial" w:hAnsi="Arial"/>
-                <w:b/>
-                <w:color w:val="FFFFFF"/>
-                <w:kern w:val="0"/>
-                <w:sz w:val="20"/>
-                <w:szCs w:val="22"/>
-                <w:lang w:val="en-US" w:eastAsia="en-US" w:bidi="ar-SA"/>
-              </w:rPr>
-              <w:t>Position</w:t>
-            </w:r>
-          </w:p>
-        </w:tc>
-        <w:tc>
-          <w:tcPr>
-            <w:tcW w:w="3135" w:type="dxa"/>
-            <w:tcBorders/>
-            <w:shd w:color="auto" w:fill="C25600" w:val="clear"/>
-          </w:tcPr>
-          <w:p>
-            <w:pPr>
-              <w:pStyle w:val="Normal"/>
-              <w:widowControl/>
-              <w:suppressAutoHyphens w:val="true"/>
-              <w:spacing w:before="0" w:after="80"/>
-              <w:jc w:val="start"/>
-              <w:rPr>
-                <w:rFonts w:eastAsia="ＭＳ 明朝" w:cs=""/>
-                <w:kern w:val="0"/>
-                <w:szCs w:val="22"/>
-                <w:lang w:val="en-US" w:eastAsia="en-US" w:bidi="ar-SA"/>
-              </w:rPr>
-            </w:pPr>
-            <w:r>
-              <w:rPr>
-                <w:rFonts w:eastAsia="ＭＳ 明朝" w:cs="" w:ascii="Arial" w:hAnsi="Arial"/>
-                <w:b/>
-                <w:color w:val="FFFFFF"/>
-                <w:kern w:val="0"/>
-                <w:sz w:val="20"/>
-                <w:szCs w:val="22"/>
-                <w:lang w:val="en-US" w:eastAsia="en-US" w:bidi="ar-SA"/>
-              </w:rPr>
-              <w:t>Tube</w:t>
-            </w:r>
-          </w:p>
-        </w:tc>
-        <w:tc>
-          <w:tcPr>
-            <w:tcW w:w="3135" w:type="dxa"/>
-            <w:tcBorders/>
-            <w:shd w:color="auto" w:fill="C25600" w:val="clear"/>
-          </w:tcPr>
-          <w:p>
-            <w:pPr>
-              <w:pStyle w:val="Normal"/>
-              <w:widowControl/>
-              <w:suppressAutoHyphens w:val="true"/>
-              <w:spacing w:before="0" w:after="80"/>
-              <w:jc w:val="start"/>
-              <w:rPr>
-                <w:rFonts w:eastAsia="ＭＳ 明朝" w:cs=""/>
-                <w:kern w:val="0"/>
-                <w:szCs w:val="22"/>
-                <w:lang w:val="en-US" w:eastAsia="en-US" w:bidi="ar-SA"/>
-              </w:rPr>
-            </w:pPr>
-            <w:r>
-              <w:rPr>
-                <w:rFonts w:eastAsia="ＭＳ 明朝" w:cs="" w:ascii="Arial" w:hAnsi="Arial"/>
-                <w:b/>
-                <w:color w:val="FFFFFF"/>
-                <w:kern w:val="0"/>
-                <w:sz w:val="20"/>
-                <w:szCs w:val="22"/>
-                <w:lang w:val="en-US" w:eastAsia="en-US" w:bidi="ar-SA"/>
-              </w:rPr>
-              <w:t>Shows</w:t>
-            </w:r>
-          </w:p>
-        </w:tc>
-      </w:tr>
-      <w:tr>
-        <w:trPr/>
-        <w:tc>
-          <w:tcPr>
-            <w:tcW w:w="3135" w:type="dxa"/>
             <w:tcBorders>
               <w:top w:val="nil"/>
             </w:tcBorders>
@@ -6365,7 +5563,7 @@
           <w:rFonts w:ascii="Arial" w:hAnsi="Arial"/>
           <w:sz w:val="22"/>
         </w:rPr>
-        <w:t>1.  Connect a phone or computer to the WiFi network named Zev-7 (or Zev-7M, ZEV-7N, ZEV-7NM, or the custom AP name).</w:t>
+        <w:t>1.  Connect a phone or computer to the WiFi network named for your model — Zev-7S, Zev-7M, Zev-7-18, Zev-7RZ, Zev-7NS, Zev-7ND or Metronome — or the custom AP name.</w:t>
       </w:r>
     </w:p>
     <w:p>

</xml_diff>

<commit_message>
Zev-7 Operator Manual: under-lights are on every model but the Zev-7ND
The manual carried "Zev-7 only" / "Zev-7 full only" in six places, and said
outright that the Metronome has none. Per Mitch the Mini does have an
under-light and the Metronome has 7, so the only model without one is the
Zev-7ND.

Corrected: the two Under Light headings lose the qualifier, the LED-count
paragraph is rewritten (two LEDs per tube on the Zev-7-18 and Zev-7RZ, the
Metronome's 7, and the Zev-7RZ's fixed chain), the ub and uc rule keywords now
say "no effect on the Zev-7ND", and the Troubleshooting symptom drops "(Zev-7)".

The bare-off entry claimed the ub field "isn't registered" on the Mini. That
was wrong twice over: it is registered everywhere, and on the Zev-7ND it stays
registered deliberately so stored rules keep their fieldMask bit positions -
it is simply a no-op. Reworded to say ub is accepted but does nothing there.

Claude-Session: https://claude.ai/code/session_019ATiXkov9EfBfPjyg6ppQc
</commit_message>
<xml_diff>
--- a/Zev-7 Operator Manual.docx
+++ b/Zev-7 Operator Manual.docx
@@ -10997,7 +10997,7 @@
           <w:color w:val="000000"/>
           <w:sz w:val="26"/>
         </w:rPr>
-        <w:t>Under Light (Zev-7 only)</w:t>
+        <w:t>Under Light</w:t>
       </w:r>
     </w:p>
     <w:tbl>
@@ -12249,7 +12249,7 @@
           <w:rFonts w:ascii="Arial" w:hAnsi="Arial"/>
           <w:sz w:val="22"/>
         </w:rPr>
-        <w:t>Under Light Brightness and Color (Zev-7 only)</w:t>
+        <w:t>Under Light Brightness and Color</w:t>
       </w:r>
     </w:p>
     <w:p>
@@ -13117,7 +13117,7 @@
                 <w:szCs w:val="22"/>
                 <w:lang w:val="en-US" w:eastAsia="en-US" w:bidi="ar-SA"/>
               </w:rPr>
-              <w:t xml:space="preserve">Under-light brightness (0-9, 0 = off). Zev-7 full only.</w:t>
+              <w:t>Under-light brightness (0-9, 0 = off). No effect on the Zev-7ND, which has no under-board string.</w:t>
             </w:r>
           </w:p>
         </w:tc>
@@ -13182,7 +13182,7 @@
                 <w:szCs w:val="22"/>
                 <w:lang w:val="en-US" w:eastAsia="en-US" w:bidi="ar-SA"/>
               </w:rPr>
-              <w:t xml:space="preserve">Under-light color. Same hex or color-name format as lc. Zev-7 full only.</w:t>
+              <w:t>Under-light color. Same hex or color-name format as lc. No effect on the Zev-7ND.</w:t>
             </w:r>
           </w:p>
         </w:tc>
@@ -13524,7 +13524,7 @@
                 <w:szCs w:val="22"/>
                 <w:lang w:val="en-US" w:eastAsia="en-US" w:bidi="ar-SA"/>
               </w:rPr>
-              <w:t xml:space="preserve">Bare keyword (no = value). Shortcut that expands to nb=0, lb=0, ub=0 (everything off: Nixie tubes, digit LEDs, and under-light). On Zev-7 Mini the ub field isn't registered, so off only expands to nb=0, lb=0.</w:t>
+              <w:t>Bare keyword (no = value). Shortcut that expands to nb=0, lb=0, ub=0 (everything off: Nixie tubes, digit LEDs, and under-light). On the Zev-7ND, ub is accepted but has no effect.</w:t>
             </w:r>
           </w:p>
         </w:tc>
@@ -15492,7 +15492,7 @@
           <w:rFonts w:ascii="Arial" w:hAnsi="Arial"/>
           <w:sz w:val="22"/>
         </w:rPr>
-        <w:t>The Zev-7 has 7 RGB LEDs behind the Nixie tubes (one per tube); the Metronome has 15 RGB LEDs (one per tube). The Zev-7 also has separate under-light LEDs along the front edge of the base — 4 by default, configurable from 4 to 20 in the AP Configuration form, with a choice of APA102 or WS2812B chip types. The Metronome has no under-light LEDs. The under-light LEDs have independent brightness and color control and are not affected by LED effects.</w:t>
+        <w:t>The Zev-7 has 7 RGB LEDs behind the Nixie tubes — one per tube, or two per tube on the Zev-7-18 and Zev-7RZ; the Metronome has 15 RGB LEDs (one per tube). Every model except the Zev-7ND also has separate under-light LEDs along the front edge of the base, configurable from 4 to 20 in the AP Configuration form with a choice of APA102 or WS2812B chip types (the factory default depends on the model). The Metronome has 7, and the Zev-7RZ’s 7 are part of one fixed chain and cannot be reconfigured. The under-light LEDs have independent brightness and color control and are not affected by LED effects.</w:t>
       </w:r>
     </w:p>
     <w:p>
@@ -22316,7 +22316,7 @@
                 <w:szCs w:val="22"/>
                 <w:lang w:val="en-US" w:eastAsia="en-US" w:bidi="ar-SA"/>
               </w:rPr>
-              <w:t>Under-light not working (Zev-7)</w:t>
+              <w:t>Under-light not working</w:t>
             </w:r>
           </w:p>
         </w:tc>

</xml_diff>

<commit_message>
Zev-7 Operator Manual: no under-light counts or configurability
Drops "4 to 20", the APA102/WS2812B chip-type choice and the factory-default
aside from section 9, and "of 4-20 LEDs" from the numitron models paragraph.
The Zev-7RZ's "cannot be reconfigured" sentence goes with them - with no
configuration described, saying one model cannot be reconfigured explains
nothing.

Section 9 now says only that every model except the Zev-7ND has under-light
LEDs, and that they have independent brightness and color control.

Claude-Session: https://claude.ai/code/session_019ATiXkov9EfBfPjyg6ppQc
</commit_message>
<xml_diff>
--- a/Zev-7 Operator Manual.docx
+++ b/Zev-7 Operator Manual.docx
@@ -2295,7 +2295,7 @@
         <w:rPr>
           <w:rFonts w:ascii="Arial" w:hAnsi="Arial"/>
         </w:rPr>
-        <w:t>Models and addressing: Zev-7NS (DR2010 tubes, one under-tube LED per display, plus a separate under-board light string of 4–20 LEDs) and Zev-7ND (DTF-104B tubes, two under-tube LEDs per display, no under-board string — the Under Lighting settings are hidden on that model). In AP mode they appear as the WiFi networks Zev-7NS and Zev-7ND, and are reachable by name at zev-7ns.local and zev-7nd.local respectively.</w:t>
+        <w:t>Models and addressing: Zev-7NS (DR2010 tubes, one under-tube LED per display, plus a separate under-board light string) and Zev-7ND (DTF-104B tubes, two under-tube LEDs per display, no under-board string — the Under Lighting settings are hidden on that model). In AP mode they appear as the WiFi networks Zev-7NS and Zev-7ND, and are reachable by name at zev-7ns.local and zev-7nd.local respectively.</w:t>
       </w:r>
     </w:p>
     <w:p>
@@ -15492,7 +15492,7 @@
           <w:rFonts w:ascii="Arial" w:hAnsi="Arial"/>
           <w:sz w:val="22"/>
         </w:rPr>
-        <w:t>The Zev-7 has 7 RGB LEDs behind the Nixie tubes — one per tube, or two per tube on the Zev-7-18 and Zev-7RZ; the Metronome has 15 RGB LEDs (one per tube). Every model except the Zev-7ND also has separate under-light LEDs along the front edge of the base, configurable from 4 to 20 in the AP Configuration form with a choice of APA102 or WS2812B chip types (the factory default depends on the model). On the Zev-7RZ the under-lights are part of one fixed chain and cannot be reconfigured. The under-light LEDs have independent brightness and color control and are not affected by LED effects.</w:t>
+        <w:t>The Zev-7 has 7 RGB LEDs behind the Nixie tubes — one per tube, or two per tube on the Zev-7-18 and Zev-7RZ; the Metronome has 15 RGB LEDs (one per tube). Every model except the Zev-7ND also has separate under-light LEDs along the front edge of the base. The under-light LEDs have independent brightness and color control and are not affected by LED effects.</w:t>
       </w:r>
     </w:p>
     <w:p>

</xml_diff>

<commit_message>
Zev-7 Operator Manual: table of contents fits on one page
A section break sat in the middle of the contents list, after the REST
Programming entry, pushing "19. Troubleshooting" onto a page of its own. The
two TOC sections were byte-identical - same header and footer references, same
page size and margins, both numbering lower-roman from 1 - so the break did
nothing except split the list, and both pages were numbered "i".

Removing it puts the whole list on one page with the entry spacing untouched.
The manual is 37 pages, down one.

Claude-Session: https://claude.ai/code/session_019ATiXkov9EfBfPjyg6ppQc
</commit_message>
<xml_diff>
--- a/Zev-7 Operator Manual.docx
+++ b/Zev-7 Operator Manual.docx
@@ -871,21 +871,6 @@
         </w:tabs>
         <w:spacing w:before="40" w:after="80"/>
         <w:rPr/>
-        <w:sectPr>
-          <w:headerReference w:type="even" r:id="rId9"/>
-          <w:headerReference w:type="default" r:id="rId9"/>
-          <w:headerReference w:type="first" r:id="rId9"/>
-          <w:footerReference w:type="even" r:id="rId12"/>
-          <w:footerReference w:type="default" r:id="rId12"/>
-          <w:footerReference w:type="first" r:id="rId12"/>
-          <w:type w:val="nextPage"/>
-          <w:pgSz w:w="12240" w:h="15840"/>
-          <w:pgMar w:left="1417" w:right="1417" w:gutter="0" w:header="720" w:top="1134" w:footer="720" w:bottom="1134"/>
-          <w:pgNumType w:start="1" w:fmt="lowerRoman"/>
-          <w:formProt w:val="false"/>
-          <w:textDirection w:val="lrTb"/>
-          <w:docGrid w:type="default" w:linePitch="360" w:charSpace="0"/>
-        </w:sectPr>
       </w:pPr>
       <w:r>
         <w:rPr>

</xml_diff>

<commit_message>
Zev-7 Operator Manual: the numitrons run their own firmware
The manual claimed three times that every model runs the same firmware. They
do not: the Nixie models share one application, the Zev-7NS and Zev-7ND another,
and the Metronome a third. They are functionally similar, differing where the
display hardware and its capabilities differ - which is what the manual should
have said.

Section 1's overview, the section 2 opening, and the Numitron Variants
introduction are reworded. The overview also loses "(Zev-7 only)" from the
under-light strip, which the earlier under-light pass had already corrected
everywhere else.

Claude-Session: https://claude.ai/code/session_019ATiXkov9EfBfPjyg6ppQc
</commit_message>
<xml_diff>
--- a/Zev-7 Operator Manual.docx
+++ b/Zev-7 Operator Manual.docx
@@ -1947,7 +1947,7 @@
           <w:rFonts w:ascii="Arial" w:hAnsi="Arial"/>
           <w:sz w:val="22"/>
         </w:rPr>
-        <w:t>The Zev-7NS and Zev-7ND are numitron-tube variants of the Zev-7. They are functionally identical to the Zev-7 and run the same firmware, but their seven displays are numitron seven-segment filament tubes driven by TLC59116 constant-current drivers rather than high-voltage Nixie tubes. Because numitron filaments do not suffer cathode poisoning, they have no anti-poison feature and no high-voltage circuitry. See Section 2 for the full list of differences.</w:t>
+        <w:t>The Zev-7NS and Zev-7ND are numitron-tube variants of the Zev-7. They run their own firmware — functionally similar to the Zev-7’s, differing where the display hardware does — and their seven displays are numitron seven-segment filament tubes driven by TLC59116 constant-current drivers rather than high-voltage Nixie tubes. Because numitron filaments do not suffer cathode poisoning, they have no anti-poison feature and no high-voltage circuitry. See Section 2 for the full list of differences.</w:t>
       </w:r>
     </w:p>
     <w:p>
@@ -1963,7 +1963,7 @@
           <w:rFonts w:ascii="Arial" w:hAnsi="Arial"/>
           <w:sz w:val="22"/>
         </w:rPr>
-        <w:t>Zev-7 is a seven-tube Nixie clock and the Metronome is its fifteen-tube companion. Both are driven by an ESP32 microcontroller and share the same firmware, web interface, and rule-based scheduling. They display hours, minutes, seconds, and tenths of a second using IN-14 Nixie tubes with HV5530 shift-register drivers. The clocks feature RGB backlighting behind the tubes, neon colon indicators, WiFi connectivity with NTP time sync, an optional motion sensor, an optional light sensor, an optional weather sensor, and (Zev-7 only) an under-light strip.</w:t>
+        <w:t>Zev-7 is a seven-tube Nixie clock and the Metronome is its fifteen-tube companion. Both are driven by an ESP32 microcontroller and present the same web interface and rule-based scheduling, each running its own firmware. They display hours, minutes, seconds, and tenths of a second using IN-14 Nixie tubes with HV5530 shift-register drivers. The clocks feature RGB backlighting behind the tubes, neon colon indicators, WiFi connectivity with NTP time sync, an optional motion sensor, an optional light sensor, an optional weather sensor, and an under-light strip.</w:t>
       </w:r>
     </w:p>
     <w:p>
@@ -2083,7 +2083,7 @@
           <w:rFonts w:ascii="Arial" w:hAnsi="Arial"/>
           <w:sz w:val="22"/>
         </w:rPr>
-        <w:t>Several model variants share this firmware. The model is set at the factory and cannot be changed by the user. The Zev-7S, Zev-7 Mini, Zev-7-18 and Zev-7RZ are Nixie-tube clocks; the Zev-7NS and Zev-7ND are the equivalent numitron-tube clocks. The Metronome uses a separate but operationally similar version of the software.</w:t>
+        <w:t>Several models are covered by this manual. The model is set at the factory and cannot be changed by the user. The Zev-7S, Zev-7 Mini, Zev-7-18 and Zev-7RZ are Nixie-tube clocks and share one firmware; the Zev-7NS and Zev-7ND are the equivalent numitron-tube clocks and run their own; the Metronome runs a third. All are operationally similar, differing where the display hardware and its capabilities differ.</w:t>
       </w:r>
       <w:r>
         <w:rPr>
@@ -2210,7 +2210,7 @@
           <w:rFonts w:ascii="Arial" w:hAnsi="Arial"/>
           <w:sz w:val="22"/>
         </w:rPr>
-        <w:t>The numitron models run the same firmware as the Zev-7 and share every feature described in this manual — Rules, LED effects, colon display patterns, the info display cycle, sensors, OTA updates, and the web interface. Wherever this manual says "Nixie" (for example, "Nixie Brightness"), read it as the numitron display on these models. The differences are:</w:t>
+        <w:t>The numitron models run their own firmware, functionally similar to the Zev-7’s, and share every feature described in this manual — Rules, LED effects, colon display patterns, the info display cycle, sensors, OTA updates, and the web interface. Wherever this manual says "Nixie" (for example, "Nixie Brightness"), read it as the numitron display on these models. The differences are:</w:t>
       </w:r>
     </w:p>
     <w:p>

</xml_diff>

<commit_message>
Zev-7 Operator Manual: Metronome tube chart, generalised tube types
The Metronome chart was off by one from NX8 onward: it showed NX8 as tenths and
ran out at NX14, leaving NX15 blank. Per NixieDriver.ino:42-49, NX8 is live
hundredths and NX9-NX15 are the countdown tubes (R-tenths through R-H-tens), so
every row shifts right and NX15 is hours tens. The sentence above it called all
eight countdown tubes; only seven are.

Section 1 no longer says the time is shown on IN-14 tubes - true of the Zev-7S
and Mini, but the Zev-7-18 uses IN-18 and the Zev-7RZ uses RZ568M.

Claude-Session: https://claude.ai/code/session_019ATiXkov9EfBfPjyg6ppQc
</commit_message>
<xml_diff>
--- a/Zev-7 Operator Manual.docx
+++ b/Zev-7 Operator Manual.docx
@@ -1963,7 +1963,7 @@
           <w:rFonts w:ascii="Arial" w:hAnsi="Arial"/>
           <w:sz w:val="22"/>
         </w:rPr>
-        <w:t>Zev-7 is a seven-tube Nixie clock and the Metronome is its fifteen-tube companion. Both are driven by an ESP32 microcontroller and present the same web interface and rule-based scheduling, each running its own firmware. They display hours, minutes, seconds, and tenths of a second using IN-14 Nixie tubes with HV5530 shift-register drivers. The clocks feature RGB backlighting behind the tubes, neon colon indicators, WiFi connectivity with NTP time sync, an optional motion sensor, an optional light sensor, an optional weather sensor, and an under-light strip.</w:t>
+        <w:t>Zev-7 is a seven-tube Nixie clock and the Metronome is its fifteen-tube companion. Both are driven by an ESP32 microcontroller and present the same web interface and rule-based scheduling, each running its own firmware. They display hours, minutes, seconds, and tenths of a second using Nixie tubes — IN-14, IN-18 or RZ568M depending on the model — with HV5530 shift-register drivers. The clocks feature RGB backlighting behind the tubes, neon colon indicators, WiFi connectivity with NTP time sync, an optional motion sensor, an optional light sensor, an optional weather sensor, and an under-light strip.</w:t>
       </w:r>
     </w:p>
     <w:p>
@@ -3219,7 +3219,7 @@
           <w:rFonts w:ascii="Arial" w:hAnsi="Arial"/>
           <w:sz w:val="22"/>
         </w:rPr>
-        <w:t xml:space="preserve">The Metronome display adds an additional eight displays. </w:t>
+        <w:t xml:space="preserve">The Metronome display adds an additional eight tubes. </w:t>
       </w:r>
       <w:r>
         <w:rPr>
@@ -3229,7 +3229,7 @@
           <w:szCs w:val="22"/>
           <w:lang w:val="en-US" w:eastAsia="en-US" w:bidi="ar-SA"/>
         </w:rPr>
-        <w:t>The following tubes count down the time to midnight.</w:t>
+        <w:t>NX8 shows live hundredths of a second; the remaining seven count down the time to midnight.</w:t>
       </w:r>
     </w:p>
     <w:tbl>
@@ -3464,17 +3464,16 @@
                 <w:szCs w:val="22"/>
                 <w:lang w:val="en-US" w:eastAsia="en-US" w:bidi="ar-SA"/>
               </w:rPr>
-              <w:t>T</w:t>
-            </w:r>
-            <w:r>
-              <w:rPr>
-                <w:rFonts w:eastAsia="ＭＳ 明朝" w:cs="" w:ascii="Arial" w:hAnsi="Arial"/>
-                <w:kern w:val="0"/>
-                <w:sz w:val="20"/>
-                <w:szCs w:val="22"/>
-                <w:lang w:val="en-US" w:eastAsia="en-US" w:bidi="ar-SA"/>
-              </w:rPr>
-              <w:t>enths of a second</w:t>
+              <w:t>Hundredths of a second</w:t>
+            </w:r>
+            <w:r>
+              <w:rPr>
+                <w:rFonts w:eastAsia="ＭＳ 明朝" w:cs="" w:ascii="Arial" w:hAnsi="Arial"/>
+                <w:kern w:val="0"/>
+                <w:sz w:val="20"/>
+                <w:szCs w:val="22"/>
+                <w:lang w:val="en-US" w:eastAsia="en-US" w:bidi="ar-SA"/>
+              </w:rPr>
             </w:r>
           </w:p>
         </w:tc>
@@ -3579,7 +3578,7 @@
                 <w:szCs w:val="22"/>
                 <w:lang w:val="en-US" w:eastAsia="en-US" w:bidi="ar-SA"/>
               </w:rPr>
-              <w:t>Second ones</w:t>
+              <w:t>Tenths of a second</w:t>
             </w:r>
           </w:p>
         </w:tc>
@@ -3684,7 +3683,7 @@
                 <w:szCs w:val="22"/>
                 <w:lang w:val="en-US" w:eastAsia="en-US" w:bidi="ar-SA"/>
               </w:rPr>
-              <w:t>Second tens</w:t>
+              <w:t>Seconds ones</w:t>
             </w:r>
           </w:p>
         </w:tc>
@@ -3789,7 +3788,7 @@
                 <w:szCs w:val="22"/>
                 <w:lang w:val="en-US" w:eastAsia="en-US" w:bidi="ar-SA"/>
               </w:rPr>
-              <w:t>Minutes ones</w:t>
+              <w:t>Seconds tens</w:t>
             </w:r>
           </w:p>
         </w:tc>
@@ -3894,7 +3893,7 @@
                 <w:szCs w:val="22"/>
                 <w:lang w:val="en-US" w:eastAsia="en-US" w:bidi="ar-SA"/>
               </w:rPr>
-              <w:t>Minute tens</w:t>
+              <w:t>Minutes ones</w:t>
             </w:r>
           </w:p>
         </w:tc>
@@ -3999,7 +3998,7 @@
                 <w:szCs w:val="22"/>
                 <w:lang w:val="en-US" w:eastAsia="en-US" w:bidi="ar-SA"/>
               </w:rPr>
-              <w:t>Hour ones</w:t>
+              <w:t>Minutes tens</w:t>
             </w:r>
           </w:p>
         </w:tc>
@@ -4101,7 +4100,7 @@
                 <w:szCs w:val="22"/>
                 <w:lang w:val="en-US" w:eastAsia="en-US" w:bidi="ar-SA"/>
               </w:rPr>
-              <w:t>Hour tens</w:t>
+              <w:t>Hours ones</w:t>
             </w:r>
           </w:p>
         </w:tc>
@@ -4203,6 +4202,7 @@
                 <w:szCs w:val="22"/>
                 <w:lang w:val="en-US" w:eastAsia="en-US" w:bidi="ar-SA"/>
               </w:rPr>
+              <w:t>Hours tens</w:t>
             </w:r>
           </w:p>
         </w:tc>

</xml_diff>

<commit_message>
Zev-7 Operator Manual rev 2.3: healing dwell rotation starts with the window
Section 15 said only that a tube with several digits marked rotates
through them five minutes each. As of Zev-7S v2.7.2 the rotation is
anchored to the moment treatment starts rather than to an absolute
wall-clock 5-minute boundary, so the first digit now gets a full five
minutes instead of whatever fraction of a slot was left when the window
opened. Documents the start point, the ascending digit order, and that a
window which ends and later reopens restarts at the first selected digit.

Footers bumped 2.2 to 2.3; PDF regenerated; pre-edit docx kept as
BACKUP pre-healdwell.
</commit_message>
<xml_diff>
--- a/Zev-7 Operator Manual.docx
+++ b/Zev-7 Operator Manual.docx
@@ -19235,7 +19235,7 @@
           <w:rFonts w:ascii="Arial" w:hAnsi="Arial"/>
           <w:sz w:val="22"/>
         </w:rPr>
-        <w:t>What you see during a window. The clock stops showing the time entirely: only the selected cathodes glow, on their own tubes, and every other tube is dark. This is deliberate — a healing digit held in place of a time digit would be unreadable and would dilute the treatment. If more than one digit is selected on the same tube, that tube rotates through them, five minutes each. The motion sensor, the scheduled anti-poison cycles, and the date and weather info displays are all suspended for the duration of the window so the treatment runs uninterrupted. The tubes run at full brightness for the whole window, regardless of the brightness setting, an nb value in any rule, the light sensor, or the motion sensor — the glow itself is the treatment, so a dimmed cathode heals slowly or not at all. Every tube with a digit selected takes part, including the tenths tube, even if it is normally switched off. Outside the window the clock behaves normally, with the brightness setting and any rules back in charge.</w:t>
+        <w:t>What you see during a window. The clock stops showing the time entirely: only the selected cathodes glow, on their own tubes, and every other tube is dark. This is deliberate — a healing digit held in place of a time digit would be unreadable and would dilute the treatment. If more than one digit is selected on the same tube, that tube rotates through them, five minutes each. The rotation begins when the window opens, starting with the lowest selected digit, so every digit — including the first — gets its full five minutes; a window that ends and later reopens starts the rotation over from the first selected digit. The motion sensor, the scheduled anti-poison cycles, and the date and weather info displays are all suspended for the duration of the window so the treatment runs uninterrupted. The tubes run at full brightness for the whole window, regardless of the brightness setting, an nb value in any rule, the light sensor, or the motion sensor — the glow itself is the treatment, so a dimmed cathode heals slowly or not at all. Every tube with a digit selected takes part, including the tenths tube, even if it is normally switched off. Outside the window the clock behaves normally, with the brightness setting and any rules back in charge.</w:t>
       </w:r>
     </w:p>
     <w:p>
@@ -22571,7 +22571,7 @@
         <w:color w:val="555555"/>
         <w:sz w:val="20"/>
       </w:rPr>
-      <w:t>Revision 2.2 — September 2026</w:t>
+      <w:t>Revision 2.3 — September 2026</w:t>
     </w:r>
     <w:r>
       <w:rPr>
@@ -22703,7 +22703,7 @@
         <w:color w:val="555555"/>
         <w:sz w:val="20"/>
       </w:rPr>
-      <w:t>Revision 2.2 — September 2026</w:t>
+      <w:t>Revision 2.3 — September 2026</w:t>
     </w:r>
     <w:r>
       <w:rPr>
@@ -22835,7 +22835,7 @@
         <w:color w:val="555555"/>
         <w:sz w:val="20"/>
       </w:rPr>
-      <w:t>Revision 2.2 — September 2026</w:t>
+      <w:t>Revision 2.3 — September 2026</w:t>
     </w:r>
     <w:r>
       <w:rPr>
@@ -22986,7 +22986,7 @@
         <w:color w:val="555555"/>
         <w:sz w:val="20"/>
       </w:rPr>
-      <w:t>Revision 2.2 — September 2026</w:t>
+      <w:t>Revision 2.3 — September 2026</w:t>
     </w:r>
     <w:r>
       <w:rPr>
@@ -23118,7 +23118,7 @@
         <w:color w:val="555555"/>
         <w:sz w:val="20"/>
       </w:rPr>
-      <w:t>Revision 2.2 — September 2026</w:t>
+      <w:t>Revision 2.3 — September 2026</w:t>
     </w:r>
     <w:r>
       <w:rPr>
@@ -23250,7 +23250,7 @@
         <w:color w:val="555555"/>
         <w:sz w:val="20"/>
       </w:rPr>
-      <w:t>Revision 2.2 — September 2026</w:t>
+      <w:t>Revision 2.3 — September 2026</w:t>
     </w:r>
     <w:r>
       <w:rPr>
@@ -23382,7 +23382,7 @@
         <w:color w:val="555555"/>
         <w:sz w:val="20"/>
       </w:rPr>
-      <w:t>Revision 2.2 — September 2026</w:t>
+      <w:t>Revision 2.3 — September 2026</w:t>
     </w:r>
     <w:r>
       <w:rPr>
@@ -23665,7 +23665,7 @@
         <w:color w:val="555555"/>
         <w:sz w:val="20"/>
       </w:rPr>
-      <w:t>Revision 2.2 — September 2026</w:t>
+      <w:t>Revision 2.3 — September 2026</w:t>
     </w:r>
     <w:r>
       <w:rPr>
@@ -23797,7 +23797,7 @@
         <w:color w:val="555555"/>
         <w:sz w:val="20"/>
       </w:rPr>
-      <w:t>Revision 2.2 — September 2026</w:t>
+      <w:t>Revision 2.3 — September 2026</w:t>
     </w:r>
     <w:r>
       <w:rPr>
@@ -23943,7 +23943,7 @@
         <w:color w:val="555555"/>
         <w:sz w:val="20"/>
       </w:rPr>
-      <w:t>Revision 2.2 — September 2026</w:t>
+      <w:t>Revision 2.3 — September 2026</w:t>
     </w:r>
     <w:r>
       <w:rPr>
@@ -24075,7 +24075,7 @@
         <w:color w:val="555555"/>
         <w:sz w:val="20"/>
       </w:rPr>
-      <w:t>Revision 2.2 — September 2026</w:t>
+      <w:t>Revision 2.3 — September 2026</w:t>
     </w:r>
     <w:r>
       <w:rPr>
@@ -24207,7 +24207,7 @@
         <w:color w:val="555555"/>
         <w:sz w:val="20"/>
       </w:rPr>
-      <w:t>Revision 2.2 — September 2026</w:t>
+      <w:t>Revision 2.3 — September 2026</w:t>
     </w:r>
     <w:r>
       <w:rPr>
@@ -24339,7 +24339,7 @@
         <w:color w:val="555555"/>
         <w:sz w:val="20"/>
       </w:rPr>
-      <w:t>Revision 2.2 — September 2026</w:t>
+      <w:t>Revision 2.3 — September 2026</w:t>
     </w:r>
     <w:r>
       <w:rPr>
@@ -24390,7 +24390,7 @@
         <w:color w:val="555555"/>
         <w:sz w:val="20"/>
       </w:rPr>
-      <w:t>Revision 2.2 — September 2026</w:t>
+      <w:t>Revision 2.3 — September 2026</w:t>
     </w:r>
     <w:r>
       <w:rPr>
@@ -24522,7 +24522,7 @@
         <w:color w:val="555555"/>
         <w:sz w:val="20"/>
       </w:rPr>
-      <w:t>Revision 2.2 — September 2026</w:t>
+      <w:t>Revision 2.3 — September 2026</w:t>
     </w:r>
     <w:r>
       <w:rPr>
@@ -24654,7 +24654,7 @@
         <w:color w:val="555555"/>
         <w:sz w:val="20"/>
       </w:rPr>
-      <w:t>Revision 2.2 — September 2026</w:t>
+      <w:t>Revision 2.3 — September 2026</w:t>
     </w:r>
     <w:r>
       <w:rPr>
@@ -24786,7 +24786,7 @@
         <w:color w:val="555555"/>
         <w:sz w:val="20"/>
       </w:rPr>
-      <w:t>Revision 2.2 — September 2026</w:t>
+      <w:t>Revision 2.3 — September 2026</w:t>
     </w:r>
     <w:r>
       <w:rPr>
@@ -24969,7 +24969,7 @@
         <w:color w:val="555555"/>
         <w:sz w:val="20"/>
       </w:rPr>
-      <w:t>Revision 2.2 — September 2026</w:t>
+      <w:t>Revision 2.3 — September 2026</w:t>
     </w:r>
   </w:p>
 </w:ftr>
@@ -25017,7 +25017,7 @@
         <w:color w:val="555555"/>
         <w:sz w:val="20"/>
       </w:rPr>
-      <w:t>Revision 2.2 — September 2026</w:t>
+      <w:t>Revision 2.3 — September 2026</w:t>
     </w:r>
     <w:r>
       <w:rPr>
@@ -25076,7 +25076,7 @@
         <w:color w:val="555555"/>
         <w:sz w:val="20"/>
       </w:rPr>
-      <w:t>Revision 2.2 — September 2026</w:t>
+      <w:t>Revision 2.3 — September 2026</w:t>
     </w:r>
     <w:r>
       <w:rPr>
@@ -25135,7 +25135,7 @@
         <w:color w:val="555555"/>
         <w:sz w:val="20"/>
       </w:rPr>
-      <w:t>Revision 2.2 — September 2026</w:t>
+      <w:t>Revision 2.3 — September 2026</w:t>
     </w:r>
     <w:r>
       <w:rPr>
@@ -25208,7 +25208,7 @@
         <w:color w:val="555555"/>
         <w:sz w:val="20"/>
       </w:rPr>
-      <w:t>Revision 2.2 — September 2026</w:t>
+      <w:t>Revision 2.3 — September 2026</w:t>
     </w:r>
     <w:r>
       <w:rPr>

</xml_diff>

<commit_message>
Zev-7 Operator Manual rev 2.4: healing grid axes flipped
Section 15 described the digit-selection grid as one column per tube and
one row per digit. As of Zev-7S v2.7.3 the axes are transposed — digits
0-9 across the top, one row per tube — so the grid fits a phone in
portrait regardless of how many tubes a clock has. Step 2 reworded to
match ("tick each weak digit in its tube's row").

Footers bumped 2.3 to 2.4; PDF regenerated; pre-edit docx kept as
BACKUP pre-gridflip.

Claude-Session: https://claude.ai/code/session_01JCkz5RYz6sc5T2WkHM4fbc
</commit_message>
<xml_diff>
--- a/Zev-7 Operator Manual.docx
+++ b/Zev-7 Operator Manual.docx
@@ -19195,7 +19195,7 @@
           <w:rFonts w:ascii="Arial" w:hAnsi="Arial"/>
           <w:sz w:val="22"/>
         </w:rPr>
-        <w:t>Where it is. Tube Healing lives on the live web interface, not the AP setup form. From the live home page, open the System page and tap Tube Healing. The page has three parts: a Healing on/off switch, a row of digit-test buttons (0–9), and a grid of checkboxes with one column per tube and one row per digit.</w:t>
+        <w:t>Where it is. Tube Healing lives on the live web interface, not the AP setup form. From the live home page, open the System page and tap Tube Healing. The page has three parts: a Healing on/off switch, a row of digit-test buttons (0–9), and a grid of checkboxes with one column per digit (0–9 across the top) and one row per tube (numbered from the left).</w:t>
       </w:r>
     </w:p>
     <w:p>
@@ -19215,7 +19215,7 @@
           <w:rFonts w:ascii="Arial" w:hAnsi="Arial"/>
           <w:sz w:val="22"/>
         </w:rPr>
-        <w:t>2. Select and arm. In the grid, tick each weak digit under its tube (tube 1 is the leftmost). Turn the Healing switch on. Selections are saved immediately and survive a reboot.</w:t>
+        <w:t>2. Select and arm. In the grid, tick each weak digit in its tube’s row (tube 1 is the leftmost). Turn the Healing switch on. Selections are saved immediately and survive a reboot.</w:t>
       </w:r>
     </w:p>
     <w:p>
@@ -22571,7 +22571,7 @@
         <w:color w:val="555555"/>
         <w:sz w:val="20"/>
       </w:rPr>
-      <w:t>Revision 2.3 — September 2026</w:t>
+      <w:t>Revision 2.4 — September 2026</w:t>
     </w:r>
     <w:r>
       <w:rPr>
@@ -22703,7 +22703,7 @@
         <w:color w:val="555555"/>
         <w:sz w:val="20"/>
       </w:rPr>
-      <w:t>Revision 2.3 — September 2026</w:t>
+      <w:t>Revision 2.4 — September 2026</w:t>
     </w:r>
     <w:r>
       <w:rPr>
@@ -22835,7 +22835,7 @@
         <w:color w:val="555555"/>
         <w:sz w:val="20"/>
       </w:rPr>
-      <w:t>Revision 2.3 — September 2026</w:t>
+      <w:t>Revision 2.4 — September 2026</w:t>
     </w:r>
     <w:r>
       <w:rPr>
@@ -22986,7 +22986,7 @@
         <w:color w:val="555555"/>
         <w:sz w:val="20"/>
       </w:rPr>
-      <w:t>Revision 2.3 — September 2026</w:t>
+      <w:t>Revision 2.4 — September 2026</w:t>
     </w:r>
     <w:r>
       <w:rPr>
@@ -23118,7 +23118,7 @@
         <w:color w:val="555555"/>
         <w:sz w:val="20"/>
       </w:rPr>
-      <w:t>Revision 2.3 — September 2026</w:t>
+      <w:t>Revision 2.4 — September 2026</w:t>
     </w:r>
     <w:r>
       <w:rPr>
@@ -23250,7 +23250,7 @@
         <w:color w:val="555555"/>
         <w:sz w:val="20"/>
       </w:rPr>
-      <w:t>Revision 2.3 — September 2026</w:t>
+      <w:t>Revision 2.4 — September 2026</w:t>
     </w:r>
     <w:r>
       <w:rPr>
@@ -23382,7 +23382,7 @@
         <w:color w:val="555555"/>
         <w:sz w:val="20"/>
       </w:rPr>
-      <w:t>Revision 2.3 — September 2026</w:t>
+      <w:t>Revision 2.4 — September 2026</w:t>
     </w:r>
     <w:r>
       <w:rPr>
@@ -23665,7 +23665,7 @@
         <w:color w:val="555555"/>
         <w:sz w:val="20"/>
       </w:rPr>
-      <w:t>Revision 2.3 — September 2026</w:t>
+      <w:t>Revision 2.4 — September 2026</w:t>
     </w:r>
     <w:r>
       <w:rPr>
@@ -23797,7 +23797,7 @@
         <w:color w:val="555555"/>
         <w:sz w:val="20"/>
       </w:rPr>
-      <w:t>Revision 2.3 — September 2026</w:t>
+      <w:t>Revision 2.4 — September 2026</w:t>
     </w:r>
     <w:r>
       <w:rPr>
@@ -23943,7 +23943,7 @@
         <w:color w:val="555555"/>
         <w:sz w:val="20"/>
       </w:rPr>
-      <w:t>Revision 2.3 — September 2026</w:t>
+      <w:t>Revision 2.4 — September 2026</w:t>
     </w:r>
     <w:r>
       <w:rPr>
@@ -24075,7 +24075,7 @@
         <w:color w:val="555555"/>
         <w:sz w:val="20"/>
       </w:rPr>
-      <w:t>Revision 2.3 — September 2026</w:t>
+      <w:t>Revision 2.4 — September 2026</w:t>
     </w:r>
     <w:r>
       <w:rPr>
@@ -24207,7 +24207,7 @@
         <w:color w:val="555555"/>
         <w:sz w:val="20"/>
       </w:rPr>
-      <w:t>Revision 2.3 — September 2026</w:t>
+      <w:t>Revision 2.4 — September 2026</w:t>
     </w:r>
     <w:r>
       <w:rPr>
@@ -24339,7 +24339,7 @@
         <w:color w:val="555555"/>
         <w:sz w:val="20"/>
       </w:rPr>
-      <w:t>Revision 2.3 — September 2026</w:t>
+      <w:t>Revision 2.4 — September 2026</w:t>
     </w:r>
     <w:r>
       <w:rPr>
@@ -24390,7 +24390,7 @@
         <w:color w:val="555555"/>
         <w:sz w:val="20"/>
       </w:rPr>
-      <w:t>Revision 2.3 — September 2026</w:t>
+      <w:t>Revision 2.4 — September 2026</w:t>
     </w:r>
     <w:r>
       <w:rPr>
@@ -24522,7 +24522,7 @@
         <w:color w:val="555555"/>
         <w:sz w:val="20"/>
       </w:rPr>
-      <w:t>Revision 2.3 — September 2026</w:t>
+      <w:t>Revision 2.4 — September 2026</w:t>
     </w:r>
     <w:r>
       <w:rPr>
@@ -24654,7 +24654,7 @@
         <w:color w:val="555555"/>
         <w:sz w:val="20"/>
       </w:rPr>
-      <w:t>Revision 2.3 — September 2026</w:t>
+      <w:t>Revision 2.4 — September 2026</w:t>
     </w:r>
     <w:r>
       <w:rPr>
@@ -24786,7 +24786,7 @@
         <w:color w:val="555555"/>
         <w:sz w:val="20"/>
       </w:rPr>
-      <w:t>Revision 2.3 — September 2026</w:t>
+      <w:t>Revision 2.4 — September 2026</w:t>
     </w:r>
     <w:r>
       <w:rPr>
@@ -24969,7 +24969,7 @@
         <w:color w:val="555555"/>
         <w:sz w:val="20"/>
       </w:rPr>
-      <w:t>Revision 2.3 — September 2026</w:t>
+      <w:t>Revision 2.4 — September 2026</w:t>
     </w:r>
   </w:p>
 </w:ftr>
@@ -25017,7 +25017,7 @@
         <w:color w:val="555555"/>
         <w:sz w:val="20"/>
       </w:rPr>
-      <w:t>Revision 2.3 — September 2026</w:t>
+      <w:t>Revision 2.4 — September 2026</w:t>
     </w:r>
     <w:r>
       <w:rPr>
@@ -25076,7 +25076,7 @@
         <w:color w:val="555555"/>
         <w:sz w:val="20"/>
       </w:rPr>
-      <w:t>Revision 2.3 — September 2026</w:t>
+      <w:t>Revision 2.4 — September 2026</w:t>
     </w:r>
     <w:r>
       <w:rPr>
@@ -25135,7 +25135,7 @@
         <w:color w:val="555555"/>
         <w:sz w:val="20"/>
       </w:rPr>
-      <w:t>Revision 2.3 — September 2026</w:t>
+      <w:t>Revision 2.4 — September 2026</w:t>
     </w:r>
     <w:r>
       <w:rPr>
@@ -25208,7 +25208,7 @@
         <w:color w:val="555555"/>
         <w:sz w:val="20"/>
       </w:rPr>
-      <w:t>Revision 2.3 — September 2026</w:t>
+      <w:t>Revision 2.4 — September 2026</w:t>
     </w:r>
     <w:r>
       <w:rPr>

</xml_diff>